<commit_message>
Zrealizowanie podpunktów 4.1 i 4.2 w sprawozdaniu końcowym
</commit_message>
<xml_diff>
--- a/TK/TK.docx
+++ b/TK/TK.docx
@@ -239,13 +239,8 @@
               <w:spacing w:line="240" w:lineRule="auto"/>
             </w:pPr>
             <w:r>
-              <w:t>Data przekazania sprawozdania: 9.06.</w:t>
+              <w:t>Data przekazania sprawozdania: 9.06.2026r.</w:t>
             </w:r>
-            <w:proofErr w:type="gramStart"/>
-            <w:r>
-              <w:t>2026r.</w:t>
-            </w:r>
-            <w:proofErr w:type="gramEnd"/>
           </w:p>
         </w:tc>
       </w:tr>
@@ -507,14 +502,400 @@
         <w:t xml:space="preserve"> oraz historii wystaw, w których brały udział poszczególne chomiki. Przygotowaniem danych będzie zajmował się wyznaczony pracownik, który ma mieć dostęp do danych operacyjnych systemu.</w:t>
       </w:r>
     </w:p>
-    <w:p/>
-    <w:p>
-      <w:pPr>
-        <w:rPr>
-          <w:b/>
-          <w:bCs/>
-        </w:rPr>
-      </w:pPr>
+    <w:p>
+      <w:pPr>
+        <w:rPr>
+          <w:sz w:val="28"/>
+          <w:szCs w:val="28"/>
+        </w:rPr>
+      </w:pPr>
+    </w:p>
+    <w:p>
+      <w:pPr>
+        <w:rPr>
+          <w:b/>
+          <w:bCs/>
+          <w:sz w:val="28"/>
+          <w:szCs w:val="28"/>
+          <w:lang w:val="pl-PL"/>
+        </w:rPr>
+      </w:pPr>
+      <w:r>
+        <w:rPr>
+          <w:b/>
+          <w:bCs/>
+          <w:sz w:val="28"/>
+          <w:szCs w:val="28"/>
+          <w:lang w:val="pl-PL"/>
+        </w:rPr>
+        <w:t>4.1 Diagramy przypadków użycia</w:t>
+      </w:r>
+    </w:p>
+    <w:p>
+      <w:pPr>
+        <w:rPr>
+          <w:lang w:val="pl-PL"/>
+        </w:rPr>
+      </w:pPr>
+      <w:r>
+        <w:rPr>
+          <w:lang w:val="pl-PL"/>
+        </w:rPr>
+        <w:t>Diagram przedstawia interakcje pomiędzy użytkownikami systemu, a funkcjonalnościami systemu menażerii chomików.</w:t>
+      </w:r>
+    </w:p>
+    <w:p>
+      <w:pPr>
+        <w:rPr>
+          <w:b/>
+          <w:bCs/>
+          <w:lang w:val="pl-PL"/>
+        </w:rPr>
+      </w:pPr>
+      <w:r>
+        <w:rPr>
+          <w:b/>
+          <w:bCs/>
+          <w:noProof/>
+          <w:lang w:val="pl-PL"/>
+        </w:rPr>
+        <w:lastRenderedPageBreak/>
+        <w:drawing>
+          <wp:inline distT="0" distB="0" distL="0" distR="0" wp14:anchorId="7D6C9FF6" wp14:editId="243D6061">
+            <wp:extent cx="6843395" cy="7026910"/>
+            <wp:effectExtent l="0" t="0" r="0" b="2540"/>
+            <wp:docPr id="842218524" name="Obraz 1"/>
+            <wp:cNvGraphicFramePr>
+              <a:graphicFrameLocks xmlns:a="http://schemas.openxmlformats.org/drawingml/2006/main" noChangeAspect="1"/>
+            </wp:cNvGraphicFramePr>
+            <a:graphic xmlns:a="http://schemas.openxmlformats.org/drawingml/2006/main">
+              <a:graphicData uri="http://schemas.openxmlformats.org/drawingml/2006/picture">
+                <pic:pic xmlns:pic="http://schemas.openxmlformats.org/drawingml/2006/picture">
+                  <pic:nvPicPr>
+                    <pic:cNvPr id="842218524" name="Obraz 842218524"/>
+                    <pic:cNvPicPr/>
+                  </pic:nvPicPr>
+                  <pic:blipFill>
+                    <a:blip r:embed="rId7">
+                      <a:extLst>
+                        <a:ext uri="{28A0092B-C50C-407E-A947-70E740481C1C}">
+                          <a14:useLocalDpi xmlns:a14="http://schemas.microsoft.com/office/drawing/2010/main" val="0"/>
+                        </a:ext>
+                      </a:extLst>
+                    </a:blip>
+                    <a:stretch>
+                      <a:fillRect/>
+                    </a:stretch>
+                  </pic:blipFill>
+                  <pic:spPr>
+                    <a:xfrm>
+                      <a:off x="0" y="0"/>
+                      <a:ext cx="6843395" cy="7026910"/>
+                    </a:xfrm>
+                    <a:prstGeom prst="rect">
+                      <a:avLst/>
+                    </a:prstGeom>
+                  </pic:spPr>
+                </pic:pic>
+              </a:graphicData>
+            </a:graphic>
+          </wp:inline>
+        </w:drawing>
+      </w:r>
+    </w:p>
+    <w:p>
+      <w:pPr>
+        <w:rPr>
+          <w:b/>
+          <w:bCs/>
+          <w:sz w:val="28"/>
+          <w:szCs w:val="28"/>
+          <w:lang w:val="pl-PL"/>
+        </w:rPr>
+      </w:pPr>
+    </w:p>
+    <w:p>
+      <w:pPr>
+        <w:rPr>
+          <w:b/>
+          <w:bCs/>
+          <w:sz w:val="28"/>
+          <w:szCs w:val="28"/>
+          <w:lang w:val="pl-PL"/>
+        </w:rPr>
+      </w:pPr>
+      <w:r>
+        <w:rPr>
+          <w:b/>
+          <w:bCs/>
+          <w:sz w:val="28"/>
+          <w:szCs w:val="28"/>
+          <w:lang w:val="pl-PL"/>
+        </w:rPr>
+        <w:t>4.2 Diagramy czynności</w:t>
+      </w:r>
+    </w:p>
+    <w:p>
+      <w:pPr>
+        <w:rPr>
+          <w:lang w:val="pl-PL"/>
+        </w:rPr>
+      </w:pPr>
+      <w:r>
+        <w:rPr>
+          <w:lang w:val="pl-PL"/>
+        </w:rPr>
+        <w:t>Diagramy czynności przedstawiają przebieg wybranych procesów realizowanych w systemie zarządzania menażerią chomików. Ukazują kolejność wykonywanych działań, podejmowane decyzje oraz możliwe alternatywne ścieżki przebiegu procesu. </w:t>
+      </w:r>
+    </w:p>
+    <w:p>
+      <w:pPr>
+        <w:rPr>
+          <w:b/>
+          <w:bCs/>
+        </w:rPr>
+      </w:pPr>
+    </w:p>
+    <w:p>
+      <w:pPr>
+        <w:rPr>
+          <w:b/>
+          <w:bCs/>
+          <w:lang w:val="pl-PL"/>
+        </w:rPr>
+      </w:pPr>
+      <w:r>
+        <w:rPr>
+          <w:b/>
+          <w:bCs/>
+        </w:rPr>
+        <w:t>Wniosek o leasing chomika</w:t>
+      </w:r>
+    </w:p>
+    <w:p>
+      <w:pPr>
+        <w:rPr>
+          <w:b/>
+          <w:bCs/>
+          <w:lang w:val="pl-PL"/>
+        </w:rPr>
+      </w:pPr>
+      <w:r>
+        <w:rPr>
+          <w:b/>
+          <w:bCs/>
+          <w:noProof/>
+          <w:lang w:val="pl-PL"/>
+        </w:rPr>
+        <w:lastRenderedPageBreak/>
+        <w:drawing>
+          <wp:inline distT="0" distB="0" distL="0" distR="0" wp14:anchorId="0EEE4898" wp14:editId="3B9F4AE7">
+            <wp:extent cx="6277610" cy="9970770"/>
+            <wp:effectExtent l="0" t="0" r="8890" b="0"/>
+            <wp:docPr id="1998868359" name="Obraz 4"/>
+            <wp:cNvGraphicFramePr>
+              <a:graphicFrameLocks xmlns:a="http://schemas.openxmlformats.org/drawingml/2006/main" noChangeAspect="1"/>
+            </wp:cNvGraphicFramePr>
+            <a:graphic xmlns:a="http://schemas.openxmlformats.org/drawingml/2006/main">
+              <a:graphicData uri="http://schemas.openxmlformats.org/drawingml/2006/picture">
+                <pic:pic xmlns:pic="http://schemas.openxmlformats.org/drawingml/2006/picture">
+                  <pic:nvPicPr>
+                    <pic:cNvPr id="1998868359" name="Obraz 1998868359"/>
+                    <pic:cNvPicPr/>
+                  </pic:nvPicPr>
+                  <pic:blipFill>
+                    <a:blip r:embed="rId8">
+                      <a:extLst>
+                        <a:ext uri="{28A0092B-C50C-407E-A947-70E740481C1C}">
+                          <a14:useLocalDpi xmlns:a14="http://schemas.microsoft.com/office/drawing/2010/main" val="0"/>
+                        </a:ext>
+                      </a:extLst>
+                    </a:blip>
+                    <a:stretch>
+                      <a:fillRect/>
+                    </a:stretch>
+                  </pic:blipFill>
+                  <pic:spPr>
+                    <a:xfrm>
+                      <a:off x="0" y="0"/>
+                      <a:ext cx="6277610" cy="9970770"/>
+                    </a:xfrm>
+                    <a:prstGeom prst="rect">
+                      <a:avLst/>
+                    </a:prstGeom>
+                  </pic:spPr>
+                </pic:pic>
+              </a:graphicData>
+            </a:graphic>
+          </wp:inline>
+        </w:drawing>
+      </w:r>
+    </w:p>
+    <w:p>
+      <w:pPr>
+        <w:rPr>
+          <w:b/>
+          <w:bCs/>
+        </w:rPr>
+      </w:pPr>
+      <w:r>
+        <w:rPr>
+          <w:b/>
+          <w:bCs/>
+        </w:rPr>
+        <w:lastRenderedPageBreak/>
+        <w:t>Realizacja grafiku karmienia</w:t>
+      </w:r>
+    </w:p>
+    <w:p>
+      <w:pPr>
+        <w:rPr>
+          <w:b/>
+          <w:bCs/>
+          <w:lang w:val="pl-PL"/>
+        </w:rPr>
+      </w:pPr>
+    </w:p>
+    <w:p>
+      <w:pPr>
+        <w:rPr>
+          <w:b/>
+          <w:bCs/>
+          <w:lang w:val="pl-PL"/>
+        </w:rPr>
+      </w:pPr>
+      <w:r>
+        <w:rPr>
+          <w:b/>
+          <w:bCs/>
+          <w:noProof/>
+          <w:lang w:val="pl-PL"/>
+        </w:rPr>
+        <w:drawing>
+          <wp:inline distT="0" distB="0" distL="0" distR="0" wp14:anchorId="6C3F7F8E" wp14:editId="610568D1">
+            <wp:extent cx="6843395" cy="7689850"/>
+            <wp:effectExtent l="0" t="0" r="0" b="6350"/>
+            <wp:docPr id="1527742614" name="Obraz 3"/>
+            <wp:cNvGraphicFramePr>
+              <a:graphicFrameLocks xmlns:a="http://schemas.openxmlformats.org/drawingml/2006/main" noChangeAspect="1"/>
+            </wp:cNvGraphicFramePr>
+            <a:graphic xmlns:a="http://schemas.openxmlformats.org/drawingml/2006/main">
+              <a:graphicData uri="http://schemas.openxmlformats.org/drawingml/2006/picture">
+                <pic:pic xmlns:pic="http://schemas.openxmlformats.org/drawingml/2006/picture">
+                  <pic:nvPicPr>
+                    <pic:cNvPr id="1527742614" name="Obraz 1527742614"/>
+                    <pic:cNvPicPr/>
+                  </pic:nvPicPr>
+                  <pic:blipFill>
+                    <a:blip r:embed="rId9">
+                      <a:extLst>
+                        <a:ext uri="{28A0092B-C50C-407E-A947-70E740481C1C}">
+                          <a14:useLocalDpi xmlns:a14="http://schemas.microsoft.com/office/drawing/2010/main" val="0"/>
+                        </a:ext>
+                      </a:extLst>
+                    </a:blip>
+                    <a:stretch>
+                      <a:fillRect/>
+                    </a:stretch>
+                  </pic:blipFill>
+                  <pic:spPr>
+                    <a:xfrm>
+                      <a:off x="0" y="0"/>
+                      <a:ext cx="6843395" cy="7689850"/>
+                    </a:xfrm>
+                    <a:prstGeom prst="rect">
+                      <a:avLst/>
+                    </a:prstGeom>
+                  </pic:spPr>
+                </pic:pic>
+              </a:graphicData>
+            </a:graphic>
+          </wp:inline>
+        </w:drawing>
+      </w:r>
+    </w:p>
+    <w:p>
+      <w:pPr>
+        <w:rPr>
+          <w:b/>
+          <w:bCs/>
+        </w:rPr>
+      </w:pPr>
+    </w:p>
+    <w:p>
+      <w:pPr>
+        <w:rPr>
+          <w:b/>
+          <w:bCs/>
+          <w:lang w:val="pl-PL"/>
+        </w:rPr>
+      </w:pPr>
+      <w:r>
+        <w:rPr>
+          <w:b/>
+          <w:bCs/>
+        </w:rPr>
+        <w:t>Obsługa zgłoszenia reklamacji leasingu</w:t>
+      </w:r>
+    </w:p>
+    <w:p>
+      <w:pPr>
+        <w:rPr>
+          <w:b/>
+          <w:bCs/>
+          <w:lang w:val="pl-PL"/>
+        </w:rPr>
+      </w:pPr>
+      <w:r>
+        <w:rPr>
+          <w:b/>
+          <w:bCs/>
+          <w:noProof/>
+          <w:lang w:val="pl-PL"/>
+        </w:rPr>
+        <w:lastRenderedPageBreak/>
+        <w:drawing>
+          <wp:inline distT="0" distB="0" distL="0" distR="0" wp14:anchorId="2200D5CD" wp14:editId="25BDA7DA">
+            <wp:extent cx="6843395" cy="8263890"/>
+            <wp:effectExtent l="0" t="0" r="0" b="3810"/>
+            <wp:docPr id="1798897198" name="Obraz 5"/>
+            <wp:cNvGraphicFramePr>
+              <a:graphicFrameLocks xmlns:a="http://schemas.openxmlformats.org/drawingml/2006/main" noChangeAspect="1"/>
+            </wp:cNvGraphicFramePr>
+            <a:graphic xmlns:a="http://schemas.openxmlformats.org/drawingml/2006/main">
+              <a:graphicData uri="http://schemas.openxmlformats.org/drawingml/2006/picture">
+                <pic:pic xmlns:pic="http://schemas.openxmlformats.org/drawingml/2006/picture">
+                  <pic:nvPicPr>
+                    <pic:cNvPr id="1798897198" name="Obraz 1798897198"/>
+                    <pic:cNvPicPr/>
+                  </pic:nvPicPr>
+                  <pic:blipFill>
+                    <a:blip r:embed="rId10">
+                      <a:extLst>
+                        <a:ext uri="{28A0092B-C50C-407E-A947-70E740481C1C}">
+                          <a14:useLocalDpi xmlns:a14="http://schemas.microsoft.com/office/drawing/2010/main" val="0"/>
+                        </a:ext>
+                      </a:extLst>
+                    </a:blip>
+                    <a:stretch>
+                      <a:fillRect/>
+                    </a:stretch>
+                  </pic:blipFill>
+                  <pic:spPr>
+                    <a:xfrm>
+                      <a:off x="0" y="0"/>
+                      <a:ext cx="6843395" cy="8263890"/>
+                    </a:xfrm>
+                    <a:prstGeom prst="rect">
+                      <a:avLst/>
+                    </a:prstGeom>
+                  </pic:spPr>
+                </pic:pic>
+              </a:graphicData>
+            </a:graphic>
+          </wp:inline>
+        </w:drawing>
+      </w:r>
     </w:p>
     <w:sectPr>
       <w:pgSz w:w="11909" w:h="16834"/>
@@ -1162,7 +1543,6 @@
   <w:style w:type="character" w:default="1" w:styleId="Domylnaczcionkaakapitu">
     <w:name w:val="Default Paragraph Font"/>
     <w:uiPriority w:val="1"/>
-    <w:semiHidden/>
     <w:unhideWhenUsed/>
   </w:style>
   <w:style w:type="table" w:default="1" w:styleId="Standardowy">

</xml_diff>

<commit_message>
Dodanie dokumentacji do podpunktu 5.3 (diagram stanu reklamacji i diagram stanu wniosku leasingowego)
</commit_message>
<xml_diff>
--- a/TK/TK.docx
+++ b/TK/TK.docx
@@ -239,8 +239,19 @@
               <w:spacing w:line="240" w:lineRule="auto"/>
             </w:pPr>
             <w:r>
-              <w:t>Data przekazania sprawozdania: 9.06.2026r.</w:t>
+              <w:t xml:space="preserve">Data przekazania sprawozdania: </w:t>
             </w:r>
+            <w:r>
+              <w:t>10</w:t>
+            </w:r>
+            <w:r>
+              <w:t>.06.</w:t>
+            </w:r>
+            <w:proofErr w:type="gramStart"/>
+            <w:r>
+              <w:t>2026r.</w:t>
+            </w:r>
+            <w:proofErr w:type="gramEnd"/>
           </w:p>
         </w:tc>
       </w:tr>
@@ -896,6 +907,865 @@
           </wp:inline>
         </w:drawing>
       </w:r>
+    </w:p>
+    <w:p>
+      <w:pPr>
+        <w:rPr>
+          <w:b/>
+          <w:bCs/>
+          <w:lang w:val="pl-PL"/>
+        </w:rPr>
+      </w:pPr>
+    </w:p>
+    <w:p>
+      <w:pPr>
+        <w:rPr>
+          <w:b/>
+          <w:bCs/>
+          <w:lang w:val="pl-PL"/>
+        </w:rPr>
+      </w:pPr>
+    </w:p>
+    <w:p>
+      <w:pPr>
+        <w:rPr>
+          <w:b/>
+          <w:bCs/>
+          <w:lang w:val="pl-PL"/>
+        </w:rPr>
+      </w:pPr>
+    </w:p>
+    <w:p>
+      <w:pPr>
+        <w:spacing w:line="240" w:lineRule="auto"/>
+        <w:rPr>
+          <w:rFonts w:ascii="Times New Roman" w:eastAsia="Times New Roman" w:hAnsi="Times New Roman" w:cs="Times New Roman"/>
+          <w:color w:val="000000"/>
+          <w:sz w:val="24"/>
+          <w:szCs w:val="24"/>
+          <w:lang w:val="pl-PL"/>
+        </w:rPr>
+      </w:pPr>
+      <w:r>
+        <w:rPr>
+          <w:rFonts w:eastAsia="Times New Roman"/>
+          <w:b/>
+          <w:bCs/>
+          <w:color w:val="000000"/>
+          <w:sz w:val="28"/>
+          <w:szCs w:val="28"/>
+          <w:lang w:val="pl-PL"/>
+        </w:rPr>
+        <w:t>5.3. Diagram stanów</w:t>
+      </w:r>
+    </w:p>
+    <w:p>
+      <w:pPr>
+        <w:spacing w:line="240" w:lineRule="auto"/>
+        <w:rPr>
+          <w:rFonts w:ascii="Times New Roman" w:eastAsia="Times New Roman" w:hAnsi="Times New Roman" w:cs="Times New Roman"/>
+          <w:color w:val="000000"/>
+          <w:sz w:val="24"/>
+          <w:szCs w:val="24"/>
+          <w:lang w:val="pl-PL"/>
+        </w:rPr>
+      </w:pPr>
+    </w:p>
+    <w:p>
+      <w:pPr>
+        <w:spacing w:line="240" w:lineRule="auto"/>
+        <w:rPr>
+          <w:rFonts w:eastAsia="Times New Roman"/>
+          <w:color w:val="000000"/>
+          <w:lang w:val="pl-PL"/>
+        </w:rPr>
+      </w:pPr>
+      <w:r>
+        <w:rPr>
+          <w:rFonts w:eastAsia="Times New Roman"/>
+          <w:color w:val="000000"/>
+          <w:lang w:val="pl-PL"/>
+        </w:rPr>
+        <w:t>Diagramy stanów przedstawiają zmiany stanów wybranych obiektów w systemie w zależności od zachodzących zdarzeń oraz wykonywanych operacji. Celem diagramów stanów jest zobrazowanie dynamicznych zmian statusów obiektów oraz warunków, które powodują przejścia pomiędzy poszczególnymi stanami.</w:t>
+      </w:r>
+    </w:p>
+    <w:p>
+      <w:pPr>
+        <w:spacing w:line="240" w:lineRule="auto"/>
+        <w:rPr>
+          <w:rFonts w:eastAsia="Times New Roman"/>
+          <w:color w:val="000000"/>
+          <w:lang w:val="pl-PL"/>
+        </w:rPr>
+      </w:pPr>
+    </w:p>
+    <w:p>
+      <w:pPr>
+        <w:spacing w:line="240" w:lineRule="auto"/>
+        <w:rPr>
+          <w:rFonts w:eastAsia="Times New Roman"/>
+          <w:color w:val="000000"/>
+          <w:lang w:val="pl-PL"/>
+        </w:rPr>
+      </w:pPr>
+    </w:p>
+    <w:p>
+      <w:pPr>
+        <w:spacing w:line="240" w:lineRule="auto"/>
+        <w:rPr>
+          <w:rFonts w:eastAsia="Times New Roman"/>
+          <w:color w:val="000000"/>
+          <w:lang w:val="pl-PL"/>
+        </w:rPr>
+      </w:pPr>
+    </w:p>
+    <w:p>
+      <w:pPr>
+        <w:spacing w:line="240" w:lineRule="auto"/>
+        <w:rPr>
+          <w:rFonts w:eastAsia="Times New Roman"/>
+          <w:color w:val="000000"/>
+          <w:lang w:val="pl-PL"/>
+        </w:rPr>
+      </w:pPr>
+    </w:p>
+    <w:p>
+      <w:pPr>
+        <w:spacing w:line="240" w:lineRule="auto"/>
+        <w:rPr>
+          <w:rFonts w:eastAsia="Times New Roman"/>
+          <w:color w:val="000000"/>
+          <w:lang w:val="pl-PL"/>
+        </w:rPr>
+      </w:pPr>
+    </w:p>
+    <w:p>
+      <w:pPr>
+        <w:spacing w:line="240" w:lineRule="auto"/>
+        <w:rPr>
+          <w:rFonts w:eastAsia="Times New Roman"/>
+          <w:color w:val="000000"/>
+          <w:lang w:val="pl-PL"/>
+        </w:rPr>
+      </w:pPr>
+    </w:p>
+    <w:p>
+      <w:pPr>
+        <w:spacing w:line="240" w:lineRule="auto"/>
+        <w:rPr>
+          <w:rFonts w:eastAsia="Times New Roman"/>
+          <w:color w:val="000000"/>
+          <w:lang w:val="pl-PL"/>
+        </w:rPr>
+      </w:pPr>
+    </w:p>
+    <w:p>
+      <w:pPr>
+        <w:spacing w:line="240" w:lineRule="auto"/>
+        <w:rPr>
+          <w:rFonts w:eastAsia="Times New Roman"/>
+          <w:color w:val="000000"/>
+          <w:lang w:val="pl-PL"/>
+        </w:rPr>
+      </w:pPr>
+    </w:p>
+    <w:p>
+      <w:pPr>
+        <w:spacing w:line="240" w:lineRule="auto"/>
+        <w:rPr>
+          <w:rFonts w:eastAsia="Times New Roman"/>
+          <w:color w:val="000000"/>
+          <w:lang w:val="pl-PL"/>
+        </w:rPr>
+      </w:pPr>
+    </w:p>
+    <w:p>
+      <w:pPr>
+        <w:spacing w:line="240" w:lineRule="auto"/>
+        <w:rPr>
+          <w:rFonts w:eastAsia="Times New Roman"/>
+          <w:color w:val="000000"/>
+          <w:lang w:val="pl-PL"/>
+        </w:rPr>
+      </w:pPr>
+    </w:p>
+    <w:p>
+      <w:pPr>
+        <w:spacing w:line="240" w:lineRule="auto"/>
+        <w:rPr>
+          <w:rFonts w:eastAsia="Times New Roman"/>
+          <w:color w:val="000000"/>
+          <w:lang w:val="pl-PL"/>
+        </w:rPr>
+      </w:pPr>
+    </w:p>
+    <w:p>
+      <w:pPr>
+        <w:spacing w:line="240" w:lineRule="auto"/>
+        <w:rPr>
+          <w:rFonts w:eastAsia="Times New Roman"/>
+          <w:color w:val="000000"/>
+          <w:lang w:val="pl-PL"/>
+        </w:rPr>
+      </w:pPr>
+    </w:p>
+    <w:p>
+      <w:pPr>
+        <w:spacing w:line="240" w:lineRule="auto"/>
+        <w:rPr>
+          <w:rFonts w:eastAsia="Times New Roman"/>
+          <w:color w:val="000000"/>
+          <w:lang w:val="pl-PL"/>
+        </w:rPr>
+      </w:pPr>
+    </w:p>
+    <w:p>
+      <w:pPr>
+        <w:spacing w:line="240" w:lineRule="auto"/>
+        <w:rPr>
+          <w:rFonts w:eastAsia="Times New Roman"/>
+          <w:color w:val="000000"/>
+          <w:lang w:val="pl-PL"/>
+        </w:rPr>
+      </w:pPr>
+    </w:p>
+    <w:p>
+      <w:pPr>
+        <w:spacing w:line="240" w:lineRule="auto"/>
+        <w:rPr>
+          <w:rFonts w:ascii="Times New Roman" w:eastAsia="Times New Roman" w:hAnsi="Times New Roman" w:cs="Times New Roman"/>
+          <w:color w:val="000000"/>
+          <w:sz w:val="24"/>
+          <w:szCs w:val="24"/>
+          <w:lang w:val="pl-PL"/>
+        </w:rPr>
+      </w:pPr>
+    </w:p>
+    <w:p>
+      <w:pPr>
+        <w:spacing w:line="240" w:lineRule="auto"/>
+        <w:jc w:val="center"/>
+        <w:rPr>
+          <w:rFonts w:ascii="Times New Roman" w:eastAsia="Times New Roman" w:hAnsi="Times New Roman" w:cs="Times New Roman"/>
+          <w:color w:val="000000"/>
+          <w:sz w:val="24"/>
+          <w:szCs w:val="24"/>
+          <w:lang w:val="pl-PL"/>
+        </w:rPr>
+      </w:pPr>
+      <w:r>
+        <w:rPr>
+          <w:rFonts w:eastAsia="Times New Roman"/>
+          <w:b/>
+          <w:bCs/>
+          <w:color w:val="000000"/>
+          <w:lang w:val="pl-PL"/>
+        </w:rPr>
+        <w:t>Stany wniosku leasingowego</w:t>
+      </w:r>
+    </w:p>
+    <w:p>
+      <w:pPr>
+        <w:spacing w:line="240" w:lineRule="auto"/>
+        <w:jc w:val="center"/>
+        <w:rPr>
+          <w:rFonts w:ascii="Times New Roman" w:eastAsia="Times New Roman" w:hAnsi="Times New Roman" w:cs="Times New Roman"/>
+          <w:color w:val="000000"/>
+          <w:sz w:val="24"/>
+          <w:szCs w:val="24"/>
+          <w:lang w:val="pl-PL"/>
+        </w:rPr>
+      </w:pPr>
+      <w:r>
+        <w:rPr>
+          <w:rFonts w:eastAsia="Times New Roman"/>
+          <w:b/>
+          <w:bCs/>
+          <w:noProof/>
+          <w:color w:val="000000"/>
+          <w:bdr w:val="none" w:sz="0" w:space="0" w:color="auto" w:frame="1"/>
+          <w:lang w:val="pl-PL"/>
+        </w:rPr>
+        <w:drawing>
+          <wp:inline distT="0" distB="0" distL="0" distR="0" wp14:anchorId="2358A67B" wp14:editId="3E0B6927">
+            <wp:extent cx="6084711" cy="5906003"/>
+            <wp:effectExtent l="0" t="0" r="0" b="0"/>
+            <wp:docPr id="1483633794" name="Obraz 2"/>
+            <wp:cNvGraphicFramePr>
+              <a:graphicFrameLocks xmlns:a="http://schemas.openxmlformats.org/drawingml/2006/main" noChangeAspect="1"/>
+            </wp:cNvGraphicFramePr>
+            <a:graphic xmlns:a="http://schemas.openxmlformats.org/drawingml/2006/main">
+              <a:graphicData uri="http://schemas.openxmlformats.org/drawingml/2006/picture">
+                <pic:pic xmlns:pic="http://schemas.openxmlformats.org/drawingml/2006/picture">
+                  <pic:nvPicPr>
+                    <pic:cNvPr id="0" name="Picture 1"/>
+                    <pic:cNvPicPr>
+                      <a:picLocks noChangeAspect="1" noChangeArrowheads="1"/>
+                    </pic:cNvPicPr>
+                  </pic:nvPicPr>
+                  <pic:blipFill>
+                    <a:blip r:embed="rId11">
+                      <a:extLst>
+                        <a:ext uri="{28A0092B-C50C-407E-A947-70E740481C1C}">
+                          <a14:useLocalDpi xmlns:a14="http://schemas.microsoft.com/office/drawing/2010/main" val="0"/>
+                        </a:ext>
+                      </a:extLst>
+                    </a:blip>
+                    <a:srcRect/>
+                    <a:stretch>
+                      <a:fillRect/>
+                    </a:stretch>
+                  </pic:blipFill>
+                  <pic:spPr bwMode="auto">
+                    <a:xfrm>
+                      <a:off x="0" y="0"/>
+                      <a:ext cx="6117294" cy="5937629"/>
+                    </a:xfrm>
+                    <a:prstGeom prst="rect">
+                      <a:avLst/>
+                    </a:prstGeom>
+                    <a:noFill/>
+                    <a:ln>
+                      <a:noFill/>
+                    </a:ln>
+                  </pic:spPr>
+                </pic:pic>
+              </a:graphicData>
+            </a:graphic>
+          </wp:inline>
+        </w:drawing>
+      </w:r>
+    </w:p>
+    <w:p>
+      <w:pPr>
+        <w:spacing w:line="240" w:lineRule="auto"/>
+        <w:rPr>
+          <w:rFonts w:ascii="Times New Roman" w:eastAsia="Times New Roman" w:hAnsi="Times New Roman" w:cs="Times New Roman"/>
+          <w:color w:val="000000"/>
+          <w:sz w:val="24"/>
+          <w:szCs w:val="24"/>
+          <w:lang w:val="pl-PL"/>
+        </w:rPr>
+      </w:pPr>
+    </w:p>
+    <w:p>
+      <w:pPr>
+        <w:spacing w:line="240" w:lineRule="auto"/>
+        <w:rPr>
+          <w:rFonts w:ascii="Times New Roman" w:eastAsia="Times New Roman" w:hAnsi="Times New Roman" w:cs="Times New Roman"/>
+          <w:color w:val="000000"/>
+          <w:sz w:val="24"/>
+          <w:szCs w:val="24"/>
+          <w:lang w:val="pl-PL"/>
+        </w:rPr>
+      </w:pPr>
+      <w:r>
+        <w:rPr>
+          <w:rFonts w:eastAsia="Times New Roman"/>
+          <w:b/>
+          <w:bCs/>
+          <w:color w:val="000000"/>
+          <w:lang w:val="pl-PL"/>
+        </w:rPr>
+        <w:t xml:space="preserve">Złożony: </w:t>
+      </w:r>
+      <w:r>
+        <w:rPr>
+          <w:rFonts w:eastAsia="Times New Roman"/>
+          <w:color w:val="000000"/>
+          <w:lang w:val="pl-PL"/>
+        </w:rPr>
+        <w:t xml:space="preserve">Początkowy stan po zapisaniu wniosku w bazie przez klienta za pomocą operacji </w:t>
+      </w:r>
+      <w:proofErr w:type="spellStart"/>
+      <w:proofErr w:type="gramStart"/>
+      <w:r>
+        <w:rPr>
+          <w:rFonts w:eastAsia="Times New Roman"/>
+          <w:color w:val="000000"/>
+          <w:lang w:val="pl-PL"/>
+        </w:rPr>
+        <w:t>zlozWniosekLeasingowy</w:t>
+      </w:r>
+      <w:proofErr w:type="spellEnd"/>
+      <w:r>
+        <w:rPr>
+          <w:rFonts w:eastAsia="Times New Roman"/>
+          <w:color w:val="000000"/>
+          <w:lang w:val="pl-PL"/>
+        </w:rPr>
+        <w:t>(</w:t>
+      </w:r>
+      <w:proofErr w:type="gramEnd"/>
+      <w:r>
+        <w:rPr>
+          <w:rFonts w:eastAsia="Times New Roman"/>
+          <w:color w:val="000000"/>
+          <w:lang w:val="pl-PL"/>
+        </w:rPr>
+        <w:t>).</w:t>
+      </w:r>
+    </w:p>
+    <w:p>
+      <w:pPr>
+        <w:spacing w:line="240" w:lineRule="auto"/>
+        <w:rPr>
+          <w:rFonts w:ascii="Times New Roman" w:eastAsia="Times New Roman" w:hAnsi="Times New Roman" w:cs="Times New Roman"/>
+          <w:color w:val="000000"/>
+          <w:sz w:val="24"/>
+          <w:szCs w:val="24"/>
+          <w:lang w:val="pl-PL"/>
+        </w:rPr>
+      </w:pPr>
+      <w:r>
+        <w:rPr>
+          <w:rFonts w:eastAsia="Times New Roman"/>
+          <w:b/>
+          <w:bCs/>
+          <w:color w:val="000000"/>
+          <w:lang w:val="pl-PL"/>
+        </w:rPr>
+        <w:t xml:space="preserve">Zarezerwowany: </w:t>
+      </w:r>
+      <w:r>
+        <w:rPr>
+          <w:rFonts w:eastAsia="Times New Roman"/>
+          <w:color w:val="000000"/>
+          <w:lang w:val="pl-PL"/>
+        </w:rPr>
+        <w:t>Wniosek pomyślnie przetworzony, chomik przypisany do wniosku oczekuje na fizyczny odbiór.</w:t>
+      </w:r>
+    </w:p>
+    <w:p>
+      <w:pPr>
+        <w:spacing w:line="240" w:lineRule="auto"/>
+        <w:rPr>
+          <w:rFonts w:ascii="Times New Roman" w:eastAsia="Times New Roman" w:hAnsi="Times New Roman" w:cs="Times New Roman"/>
+          <w:color w:val="000000"/>
+          <w:sz w:val="24"/>
+          <w:szCs w:val="24"/>
+          <w:lang w:val="pl-PL"/>
+        </w:rPr>
+      </w:pPr>
+      <w:r>
+        <w:rPr>
+          <w:rFonts w:eastAsia="Times New Roman"/>
+          <w:b/>
+          <w:bCs/>
+          <w:color w:val="000000"/>
+          <w:lang w:val="pl-PL"/>
+        </w:rPr>
+        <w:t>Trwający:</w:t>
+      </w:r>
+      <w:r>
+        <w:rPr>
+          <w:rFonts w:eastAsia="Times New Roman"/>
+          <w:color w:val="000000"/>
+          <w:lang w:val="pl-PL"/>
+        </w:rPr>
+        <w:t xml:space="preserve"> Stan aktywny umowy leasingowej, rozpoczyna się po wydaniu chomika dla klienta.</w:t>
+      </w:r>
+    </w:p>
+    <w:p>
+      <w:pPr>
+        <w:spacing w:line="240" w:lineRule="auto"/>
+        <w:rPr>
+          <w:rFonts w:ascii="Times New Roman" w:eastAsia="Times New Roman" w:hAnsi="Times New Roman" w:cs="Times New Roman"/>
+          <w:color w:val="000000"/>
+          <w:sz w:val="24"/>
+          <w:szCs w:val="24"/>
+          <w:lang w:val="pl-PL"/>
+        </w:rPr>
+      </w:pPr>
+      <w:r>
+        <w:rPr>
+          <w:rFonts w:eastAsia="Times New Roman"/>
+          <w:b/>
+          <w:bCs/>
+          <w:color w:val="000000"/>
+          <w:lang w:val="pl-PL"/>
+        </w:rPr>
+        <w:t xml:space="preserve">Zakończony: </w:t>
+      </w:r>
+      <w:r>
+        <w:rPr>
+          <w:rFonts w:eastAsia="Times New Roman"/>
+          <w:color w:val="000000"/>
+          <w:lang w:val="pl-PL"/>
+        </w:rPr>
+        <w:t>Stan końcowy, osiągany po zwrocie chomika do menażerii.</w:t>
+      </w:r>
+    </w:p>
+    <w:p>
+      <w:pPr>
+        <w:spacing w:line="240" w:lineRule="auto"/>
+        <w:rPr>
+          <w:rFonts w:ascii="Times New Roman" w:eastAsia="Times New Roman" w:hAnsi="Times New Roman" w:cs="Times New Roman"/>
+          <w:color w:val="000000"/>
+          <w:sz w:val="24"/>
+          <w:szCs w:val="24"/>
+          <w:lang w:val="pl-PL"/>
+        </w:rPr>
+      </w:pPr>
+      <w:r>
+        <w:rPr>
+          <w:rFonts w:eastAsia="Times New Roman"/>
+          <w:b/>
+          <w:bCs/>
+          <w:color w:val="000000"/>
+          <w:lang w:val="pl-PL"/>
+        </w:rPr>
+        <w:t xml:space="preserve">Anulowany: </w:t>
+      </w:r>
+      <w:r>
+        <w:rPr>
+          <w:rFonts w:eastAsia="Times New Roman"/>
+          <w:color w:val="000000"/>
+          <w:lang w:val="pl-PL"/>
+        </w:rPr>
+        <w:t>Stan końcowy wynikający z rezygnacji klienta.</w:t>
+      </w:r>
+    </w:p>
+    <w:p>
+      <w:pPr>
+        <w:spacing w:line="240" w:lineRule="auto"/>
+        <w:rPr>
+          <w:rFonts w:ascii="Times New Roman" w:eastAsia="Times New Roman" w:hAnsi="Times New Roman" w:cs="Times New Roman"/>
+          <w:color w:val="000000"/>
+          <w:sz w:val="24"/>
+          <w:szCs w:val="24"/>
+          <w:lang w:val="pl-PL"/>
+        </w:rPr>
+      </w:pPr>
+    </w:p>
+    <w:p>
+      <w:pPr>
+        <w:spacing w:line="240" w:lineRule="auto"/>
+        <w:jc w:val="center"/>
+        <w:rPr>
+          <w:rFonts w:ascii="Times New Roman" w:eastAsia="Times New Roman" w:hAnsi="Times New Roman" w:cs="Times New Roman"/>
+          <w:color w:val="000000"/>
+          <w:sz w:val="24"/>
+          <w:szCs w:val="24"/>
+          <w:lang w:val="pl-PL"/>
+        </w:rPr>
+      </w:pPr>
+      <w:r>
+        <w:rPr>
+          <w:rFonts w:eastAsia="Times New Roman"/>
+          <w:b/>
+          <w:bCs/>
+          <w:color w:val="000000"/>
+          <w:lang w:val="pl-PL"/>
+        </w:rPr>
+        <w:lastRenderedPageBreak/>
+        <w:t>Stany reklamacji</w:t>
+      </w:r>
+    </w:p>
+    <w:p>
+      <w:pPr>
+        <w:spacing w:line="240" w:lineRule="auto"/>
+        <w:jc w:val="center"/>
+        <w:rPr>
+          <w:rFonts w:ascii="Times New Roman" w:eastAsia="Times New Roman" w:hAnsi="Times New Roman" w:cs="Times New Roman"/>
+          <w:color w:val="000000"/>
+          <w:sz w:val="24"/>
+          <w:szCs w:val="24"/>
+          <w:lang w:val="pl-PL"/>
+        </w:rPr>
+      </w:pPr>
+      <w:r>
+        <w:rPr>
+          <w:rFonts w:eastAsia="Times New Roman"/>
+          <w:b/>
+          <w:bCs/>
+          <w:noProof/>
+          <w:color w:val="000000"/>
+          <w:bdr w:val="none" w:sz="0" w:space="0" w:color="auto" w:frame="1"/>
+          <w:lang w:val="pl-PL"/>
+        </w:rPr>
+        <w:drawing>
+          <wp:inline distT="0" distB="0" distL="0" distR="0" wp14:anchorId="1AF77E66" wp14:editId="6CED090F">
+            <wp:extent cx="6355644" cy="6765413"/>
+            <wp:effectExtent l="0" t="0" r="0" b="3810"/>
+            <wp:docPr id="986096403" name="Obraz 1"/>
+            <wp:cNvGraphicFramePr>
+              <a:graphicFrameLocks xmlns:a="http://schemas.openxmlformats.org/drawingml/2006/main" noChangeAspect="1"/>
+            </wp:cNvGraphicFramePr>
+            <a:graphic xmlns:a="http://schemas.openxmlformats.org/drawingml/2006/main">
+              <a:graphicData uri="http://schemas.openxmlformats.org/drawingml/2006/picture">
+                <pic:pic xmlns:pic="http://schemas.openxmlformats.org/drawingml/2006/picture">
+                  <pic:nvPicPr>
+                    <pic:cNvPr id="0" name="Picture 2"/>
+                    <pic:cNvPicPr>
+                      <a:picLocks noChangeAspect="1" noChangeArrowheads="1"/>
+                    </pic:cNvPicPr>
+                  </pic:nvPicPr>
+                  <pic:blipFill>
+                    <a:blip r:embed="rId12">
+                      <a:extLst>
+                        <a:ext uri="{28A0092B-C50C-407E-A947-70E740481C1C}">
+                          <a14:useLocalDpi xmlns:a14="http://schemas.microsoft.com/office/drawing/2010/main" val="0"/>
+                        </a:ext>
+                      </a:extLst>
+                    </a:blip>
+                    <a:srcRect/>
+                    <a:stretch>
+                      <a:fillRect/>
+                    </a:stretch>
+                  </pic:blipFill>
+                  <pic:spPr bwMode="auto">
+                    <a:xfrm>
+                      <a:off x="0" y="0"/>
+                      <a:ext cx="6401954" cy="6814709"/>
+                    </a:xfrm>
+                    <a:prstGeom prst="rect">
+                      <a:avLst/>
+                    </a:prstGeom>
+                    <a:noFill/>
+                    <a:ln>
+                      <a:noFill/>
+                    </a:ln>
+                  </pic:spPr>
+                </pic:pic>
+              </a:graphicData>
+            </a:graphic>
+          </wp:inline>
+        </w:drawing>
+      </w:r>
+    </w:p>
+    <w:p>
+      <w:pPr>
+        <w:spacing w:line="240" w:lineRule="auto"/>
+        <w:rPr>
+          <w:rFonts w:eastAsia="Times New Roman"/>
+          <w:b/>
+          <w:bCs/>
+          <w:color w:val="000000"/>
+          <w:lang w:val="pl-PL"/>
+        </w:rPr>
+      </w:pPr>
+    </w:p>
+    <w:p>
+      <w:pPr>
+        <w:spacing w:line="240" w:lineRule="auto"/>
+        <w:rPr>
+          <w:rFonts w:ascii="Times New Roman" w:eastAsia="Times New Roman" w:hAnsi="Times New Roman" w:cs="Times New Roman"/>
+          <w:color w:val="000000"/>
+          <w:sz w:val="24"/>
+          <w:szCs w:val="24"/>
+          <w:lang w:val="pl-PL"/>
+        </w:rPr>
+      </w:pPr>
+      <w:r>
+        <w:rPr>
+          <w:rFonts w:eastAsia="Times New Roman"/>
+          <w:b/>
+          <w:bCs/>
+          <w:color w:val="000000"/>
+          <w:lang w:val="pl-PL"/>
+        </w:rPr>
+        <w:t xml:space="preserve">Zgłoszona: </w:t>
+      </w:r>
+      <w:r>
+        <w:rPr>
+          <w:rFonts w:eastAsia="Times New Roman"/>
+          <w:color w:val="000000"/>
+          <w:lang w:val="pl-PL"/>
+        </w:rPr>
+        <w:t xml:space="preserve">Początkowy stan po utworzeniu zgłoszenia reklamacyjnego przez klienta </w:t>
+      </w:r>
+      <w:r>
+        <w:rPr>
+          <w:rFonts w:eastAsia="Times New Roman"/>
+          <w:color w:val="000000"/>
+          <w:lang w:val="pl-PL"/>
+        </w:rPr>
+        <w:t xml:space="preserve">za pomocą operacji </w:t>
+      </w:r>
+      <w:proofErr w:type="spellStart"/>
+      <w:proofErr w:type="gramStart"/>
+      <w:r>
+        <w:rPr>
+          <w:rFonts w:eastAsia="Times New Roman"/>
+          <w:color w:val="000000"/>
+          <w:lang w:val="pl-PL"/>
+        </w:rPr>
+        <w:t>zglosReklamacje</w:t>
+      </w:r>
+      <w:proofErr w:type="spellEnd"/>
+      <w:r>
+        <w:rPr>
+          <w:rFonts w:eastAsia="Times New Roman"/>
+          <w:color w:val="000000"/>
+          <w:lang w:val="pl-PL"/>
+        </w:rPr>
+        <w:t>(</w:t>
+      </w:r>
+      <w:proofErr w:type="gramEnd"/>
+      <w:r>
+        <w:rPr>
+          <w:rFonts w:eastAsia="Times New Roman"/>
+          <w:color w:val="000000"/>
+          <w:lang w:val="pl-PL"/>
+        </w:rPr>
+        <w:t>).</w:t>
+      </w:r>
+    </w:p>
+    <w:p>
+      <w:pPr>
+        <w:spacing w:line="240" w:lineRule="auto"/>
+        <w:rPr>
+          <w:rFonts w:ascii="Times New Roman" w:eastAsia="Times New Roman" w:hAnsi="Times New Roman" w:cs="Times New Roman"/>
+          <w:color w:val="000000"/>
+          <w:sz w:val="24"/>
+          <w:szCs w:val="24"/>
+          <w:lang w:val="pl-PL"/>
+        </w:rPr>
+      </w:pPr>
+      <w:r>
+        <w:rPr>
+          <w:rFonts w:eastAsia="Times New Roman"/>
+          <w:b/>
+          <w:bCs/>
+          <w:color w:val="000000"/>
+          <w:lang w:val="pl-PL"/>
+        </w:rPr>
+        <w:t xml:space="preserve">Rozpatrywana: </w:t>
+      </w:r>
+      <w:r>
+        <w:rPr>
+          <w:rFonts w:eastAsia="Times New Roman"/>
+          <w:color w:val="000000"/>
+          <w:lang w:val="pl-PL"/>
+        </w:rPr>
+        <w:t xml:space="preserve">Stan przejściowy, gdy </w:t>
+      </w:r>
+      <w:r>
+        <w:rPr>
+          <w:rFonts w:eastAsia="Times New Roman"/>
+          <w:color w:val="000000"/>
+          <w:lang w:val="pl-PL"/>
+        </w:rPr>
+        <w:t xml:space="preserve">administrator </w:t>
+      </w:r>
+      <w:r>
+        <w:rPr>
+          <w:rFonts w:eastAsia="Times New Roman"/>
+          <w:color w:val="000000"/>
+          <w:lang w:val="pl-PL"/>
+        </w:rPr>
+        <w:t>analizuje zasadność zgłoszenia.</w:t>
+      </w:r>
+    </w:p>
+    <w:p>
+      <w:pPr>
+        <w:spacing w:line="240" w:lineRule="auto"/>
+        <w:rPr>
+          <w:rFonts w:ascii="Times New Roman" w:eastAsia="Times New Roman" w:hAnsi="Times New Roman" w:cs="Times New Roman"/>
+          <w:color w:val="000000"/>
+          <w:sz w:val="24"/>
+          <w:szCs w:val="24"/>
+          <w:lang w:val="pl-PL"/>
+        </w:rPr>
+      </w:pPr>
+      <w:r>
+        <w:rPr>
+          <w:rFonts w:eastAsia="Times New Roman"/>
+          <w:b/>
+          <w:bCs/>
+          <w:color w:val="000000"/>
+          <w:lang w:val="pl-PL"/>
+        </w:rPr>
+        <w:t xml:space="preserve">Zaakceptowana: </w:t>
+      </w:r>
+      <w:r>
+        <w:rPr>
+          <w:rFonts w:eastAsia="Times New Roman"/>
+          <w:color w:val="000000"/>
+          <w:lang w:val="pl-PL"/>
+        </w:rPr>
+        <w:t>Stan końcowy,</w:t>
+      </w:r>
+      <w:r>
+        <w:rPr>
+          <w:rFonts w:eastAsia="Times New Roman"/>
+          <w:b/>
+          <w:bCs/>
+          <w:color w:val="000000"/>
+          <w:lang w:val="pl-PL"/>
+        </w:rPr>
+        <w:t xml:space="preserve"> </w:t>
+      </w:r>
+      <w:r>
+        <w:rPr>
+          <w:rFonts w:eastAsia="Times New Roman"/>
+          <w:color w:val="000000"/>
+          <w:lang w:val="pl-PL"/>
+        </w:rPr>
+        <w:t>decyzja pozytywna dla klienta prowadząca do zwrotu kosztów.</w:t>
+      </w:r>
+    </w:p>
+    <w:p>
+      <w:pPr>
+        <w:spacing w:line="240" w:lineRule="auto"/>
+        <w:rPr>
+          <w:rFonts w:ascii="Times New Roman" w:eastAsia="Times New Roman" w:hAnsi="Times New Roman" w:cs="Times New Roman"/>
+          <w:color w:val="000000"/>
+          <w:sz w:val="24"/>
+          <w:szCs w:val="24"/>
+          <w:lang w:val="pl-PL"/>
+        </w:rPr>
+      </w:pPr>
+      <w:r>
+        <w:rPr>
+          <w:rFonts w:eastAsia="Times New Roman"/>
+          <w:b/>
+          <w:bCs/>
+          <w:color w:val="000000"/>
+          <w:lang w:val="pl-PL"/>
+        </w:rPr>
+        <w:t xml:space="preserve">Odrzucona: </w:t>
+      </w:r>
+      <w:r>
+        <w:rPr>
+          <w:rFonts w:eastAsia="Times New Roman"/>
+          <w:color w:val="000000"/>
+          <w:lang w:val="pl-PL"/>
+        </w:rPr>
+        <w:t>Stan końcowy, decyzja negatywna dla klienta.</w:t>
+      </w:r>
+    </w:p>
+    <w:p>
+      <w:pPr>
+        <w:spacing w:after="240" w:line="240" w:lineRule="auto"/>
+        <w:rPr>
+          <w:rFonts w:ascii="Times New Roman" w:eastAsia="Times New Roman" w:hAnsi="Times New Roman" w:cs="Times New Roman"/>
+          <w:sz w:val="24"/>
+          <w:szCs w:val="24"/>
+          <w:lang w:val="pl-PL"/>
+        </w:rPr>
+      </w:pPr>
+    </w:p>
+    <w:p>
+      <w:pPr>
+        <w:spacing w:line="240" w:lineRule="auto"/>
+        <w:rPr>
+          <w:rFonts w:ascii="Times New Roman" w:eastAsia="Times New Roman" w:hAnsi="Times New Roman" w:cs="Times New Roman"/>
+          <w:sz w:val="24"/>
+          <w:szCs w:val="24"/>
+          <w:lang w:val="pl-PL"/>
+        </w:rPr>
+      </w:pPr>
+    </w:p>
+    <w:p>
+      <w:pPr>
+        <w:rPr>
+          <w:b/>
+          <w:bCs/>
+          <w:lang w:val="pl-PL"/>
+        </w:rPr>
+      </w:pPr>
     </w:p>
     <w:sectPr>
       <w:pgSz w:w="11909" w:h="16834"/>
@@ -1543,6 +2413,7 @@
   <w:style w:type="character" w:default="1" w:styleId="Domylnaczcionkaakapitu">
     <w:name w:val="Default Paragraph Font"/>
     <w:uiPriority w:val="1"/>
+    <w:semiHidden/>
     <w:unhideWhenUsed/>
   </w:style>
   <w:style w:type="table" w:default="1" w:styleId="Standardowy">
@@ -1616,6 +2487,23 @@
       <w:tblStyleRowBandSize w:val="1"/>
       <w:tblStyleColBandSize w:val="1"/>
     </w:tblPr>
+  </w:style>
+  <w:style w:type="paragraph" w:styleId="NormalnyWeb">
+    <w:name w:val="Normal (Web)"/>
+    <w:basedOn w:val="Normalny"/>
+    <w:uiPriority w:val="99"/>
+    <w:semiHidden/>
+    <w:unhideWhenUsed/>
+    <w:rsid w:val="00EA250B"/>
+    <w:pPr>
+      <w:spacing w:before="100" w:beforeAutospacing="1" w:after="100" w:afterAutospacing="1" w:line="240" w:lineRule="auto"/>
+    </w:pPr>
+    <w:rPr>
+      <w:rFonts w:ascii="Times New Roman" w:eastAsia="Times New Roman" w:hAnsi="Times New Roman" w:cs="Times New Roman"/>
+      <w:sz w:val="24"/>
+      <w:szCs w:val="24"/>
+      <w:lang w:val="pl-PL"/>
+    </w:rPr>
   </w:style>
 </w:styles>
 </file>

</xml_diff>

<commit_message>
Dodanie dokumentacji do podpunktu 2 i mała poprawka w podpunkcie 0
</commit_message>
<xml_diff>
--- a/TK/TK.docx
+++ b/TK/TK.docx
@@ -515,23 +515,1587 @@
     </w:p>
     <w:p>
       <w:pPr>
-        <w:rPr>
+        <w:jc w:val="both"/>
+      </w:pPr>
+    </w:p>
+    <w:p>
+      <w:pPr>
+        <w:pStyle w:val="NormalnyWeb"/>
+        <w:spacing w:before="0" w:beforeAutospacing="0" w:after="0" w:afterAutospacing="0"/>
+        <w:rPr>
+          <w:color w:val="000000"/>
+        </w:rPr>
+      </w:pPr>
+      <w:r>
+        <w:rPr>
+          <w:rFonts w:ascii="Arial" w:hAnsi="Arial" w:cs="Arial"/>
+          <w:b/>
+          <w:bCs/>
+          <w:color w:val="000000"/>
           <w:sz w:val="28"/>
           <w:szCs w:val="28"/>
         </w:rPr>
-      </w:pPr>
-    </w:p>
-    <w:p>
-      <w:pPr>
-        <w:rPr>
-          <w:b/>
-          <w:bCs/>
+        <w:t>2. Cel budowania systemu</w:t>
+      </w:r>
+    </w:p>
+    <w:p>
+      <w:pPr>
+        <w:pStyle w:val="NormalnyWeb"/>
+        <w:spacing w:before="0" w:beforeAutospacing="0" w:after="0" w:afterAutospacing="0"/>
+        <w:rPr>
+          <w:color w:val="000000"/>
+        </w:rPr>
+      </w:pPr>
+      <w:r>
+        <w:rPr>
+          <w:rFonts w:ascii="Arial" w:hAnsi="Arial" w:cs="Arial"/>
+          <w:b/>
+          <w:bCs/>
+          <w:color w:val="000000"/>
+        </w:rPr>
+        <w:t>Cel systemu</w:t>
+      </w:r>
+    </w:p>
+    <w:p>
+      <w:pPr>
+        <w:pStyle w:val="NormalnyWeb"/>
+        <w:spacing w:before="0" w:beforeAutospacing="0" w:after="0" w:afterAutospacing="0"/>
+        <w:jc w:val="both"/>
+        <w:rPr>
+          <w:color w:val="000000"/>
+        </w:rPr>
+      </w:pPr>
+      <w:r>
+        <w:rPr>
+          <w:rFonts w:ascii="Arial" w:hAnsi="Arial" w:cs="Arial"/>
+          <w:color w:val="000000"/>
+          <w:sz w:val="22"/>
+          <w:szCs w:val="22"/>
+        </w:rPr>
+        <w:t xml:space="preserve">Celem systemu jest stworzenie kompleksowego narzędzia informatycznego wspierającego zarządzanie menażerią chomików, obejmującego obsługę klientów, zarządzanie chomikami, proces leasingu oraz operacje administracyjne i weterynaryjne. Obsługuje on uporządkowanie danych o chomikach i klientach, automatyzację procesu </w:t>
+      </w:r>
+      <w:proofErr w:type="spellStart"/>
+      <w:r>
+        <w:rPr>
+          <w:rFonts w:ascii="Arial" w:hAnsi="Arial" w:cs="Arial"/>
+          <w:color w:val="000000"/>
+          <w:sz w:val="22"/>
+          <w:szCs w:val="22"/>
+        </w:rPr>
+        <w:t>wypożyczeń</w:t>
+      </w:r>
+      <w:proofErr w:type="spellEnd"/>
+      <w:r>
+        <w:rPr>
+          <w:rFonts w:ascii="Arial" w:hAnsi="Arial" w:cs="Arial"/>
+          <w:color w:val="000000"/>
+          <w:sz w:val="22"/>
+          <w:szCs w:val="22"/>
+        </w:rPr>
+        <w:t>, umożliwienie kontroli zdrowia i historii chomików, wspieranie pracowników w codziennych obowiązkach, a także dostarczenie Panu Zbigniewowi rzetelnych danych o kondycji finansowej i sukcesach wystawowych jego przedsięwzięcia. </w:t>
+      </w:r>
+    </w:p>
+    <w:p>
+      <w:pPr>
+        <w:rPr>
+          <w:color w:val="000000"/>
+        </w:rPr>
+      </w:pPr>
+    </w:p>
+    <w:p>
+      <w:pPr>
+        <w:pStyle w:val="NormalnyWeb"/>
+        <w:spacing w:before="0" w:beforeAutospacing="0" w:after="0" w:afterAutospacing="0"/>
+        <w:jc w:val="both"/>
+        <w:rPr>
+          <w:color w:val="000000"/>
+        </w:rPr>
+      </w:pPr>
+      <w:r>
+        <w:rPr>
+          <w:rFonts w:ascii="Arial" w:hAnsi="Arial" w:cs="Arial"/>
+          <w:b/>
+          <w:bCs/>
+          <w:color w:val="000000"/>
+        </w:rPr>
+        <w:t>Zakres systemu</w:t>
+      </w:r>
+    </w:p>
+    <w:p>
+      <w:pPr>
+        <w:pStyle w:val="NormalnyWeb"/>
+        <w:spacing w:before="0" w:beforeAutospacing="0" w:after="0" w:afterAutospacing="0"/>
+        <w:jc w:val="both"/>
+        <w:rPr>
+          <w:color w:val="000000"/>
+        </w:rPr>
+      </w:pPr>
+      <w:r>
+        <w:rPr>
+          <w:rFonts w:ascii="Arial" w:hAnsi="Arial" w:cs="Arial"/>
+          <w:color w:val="000000"/>
+          <w:sz w:val="22"/>
+          <w:szCs w:val="22"/>
+        </w:rPr>
+        <w:t>Dla klienta niezalogowanego system obejmuje:</w:t>
+      </w:r>
+    </w:p>
+    <w:p>
+      <w:pPr>
+        <w:pStyle w:val="NormalnyWeb"/>
+        <w:numPr>
+          <w:ilvl w:val="0"/>
+          <w:numId w:val="2"/>
+        </w:numPr>
+        <w:spacing w:before="0" w:beforeAutospacing="0" w:after="0" w:afterAutospacing="0"/>
+        <w:jc w:val="both"/>
+        <w:textAlignment w:val="baseline"/>
+        <w:rPr>
+          <w:rFonts w:ascii="Arial" w:hAnsi="Arial" w:cs="Arial"/>
+          <w:color w:val="000000"/>
+          <w:sz w:val="22"/>
+          <w:szCs w:val="22"/>
+        </w:rPr>
+      </w:pPr>
+      <w:r>
+        <w:rPr>
+          <w:rFonts w:ascii="Arial" w:hAnsi="Arial" w:cs="Arial"/>
+          <w:color w:val="000000"/>
+          <w:sz w:val="22"/>
+          <w:szCs w:val="22"/>
+        </w:rPr>
+        <w:t>przeglądanie informacji o menażerii</w:t>
+      </w:r>
+    </w:p>
+    <w:p>
+      <w:pPr>
+        <w:pStyle w:val="NormalnyWeb"/>
+        <w:numPr>
+          <w:ilvl w:val="0"/>
+          <w:numId w:val="2"/>
+        </w:numPr>
+        <w:spacing w:before="0" w:beforeAutospacing="0" w:after="0" w:afterAutospacing="0"/>
+        <w:jc w:val="both"/>
+        <w:textAlignment w:val="baseline"/>
+        <w:rPr>
+          <w:rFonts w:ascii="Arial" w:hAnsi="Arial" w:cs="Arial"/>
+          <w:color w:val="000000"/>
+          <w:sz w:val="22"/>
+          <w:szCs w:val="22"/>
+        </w:rPr>
+      </w:pPr>
+      <w:r>
+        <w:rPr>
+          <w:rFonts w:ascii="Arial" w:hAnsi="Arial" w:cs="Arial"/>
+          <w:color w:val="000000"/>
+          <w:sz w:val="22"/>
+          <w:szCs w:val="22"/>
+        </w:rPr>
+        <w:t>przegląd dostępnych chomików</w:t>
+      </w:r>
+    </w:p>
+    <w:p>
+      <w:pPr>
+        <w:pStyle w:val="NormalnyWeb"/>
+        <w:numPr>
+          <w:ilvl w:val="0"/>
+          <w:numId w:val="2"/>
+        </w:numPr>
+        <w:spacing w:before="0" w:beforeAutospacing="0" w:after="0" w:afterAutospacing="0"/>
+        <w:jc w:val="both"/>
+        <w:textAlignment w:val="baseline"/>
+        <w:rPr>
+          <w:rFonts w:ascii="Arial" w:hAnsi="Arial" w:cs="Arial"/>
+          <w:color w:val="000000"/>
+          <w:sz w:val="22"/>
+          <w:szCs w:val="22"/>
+        </w:rPr>
+      </w:pPr>
+      <w:r>
+        <w:rPr>
+          <w:rFonts w:ascii="Arial" w:hAnsi="Arial" w:cs="Arial"/>
+          <w:color w:val="000000"/>
+          <w:sz w:val="22"/>
+          <w:szCs w:val="22"/>
+        </w:rPr>
+        <w:t>rejestrację i logowanie </w:t>
+      </w:r>
+    </w:p>
+    <w:p>
+      <w:pPr>
+        <w:rPr>
+          <w:rFonts w:ascii="Times New Roman" w:hAnsi="Times New Roman" w:cs="Times New Roman"/>
+          <w:color w:val="000000"/>
+          <w:sz w:val="24"/>
+          <w:szCs w:val="24"/>
+        </w:rPr>
+      </w:pPr>
+    </w:p>
+    <w:p>
+      <w:pPr>
+        <w:pStyle w:val="NormalnyWeb"/>
+        <w:spacing w:before="0" w:beforeAutospacing="0" w:after="0" w:afterAutospacing="0"/>
+        <w:jc w:val="both"/>
+        <w:rPr>
+          <w:color w:val="000000"/>
+        </w:rPr>
+      </w:pPr>
+      <w:r>
+        <w:rPr>
+          <w:rFonts w:ascii="Arial" w:hAnsi="Arial" w:cs="Arial"/>
+          <w:color w:val="000000"/>
+          <w:sz w:val="22"/>
+          <w:szCs w:val="22"/>
+        </w:rPr>
+        <w:t>Dla klienta zalogowanego system obejmuje:</w:t>
+      </w:r>
+    </w:p>
+    <w:p>
+      <w:pPr>
+        <w:pStyle w:val="NormalnyWeb"/>
+        <w:numPr>
+          <w:ilvl w:val="0"/>
+          <w:numId w:val="3"/>
+        </w:numPr>
+        <w:spacing w:before="0" w:beforeAutospacing="0" w:after="0" w:afterAutospacing="0"/>
+        <w:jc w:val="both"/>
+        <w:textAlignment w:val="baseline"/>
+        <w:rPr>
+          <w:rFonts w:ascii="Arial" w:hAnsi="Arial" w:cs="Arial"/>
+          <w:color w:val="000000"/>
+          <w:sz w:val="22"/>
+          <w:szCs w:val="22"/>
+        </w:rPr>
+      </w:pPr>
+      <w:r>
+        <w:rPr>
+          <w:rFonts w:ascii="Arial" w:hAnsi="Arial" w:cs="Arial"/>
+          <w:color w:val="000000"/>
+          <w:sz w:val="22"/>
+          <w:szCs w:val="22"/>
+        </w:rPr>
+        <w:t>wybór cech chomika</w:t>
+      </w:r>
+    </w:p>
+    <w:p>
+      <w:pPr>
+        <w:pStyle w:val="NormalnyWeb"/>
+        <w:numPr>
+          <w:ilvl w:val="0"/>
+          <w:numId w:val="3"/>
+        </w:numPr>
+        <w:spacing w:before="0" w:beforeAutospacing="0" w:after="0" w:afterAutospacing="0"/>
+        <w:jc w:val="both"/>
+        <w:textAlignment w:val="baseline"/>
+        <w:rPr>
+          <w:rFonts w:ascii="Arial" w:hAnsi="Arial" w:cs="Arial"/>
+          <w:color w:val="000000"/>
+          <w:sz w:val="22"/>
+          <w:szCs w:val="22"/>
+        </w:rPr>
+      </w:pPr>
+      <w:r>
+        <w:rPr>
+          <w:rFonts w:ascii="Arial" w:hAnsi="Arial" w:cs="Arial"/>
+          <w:color w:val="000000"/>
+          <w:sz w:val="22"/>
+          <w:szCs w:val="22"/>
+        </w:rPr>
+        <w:t>sprawdzenie historii chorób chomika</w:t>
+      </w:r>
+    </w:p>
+    <w:p>
+      <w:pPr>
+        <w:pStyle w:val="NormalnyWeb"/>
+        <w:numPr>
+          <w:ilvl w:val="0"/>
+          <w:numId w:val="3"/>
+        </w:numPr>
+        <w:spacing w:before="0" w:beforeAutospacing="0" w:after="0" w:afterAutospacing="0"/>
+        <w:jc w:val="both"/>
+        <w:textAlignment w:val="baseline"/>
+        <w:rPr>
+          <w:rFonts w:ascii="Arial" w:hAnsi="Arial" w:cs="Arial"/>
+          <w:color w:val="000000"/>
+          <w:sz w:val="22"/>
+          <w:szCs w:val="22"/>
+        </w:rPr>
+      </w:pPr>
+      <w:r>
+        <w:rPr>
+          <w:rFonts w:ascii="Arial" w:hAnsi="Arial" w:cs="Arial"/>
+          <w:color w:val="000000"/>
+          <w:sz w:val="22"/>
+          <w:szCs w:val="22"/>
+        </w:rPr>
+        <w:t>składanie wniosku o wypożyczenie chomika</w:t>
+      </w:r>
+    </w:p>
+    <w:p>
+      <w:pPr>
+        <w:pStyle w:val="NormalnyWeb"/>
+        <w:numPr>
+          <w:ilvl w:val="0"/>
+          <w:numId w:val="3"/>
+        </w:numPr>
+        <w:spacing w:before="0" w:beforeAutospacing="0" w:after="0" w:afterAutospacing="0"/>
+        <w:jc w:val="both"/>
+        <w:textAlignment w:val="baseline"/>
+        <w:rPr>
+          <w:rFonts w:ascii="Arial" w:hAnsi="Arial" w:cs="Arial"/>
+          <w:color w:val="000000"/>
+          <w:sz w:val="22"/>
+          <w:szCs w:val="22"/>
+        </w:rPr>
+      </w:pPr>
+      <w:r>
+        <w:rPr>
+          <w:rFonts w:ascii="Arial" w:hAnsi="Arial" w:cs="Arial"/>
+          <w:color w:val="000000"/>
+          <w:sz w:val="22"/>
+          <w:szCs w:val="22"/>
+        </w:rPr>
+        <w:t>anulowanie wniosek o leasing </w:t>
+      </w:r>
+    </w:p>
+    <w:p>
+      <w:pPr>
+        <w:pStyle w:val="NormalnyWeb"/>
+        <w:numPr>
+          <w:ilvl w:val="0"/>
+          <w:numId w:val="3"/>
+        </w:numPr>
+        <w:spacing w:before="0" w:beforeAutospacing="0" w:after="0" w:afterAutospacing="0"/>
+        <w:jc w:val="both"/>
+        <w:textAlignment w:val="baseline"/>
+        <w:rPr>
+          <w:rFonts w:ascii="Arial" w:hAnsi="Arial" w:cs="Arial"/>
+          <w:color w:val="000000"/>
+          <w:sz w:val="22"/>
+          <w:szCs w:val="22"/>
+        </w:rPr>
+      </w:pPr>
+      <w:r>
+        <w:rPr>
+          <w:rFonts w:ascii="Arial" w:hAnsi="Arial" w:cs="Arial"/>
+          <w:color w:val="000000"/>
+          <w:sz w:val="22"/>
+          <w:szCs w:val="22"/>
+        </w:rPr>
+        <w:t>składanie reklamacji </w:t>
+      </w:r>
+    </w:p>
+    <w:p>
+      <w:pPr>
+        <w:rPr>
+          <w:rFonts w:ascii="Times New Roman" w:hAnsi="Times New Roman" w:cs="Times New Roman"/>
+          <w:color w:val="000000"/>
+          <w:sz w:val="24"/>
+          <w:szCs w:val="24"/>
+        </w:rPr>
+      </w:pPr>
+    </w:p>
+    <w:p>
+      <w:pPr>
+        <w:pStyle w:val="NormalnyWeb"/>
+        <w:spacing w:before="0" w:beforeAutospacing="0" w:after="0" w:afterAutospacing="0"/>
+        <w:jc w:val="both"/>
+        <w:rPr>
+          <w:color w:val="000000"/>
+        </w:rPr>
+      </w:pPr>
+      <w:r>
+        <w:rPr>
+          <w:rFonts w:ascii="Arial" w:hAnsi="Arial" w:cs="Arial"/>
+          <w:color w:val="000000"/>
+          <w:sz w:val="22"/>
+          <w:szCs w:val="22"/>
+        </w:rPr>
+        <w:t>Dla administratora system obejmuje:</w:t>
+      </w:r>
+    </w:p>
+    <w:p>
+      <w:pPr>
+        <w:pStyle w:val="NormalnyWeb"/>
+        <w:numPr>
+          <w:ilvl w:val="0"/>
+          <w:numId w:val="4"/>
+        </w:numPr>
+        <w:spacing w:before="0" w:beforeAutospacing="0" w:after="0" w:afterAutospacing="0"/>
+        <w:jc w:val="both"/>
+        <w:textAlignment w:val="baseline"/>
+        <w:rPr>
+          <w:rFonts w:ascii="Arial" w:hAnsi="Arial" w:cs="Arial"/>
+          <w:color w:val="000000"/>
+          <w:sz w:val="22"/>
+          <w:szCs w:val="22"/>
+        </w:rPr>
+      </w:pPr>
+      <w:r>
+        <w:rPr>
+          <w:rFonts w:ascii="Arial" w:hAnsi="Arial" w:cs="Arial"/>
+          <w:color w:val="000000"/>
+          <w:sz w:val="22"/>
+          <w:szCs w:val="22"/>
+        </w:rPr>
+        <w:t>dodawanie, usuwanie i edycja chomików</w:t>
+      </w:r>
+    </w:p>
+    <w:p>
+      <w:pPr>
+        <w:pStyle w:val="NormalnyWeb"/>
+        <w:numPr>
+          <w:ilvl w:val="0"/>
+          <w:numId w:val="4"/>
+        </w:numPr>
+        <w:spacing w:before="0" w:beforeAutospacing="0" w:after="0" w:afterAutospacing="0"/>
+        <w:jc w:val="both"/>
+        <w:textAlignment w:val="baseline"/>
+        <w:rPr>
+          <w:rFonts w:ascii="Arial" w:hAnsi="Arial" w:cs="Arial"/>
+          <w:color w:val="000000"/>
+          <w:sz w:val="22"/>
+          <w:szCs w:val="22"/>
+        </w:rPr>
+      </w:pPr>
+      <w:r>
+        <w:rPr>
+          <w:rFonts w:ascii="Arial" w:hAnsi="Arial" w:cs="Arial"/>
+          <w:color w:val="000000"/>
+          <w:sz w:val="22"/>
+          <w:szCs w:val="22"/>
+        </w:rPr>
+        <w:t>zarządzanie leasingiem</w:t>
+      </w:r>
+    </w:p>
+    <w:p>
+      <w:pPr>
+        <w:pStyle w:val="NormalnyWeb"/>
+        <w:numPr>
+          <w:ilvl w:val="0"/>
+          <w:numId w:val="4"/>
+        </w:numPr>
+        <w:spacing w:before="0" w:beforeAutospacing="0" w:after="0" w:afterAutospacing="0"/>
+        <w:jc w:val="both"/>
+        <w:textAlignment w:val="baseline"/>
+        <w:rPr>
+          <w:rFonts w:ascii="Arial" w:hAnsi="Arial" w:cs="Arial"/>
+          <w:color w:val="000000"/>
+          <w:sz w:val="22"/>
+          <w:szCs w:val="22"/>
+        </w:rPr>
+      </w:pPr>
+      <w:r>
+        <w:rPr>
+          <w:rFonts w:ascii="Arial" w:hAnsi="Arial" w:cs="Arial"/>
+          <w:color w:val="000000"/>
+          <w:sz w:val="22"/>
+          <w:szCs w:val="22"/>
+        </w:rPr>
+        <w:t>rejestrowanie rozmnażania </w:t>
+      </w:r>
+    </w:p>
+    <w:p>
+      <w:pPr>
+        <w:pStyle w:val="NormalnyWeb"/>
+        <w:numPr>
+          <w:ilvl w:val="0"/>
+          <w:numId w:val="4"/>
+        </w:numPr>
+        <w:spacing w:before="0" w:beforeAutospacing="0" w:after="0" w:afterAutospacing="0"/>
+        <w:jc w:val="both"/>
+        <w:textAlignment w:val="baseline"/>
+        <w:rPr>
+          <w:rFonts w:ascii="Arial" w:hAnsi="Arial" w:cs="Arial"/>
+          <w:color w:val="000000"/>
+          <w:sz w:val="22"/>
+          <w:szCs w:val="22"/>
+        </w:rPr>
+      </w:pPr>
+      <w:r>
+        <w:rPr>
+          <w:rFonts w:ascii="Arial" w:hAnsi="Arial" w:cs="Arial"/>
+          <w:color w:val="000000"/>
+          <w:sz w:val="22"/>
+          <w:szCs w:val="22"/>
+        </w:rPr>
+        <w:t>zgłaszanie chomików na wystawy</w:t>
+      </w:r>
+    </w:p>
+    <w:p>
+      <w:pPr>
+        <w:pStyle w:val="NormalnyWeb"/>
+        <w:numPr>
+          <w:ilvl w:val="0"/>
+          <w:numId w:val="4"/>
+        </w:numPr>
+        <w:spacing w:before="0" w:beforeAutospacing="0" w:after="0" w:afterAutospacing="0"/>
+        <w:jc w:val="both"/>
+        <w:textAlignment w:val="baseline"/>
+        <w:rPr>
+          <w:rFonts w:ascii="Arial" w:hAnsi="Arial" w:cs="Arial"/>
+          <w:color w:val="000000"/>
+          <w:sz w:val="22"/>
+          <w:szCs w:val="22"/>
+        </w:rPr>
+      </w:pPr>
+      <w:r>
+        <w:rPr>
+          <w:rFonts w:ascii="Arial" w:hAnsi="Arial" w:cs="Arial"/>
+          <w:color w:val="000000"/>
+          <w:sz w:val="22"/>
+          <w:szCs w:val="22"/>
+        </w:rPr>
+        <w:t>zarządzanie systemem</w:t>
+      </w:r>
+    </w:p>
+    <w:p>
+      <w:pPr>
+        <w:rPr>
+          <w:rFonts w:ascii="Times New Roman" w:hAnsi="Times New Roman" w:cs="Times New Roman"/>
+          <w:color w:val="000000"/>
+          <w:sz w:val="24"/>
+          <w:szCs w:val="24"/>
+        </w:rPr>
+      </w:pPr>
+    </w:p>
+    <w:p>
+      <w:pPr>
+        <w:pStyle w:val="NormalnyWeb"/>
+        <w:spacing w:before="0" w:beforeAutospacing="0" w:after="0" w:afterAutospacing="0"/>
+        <w:jc w:val="both"/>
+        <w:rPr>
+          <w:color w:val="000000"/>
+        </w:rPr>
+      </w:pPr>
+      <w:r>
+        <w:rPr>
+          <w:rFonts w:ascii="Arial" w:hAnsi="Arial" w:cs="Arial"/>
+          <w:color w:val="000000"/>
+          <w:sz w:val="22"/>
+          <w:szCs w:val="22"/>
+        </w:rPr>
+        <w:t>Dla weterynarza system obejmuje:</w:t>
+      </w:r>
+    </w:p>
+    <w:p>
+      <w:pPr>
+        <w:pStyle w:val="NormalnyWeb"/>
+        <w:numPr>
+          <w:ilvl w:val="0"/>
+          <w:numId w:val="5"/>
+        </w:numPr>
+        <w:spacing w:before="0" w:beforeAutospacing="0" w:after="0" w:afterAutospacing="0"/>
+        <w:jc w:val="both"/>
+        <w:textAlignment w:val="baseline"/>
+        <w:rPr>
+          <w:rFonts w:ascii="Arial" w:hAnsi="Arial" w:cs="Arial"/>
+          <w:color w:val="000000"/>
+          <w:sz w:val="22"/>
+          <w:szCs w:val="22"/>
+        </w:rPr>
+      </w:pPr>
+      <w:r>
+        <w:rPr>
+          <w:rFonts w:ascii="Arial" w:hAnsi="Arial" w:cs="Arial"/>
+          <w:color w:val="000000"/>
+          <w:sz w:val="22"/>
+          <w:szCs w:val="22"/>
+        </w:rPr>
+        <w:t>tworzenie harmonogramów karmienia i sprzątania</w:t>
+      </w:r>
+    </w:p>
+    <w:p>
+      <w:pPr>
+        <w:pStyle w:val="NormalnyWeb"/>
+        <w:numPr>
+          <w:ilvl w:val="0"/>
+          <w:numId w:val="5"/>
+        </w:numPr>
+        <w:spacing w:before="0" w:beforeAutospacing="0" w:after="0" w:afterAutospacing="0"/>
+        <w:jc w:val="both"/>
+        <w:textAlignment w:val="baseline"/>
+        <w:rPr>
+          <w:rFonts w:ascii="Arial" w:hAnsi="Arial" w:cs="Arial"/>
+          <w:color w:val="000000"/>
+          <w:sz w:val="22"/>
+          <w:szCs w:val="22"/>
+        </w:rPr>
+      </w:pPr>
+      <w:r>
+        <w:rPr>
+          <w:rFonts w:ascii="Arial" w:hAnsi="Arial" w:cs="Arial"/>
+          <w:color w:val="000000"/>
+          <w:sz w:val="22"/>
+          <w:szCs w:val="22"/>
+        </w:rPr>
+        <w:t>prowadzenie dokumentacji leczenia</w:t>
+      </w:r>
+    </w:p>
+    <w:p>
+      <w:pPr>
+        <w:rPr>
+          <w:rFonts w:ascii="Times New Roman" w:hAnsi="Times New Roman" w:cs="Times New Roman"/>
+          <w:color w:val="000000"/>
+          <w:sz w:val="24"/>
+          <w:szCs w:val="24"/>
+        </w:rPr>
+      </w:pPr>
+    </w:p>
+    <w:p>
+      <w:pPr>
+        <w:pStyle w:val="NormalnyWeb"/>
+        <w:spacing w:before="0" w:beforeAutospacing="0" w:after="0" w:afterAutospacing="0"/>
+        <w:jc w:val="both"/>
+        <w:rPr>
+          <w:color w:val="000000"/>
+        </w:rPr>
+      </w:pPr>
+      <w:r>
+        <w:rPr>
+          <w:rFonts w:ascii="Arial" w:hAnsi="Arial" w:cs="Arial"/>
+          <w:color w:val="000000"/>
+          <w:sz w:val="22"/>
+          <w:szCs w:val="22"/>
+        </w:rPr>
+        <w:t>Dla pracownika system obejmuje:</w:t>
+      </w:r>
+    </w:p>
+    <w:p>
+      <w:pPr>
+        <w:pStyle w:val="NormalnyWeb"/>
+        <w:numPr>
+          <w:ilvl w:val="0"/>
+          <w:numId w:val="6"/>
+        </w:numPr>
+        <w:spacing w:before="0" w:beforeAutospacing="0" w:after="0" w:afterAutospacing="0"/>
+        <w:jc w:val="both"/>
+        <w:textAlignment w:val="baseline"/>
+        <w:rPr>
+          <w:rFonts w:ascii="Arial" w:hAnsi="Arial" w:cs="Arial"/>
+          <w:color w:val="000000"/>
+          <w:sz w:val="22"/>
+          <w:szCs w:val="22"/>
+        </w:rPr>
+      </w:pPr>
+      <w:r>
+        <w:rPr>
+          <w:rFonts w:ascii="Arial" w:hAnsi="Arial" w:cs="Arial"/>
+          <w:color w:val="000000"/>
+          <w:sz w:val="22"/>
+          <w:szCs w:val="22"/>
+        </w:rPr>
+        <w:t>odnotowanie karmienia chomików i sprzątania klatek</w:t>
+      </w:r>
+    </w:p>
+    <w:p>
+      <w:pPr>
+        <w:rPr>
+          <w:rFonts w:ascii="Times New Roman" w:hAnsi="Times New Roman" w:cs="Times New Roman"/>
+          <w:color w:val="000000"/>
+          <w:sz w:val="24"/>
+          <w:szCs w:val="24"/>
+        </w:rPr>
+      </w:pPr>
+    </w:p>
+    <w:p>
+      <w:pPr>
+        <w:pStyle w:val="NormalnyWeb"/>
+        <w:spacing w:before="0" w:beforeAutospacing="0" w:after="0" w:afterAutospacing="0"/>
+        <w:jc w:val="both"/>
+        <w:rPr>
+          <w:color w:val="000000"/>
+        </w:rPr>
+      </w:pPr>
+      <w:r>
+        <w:rPr>
+          <w:rFonts w:ascii="Arial" w:hAnsi="Arial" w:cs="Arial"/>
+          <w:color w:val="000000"/>
+          <w:sz w:val="22"/>
+          <w:szCs w:val="22"/>
+        </w:rPr>
+        <w:t>Dla pracownika analitycznego system obejmuje:</w:t>
+      </w:r>
+    </w:p>
+    <w:p>
+      <w:pPr>
+        <w:pStyle w:val="NormalnyWeb"/>
+        <w:numPr>
+          <w:ilvl w:val="0"/>
+          <w:numId w:val="7"/>
+        </w:numPr>
+        <w:spacing w:before="0" w:beforeAutospacing="0" w:after="0" w:afterAutospacing="0"/>
+        <w:jc w:val="both"/>
+        <w:textAlignment w:val="baseline"/>
+        <w:rPr>
+          <w:rFonts w:ascii="Arial" w:hAnsi="Arial" w:cs="Arial"/>
+          <w:color w:val="000000"/>
+          <w:sz w:val="22"/>
+          <w:szCs w:val="22"/>
+        </w:rPr>
+      </w:pPr>
+      <w:r>
+        <w:rPr>
+          <w:rFonts w:ascii="Arial" w:hAnsi="Arial" w:cs="Arial"/>
+          <w:color w:val="000000"/>
+          <w:sz w:val="22"/>
+          <w:szCs w:val="22"/>
+        </w:rPr>
+        <w:t>generowanie raportów </w:t>
+      </w:r>
+    </w:p>
+    <w:p>
+      <w:pPr>
+        <w:spacing w:after="240"/>
+        <w:rPr>
+          <w:rFonts w:ascii="Times New Roman" w:hAnsi="Times New Roman" w:cs="Times New Roman"/>
+          <w:color w:val="000000"/>
+          <w:sz w:val="24"/>
+          <w:szCs w:val="24"/>
+        </w:rPr>
+      </w:pPr>
+    </w:p>
+    <w:p>
+      <w:pPr>
+        <w:pStyle w:val="NormalnyWeb"/>
+        <w:spacing w:before="0" w:beforeAutospacing="0" w:after="0" w:afterAutospacing="0"/>
+        <w:rPr>
+          <w:color w:val="000000"/>
+        </w:rPr>
+      </w:pPr>
+      <w:r>
+        <w:rPr>
+          <w:rFonts w:ascii="Arial" w:hAnsi="Arial" w:cs="Arial"/>
+          <w:b/>
+          <w:bCs/>
+          <w:color w:val="000000"/>
+        </w:rPr>
+        <w:t>Kontekst systemu</w:t>
+      </w:r>
+    </w:p>
+    <w:p>
+      <w:pPr>
+        <w:pStyle w:val="NormalnyWeb"/>
+        <w:spacing w:before="0" w:beforeAutospacing="0" w:after="0" w:afterAutospacing="0"/>
+        <w:rPr>
+          <w:color w:val="000000"/>
+        </w:rPr>
+      </w:pPr>
+      <w:r>
+        <w:rPr>
+          <w:rFonts w:ascii="Arial" w:hAnsi="Arial" w:cs="Arial"/>
+          <w:color w:val="000000"/>
+          <w:sz w:val="22"/>
+          <w:szCs w:val="22"/>
+        </w:rPr>
+        <w:lastRenderedPageBreak/>
+        <w:t>System funkcjonuje jako aplikacja webowa, dostępna z poziomu przeglądarki internetowej. Pozwala to na swobodny przepływ informacji między pracownikami a biurem Pana Zbigniewa. </w:t>
+      </w:r>
+    </w:p>
+    <w:p>
+      <w:pPr>
+        <w:pStyle w:val="NormalnyWeb"/>
+        <w:numPr>
+          <w:ilvl w:val="0"/>
+          <w:numId w:val="8"/>
+        </w:numPr>
+        <w:spacing w:before="0" w:beforeAutospacing="0" w:after="0" w:afterAutospacing="0"/>
+        <w:textAlignment w:val="baseline"/>
+        <w:rPr>
+          <w:rFonts w:ascii="Arial" w:hAnsi="Arial" w:cs="Arial"/>
+          <w:color w:val="000000"/>
+          <w:sz w:val="22"/>
+          <w:szCs w:val="22"/>
+        </w:rPr>
+      </w:pPr>
+      <w:r>
+        <w:rPr>
+          <w:rFonts w:ascii="Arial" w:hAnsi="Arial" w:cs="Arial"/>
+          <w:b/>
+          <w:bCs/>
+          <w:color w:val="000000"/>
+          <w:sz w:val="22"/>
+          <w:szCs w:val="22"/>
+        </w:rPr>
+        <w:t>Infrastruktura i dostępność:</w:t>
+      </w:r>
+      <w:r>
+        <w:rPr>
+          <w:rFonts w:ascii="Arial" w:hAnsi="Arial" w:cs="Arial"/>
+          <w:color w:val="000000"/>
+          <w:sz w:val="22"/>
+          <w:szCs w:val="22"/>
+        </w:rPr>
+        <w:t xml:space="preserve"> System osadzony na serwerze webowym (</w:t>
+      </w:r>
+      <w:proofErr w:type="spellStart"/>
+      <w:r>
+        <w:rPr>
+          <w:rFonts w:ascii="Arial" w:hAnsi="Arial" w:cs="Arial"/>
+          <w:color w:val="000000"/>
+          <w:sz w:val="22"/>
+          <w:szCs w:val="22"/>
+        </w:rPr>
+        <w:t>frontend</w:t>
+      </w:r>
+      <w:proofErr w:type="spellEnd"/>
+      <w:r>
+        <w:rPr>
+          <w:rFonts w:ascii="Arial" w:hAnsi="Arial" w:cs="Arial"/>
+          <w:color w:val="000000"/>
+          <w:sz w:val="22"/>
+          <w:szCs w:val="22"/>
+        </w:rPr>
+        <w:t xml:space="preserve">), serwerze </w:t>
+      </w:r>
+      <w:proofErr w:type="spellStart"/>
+      <w:r>
+        <w:rPr>
+          <w:rFonts w:ascii="Arial" w:hAnsi="Arial" w:cs="Arial"/>
+          <w:color w:val="000000"/>
+          <w:sz w:val="22"/>
+          <w:szCs w:val="22"/>
+        </w:rPr>
+        <w:t>api</w:t>
+      </w:r>
+      <w:proofErr w:type="spellEnd"/>
+      <w:r>
+        <w:rPr>
+          <w:rFonts w:ascii="Arial" w:hAnsi="Arial" w:cs="Arial"/>
+          <w:color w:val="000000"/>
+          <w:sz w:val="22"/>
+          <w:szCs w:val="22"/>
+        </w:rPr>
+        <w:t xml:space="preserve"> (</w:t>
+      </w:r>
+      <w:proofErr w:type="spellStart"/>
+      <w:r>
+        <w:rPr>
+          <w:rFonts w:ascii="Arial" w:hAnsi="Arial" w:cs="Arial"/>
+          <w:color w:val="000000"/>
+          <w:sz w:val="22"/>
+          <w:szCs w:val="22"/>
+        </w:rPr>
+        <w:t>backend</w:t>
+      </w:r>
+      <w:proofErr w:type="spellEnd"/>
+      <w:r>
+        <w:rPr>
+          <w:rFonts w:ascii="Arial" w:hAnsi="Arial" w:cs="Arial"/>
+          <w:color w:val="000000"/>
+          <w:sz w:val="22"/>
+          <w:szCs w:val="22"/>
+        </w:rPr>
+        <w:t>) oraz serwerze z bazą danych, co zapewnia dostęp 24/7 dla klientów chcących przejrzeć ofertę leasingu, niezależnie od godzin pracy menażerii. </w:t>
+      </w:r>
+    </w:p>
+    <w:p>
+      <w:pPr>
+        <w:pStyle w:val="NormalnyWeb"/>
+        <w:numPr>
+          <w:ilvl w:val="0"/>
+          <w:numId w:val="8"/>
+        </w:numPr>
+        <w:spacing w:before="0" w:beforeAutospacing="0" w:after="0" w:afterAutospacing="0"/>
+        <w:textAlignment w:val="baseline"/>
+        <w:rPr>
+          <w:rFonts w:ascii="Arial" w:hAnsi="Arial" w:cs="Arial"/>
+          <w:color w:val="000000"/>
+          <w:sz w:val="22"/>
+          <w:szCs w:val="22"/>
+        </w:rPr>
+      </w:pPr>
+      <w:r>
+        <w:rPr>
+          <w:rFonts w:ascii="Arial" w:hAnsi="Arial" w:cs="Arial"/>
+          <w:b/>
+          <w:bCs/>
+          <w:color w:val="000000"/>
+          <w:sz w:val="22"/>
+          <w:szCs w:val="22"/>
+        </w:rPr>
+        <w:t>Interakcja użytkowników:</w:t>
+      </w:r>
+      <w:r>
+        <w:rPr>
+          <w:rFonts w:ascii="Arial" w:hAnsi="Arial" w:cs="Arial"/>
+          <w:color w:val="000000"/>
+          <w:sz w:val="22"/>
+          <w:szCs w:val="22"/>
+        </w:rPr>
+        <w:t xml:space="preserve"> Zakłada wielodostępność w tym samym czasie klient może zarezerwować chomika przez </w:t>
+      </w:r>
+      <w:proofErr w:type="spellStart"/>
+      <w:r>
+        <w:rPr>
+          <w:rFonts w:ascii="Arial" w:hAnsi="Arial" w:cs="Arial"/>
+          <w:color w:val="000000"/>
+          <w:sz w:val="22"/>
+          <w:szCs w:val="22"/>
+        </w:rPr>
+        <w:t>smartfona</w:t>
+      </w:r>
+      <w:proofErr w:type="spellEnd"/>
+      <w:r>
+        <w:rPr>
+          <w:rFonts w:ascii="Arial" w:hAnsi="Arial" w:cs="Arial"/>
+          <w:color w:val="000000"/>
+          <w:sz w:val="22"/>
+          <w:szCs w:val="22"/>
+        </w:rPr>
+        <w:t>, a weterynarz na tablecie może stworzyć grafik karmienia. </w:t>
+      </w:r>
+    </w:p>
+    <w:p>
+      <w:pPr>
+        <w:pStyle w:val="NormalnyWeb"/>
+        <w:numPr>
+          <w:ilvl w:val="0"/>
+          <w:numId w:val="8"/>
+        </w:numPr>
+        <w:spacing w:before="0" w:beforeAutospacing="0" w:after="0" w:afterAutospacing="0"/>
+        <w:textAlignment w:val="baseline"/>
+        <w:rPr>
+          <w:rFonts w:ascii="Arial" w:hAnsi="Arial" w:cs="Arial"/>
+          <w:color w:val="000000"/>
+          <w:sz w:val="22"/>
+          <w:szCs w:val="22"/>
+        </w:rPr>
+      </w:pPr>
+      <w:r>
+        <w:rPr>
+          <w:rFonts w:ascii="Arial" w:hAnsi="Arial" w:cs="Arial"/>
+          <w:b/>
+          <w:bCs/>
+          <w:color w:val="000000"/>
+          <w:sz w:val="22"/>
+          <w:szCs w:val="22"/>
+        </w:rPr>
+        <w:t>Bezpieczeństwo i role:</w:t>
+      </w:r>
+      <w:r>
+        <w:rPr>
+          <w:rFonts w:ascii="Arial" w:hAnsi="Arial" w:cs="Arial"/>
+          <w:color w:val="000000"/>
+          <w:sz w:val="22"/>
+          <w:szCs w:val="22"/>
+        </w:rPr>
+        <w:t xml:space="preserve"> System rozdziela uprawnienia zgodnie z rolami (Gość, Klient, Weterynarz, Administrator, Analityk, Pracownik), dbając o bezpieczeństwo danych osobowych i historii medycznej zwierząt. </w:t>
+      </w:r>
+    </w:p>
+    <w:p>
+      <w:pPr>
+        <w:pStyle w:val="NormalnyWeb"/>
+        <w:numPr>
+          <w:ilvl w:val="0"/>
+          <w:numId w:val="8"/>
+        </w:numPr>
+        <w:spacing w:before="0" w:beforeAutospacing="0" w:after="0" w:afterAutospacing="0"/>
+        <w:textAlignment w:val="baseline"/>
+        <w:rPr>
+          <w:rFonts w:ascii="Arial" w:hAnsi="Arial" w:cs="Arial"/>
+          <w:color w:val="000000"/>
+          <w:sz w:val="22"/>
+          <w:szCs w:val="22"/>
+        </w:rPr>
+      </w:pPr>
+      <w:r>
+        <w:rPr>
+          <w:rFonts w:ascii="Arial" w:hAnsi="Arial" w:cs="Arial"/>
+          <w:b/>
+          <w:bCs/>
+          <w:color w:val="000000"/>
+          <w:sz w:val="22"/>
+          <w:szCs w:val="22"/>
+        </w:rPr>
+        <w:t>Szybkość ładowania danych:</w:t>
+      </w:r>
+      <w:r>
+        <w:rPr>
+          <w:rFonts w:ascii="Arial" w:hAnsi="Arial" w:cs="Arial"/>
+          <w:color w:val="000000"/>
+          <w:sz w:val="22"/>
+          <w:szCs w:val="22"/>
+        </w:rPr>
+        <w:t xml:space="preserve"> Skrócenie czasu generowania raportów dla pracownika operacyjnego dzięki zoptymalizowanej bazie danych (np. raport w &lt; 2 sekundy). </w:t>
+      </w:r>
+    </w:p>
+    <w:p>
+      <w:pPr>
+        <w:rPr>
+          <w:rFonts w:ascii="Times New Roman" w:hAnsi="Times New Roman" w:cs="Times New Roman"/>
+          <w:color w:val="000000"/>
+          <w:sz w:val="24"/>
+          <w:szCs w:val="24"/>
+        </w:rPr>
+      </w:pPr>
+    </w:p>
+    <w:p>
+      <w:pPr>
+        <w:pStyle w:val="NormalnyWeb"/>
+        <w:spacing w:before="0" w:beforeAutospacing="0" w:after="0" w:afterAutospacing="0"/>
+        <w:rPr>
+          <w:color w:val="000000"/>
+        </w:rPr>
+      </w:pPr>
+      <w:r>
+        <w:rPr>
+          <w:rFonts w:ascii="Arial" w:hAnsi="Arial" w:cs="Arial"/>
+          <w:b/>
+          <w:bCs/>
+          <w:color w:val="000000"/>
+        </w:rPr>
+        <w:t>Korzyści z wdrożenia</w:t>
+      </w:r>
+    </w:p>
+    <w:p>
+      <w:pPr>
+        <w:pStyle w:val="NormalnyWeb"/>
+        <w:spacing w:before="0" w:beforeAutospacing="0" w:after="0" w:afterAutospacing="0"/>
+        <w:rPr>
+          <w:color w:val="000000"/>
+        </w:rPr>
+      </w:pPr>
+      <w:r>
+        <w:rPr>
+          <w:rFonts w:ascii="Arial" w:hAnsi="Arial" w:cs="Arial"/>
+          <w:color w:val="000000"/>
+          <w:sz w:val="22"/>
+          <w:szCs w:val="22"/>
+        </w:rPr>
+        <w:t>Mierzalne (Wartości oszacowano na podstawie porównania procesu wykonywanego ręcznie z procesem realizowanym przez system informatyczny):</w:t>
+      </w:r>
+    </w:p>
+    <w:p>
+      <w:pPr>
+        <w:pStyle w:val="NormalnyWeb"/>
+        <w:numPr>
+          <w:ilvl w:val="0"/>
+          <w:numId w:val="9"/>
+        </w:numPr>
+        <w:spacing w:before="0" w:beforeAutospacing="0" w:after="0" w:afterAutospacing="0"/>
+        <w:textAlignment w:val="baseline"/>
+        <w:rPr>
+          <w:rFonts w:ascii="Arial" w:hAnsi="Arial" w:cs="Arial"/>
+          <w:color w:val="000000"/>
+          <w:sz w:val="22"/>
+          <w:szCs w:val="22"/>
+        </w:rPr>
+      </w:pPr>
+      <w:r>
+        <w:rPr>
+          <w:rFonts w:ascii="Arial" w:hAnsi="Arial" w:cs="Arial"/>
+          <w:b/>
+          <w:bCs/>
+          <w:color w:val="000000"/>
+          <w:sz w:val="22"/>
+          <w:szCs w:val="22"/>
+        </w:rPr>
+        <w:t xml:space="preserve">Skrócenie czasu obsługi klienta: </w:t>
+      </w:r>
+      <w:r>
+        <w:rPr>
+          <w:rFonts w:ascii="Arial" w:hAnsi="Arial" w:cs="Arial"/>
+          <w:color w:val="000000"/>
+          <w:sz w:val="22"/>
+          <w:szCs w:val="22"/>
+        </w:rPr>
+        <w:t>Czas potrzebny na złożenie wniosku o leasing zostaje skrócony</w:t>
+      </w:r>
+      <w:r>
+        <w:rPr>
+          <w:rFonts w:ascii="Arial" w:hAnsi="Arial" w:cs="Arial"/>
+          <w:b/>
+          <w:bCs/>
+          <w:color w:val="000000"/>
+          <w:sz w:val="22"/>
+          <w:szCs w:val="22"/>
+        </w:rPr>
+        <w:t xml:space="preserve"> </w:t>
+      </w:r>
+      <w:r>
+        <w:rPr>
+          <w:rFonts w:ascii="Arial" w:hAnsi="Arial" w:cs="Arial"/>
+          <w:color w:val="000000"/>
+          <w:sz w:val="22"/>
+          <w:szCs w:val="22"/>
+        </w:rPr>
+        <w:t>o około 60% (z około 5 minut do około 2 minut).</w:t>
+      </w:r>
+    </w:p>
+    <w:p>
+      <w:pPr>
+        <w:pStyle w:val="NormalnyWeb"/>
+        <w:numPr>
+          <w:ilvl w:val="0"/>
+          <w:numId w:val="9"/>
+        </w:numPr>
+        <w:spacing w:before="0" w:beforeAutospacing="0" w:after="0" w:afterAutospacing="0"/>
+        <w:textAlignment w:val="baseline"/>
+        <w:rPr>
+          <w:rFonts w:ascii="Arial" w:hAnsi="Arial" w:cs="Arial"/>
+          <w:color w:val="000000"/>
+          <w:sz w:val="22"/>
+          <w:szCs w:val="22"/>
+        </w:rPr>
+      </w:pPr>
+      <w:r>
+        <w:rPr>
+          <w:rFonts w:ascii="Arial" w:hAnsi="Arial" w:cs="Arial"/>
+          <w:b/>
+          <w:bCs/>
+          <w:color w:val="000000"/>
+          <w:sz w:val="22"/>
+          <w:szCs w:val="22"/>
+        </w:rPr>
+        <w:t>Zmniejszenie liczby błędów w dokumentacji:</w:t>
+      </w:r>
+      <w:r>
+        <w:rPr>
+          <w:rFonts w:ascii="Arial" w:hAnsi="Arial" w:cs="Arial"/>
+          <w:color w:val="000000"/>
+          <w:sz w:val="22"/>
+          <w:szCs w:val="22"/>
+        </w:rPr>
+        <w:t xml:space="preserve"> Walidacja danych ogranicza liczbę błędów o około 70%, eliminując np. możliwość wprowadzenia nieistniejących dat.</w:t>
+      </w:r>
+    </w:p>
+    <w:p>
+      <w:pPr>
+        <w:pStyle w:val="NormalnyWeb"/>
+        <w:numPr>
+          <w:ilvl w:val="0"/>
+          <w:numId w:val="9"/>
+        </w:numPr>
+        <w:spacing w:before="0" w:beforeAutospacing="0" w:after="0" w:afterAutospacing="0"/>
+        <w:textAlignment w:val="baseline"/>
+        <w:rPr>
+          <w:rFonts w:ascii="Arial" w:hAnsi="Arial" w:cs="Arial"/>
+          <w:color w:val="000000"/>
+          <w:sz w:val="22"/>
+          <w:szCs w:val="22"/>
+        </w:rPr>
+      </w:pPr>
+      <w:r>
+        <w:rPr>
+          <w:rFonts w:ascii="Arial" w:hAnsi="Arial" w:cs="Arial"/>
+          <w:b/>
+          <w:bCs/>
+          <w:color w:val="000000"/>
+          <w:sz w:val="22"/>
+          <w:szCs w:val="22"/>
+        </w:rPr>
+        <w:t>Możliwość obsługi większej liczby klientów:</w:t>
+      </w:r>
+      <w:r>
+        <w:rPr>
+          <w:rFonts w:ascii="Arial" w:hAnsi="Arial" w:cs="Arial"/>
+          <w:color w:val="000000"/>
+          <w:sz w:val="22"/>
+          <w:szCs w:val="22"/>
+        </w:rPr>
+        <w:t xml:space="preserve"> Dzięki dostępowi online menażeria może obsługiwać o około 30% więcej klientów, obejmując zasięgiem całą Polskę.</w:t>
+      </w:r>
+    </w:p>
+    <w:p>
+      <w:pPr>
+        <w:pStyle w:val="NormalnyWeb"/>
+        <w:numPr>
+          <w:ilvl w:val="0"/>
+          <w:numId w:val="9"/>
+        </w:numPr>
+        <w:spacing w:before="0" w:beforeAutospacing="0" w:after="0" w:afterAutospacing="0"/>
+        <w:textAlignment w:val="baseline"/>
+        <w:rPr>
+          <w:rFonts w:ascii="Arial" w:hAnsi="Arial" w:cs="Arial"/>
+          <w:color w:val="000000"/>
+          <w:sz w:val="22"/>
+          <w:szCs w:val="22"/>
+        </w:rPr>
+      </w:pPr>
+      <w:r>
+        <w:rPr>
+          <w:rFonts w:ascii="Arial" w:hAnsi="Arial" w:cs="Arial"/>
+          <w:b/>
+          <w:bCs/>
+          <w:color w:val="000000"/>
+          <w:sz w:val="22"/>
+          <w:szCs w:val="22"/>
+        </w:rPr>
+        <w:t>Automatyczne raportowanie:</w:t>
+      </w:r>
+      <w:r>
+        <w:rPr>
+          <w:rFonts w:ascii="Arial" w:hAnsi="Arial" w:cs="Arial"/>
+          <w:color w:val="000000"/>
+          <w:sz w:val="22"/>
+          <w:szCs w:val="22"/>
+        </w:rPr>
+        <w:t xml:space="preserve"> Generowanie raportów zostaje skrócone z około 30 min pracy ręcznej do kilku sekund, co pozwala zaoszczędzić średnio 2-3 godziny pracy tygodniowo.</w:t>
+      </w:r>
+    </w:p>
+    <w:p>
+      <w:pPr>
+        <w:pStyle w:val="NormalnyWeb"/>
+        <w:numPr>
+          <w:ilvl w:val="0"/>
+          <w:numId w:val="9"/>
+        </w:numPr>
+        <w:spacing w:before="0" w:beforeAutospacing="0" w:after="0" w:afterAutospacing="0"/>
+        <w:textAlignment w:val="baseline"/>
+        <w:rPr>
+          <w:rFonts w:ascii="Arial" w:hAnsi="Arial" w:cs="Arial"/>
+          <w:color w:val="000000"/>
+          <w:sz w:val="22"/>
+          <w:szCs w:val="22"/>
+        </w:rPr>
+      </w:pPr>
+      <w:r>
+        <w:rPr>
+          <w:rFonts w:ascii="Arial" w:hAnsi="Arial" w:cs="Arial"/>
+          <w:b/>
+          <w:bCs/>
+          <w:color w:val="000000"/>
+          <w:sz w:val="22"/>
+          <w:szCs w:val="22"/>
+        </w:rPr>
+        <w:t>Skrócenie czasu rejestracji chomika:</w:t>
+      </w:r>
+      <w:r>
+        <w:rPr>
+          <w:rFonts w:ascii="Arial" w:hAnsi="Arial" w:cs="Arial"/>
+          <w:color w:val="000000"/>
+          <w:sz w:val="22"/>
+          <w:szCs w:val="22"/>
+        </w:rPr>
+        <w:t xml:space="preserve"> Proces rejestracji zostaje skrócony o około 75% (z około 20 minut do około 5 minut).</w:t>
+      </w:r>
+    </w:p>
+    <w:p>
+      <w:pPr>
+        <w:pStyle w:val="NormalnyWeb"/>
+        <w:numPr>
+          <w:ilvl w:val="0"/>
+          <w:numId w:val="9"/>
+        </w:numPr>
+        <w:spacing w:before="0" w:beforeAutospacing="0" w:after="0" w:afterAutospacing="0"/>
+        <w:textAlignment w:val="baseline"/>
+        <w:rPr>
+          <w:rFonts w:ascii="Arial" w:hAnsi="Arial" w:cs="Arial"/>
+          <w:color w:val="000000"/>
+          <w:sz w:val="22"/>
+          <w:szCs w:val="22"/>
+        </w:rPr>
+      </w:pPr>
+      <w:r>
+        <w:rPr>
+          <w:rFonts w:ascii="Arial" w:hAnsi="Arial" w:cs="Arial"/>
+          <w:b/>
+          <w:bCs/>
+          <w:color w:val="000000"/>
+          <w:sz w:val="22"/>
+          <w:szCs w:val="22"/>
+        </w:rPr>
+        <w:t>Redukcja czasu wyszukiwania informacji:</w:t>
+      </w:r>
+      <w:r>
+        <w:rPr>
+          <w:rFonts w:ascii="Arial" w:hAnsi="Arial" w:cs="Arial"/>
+          <w:color w:val="000000"/>
+          <w:sz w:val="22"/>
+          <w:szCs w:val="22"/>
+        </w:rPr>
+        <w:t xml:space="preserve"> Wyszukiwanie informacji, np. o chorobach chomika, zostaje przyspieszone i około 95% (z około 3 minut do mniej niż 10 sekund).</w:t>
+      </w:r>
+    </w:p>
+    <w:p>
+      <w:pPr>
+        <w:pStyle w:val="Nagwek3"/>
+        <w:spacing w:before="280"/>
+        <w:rPr>
+          <w:rFonts w:ascii="Times New Roman" w:hAnsi="Times New Roman" w:cs="Times New Roman"/>
+          <w:color w:val="000000"/>
+          <w:sz w:val="27"/>
+          <w:szCs w:val="27"/>
+        </w:rPr>
+      </w:pPr>
+      <w:r>
+        <w:rPr>
+          <w:b/>
+          <w:bCs/>
+          <w:color w:val="000000"/>
+          <w:sz w:val="22"/>
+          <w:szCs w:val="22"/>
+        </w:rPr>
+        <w:t>Niemierzalne:</w:t>
+      </w:r>
+    </w:p>
+    <w:p>
+      <w:pPr>
+        <w:pStyle w:val="NormalnyWeb"/>
+        <w:numPr>
+          <w:ilvl w:val="0"/>
+          <w:numId w:val="10"/>
+        </w:numPr>
+        <w:spacing w:before="240" w:beforeAutospacing="0" w:after="0" w:afterAutospacing="0"/>
+        <w:textAlignment w:val="baseline"/>
+        <w:rPr>
+          <w:rFonts w:ascii="Arial" w:hAnsi="Arial" w:cs="Arial"/>
+          <w:color w:val="000000"/>
+          <w:sz w:val="22"/>
+          <w:szCs w:val="22"/>
+        </w:rPr>
+      </w:pPr>
+      <w:r>
+        <w:rPr>
+          <w:rFonts w:ascii="Arial" w:hAnsi="Arial" w:cs="Arial"/>
+          <w:b/>
+          <w:bCs/>
+          <w:color w:val="000000"/>
+          <w:sz w:val="22"/>
+          <w:szCs w:val="22"/>
+        </w:rPr>
+        <w:t>Poprawa dobrostanu zwierząt:</w:t>
+      </w:r>
+      <w:r>
+        <w:rPr>
+          <w:rFonts w:ascii="Arial" w:hAnsi="Arial" w:cs="Arial"/>
+          <w:color w:val="000000"/>
+          <w:sz w:val="22"/>
+          <w:szCs w:val="22"/>
+        </w:rPr>
+        <w:t xml:space="preserve"> Dzięki rygorystycznemu przestrzeganiu grafików karmienia i sprzątania, chomiki są zdrowsze i lepiej zadbane.</w:t>
+      </w:r>
+    </w:p>
+    <w:p>
+      <w:pPr>
+        <w:pStyle w:val="NormalnyWeb"/>
+        <w:numPr>
+          <w:ilvl w:val="0"/>
+          <w:numId w:val="10"/>
+        </w:numPr>
+        <w:spacing w:before="0" w:beforeAutospacing="0" w:after="0" w:afterAutospacing="0"/>
+        <w:textAlignment w:val="baseline"/>
+        <w:rPr>
+          <w:rFonts w:ascii="Arial" w:hAnsi="Arial" w:cs="Arial"/>
+          <w:color w:val="000000"/>
+          <w:sz w:val="22"/>
+          <w:szCs w:val="22"/>
+        </w:rPr>
+      </w:pPr>
+      <w:r>
+        <w:rPr>
+          <w:rFonts w:ascii="Arial" w:hAnsi="Arial" w:cs="Arial"/>
+          <w:b/>
+          <w:bCs/>
+          <w:color w:val="000000"/>
+          <w:sz w:val="22"/>
+          <w:szCs w:val="22"/>
+        </w:rPr>
+        <w:t>Wzrost prestiżu menażerii:</w:t>
+      </w:r>
+      <w:r>
+        <w:rPr>
+          <w:rFonts w:ascii="Arial" w:hAnsi="Arial" w:cs="Arial"/>
+          <w:color w:val="000000"/>
+          <w:sz w:val="22"/>
+          <w:szCs w:val="22"/>
+        </w:rPr>
+        <w:t xml:space="preserve"> Możliwość łatwego sprawdzenia historii wystawowej i zdrowotnej buduje zaufanie klientów i markę profesjonalnej hodowli.</w:t>
+      </w:r>
+    </w:p>
+    <w:p>
+      <w:pPr>
+        <w:pStyle w:val="NormalnyWeb"/>
+        <w:numPr>
+          <w:ilvl w:val="0"/>
+          <w:numId w:val="10"/>
+        </w:numPr>
+        <w:spacing w:before="0" w:beforeAutospacing="0" w:after="0" w:afterAutospacing="0"/>
+        <w:textAlignment w:val="baseline"/>
+        <w:rPr>
+          <w:rFonts w:ascii="Arial" w:hAnsi="Arial" w:cs="Arial"/>
+          <w:color w:val="000000"/>
+          <w:sz w:val="22"/>
+          <w:szCs w:val="22"/>
+        </w:rPr>
+      </w:pPr>
+      <w:r>
+        <w:rPr>
+          <w:rFonts w:ascii="Arial" w:hAnsi="Arial" w:cs="Arial"/>
+          <w:b/>
+          <w:bCs/>
+          <w:color w:val="000000"/>
+          <w:sz w:val="22"/>
+          <w:szCs w:val="22"/>
+        </w:rPr>
+        <w:t>Spokój ducha właściciela:</w:t>
+      </w:r>
+      <w:r>
+        <w:rPr>
+          <w:rFonts w:ascii="Arial" w:hAnsi="Arial" w:cs="Arial"/>
+          <w:color w:val="000000"/>
+          <w:sz w:val="22"/>
+          <w:szCs w:val="22"/>
+        </w:rPr>
+        <w:t xml:space="preserve"> Pan Zbigniew odzyskuje kontrolę nad marzeniem bez konieczności pamiętania o każdym szczególe, system pilnuje terminów za niego.</w:t>
+      </w:r>
+    </w:p>
+    <w:p>
+      <w:pPr>
+        <w:pStyle w:val="NormalnyWeb"/>
+        <w:numPr>
+          <w:ilvl w:val="0"/>
+          <w:numId w:val="10"/>
+        </w:numPr>
+        <w:spacing w:before="0" w:beforeAutospacing="0" w:after="0" w:afterAutospacing="0"/>
+        <w:textAlignment w:val="baseline"/>
+        <w:rPr>
+          <w:rFonts w:ascii="Arial" w:hAnsi="Arial" w:cs="Arial"/>
+          <w:color w:val="000000"/>
+          <w:sz w:val="22"/>
+          <w:szCs w:val="22"/>
+        </w:rPr>
+      </w:pPr>
+      <w:r>
+        <w:rPr>
+          <w:rFonts w:ascii="Arial" w:hAnsi="Arial" w:cs="Arial"/>
+          <w:b/>
+          <w:bCs/>
+          <w:color w:val="000000"/>
+          <w:sz w:val="22"/>
+          <w:szCs w:val="22"/>
+        </w:rPr>
+        <w:t>Lepsza analityka hodowlana:</w:t>
+      </w:r>
+      <w:r>
+        <w:rPr>
+          <w:rFonts w:ascii="Arial" w:hAnsi="Arial" w:cs="Arial"/>
+          <w:color w:val="000000"/>
+          <w:sz w:val="22"/>
+          <w:szCs w:val="22"/>
+        </w:rPr>
+        <w:t xml:space="preserve"> Protokoły rozmnażania pozwalają na lepszy dobór par w przyszłości, co podnosi jakość genetyczną chomików (trudne do wyliczenia w krótkim terminie).</w:t>
+      </w:r>
+    </w:p>
+    <w:p>
+      <w:pPr>
+        <w:pStyle w:val="NormalnyWeb"/>
+        <w:numPr>
+          <w:ilvl w:val="0"/>
+          <w:numId w:val="10"/>
+        </w:numPr>
+        <w:spacing w:before="0" w:beforeAutospacing="0" w:after="240" w:afterAutospacing="0"/>
+        <w:textAlignment w:val="baseline"/>
+        <w:rPr>
+          <w:rFonts w:ascii="Arial" w:hAnsi="Arial" w:cs="Arial"/>
+          <w:color w:val="000000"/>
+          <w:sz w:val="22"/>
+          <w:szCs w:val="22"/>
+        </w:rPr>
+      </w:pPr>
+      <w:r>
+        <w:rPr>
+          <w:rFonts w:ascii="Arial" w:hAnsi="Arial" w:cs="Arial"/>
+          <w:b/>
+          <w:bCs/>
+          <w:color w:val="000000"/>
+          <w:sz w:val="22"/>
+          <w:szCs w:val="22"/>
+        </w:rPr>
+        <w:t>Przejrzystość odpowiedzialności:</w:t>
+      </w:r>
+      <w:r>
+        <w:rPr>
+          <w:rFonts w:ascii="Arial" w:hAnsi="Arial" w:cs="Arial"/>
+          <w:color w:val="000000"/>
+          <w:sz w:val="22"/>
+          <w:szCs w:val="22"/>
+        </w:rPr>
+        <w:t xml:space="preserve"> System loguje, kto i kiedy wykonał daną czynność, co eliminuje konflikty w zespole i motywuje pracowników.</w:t>
+      </w:r>
+    </w:p>
+    <w:p/>
+    <w:p>
+      <w:pPr>
+        <w:jc w:val="both"/>
+      </w:pPr>
+    </w:p>
+    <w:p>
+      <w:pPr>
+        <w:jc w:val="both"/>
+      </w:pPr>
+    </w:p>
+    <w:p>
+      <w:pPr>
+        <w:jc w:val="both"/>
+      </w:pPr>
+    </w:p>
+    <w:p>
+      <w:pPr>
+        <w:jc w:val="both"/>
+      </w:pPr>
+    </w:p>
+    <w:p>
+      <w:pPr>
+        <w:jc w:val="both"/>
+      </w:pPr>
+    </w:p>
+    <w:p>
+      <w:pPr>
+        <w:jc w:val="both"/>
+      </w:pPr>
+    </w:p>
+    <w:p>
+      <w:pPr>
+        <w:jc w:val="both"/>
+      </w:pPr>
+    </w:p>
+    <w:p>
+      <w:pPr>
+        <w:jc w:val="both"/>
+      </w:pPr>
+    </w:p>
+    <w:p>
+      <w:pPr>
+        <w:jc w:val="both"/>
+      </w:pPr>
+    </w:p>
+    <w:p>
+      <w:pPr>
+        <w:jc w:val="both"/>
+      </w:pPr>
+    </w:p>
+    <w:p>
+      <w:pPr>
+        <w:jc w:val="both"/>
+      </w:pPr>
+    </w:p>
+    <w:p>
+      <w:pPr>
+        <w:jc w:val="both"/>
+      </w:pPr>
+    </w:p>
+    <w:p>
+      <w:pPr>
+        <w:jc w:val="both"/>
+      </w:pPr>
+    </w:p>
+    <w:p>
+      <w:pPr>
+        <w:jc w:val="both"/>
+      </w:pPr>
+    </w:p>
+    <w:p>
+      <w:pPr>
+        <w:rPr>
           <w:sz w:val="28"/>
           <w:szCs w:val="28"/>
-          <w:lang w:val="pl-PL"/>
-        </w:rPr>
-      </w:pPr>
-      <w:r>
+        </w:rPr>
+      </w:pPr>
+    </w:p>
+    <w:p>
+      <w:pPr>
         <w:rPr>
           <w:b/>
           <w:bCs/>
@@ -539,6 +2103,16 @@
           <w:szCs w:val="28"/>
           <w:lang w:val="pl-PL"/>
         </w:rPr>
+      </w:pPr>
+      <w:r>
+        <w:rPr>
+          <w:b/>
+          <w:bCs/>
+          <w:sz w:val="28"/>
+          <w:szCs w:val="28"/>
+          <w:lang w:val="pl-PL"/>
+        </w:rPr>
+        <w:lastRenderedPageBreak/>
         <w:t>4.1 Diagramy przypadków użycia</w:t>
       </w:r>
     </w:p>
@@ -570,7 +2144,6 @@
           <w:noProof/>
           <w:lang w:val="pl-PL"/>
         </w:rPr>
-        <w:lastRenderedPageBreak/>
         <w:drawing>
           <wp:inline distT="0" distB="0" distL="0" distR="0" wp14:anchorId="7D6C9FF6" wp14:editId="243D6061">
             <wp:extent cx="6843395" cy="7026910"/>
@@ -1780,6 +3353,900 @@
 <file path=word/numbering.xml><?xml version="1.0" encoding="utf-8"?>
 <w:numbering xmlns:wpc="http://schemas.microsoft.com/office/word/2010/wordprocessingCanvas" xmlns:cx="http://schemas.microsoft.com/office/drawing/2014/chartex" xmlns:cx1="http://schemas.microsoft.com/office/drawing/2015/9/8/chartex" xmlns:cx2="http://schemas.microsoft.com/office/drawing/2015/10/21/chartex" xmlns:cx3="http://schemas.microsoft.com/office/drawing/2016/5/9/chartex" xmlns:cx4="http://schemas.microsoft.com/office/drawing/2016/5/10/chartex" xmlns:cx5="http://schemas.microsoft.com/office/drawing/2016/5/11/chartex" xmlns:cx6="http://schemas.microsoft.com/office/drawing/2016/5/12/chartex" xmlns:cx7="http://schemas.microsoft.com/office/drawing/2016/5/13/chartex" xmlns:cx8="http://schemas.microsoft.com/office/drawing/2016/5/14/chartex" xmlns:mc="http://schemas.openxmlformats.org/markup-compatibility/2006" xmlns:aink="http://schemas.microsoft.com/office/drawing/2016/ink" xmlns:am3d="http://schemas.microsoft.com/office/drawing/2017/model3d" xmlns:o="urn:schemas-microsoft-com:office:office" xmlns:oel="http://schemas.microsoft.com/office/2019/extlst" xmlns:r="http://schemas.openxmlformats.org/officeDocument/2006/relationships" xmlns:m="http://schemas.openxmlformats.org/officeDocument/2006/math" xmlns:v="urn:schemas-microsoft-com:vml" xmlns:wp14="http://schemas.microsoft.com/office/word/2010/wordprocessingDrawing" xmlns:wp="http://schemas.openxmlformats.org/drawingml/2006/wordprocessingDrawing" xmlns:w10="urn:schemas-microsoft-com:office:word" xmlns:w="http://schemas.openxmlformats.org/wordprocessingml/2006/main" xmlns:w14="http://schemas.microsoft.com/office/word/2010/wordml" xmlns:w15="http://schemas.microsoft.com/office/word/2012/wordml" xmlns:w16cex="http://schemas.microsoft.com/office/word/2018/wordml/cex" xmlns:w16cid="http://schemas.microsoft.com/office/word/2016/wordml/cid" xmlns:w16="http://schemas.microsoft.com/office/word/2018/wordml" xmlns:w16du="http://schemas.microsoft.com/office/word/2023/wordml/word16du" xmlns:w16sdtdh="http://schemas.microsoft.com/office/word/2020/wordml/sdtdatahash" xmlns:w16sdtfl="http://schemas.microsoft.com/office/word/2024/wordml/sdtformatlock" xmlns:w16se="http://schemas.microsoft.com/office/word/2015/wordml/symex" xmlns:wpg="http://schemas.microsoft.com/office/word/2010/wordprocessingGroup" xmlns:wpi="http://schemas.microsoft.com/office/word/2010/wordprocessingInk" xmlns:wne="http://schemas.microsoft.com/office/word/2006/wordml" xmlns:wps="http://schemas.microsoft.com/office/word/2010/wordprocessingShape" mc:Ignorable="w14 w15 w16se w16cid w16 w16cex w16sdtdh w16sdtfl w16du wp14">
   <w:abstractNum w:abstractNumId="0" w15:restartNumberingAfterBreak="0">
+    <w:nsid w:val="084C776F"/>
+    <w:multiLevelType w:val="multilevel"/>
+    <w:tmpl w:val="5DC4A9FC"/>
+    <w:lvl w:ilvl="0">
+      <w:start w:val="1"/>
+      <w:numFmt w:val="bullet"/>
+      <w:lvlText w:val=""/>
+      <w:lvlJc w:val="left"/>
+      <w:pPr>
+        <w:tabs>
+          <w:tab w:val="num" w:pos="720"/>
+        </w:tabs>
+        <w:ind w:left="720" w:hanging="360"/>
+      </w:pPr>
+      <w:rPr>
+        <w:rFonts w:ascii="Symbol" w:hAnsi="Symbol" w:hint="default"/>
+        <w:sz w:val="20"/>
+      </w:rPr>
+    </w:lvl>
+    <w:lvl w:ilvl="1" w:tentative="1">
+      <w:start w:val="1"/>
+      <w:numFmt w:val="bullet"/>
+      <w:lvlText w:val="o"/>
+      <w:lvlJc w:val="left"/>
+      <w:pPr>
+        <w:tabs>
+          <w:tab w:val="num" w:pos="1440"/>
+        </w:tabs>
+        <w:ind w:left="1440" w:hanging="360"/>
+      </w:pPr>
+      <w:rPr>
+        <w:rFonts w:ascii="Courier New" w:hAnsi="Courier New" w:hint="default"/>
+        <w:sz w:val="20"/>
+      </w:rPr>
+    </w:lvl>
+    <w:lvl w:ilvl="2" w:tentative="1">
+      <w:start w:val="1"/>
+      <w:numFmt w:val="bullet"/>
+      <w:lvlText w:val=""/>
+      <w:lvlJc w:val="left"/>
+      <w:pPr>
+        <w:tabs>
+          <w:tab w:val="num" w:pos="2160"/>
+        </w:tabs>
+        <w:ind w:left="2160" w:hanging="360"/>
+      </w:pPr>
+      <w:rPr>
+        <w:rFonts w:ascii="Wingdings" w:hAnsi="Wingdings" w:hint="default"/>
+        <w:sz w:val="20"/>
+      </w:rPr>
+    </w:lvl>
+    <w:lvl w:ilvl="3" w:tentative="1">
+      <w:start w:val="1"/>
+      <w:numFmt w:val="bullet"/>
+      <w:lvlText w:val=""/>
+      <w:lvlJc w:val="left"/>
+      <w:pPr>
+        <w:tabs>
+          <w:tab w:val="num" w:pos="2880"/>
+        </w:tabs>
+        <w:ind w:left="2880" w:hanging="360"/>
+      </w:pPr>
+      <w:rPr>
+        <w:rFonts w:ascii="Wingdings" w:hAnsi="Wingdings" w:hint="default"/>
+        <w:sz w:val="20"/>
+      </w:rPr>
+    </w:lvl>
+    <w:lvl w:ilvl="4" w:tentative="1">
+      <w:start w:val="1"/>
+      <w:numFmt w:val="bullet"/>
+      <w:lvlText w:val=""/>
+      <w:lvlJc w:val="left"/>
+      <w:pPr>
+        <w:tabs>
+          <w:tab w:val="num" w:pos="3600"/>
+        </w:tabs>
+        <w:ind w:left="3600" w:hanging="360"/>
+      </w:pPr>
+      <w:rPr>
+        <w:rFonts w:ascii="Wingdings" w:hAnsi="Wingdings" w:hint="default"/>
+        <w:sz w:val="20"/>
+      </w:rPr>
+    </w:lvl>
+    <w:lvl w:ilvl="5" w:tentative="1">
+      <w:start w:val="1"/>
+      <w:numFmt w:val="bullet"/>
+      <w:lvlText w:val=""/>
+      <w:lvlJc w:val="left"/>
+      <w:pPr>
+        <w:tabs>
+          <w:tab w:val="num" w:pos="4320"/>
+        </w:tabs>
+        <w:ind w:left="4320" w:hanging="360"/>
+      </w:pPr>
+      <w:rPr>
+        <w:rFonts w:ascii="Wingdings" w:hAnsi="Wingdings" w:hint="default"/>
+        <w:sz w:val="20"/>
+      </w:rPr>
+    </w:lvl>
+    <w:lvl w:ilvl="6" w:tentative="1">
+      <w:start w:val="1"/>
+      <w:numFmt w:val="bullet"/>
+      <w:lvlText w:val=""/>
+      <w:lvlJc w:val="left"/>
+      <w:pPr>
+        <w:tabs>
+          <w:tab w:val="num" w:pos="5040"/>
+        </w:tabs>
+        <w:ind w:left="5040" w:hanging="360"/>
+      </w:pPr>
+      <w:rPr>
+        <w:rFonts w:ascii="Wingdings" w:hAnsi="Wingdings" w:hint="default"/>
+        <w:sz w:val="20"/>
+      </w:rPr>
+    </w:lvl>
+    <w:lvl w:ilvl="7" w:tentative="1">
+      <w:start w:val="1"/>
+      <w:numFmt w:val="bullet"/>
+      <w:lvlText w:val=""/>
+      <w:lvlJc w:val="left"/>
+      <w:pPr>
+        <w:tabs>
+          <w:tab w:val="num" w:pos="5760"/>
+        </w:tabs>
+        <w:ind w:left="5760" w:hanging="360"/>
+      </w:pPr>
+      <w:rPr>
+        <w:rFonts w:ascii="Wingdings" w:hAnsi="Wingdings" w:hint="default"/>
+        <w:sz w:val="20"/>
+      </w:rPr>
+    </w:lvl>
+    <w:lvl w:ilvl="8" w:tentative="1">
+      <w:start w:val="1"/>
+      <w:numFmt w:val="bullet"/>
+      <w:lvlText w:val=""/>
+      <w:lvlJc w:val="left"/>
+      <w:pPr>
+        <w:tabs>
+          <w:tab w:val="num" w:pos="6480"/>
+        </w:tabs>
+        <w:ind w:left="6480" w:hanging="360"/>
+      </w:pPr>
+      <w:rPr>
+        <w:rFonts w:ascii="Wingdings" w:hAnsi="Wingdings" w:hint="default"/>
+        <w:sz w:val="20"/>
+      </w:rPr>
+    </w:lvl>
+  </w:abstractNum>
+  <w:abstractNum w:abstractNumId="1" w15:restartNumberingAfterBreak="0">
+    <w:nsid w:val="1E527A44"/>
+    <w:multiLevelType w:val="multilevel"/>
+    <w:tmpl w:val="ABD83246"/>
+    <w:lvl w:ilvl="0">
+      <w:start w:val="1"/>
+      <w:numFmt w:val="bullet"/>
+      <w:lvlText w:val=""/>
+      <w:lvlJc w:val="left"/>
+      <w:pPr>
+        <w:tabs>
+          <w:tab w:val="num" w:pos="720"/>
+        </w:tabs>
+        <w:ind w:left="720" w:hanging="360"/>
+      </w:pPr>
+      <w:rPr>
+        <w:rFonts w:ascii="Symbol" w:hAnsi="Symbol" w:hint="default"/>
+        <w:sz w:val="20"/>
+      </w:rPr>
+    </w:lvl>
+    <w:lvl w:ilvl="1" w:tentative="1">
+      <w:start w:val="1"/>
+      <w:numFmt w:val="bullet"/>
+      <w:lvlText w:val="o"/>
+      <w:lvlJc w:val="left"/>
+      <w:pPr>
+        <w:tabs>
+          <w:tab w:val="num" w:pos="1440"/>
+        </w:tabs>
+        <w:ind w:left="1440" w:hanging="360"/>
+      </w:pPr>
+      <w:rPr>
+        <w:rFonts w:ascii="Courier New" w:hAnsi="Courier New" w:hint="default"/>
+        <w:sz w:val="20"/>
+      </w:rPr>
+    </w:lvl>
+    <w:lvl w:ilvl="2" w:tentative="1">
+      <w:start w:val="1"/>
+      <w:numFmt w:val="bullet"/>
+      <w:lvlText w:val=""/>
+      <w:lvlJc w:val="left"/>
+      <w:pPr>
+        <w:tabs>
+          <w:tab w:val="num" w:pos="2160"/>
+        </w:tabs>
+        <w:ind w:left="2160" w:hanging="360"/>
+      </w:pPr>
+      <w:rPr>
+        <w:rFonts w:ascii="Wingdings" w:hAnsi="Wingdings" w:hint="default"/>
+        <w:sz w:val="20"/>
+      </w:rPr>
+    </w:lvl>
+    <w:lvl w:ilvl="3" w:tentative="1">
+      <w:start w:val="1"/>
+      <w:numFmt w:val="bullet"/>
+      <w:lvlText w:val=""/>
+      <w:lvlJc w:val="left"/>
+      <w:pPr>
+        <w:tabs>
+          <w:tab w:val="num" w:pos="2880"/>
+        </w:tabs>
+        <w:ind w:left="2880" w:hanging="360"/>
+      </w:pPr>
+      <w:rPr>
+        <w:rFonts w:ascii="Wingdings" w:hAnsi="Wingdings" w:hint="default"/>
+        <w:sz w:val="20"/>
+      </w:rPr>
+    </w:lvl>
+    <w:lvl w:ilvl="4" w:tentative="1">
+      <w:start w:val="1"/>
+      <w:numFmt w:val="bullet"/>
+      <w:lvlText w:val=""/>
+      <w:lvlJc w:val="left"/>
+      <w:pPr>
+        <w:tabs>
+          <w:tab w:val="num" w:pos="3600"/>
+        </w:tabs>
+        <w:ind w:left="3600" w:hanging="360"/>
+      </w:pPr>
+      <w:rPr>
+        <w:rFonts w:ascii="Wingdings" w:hAnsi="Wingdings" w:hint="default"/>
+        <w:sz w:val="20"/>
+      </w:rPr>
+    </w:lvl>
+    <w:lvl w:ilvl="5" w:tentative="1">
+      <w:start w:val="1"/>
+      <w:numFmt w:val="bullet"/>
+      <w:lvlText w:val=""/>
+      <w:lvlJc w:val="left"/>
+      <w:pPr>
+        <w:tabs>
+          <w:tab w:val="num" w:pos="4320"/>
+        </w:tabs>
+        <w:ind w:left="4320" w:hanging="360"/>
+      </w:pPr>
+      <w:rPr>
+        <w:rFonts w:ascii="Wingdings" w:hAnsi="Wingdings" w:hint="default"/>
+        <w:sz w:val="20"/>
+      </w:rPr>
+    </w:lvl>
+    <w:lvl w:ilvl="6" w:tentative="1">
+      <w:start w:val="1"/>
+      <w:numFmt w:val="bullet"/>
+      <w:lvlText w:val=""/>
+      <w:lvlJc w:val="left"/>
+      <w:pPr>
+        <w:tabs>
+          <w:tab w:val="num" w:pos="5040"/>
+        </w:tabs>
+        <w:ind w:left="5040" w:hanging="360"/>
+      </w:pPr>
+      <w:rPr>
+        <w:rFonts w:ascii="Wingdings" w:hAnsi="Wingdings" w:hint="default"/>
+        <w:sz w:val="20"/>
+      </w:rPr>
+    </w:lvl>
+    <w:lvl w:ilvl="7" w:tentative="1">
+      <w:start w:val="1"/>
+      <w:numFmt w:val="bullet"/>
+      <w:lvlText w:val=""/>
+      <w:lvlJc w:val="left"/>
+      <w:pPr>
+        <w:tabs>
+          <w:tab w:val="num" w:pos="5760"/>
+        </w:tabs>
+        <w:ind w:left="5760" w:hanging="360"/>
+      </w:pPr>
+      <w:rPr>
+        <w:rFonts w:ascii="Wingdings" w:hAnsi="Wingdings" w:hint="default"/>
+        <w:sz w:val="20"/>
+      </w:rPr>
+    </w:lvl>
+    <w:lvl w:ilvl="8" w:tentative="1">
+      <w:start w:val="1"/>
+      <w:numFmt w:val="bullet"/>
+      <w:lvlText w:val=""/>
+      <w:lvlJc w:val="left"/>
+      <w:pPr>
+        <w:tabs>
+          <w:tab w:val="num" w:pos="6480"/>
+        </w:tabs>
+        <w:ind w:left="6480" w:hanging="360"/>
+      </w:pPr>
+      <w:rPr>
+        <w:rFonts w:ascii="Wingdings" w:hAnsi="Wingdings" w:hint="default"/>
+        <w:sz w:val="20"/>
+      </w:rPr>
+    </w:lvl>
+  </w:abstractNum>
+  <w:abstractNum w:abstractNumId="2" w15:restartNumberingAfterBreak="0">
+    <w:nsid w:val="287D79F9"/>
+    <w:multiLevelType w:val="multilevel"/>
+    <w:tmpl w:val="427619BA"/>
+    <w:lvl w:ilvl="0">
+      <w:start w:val="1"/>
+      <w:numFmt w:val="bullet"/>
+      <w:lvlText w:val=""/>
+      <w:lvlJc w:val="left"/>
+      <w:pPr>
+        <w:tabs>
+          <w:tab w:val="num" w:pos="720"/>
+        </w:tabs>
+        <w:ind w:left="720" w:hanging="360"/>
+      </w:pPr>
+      <w:rPr>
+        <w:rFonts w:ascii="Symbol" w:hAnsi="Symbol" w:hint="default"/>
+        <w:sz w:val="20"/>
+      </w:rPr>
+    </w:lvl>
+    <w:lvl w:ilvl="1" w:tentative="1">
+      <w:start w:val="1"/>
+      <w:numFmt w:val="bullet"/>
+      <w:lvlText w:val="o"/>
+      <w:lvlJc w:val="left"/>
+      <w:pPr>
+        <w:tabs>
+          <w:tab w:val="num" w:pos="1440"/>
+        </w:tabs>
+        <w:ind w:left="1440" w:hanging="360"/>
+      </w:pPr>
+      <w:rPr>
+        <w:rFonts w:ascii="Courier New" w:hAnsi="Courier New" w:hint="default"/>
+        <w:sz w:val="20"/>
+      </w:rPr>
+    </w:lvl>
+    <w:lvl w:ilvl="2" w:tentative="1">
+      <w:start w:val="1"/>
+      <w:numFmt w:val="bullet"/>
+      <w:lvlText w:val=""/>
+      <w:lvlJc w:val="left"/>
+      <w:pPr>
+        <w:tabs>
+          <w:tab w:val="num" w:pos="2160"/>
+        </w:tabs>
+        <w:ind w:left="2160" w:hanging="360"/>
+      </w:pPr>
+      <w:rPr>
+        <w:rFonts w:ascii="Wingdings" w:hAnsi="Wingdings" w:hint="default"/>
+        <w:sz w:val="20"/>
+      </w:rPr>
+    </w:lvl>
+    <w:lvl w:ilvl="3" w:tentative="1">
+      <w:start w:val="1"/>
+      <w:numFmt w:val="bullet"/>
+      <w:lvlText w:val=""/>
+      <w:lvlJc w:val="left"/>
+      <w:pPr>
+        <w:tabs>
+          <w:tab w:val="num" w:pos="2880"/>
+        </w:tabs>
+        <w:ind w:left="2880" w:hanging="360"/>
+      </w:pPr>
+      <w:rPr>
+        <w:rFonts w:ascii="Wingdings" w:hAnsi="Wingdings" w:hint="default"/>
+        <w:sz w:val="20"/>
+      </w:rPr>
+    </w:lvl>
+    <w:lvl w:ilvl="4" w:tentative="1">
+      <w:start w:val="1"/>
+      <w:numFmt w:val="bullet"/>
+      <w:lvlText w:val=""/>
+      <w:lvlJc w:val="left"/>
+      <w:pPr>
+        <w:tabs>
+          <w:tab w:val="num" w:pos="3600"/>
+        </w:tabs>
+        <w:ind w:left="3600" w:hanging="360"/>
+      </w:pPr>
+      <w:rPr>
+        <w:rFonts w:ascii="Wingdings" w:hAnsi="Wingdings" w:hint="default"/>
+        <w:sz w:val="20"/>
+      </w:rPr>
+    </w:lvl>
+    <w:lvl w:ilvl="5" w:tentative="1">
+      <w:start w:val="1"/>
+      <w:numFmt w:val="bullet"/>
+      <w:lvlText w:val=""/>
+      <w:lvlJc w:val="left"/>
+      <w:pPr>
+        <w:tabs>
+          <w:tab w:val="num" w:pos="4320"/>
+        </w:tabs>
+        <w:ind w:left="4320" w:hanging="360"/>
+      </w:pPr>
+      <w:rPr>
+        <w:rFonts w:ascii="Wingdings" w:hAnsi="Wingdings" w:hint="default"/>
+        <w:sz w:val="20"/>
+      </w:rPr>
+    </w:lvl>
+    <w:lvl w:ilvl="6" w:tentative="1">
+      <w:start w:val="1"/>
+      <w:numFmt w:val="bullet"/>
+      <w:lvlText w:val=""/>
+      <w:lvlJc w:val="left"/>
+      <w:pPr>
+        <w:tabs>
+          <w:tab w:val="num" w:pos="5040"/>
+        </w:tabs>
+        <w:ind w:left="5040" w:hanging="360"/>
+      </w:pPr>
+      <w:rPr>
+        <w:rFonts w:ascii="Wingdings" w:hAnsi="Wingdings" w:hint="default"/>
+        <w:sz w:val="20"/>
+      </w:rPr>
+    </w:lvl>
+    <w:lvl w:ilvl="7" w:tentative="1">
+      <w:start w:val="1"/>
+      <w:numFmt w:val="bullet"/>
+      <w:lvlText w:val=""/>
+      <w:lvlJc w:val="left"/>
+      <w:pPr>
+        <w:tabs>
+          <w:tab w:val="num" w:pos="5760"/>
+        </w:tabs>
+        <w:ind w:left="5760" w:hanging="360"/>
+      </w:pPr>
+      <w:rPr>
+        <w:rFonts w:ascii="Wingdings" w:hAnsi="Wingdings" w:hint="default"/>
+        <w:sz w:val="20"/>
+      </w:rPr>
+    </w:lvl>
+    <w:lvl w:ilvl="8" w:tentative="1">
+      <w:start w:val="1"/>
+      <w:numFmt w:val="bullet"/>
+      <w:lvlText w:val=""/>
+      <w:lvlJc w:val="left"/>
+      <w:pPr>
+        <w:tabs>
+          <w:tab w:val="num" w:pos="6480"/>
+        </w:tabs>
+        <w:ind w:left="6480" w:hanging="360"/>
+      </w:pPr>
+      <w:rPr>
+        <w:rFonts w:ascii="Wingdings" w:hAnsi="Wingdings" w:hint="default"/>
+        <w:sz w:val="20"/>
+      </w:rPr>
+    </w:lvl>
+  </w:abstractNum>
+  <w:abstractNum w:abstractNumId="3" w15:restartNumberingAfterBreak="0">
+    <w:nsid w:val="44280337"/>
+    <w:multiLevelType w:val="multilevel"/>
+    <w:tmpl w:val="2D323A4C"/>
+    <w:lvl w:ilvl="0">
+      <w:start w:val="1"/>
+      <w:numFmt w:val="bullet"/>
+      <w:lvlText w:val=""/>
+      <w:lvlJc w:val="left"/>
+      <w:pPr>
+        <w:tabs>
+          <w:tab w:val="num" w:pos="720"/>
+        </w:tabs>
+        <w:ind w:left="720" w:hanging="360"/>
+      </w:pPr>
+      <w:rPr>
+        <w:rFonts w:ascii="Symbol" w:hAnsi="Symbol" w:hint="default"/>
+        <w:sz w:val="20"/>
+      </w:rPr>
+    </w:lvl>
+    <w:lvl w:ilvl="1" w:tentative="1">
+      <w:start w:val="1"/>
+      <w:numFmt w:val="bullet"/>
+      <w:lvlText w:val="o"/>
+      <w:lvlJc w:val="left"/>
+      <w:pPr>
+        <w:tabs>
+          <w:tab w:val="num" w:pos="1440"/>
+        </w:tabs>
+        <w:ind w:left="1440" w:hanging="360"/>
+      </w:pPr>
+      <w:rPr>
+        <w:rFonts w:ascii="Courier New" w:hAnsi="Courier New" w:hint="default"/>
+        <w:sz w:val="20"/>
+      </w:rPr>
+    </w:lvl>
+    <w:lvl w:ilvl="2" w:tentative="1">
+      <w:start w:val="1"/>
+      <w:numFmt w:val="bullet"/>
+      <w:lvlText w:val=""/>
+      <w:lvlJc w:val="left"/>
+      <w:pPr>
+        <w:tabs>
+          <w:tab w:val="num" w:pos="2160"/>
+        </w:tabs>
+        <w:ind w:left="2160" w:hanging="360"/>
+      </w:pPr>
+      <w:rPr>
+        <w:rFonts w:ascii="Wingdings" w:hAnsi="Wingdings" w:hint="default"/>
+        <w:sz w:val="20"/>
+      </w:rPr>
+    </w:lvl>
+    <w:lvl w:ilvl="3" w:tentative="1">
+      <w:start w:val="1"/>
+      <w:numFmt w:val="bullet"/>
+      <w:lvlText w:val=""/>
+      <w:lvlJc w:val="left"/>
+      <w:pPr>
+        <w:tabs>
+          <w:tab w:val="num" w:pos="2880"/>
+        </w:tabs>
+        <w:ind w:left="2880" w:hanging="360"/>
+      </w:pPr>
+      <w:rPr>
+        <w:rFonts w:ascii="Wingdings" w:hAnsi="Wingdings" w:hint="default"/>
+        <w:sz w:val="20"/>
+      </w:rPr>
+    </w:lvl>
+    <w:lvl w:ilvl="4" w:tentative="1">
+      <w:start w:val="1"/>
+      <w:numFmt w:val="bullet"/>
+      <w:lvlText w:val=""/>
+      <w:lvlJc w:val="left"/>
+      <w:pPr>
+        <w:tabs>
+          <w:tab w:val="num" w:pos="3600"/>
+        </w:tabs>
+        <w:ind w:left="3600" w:hanging="360"/>
+      </w:pPr>
+      <w:rPr>
+        <w:rFonts w:ascii="Wingdings" w:hAnsi="Wingdings" w:hint="default"/>
+        <w:sz w:val="20"/>
+      </w:rPr>
+    </w:lvl>
+    <w:lvl w:ilvl="5" w:tentative="1">
+      <w:start w:val="1"/>
+      <w:numFmt w:val="bullet"/>
+      <w:lvlText w:val=""/>
+      <w:lvlJc w:val="left"/>
+      <w:pPr>
+        <w:tabs>
+          <w:tab w:val="num" w:pos="4320"/>
+        </w:tabs>
+        <w:ind w:left="4320" w:hanging="360"/>
+      </w:pPr>
+      <w:rPr>
+        <w:rFonts w:ascii="Wingdings" w:hAnsi="Wingdings" w:hint="default"/>
+        <w:sz w:val="20"/>
+      </w:rPr>
+    </w:lvl>
+    <w:lvl w:ilvl="6" w:tentative="1">
+      <w:start w:val="1"/>
+      <w:numFmt w:val="bullet"/>
+      <w:lvlText w:val=""/>
+      <w:lvlJc w:val="left"/>
+      <w:pPr>
+        <w:tabs>
+          <w:tab w:val="num" w:pos="5040"/>
+        </w:tabs>
+        <w:ind w:left="5040" w:hanging="360"/>
+      </w:pPr>
+      <w:rPr>
+        <w:rFonts w:ascii="Wingdings" w:hAnsi="Wingdings" w:hint="default"/>
+        <w:sz w:val="20"/>
+      </w:rPr>
+    </w:lvl>
+    <w:lvl w:ilvl="7" w:tentative="1">
+      <w:start w:val="1"/>
+      <w:numFmt w:val="bullet"/>
+      <w:lvlText w:val=""/>
+      <w:lvlJc w:val="left"/>
+      <w:pPr>
+        <w:tabs>
+          <w:tab w:val="num" w:pos="5760"/>
+        </w:tabs>
+        <w:ind w:left="5760" w:hanging="360"/>
+      </w:pPr>
+      <w:rPr>
+        <w:rFonts w:ascii="Wingdings" w:hAnsi="Wingdings" w:hint="default"/>
+        <w:sz w:val="20"/>
+      </w:rPr>
+    </w:lvl>
+    <w:lvl w:ilvl="8" w:tentative="1">
+      <w:start w:val="1"/>
+      <w:numFmt w:val="bullet"/>
+      <w:lvlText w:val=""/>
+      <w:lvlJc w:val="left"/>
+      <w:pPr>
+        <w:tabs>
+          <w:tab w:val="num" w:pos="6480"/>
+        </w:tabs>
+        <w:ind w:left="6480" w:hanging="360"/>
+      </w:pPr>
+      <w:rPr>
+        <w:rFonts w:ascii="Wingdings" w:hAnsi="Wingdings" w:hint="default"/>
+        <w:sz w:val="20"/>
+      </w:rPr>
+    </w:lvl>
+  </w:abstractNum>
+  <w:abstractNum w:abstractNumId="4" w15:restartNumberingAfterBreak="0">
+    <w:nsid w:val="53342C6F"/>
+    <w:multiLevelType w:val="multilevel"/>
+    <w:tmpl w:val="9C7CACD4"/>
+    <w:lvl w:ilvl="0">
+      <w:start w:val="1"/>
+      <w:numFmt w:val="bullet"/>
+      <w:lvlText w:val=""/>
+      <w:lvlJc w:val="left"/>
+      <w:pPr>
+        <w:tabs>
+          <w:tab w:val="num" w:pos="720"/>
+        </w:tabs>
+        <w:ind w:left="720" w:hanging="360"/>
+      </w:pPr>
+      <w:rPr>
+        <w:rFonts w:ascii="Symbol" w:hAnsi="Symbol" w:hint="default"/>
+        <w:sz w:val="20"/>
+      </w:rPr>
+    </w:lvl>
+    <w:lvl w:ilvl="1" w:tentative="1">
+      <w:start w:val="1"/>
+      <w:numFmt w:val="bullet"/>
+      <w:lvlText w:val="o"/>
+      <w:lvlJc w:val="left"/>
+      <w:pPr>
+        <w:tabs>
+          <w:tab w:val="num" w:pos="1440"/>
+        </w:tabs>
+        <w:ind w:left="1440" w:hanging="360"/>
+      </w:pPr>
+      <w:rPr>
+        <w:rFonts w:ascii="Courier New" w:hAnsi="Courier New" w:hint="default"/>
+        <w:sz w:val="20"/>
+      </w:rPr>
+    </w:lvl>
+    <w:lvl w:ilvl="2" w:tentative="1">
+      <w:start w:val="1"/>
+      <w:numFmt w:val="bullet"/>
+      <w:lvlText w:val=""/>
+      <w:lvlJc w:val="left"/>
+      <w:pPr>
+        <w:tabs>
+          <w:tab w:val="num" w:pos="2160"/>
+        </w:tabs>
+        <w:ind w:left="2160" w:hanging="360"/>
+      </w:pPr>
+      <w:rPr>
+        <w:rFonts w:ascii="Wingdings" w:hAnsi="Wingdings" w:hint="default"/>
+        <w:sz w:val="20"/>
+      </w:rPr>
+    </w:lvl>
+    <w:lvl w:ilvl="3" w:tentative="1">
+      <w:start w:val="1"/>
+      <w:numFmt w:val="bullet"/>
+      <w:lvlText w:val=""/>
+      <w:lvlJc w:val="left"/>
+      <w:pPr>
+        <w:tabs>
+          <w:tab w:val="num" w:pos="2880"/>
+        </w:tabs>
+        <w:ind w:left="2880" w:hanging="360"/>
+      </w:pPr>
+      <w:rPr>
+        <w:rFonts w:ascii="Wingdings" w:hAnsi="Wingdings" w:hint="default"/>
+        <w:sz w:val="20"/>
+      </w:rPr>
+    </w:lvl>
+    <w:lvl w:ilvl="4" w:tentative="1">
+      <w:start w:val="1"/>
+      <w:numFmt w:val="bullet"/>
+      <w:lvlText w:val=""/>
+      <w:lvlJc w:val="left"/>
+      <w:pPr>
+        <w:tabs>
+          <w:tab w:val="num" w:pos="3600"/>
+        </w:tabs>
+        <w:ind w:left="3600" w:hanging="360"/>
+      </w:pPr>
+      <w:rPr>
+        <w:rFonts w:ascii="Wingdings" w:hAnsi="Wingdings" w:hint="default"/>
+        <w:sz w:val="20"/>
+      </w:rPr>
+    </w:lvl>
+    <w:lvl w:ilvl="5" w:tentative="1">
+      <w:start w:val="1"/>
+      <w:numFmt w:val="bullet"/>
+      <w:lvlText w:val=""/>
+      <w:lvlJc w:val="left"/>
+      <w:pPr>
+        <w:tabs>
+          <w:tab w:val="num" w:pos="4320"/>
+        </w:tabs>
+        <w:ind w:left="4320" w:hanging="360"/>
+      </w:pPr>
+      <w:rPr>
+        <w:rFonts w:ascii="Wingdings" w:hAnsi="Wingdings" w:hint="default"/>
+        <w:sz w:val="20"/>
+      </w:rPr>
+    </w:lvl>
+    <w:lvl w:ilvl="6" w:tentative="1">
+      <w:start w:val="1"/>
+      <w:numFmt w:val="bullet"/>
+      <w:lvlText w:val=""/>
+      <w:lvlJc w:val="left"/>
+      <w:pPr>
+        <w:tabs>
+          <w:tab w:val="num" w:pos="5040"/>
+        </w:tabs>
+        <w:ind w:left="5040" w:hanging="360"/>
+      </w:pPr>
+      <w:rPr>
+        <w:rFonts w:ascii="Wingdings" w:hAnsi="Wingdings" w:hint="default"/>
+        <w:sz w:val="20"/>
+      </w:rPr>
+    </w:lvl>
+    <w:lvl w:ilvl="7" w:tentative="1">
+      <w:start w:val="1"/>
+      <w:numFmt w:val="bullet"/>
+      <w:lvlText w:val=""/>
+      <w:lvlJc w:val="left"/>
+      <w:pPr>
+        <w:tabs>
+          <w:tab w:val="num" w:pos="5760"/>
+        </w:tabs>
+        <w:ind w:left="5760" w:hanging="360"/>
+      </w:pPr>
+      <w:rPr>
+        <w:rFonts w:ascii="Wingdings" w:hAnsi="Wingdings" w:hint="default"/>
+        <w:sz w:val="20"/>
+      </w:rPr>
+    </w:lvl>
+    <w:lvl w:ilvl="8" w:tentative="1">
+      <w:start w:val="1"/>
+      <w:numFmt w:val="bullet"/>
+      <w:lvlText w:val=""/>
+      <w:lvlJc w:val="left"/>
+      <w:pPr>
+        <w:tabs>
+          <w:tab w:val="num" w:pos="6480"/>
+        </w:tabs>
+        <w:ind w:left="6480" w:hanging="360"/>
+      </w:pPr>
+      <w:rPr>
+        <w:rFonts w:ascii="Wingdings" w:hAnsi="Wingdings" w:hint="default"/>
+        <w:sz w:val="20"/>
+      </w:rPr>
+    </w:lvl>
+  </w:abstractNum>
+  <w:abstractNum w:abstractNumId="5" w15:restartNumberingAfterBreak="0">
+    <w:nsid w:val="568572B6"/>
+    <w:multiLevelType w:val="multilevel"/>
+    <w:tmpl w:val="DFDA65F2"/>
+    <w:lvl w:ilvl="0">
+      <w:start w:val="1"/>
+      <w:numFmt w:val="bullet"/>
+      <w:lvlText w:val=""/>
+      <w:lvlJc w:val="left"/>
+      <w:pPr>
+        <w:tabs>
+          <w:tab w:val="num" w:pos="720"/>
+        </w:tabs>
+        <w:ind w:left="720" w:hanging="360"/>
+      </w:pPr>
+      <w:rPr>
+        <w:rFonts w:ascii="Symbol" w:hAnsi="Symbol" w:hint="default"/>
+        <w:sz w:val="20"/>
+      </w:rPr>
+    </w:lvl>
+    <w:lvl w:ilvl="1" w:tentative="1">
+      <w:start w:val="1"/>
+      <w:numFmt w:val="bullet"/>
+      <w:lvlText w:val="o"/>
+      <w:lvlJc w:val="left"/>
+      <w:pPr>
+        <w:tabs>
+          <w:tab w:val="num" w:pos="1440"/>
+        </w:tabs>
+        <w:ind w:left="1440" w:hanging="360"/>
+      </w:pPr>
+      <w:rPr>
+        <w:rFonts w:ascii="Courier New" w:hAnsi="Courier New" w:hint="default"/>
+        <w:sz w:val="20"/>
+      </w:rPr>
+    </w:lvl>
+    <w:lvl w:ilvl="2" w:tentative="1">
+      <w:start w:val="1"/>
+      <w:numFmt w:val="bullet"/>
+      <w:lvlText w:val=""/>
+      <w:lvlJc w:val="left"/>
+      <w:pPr>
+        <w:tabs>
+          <w:tab w:val="num" w:pos="2160"/>
+        </w:tabs>
+        <w:ind w:left="2160" w:hanging="360"/>
+      </w:pPr>
+      <w:rPr>
+        <w:rFonts w:ascii="Wingdings" w:hAnsi="Wingdings" w:hint="default"/>
+        <w:sz w:val="20"/>
+      </w:rPr>
+    </w:lvl>
+    <w:lvl w:ilvl="3" w:tentative="1">
+      <w:start w:val="1"/>
+      <w:numFmt w:val="bullet"/>
+      <w:lvlText w:val=""/>
+      <w:lvlJc w:val="left"/>
+      <w:pPr>
+        <w:tabs>
+          <w:tab w:val="num" w:pos="2880"/>
+        </w:tabs>
+        <w:ind w:left="2880" w:hanging="360"/>
+      </w:pPr>
+      <w:rPr>
+        <w:rFonts w:ascii="Wingdings" w:hAnsi="Wingdings" w:hint="default"/>
+        <w:sz w:val="20"/>
+      </w:rPr>
+    </w:lvl>
+    <w:lvl w:ilvl="4" w:tentative="1">
+      <w:start w:val="1"/>
+      <w:numFmt w:val="bullet"/>
+      <w:lvlText w:val=""/>
+      <w:lvlJc w:val="left"/>
+      <w:pPr>
+        <w:tabs>
+          <w:tab w:val="num" w:pos="3600"/>
+        </w:tabs>
+        <w:ind w:left="3600" w:hanging="360"/>
+      </w:pPr>
+      <w:rPr>
+        <w:rFonts w:ascii="Wingdings" w:hAnsi="Wingdings" w:hint="default"/>
+        <w:sz w:val="20"/>
+      </w:rPr>
+    </w:lvl>
+    <w:lvl w:ilvl="5" w:tentative="1">
+      <w:start w:val="1"/>
+      <w:numFmt w:val="bullet"/>
+      <w:lvlText w:val=""/>
+      <w:lvlJc w:val="left"/>
+      <w:pPr>
+        <w:tabs>
+          <w:tab w:val="num" w:pos="4320"/>
+        </w:tabs>
+        <w:ind w:left="4320" w:hanging="360"/>
+      </w:pPr>
+      <w:rPr>
+        <w:rFonts w:ascii="Wingdings" w:hAnsi="Wingdings" w:hint="default"/>
+        <w:sz w:val="20"/>
+      </w:rPr>
+    </w:lvl>
+    <w:lvl w:ilvl="6" w:tentative="1">
+      <w:start w:val="1"/>
+      <w:numFmt w:val="bullet"/>
+      <w:lvlText w:val=""/>
+      <w:lvlJc w:val="left"/>
+      <w:pPr>
+        <w:tabs>
+          <w:tab w:val="num" w:pos="5040"/>
+        </w:tabs>
+        <w:ind w:left="5040" w:hanging="360"/>
+      </w:pPr>
+      <w:rPr>
+        <w:rFonts w:ascii="Wingdings" w:hAnsi="Wingdings" w:hint="default"/>
+        <w:sz w:val="20"/>
+      </w:rPr>
+    </w:lvl>
+    <w:lvl w:ilvl="7" w:tentative="1">
+      <w:start w:val="1"/>
+      <w:numFmt w:val="bullet"/>
+      <w:lvlText w:val=""/>
+      <w:lvlJc w:val="left"/>
+      <w:pPr>
+        <w:tabs>
+          <w:tab w:val="num" w:pos="5760"/>
+        </w:tabs>
+        <w:ind w:left="5760" w:hanging="360"/>
+      </w:pPr>
+      <w:rPr>
+        <w:rFonts w:ascii="Wingdings" w:hAnsi="Wingdings" w:hint="default"/>
+        <w:sz w:val="20"/>
+      </w:rPr>
+    </w:lvl>
+    <w:lvl w:ilvl="8" w:tentative="1">
+      <w:start w:val="1"/>
+      <w:numFmt w:val="bullet"/>
+      <w:lvlText w:val=""/>
+      <w:lvlJc w:val="left"/>
+      <w:pPr>
+        <w:tabs>
+          <w:tab w:val="num" w:pos="6480"/>
+        </w:tabs>
+        <w:ind w:left="6480" w:hanging="360"/>
+      </w:pPr>
+      <w:rPr>
+        <w:rFonts w:ascii="Wingdings" w:hAnsi="Wingdings" w:hint="default"/>
+        <w:sz w:val="20"/>
+      </w:rPr>
+    </w:lvl>
+  </w:abstractNum>
+  <w:abstractNum w:abstractNumId="6" w15:restartNumberingAfterBreak="0">
     <w:nsid w:val="5C7F3EA5"/>
     <w:multiLevelType w:val="multilevel"/>
     <w:tmpl w:val="E292C06A"/>
@@ -1892,7 +4359,481 @@
       </w:rPr>
     </w:lvl>
   </w:abstractNum>
+  <w:abstractNum w:abstractNumId="7" w15:restartNumberingAfterBreak="0">
+    <w:nsid w:val="5E576AB2"/>
+    <w:multiLevelType w:val="multilevel"/>
+    <w:tmpl w:val="E726620C"/>
+    <w:lvl w:ilvl="0">
+      <w:start w:val="1"/>
+      <w:numFmt w:val="bullet"/>
+      <w:lvlText w:val=""/>
+      <w:lvlJc w:val="left"/>
+      <w:pPr>
+        <w:tabs>
+          <w:tab w:val="num" w:pos="720"/>
+        </w:tabs>
+        <w:ind w:left="720" w:hanging="360"/>
+      </w:pPr>
+      <w:rPr>
+        <w:rFonts w:ascii="Symbol" w:hAnsi="Symbol" w:hint="default"/>
+        <w:sz w:val="20"/>
+      </w:rPr>
+    </w:lvl>
+    <w:lvl w:ilvl="1" w:tentative="1">
+      <w:start w:val="1"/>
+      <w:numFmt w:val="bullet"/>
+      <w:lvlText w:val="o"/>
+      <w:lvlJc w:val="left"/>
+      <w:pPr>
+        <w:tabs>
+          <w:tab w:val="num" w:pos="1440"/>
+        </w:tabs>
+        <w:ind w:left="1440" w:hanging="360"/>
+      </w:pPr>
+      <w:rPr>
+        <w:rFonts w:ascii="Courier New" w:hAnsi="Courier New" w:hint="default"/>
+        <w:sz w:val="20"/>
+      </w:rPr>
+    </w:lvl>
+    <w:lvl w:ilvl="2" w:tentative="1">
+      <w:start w:val="1"/>
+      <w:numFmt w:val="bullet"/>
+      <w:lvlText w:val=""/>
+      <w:lvlJc w:val="left"/>
+      <w:pPr>
+        <w:tabs>
+          <w:tab w:val="num" w:pos="2160"/>
+        </w:tabs>
+        <w:ind w:left="2160" w:hanging="360"/>
+      </w:pPr>
+      <w:rPr>
+        <w:rFonts w:ascii="Wingdings" w:hAnsi="Wingdings" w:hint="default"/>
+        <w:sz w:val="20"/>
+      </w:rPr>
+    </w:lvl>
+    <w:lvl w:ilvl="3" w:tentative="1">
+      <w:start w:val="1"/>
+      <w:numFmt w:val="bullet"/>
+      <w:lvlText w:val=""/>
+      <w:lvlJc w:val="left"/>
+      <w:pPr>
+        <w:tabs>
+          <w:tab w:val="num" w:pos="2880"/>
+        </w:tabs>
+        <w:ind w:left="2880" w:hanging="360"/>
+      </w:pPr>
+      <w:rPr>
+        <w:rFonts w:ascii="Wingdings" w:hAnsi="Wingdings" w:hint="default"/>
+        <w:sz w:val="20"/>
+      </w:rPr>
+    </w:lvl>
+    <w:lvl w:ilvl="4" w:tentative="1">
+      <w:start w:val="1"/>
+      <w:numFmt w:val="bullet"/>
+      <w:lvlText w:val=""/>
+      <w:lvlJc w:val="left"/>
+      <w:pPr>
+        <w:tabs>
+          <w:tab w:val="num" w:pos="3600"/>
+        </w:tabs>
+        <w:ind w:left="3600" w:hanging="360"/>
+      </w:pPr>
+      <w:rPr>
+        <w:rFonts w:ascii="Wingdings" w:hAnsi="Wingdings" w:hint="default"/>
+        <w:sz w:val="20"/>
+      </w:rPr>
+    </w:lvl>
+    <w:lvl w:ilvl="5" w:tentative="1">
+      <w:start w:val="1"/>
+      <w:numFmt w:val="bullet"/>
+      <w:lvlText w:val=""/>
+      <w:lvlJc w:val="left"/>
+      <w:pPr>
+        <w:tabs>
+          <w:tab w:val="num" w:pos="4320"/>
+        </w:tabs>
+        <w:ind w:left="4320" w:hanging="360"/>
+      </w:pPr>
+      <w:rPr>
+        <w:rFonts w:ascii="Wingdings" w:hAnsi="Wingdings" w:hint="default"/>
+        <w:sz w:val="20"/>
+      </w:rPr>
+    </w:lvl>
+    <w:lvl w:ilvl="6" w:tentative="1">
+      <w:start w:val="1"/>
+      <w:numFmt w:val="bullet"/>
+      <w:lvlText w:val=""/>
+      <w:lvlJc w:val="left"/>
+      <w:pPr>
+        <w:tabs>
+          <w:tab w:val="num" w:pos="5040"/>
+        </w:tabs>
+        <w:ind w:left="5040" w:hanging="360"/>
+      </w:pPr>
+      <w:rPr>
+        <w:rFonts w:ascii="Wingdings" w:hAnsi="Wingdings" w:hint="default"/>
+        <w:sz w:val="20"/>
+      </w:rPr>
+    </w:lvl>
+    <w:lvl w:ilvl="7" w:tentative="1">
+      <w:start w:val="1"/>
+      <w:numFmt w:val="bullet"/>
+      <w:lvlText w:val=""/>
+      <w:lvlJc w:val="left"/>
+      <w:pPr>
+        <w:tabs>
+          <w:tab w:val="num" w:pos="5760"/>
+        </w:tabs>
+        <w:ind w:left="5760" w:hanging="360"/>
+      </w:pPr>
+      <w:rPr>
+        <w:rFonts w:ascii="Wingdings" w:hAnsi="Wingdings" w:hint="default"/>
+        <w:sz w:val="20"/>
+      </w:rPr>
+    </w:lvl>
+    <w:lvl w:ilvl="8" w:tentative="1">
+      <w:start w:val="1"/>
+      <w:numFmt w:val="bullet"/>
+      <w:lvlText w:val=""/>
+      <w:lvlJc w:val="left"/>
+      <w:pPr>
+        <w:tabs>
+          <w:tab w:val="num" w:pos="6480"/>
+        </w:tabs>
+        <w:ind w:left="6480" w:hanging="360"/>
+      </w:pPr>
+      <w:rPr>
+        <w:rFonts w:ascii="Wingdings" w:hAnsi="Wingdings" w:hint="default"/>
+        <w:sz w:val="20"/>
+      </w:rPr>
+    </w:lvl>
+  </w:abstractNum>
+  <w:abstractNum w:abstractNumId="8" w15:restartNumberingAfterBreak="0">
+    <w:nsid w:val="72DE07B6"/>
+    <w:multiLevelType w:val="multilevel"/>
+    <w:tmpl w:val="F3A24FD6"/>
+    <w:lvl w:ilvl="0">
+      <w:start w:val="1"/>
+      <w:numFmt w:val="bullet"/>
+      <w:lvlText w:val=""/>
+      <w:lvlJc w:val="left"/>
+      <w:pPr>
+        <w:tabs>
+          <w:tab w:val="num" w:pos="720"/>
+        </w:tabs>
+        <w:ind w:left="720" w:hanging="360"/>
+      </w:pPr>
+      <w:rPr>
+        <w:rFonts w:ascii="Symbol" w:hAnsi="Symbol" w:hint="default"/>
+        <w:sz w:val="20"/>
+      </w:rPr>
+    </w:lvl>
+    <w:lvl w:ilvl="1" w:tentative="1">
+      <w:start w:val="1"/>
+      <w:numFmt w:val="bullet"/>
+      <w:lvlText w:val="o"/>
+      <w:lvlJc w:val="left"/>
+      <w:pPr>
+        <w:tabs>
+          <w:tab w:val="num" w:pos="1440"/>
+        </w:tabs>
+        <w:ind w:left="1440" w:hanging="360"/>
+      </w:pPr>
+      <w:rPr>
+        <w:rFonts w:ascii="Courier New" w:hAnsi="Courier New" w:hint="default"/>
+        <w:sz w:val="20"/>
+      </w:rPr>
+    </w:lvl>
+    <w:lvl w:ilvl="2" w:tentative="1">
+      <w:start w:val="1"/>
+      <w:numFmt w:val="bullet"/>
+      <w:lvlText w:val=""/>
+      <w:lvlJc w:val="left"/>
+      <w:pPr>
+        <w:tabs>
+          <w:tab w:val="num" w:pos="2160"/>
+        </w:tabs>
+        <w:ind w:left="2160" w:hanging="360"/>
+      </w:pPr>
+      <w:rPr>
+        <w:rFonts w:ascii="Wingdings" w:hAnsi="Wingdings" w:hint="default"/>
+        <w:sz w:val="20"/>
+      </w:rPr>
+    </w:lvl>
+    <w:lvl w:ilvl="3" w:tentative="1">
+      <w:start w:val="1"/>
+      <w:numFmt w:val="bullet"/>
+      <w:lvlText w:val=""/>
+      <w:lvlJc w:val="left"/>
+      <w:pPr>
+        <w:tabs>
+          <w:tab w:val="num" w:pos="2880"/>
+        </w:tabs>
+        <w:ind w:left="2880" w:hanging="360"/>
+      </w:pPr>
+      <w:rPr>
+        <w:rFonts w:ascii="Wingdings" w:hAnsi="Wingdings" w:hint="default"/>
+        <w:sz w:val="20"/>
+      </w:rPr>
+    </w:lvl>
+    <w:lvl w:ilvl="4" w:tentative="1">
+      <w:start w:val="1"/>
+      <w:numFmt w:val="bullet"/>
+      <w:lvlText w:val=""/>
+      <w:lvlJc w:val="left"/>
+      <w:pPr>
+        <w:tabs>
+          <w:tab w:val="num" w:pos="3600"/>
+        </w:tabs>
+        <w:ind w:left="3600" w:hanging="360"/>
+      </w:pPr>
+      <w:rPr>
+        <w:rFonts w:ascii="Wingdings" w:hAnsi="Wingdings" w:hint="default"/>
+        <w:sz w:val="20"/>
+      </w:rPr>
+    </w:lvl>
+    <w:lvl w:ilvl="5" w:tentative="1">
+      <w:start w:val="1"/>
+      <w:numFmt w:val="bullet"/>
+      <w:lvlText w:val=""/>
+      <w:lvlJc w:val="left"/>
+      <w:pPr>
+        <w:tabs>
+          <w:tab w:val="num" w:pos="4320"/>
+        </w:tabs>
+        <w:ind w:left="4320" w:hanging="360"/>
+      </w:pPr>
+      <w:rPr>
+        <w:rFonts w:ascii="Wingdings" w:hAnsi="Wingdings" w:hint="default"/>
+        <w:sz w:val="20"/>
+      </w:rPr>
+    </w:lvl>
+    <w:lvl w:ilvl="6" w:tentative="1">
+      <w:start w:val="1"/>
+      <w:numFmt w:val="bullet"/>
+      <w:lvlText w:val=""/>
+      <w:lvlJc w:val="left"/>
+      <w:pPr>
+        <w:tabs>
+          <w:tab w:val="num" w:pos="5040"/>
+        </w:tabs>
+        <w:ind w:left="5040" w:hanging="360"/>
+      </w:pPr>
+      <w:rPr>
+        <w:rFonts w:ascii="Wingdings" w:hAnsi="Wingdings" w:hint="default"/>
+        <w:sz w:val="20"/>
+      </w:rPr>
+    </w:lvl>
+    <w:lvl w:ilvl="7" w:tentative="1">
+      <w:start w:val="1"/>
+      <w:numFmt w:val="bullet"/>
+      <w:lvlText w:val=""/>
+      <w:lvlJc w:val="left"/>
+      <w:pPr>
+        <w:tabs>
+          <w:tab w:val="num" w:pos="5760"/>
+        </w:tabs>
+        <w:ind w:left="5760" w:hanging="360"/>
+      </w:pPr>
+      <w:rPr>
+        <w:rFonts w:ascii="Wingdings" w:hAnsi="Wingdings" w:hint="default"/>
+        <w:sz w:val="20"/>
+      </w:rPr>
+    </w:lvl>
+    <w:lvl w:ilvl="8" w:tentative="1">
+      <w:start w:val="1"/>
+      <w:numFmt w:val="bullet"/>
+      <w:lvlText w:val=""/>
+      <w:lvlJc w:val="left"/>
+      <w:pPr>
+        <w:tabs>
+          <w:tab w:val="num" w:pos="6480"/>
+        </w:tabs>
+        <w:ind w:left="6480" w:hanging="360"/>
+      </w:pPr>
+      <w:rPr>
+        <w:rFonts w:ascii="Wingdings" w:hAnsi="Wingdings" w:hint="default"/>
+        <w:sz w:val="20"/>
+      </w:rPr>
+    </w:lvl>
+  </w:abstractNum>
+  <w:abstractNum w:abstractNumId="9" w15:restartNumberingAfterBreak="0">
+    <w:nsid w:val="73DB72A2"/>
+    <w:multiLevelType w:val="multilevel"/>
+    <w:tmpl w:val="1B24B312"/>
+    <w:lvl w:ilvl="0">
+      <w:start w:val="1"/>
+      <w:numFmt w:val="bullet"/>
+      <w:lvlText w:val=""/>
+      <w:lvlJc w:val="left"/>
+      <w:pPr>
+        <w:tabs>
+          <w:tab w:val="num" w:pos="720"/>
+        </w:tabs>
+        <w:ind w:left="720" w:hanging="360"/>
+      </w:pPr>
+      <w:rPr>
+        <w:rFonts w:ascii="Symbol" w:hAnsi="Symbol" w:hint="default"/>
+        <w:sz w:val="20"/>
+      </w:rPr>
+    </w:lvl>
+    <w:lvl w:ilvl="1" w:tentative="1">
+      <w:start w:val="1"/>
+      <w:numFmt w:val="bullet"/>
+      <w:lvlText w:val="o"/>
+      <w:lvlJc w:val="left"/>
+      <w:pPr>
+        <w:tabs>
+          <w:tab w:val="num" w:pos="1440"/>
+        </w:tabs>
+        <w:ind w:left="1440" w:hanging="360"/>
+      </w:pPr>
+      <w:rPr>
+        <w:rFonts w:ascii="Courier New" w:hAnsi="Courier New" w:hint="default"/>
+        <w:sz w:val="20"/>
+      </w:rPr>
+    </w:lvl>
+    <w:lvl w:ilvl="2" w:tentative="1">
+      <w:start w:val="1"/>
+      <w:numFmt w:val="bullet"/>
+      <w:lvlText w:val=""/>
+      <w:lvlJc w:val="left"/>
+      <w:pPr>
+        <w:tabs>
+          <w:tab w:val="num" w:pos="2160"/>
+        </w:tabs>
+        <w:ind w:left="2160" w:hanging="360"/>
+      </w:pPr>
+      <w:rPr>
+        <w:rFonts w:ascii="Wingdings" w:hAnsi="Wingdings" w:hint="default"/>
+        <w:sz w:val="20"/>
+      </w:rPr>
+    </w:lvl>
+    <w:lvl w:ilvl="3" w:tentative="1">
+      <w:start w:val="1"/>
+      <w:numFmt w:val="bullet"/>
+      <w:lvlText w:val=""/>
+      <w:lvlJc w:val="left"/>
+      <w:pPr>
+        <w:tabs>
+          <w:tab w:val="num" w:pos="2880"/>
+        </w:tabs>
+        <w:ind w:left="2880" w:hanging="360"/>
+      </w:pPr>
+      <w:rPr>
+        <w:rFonts w:ascii="Wingdings" w:hAnsi="Wingdings" w:hint="default"/>
+        <w:sz w:val="20"/>
+      </w:rPr>
+    </w:lvl>
+    <w:lvl w:ilvl="4" w:tentative="1">
+      <w:start w:val="1"/>
+      <w:numFmt w:val="bullet"/>
+      <w:lvlText w:val=""/>
+      <w:lvlJc w:val="left"/>
+      <w:pPr>
+        <w:tabs>
+          <w:tab w:val="num" w:pos="3600"/>
+        </w:tabs>
+        <w:ind w:left="3600" w:hanging="360"/>
+      </w:pPr>
+      <w:rPr>
+        <w:rFonts w:ascii="Wingdings" w:hAnsi="Wingdings" w:hint="default"/>
+        <w:sz w:val="20"/>
+      </w:rPr>
+    </w:lvl>
+    <w:lvl w:ilvl="5" w:tentative="1">
+      <w:start w:val="1"/>
+      <w:numFmt w:val="bullet"/>
+      <w:lvlText w:val=""/>
+      <w:lvlJc w:val="left"/>
+      <w:pPr>
+        <w:tabs>
+          <w:tab w:val="num" w:pos="4320"/>
+        </w:tabs>
+        <w:ind w:left="4320" w:hanging="360"/>
+      </w:pPr>
+      <w:rPr>
+        <w:rFonts w:ascii="Wingdings" w:hAnsi="Wingdings" w:hint="default"/>
+        <w:sz w:val="20"/>
+      </w:rPr>
+    </w:lvl>
+    <w:lvl w:ilvl="6" w:tentative="1">
+      <w:start w:val="1"/>
+      <w:numFmt w:val="bullet"/>
+      <w:lvlText w:val=""/>
+      <w:lvlJc w:val="left"/>
+      <w:pPr>
+        <w:tabs>
+          <w:tab w:val="num" w:pos="5040"/>
+        </w:tabs>
+        <w:ind w:left="5040" w:hanging="360"/>
+      </w:pPr>
+      <w:rPr>
+        <w:rFonts w:ascii="Wingdings" w:hAnsi="Wingdings" w:hint="default"/>
+        <w:sz w:val="20"/>
+      </w:rPr>
+    </w:lvl>
+    <w:lvl w:ilvl="7" w:tentative="1">
+      <w:start w:val="1"/>
+      <w:numFmt w:val="bullet"/>
+      <w:lvlText w:val=""/>
+      <w:lvlJc w:val="left"/>
+      <w:pPr>
+        <w:tabs>
+          <w:tab w:val="num" w:pos="5760"/>
+        </w:tabs>
+        <w:ind w:left="5760" w:hanging="360"/>
+      </w:pPr>
+      <w:rPr>
+        <w:rFonts w:ascii="Wingdings" w:hAnsi="Wingdings" w:hint="default"/>
+        <w:sz w:val="20"/>
+      </w:rPr>
+    </w:lvl>
+    <w:lvl w:ilvl="8" w:tentative="1">
+      <w:start w:val="1"/>
+      <w:numFmt w:val="bullet"/>
+      <w:lvlText w:val=""/>
+      <w:lvlJc w:val="left"/>
+      <w:pPr>
+        <w:tabs>
+          <w:tab w:val="num" w:pos="6480"/>
+        </w:tabs>
+        <w:ind w:left="6480" w:hanging="360"/>
+      </w:pPr>
+      <w:rPr>
+        <w:rFonts w:ascii="Wingdings" w:hAnsi="Wingdings" w:hint="default"/>
+        <w:sz w:val="20"/>
+      </w:rPr>
+    </w:lvl>
+  </w:abstractNum>
   <w:num w:numId="1" w16cid:durableId="993529380">
+    <w:abstractNumId w:val="6"/>
+  </w:num>
+  <w:num w:numId="2" w16cid:durableId="1957254034">
+    <w:abstractNumId w:val="7"/>
+  </w:num>
+  <w:num w:numId="3" w16cid:durableId="734547526">
+    <w:abstractNumId w:val="5"/>
+  </w:num>
+  <w:num w:numId="4" w16cid:durableId="146020699">
+    <w:abstractNumId w:val="1"/>
+  </w:num>
+  <w:num w:numId="5" w16cid:durableId="174611146">
+    <w:abstractNumId w:val="8"/>
+  </w:num>
+  <w:num w:numId="6" w16cid:durableId="1825274068">
+    <w:abstractNumId w:val="3"/>
+  </w:num>
+  <w:num w:numId="7" w16cid:durableId="454258387">
+    <w:abstractNumId w:val="2"/>
+  </w:num>
+  <w:num w:numId="8" w16cid:durableId="677578760">
+    <w:abstractNumId w:val="9"/>
+  </w:num>
+  <w:num w:numId="9" w16cid:durableId="1490436316">
+    <w:abstractNumId w:val="4"/>
+  </w:num>
+  <w:num w:numId="10" w16cid:durableId="1596278286">
     <w:abstractNumId w:val="0"/>
   </w:num>
   <w:numIdMacAtCleanup w:val="1"/>
@@ -2492,7 +5433,6 @@
     <w:name w:val="Normal (Web)"/>
     <w:basedOn w:val="Normalny"/>
     <w:uiPriority w:val="99"/>
-    <w:semiHidden/>
     <w:unhideWhenUsed/>
     <w:rsid w:val="00EA250B"/>
     <w:pPr>

</xml_diff>

<commit_message>
5.4 - Propozycje interfejsu użytkownika
</commit_message>
<xml_diff>
--- a/TK/TK.docx
+++ b/TK/TK.docx
@@ -5732,6 +5732,2667 @@
         </w:rPr>
         <w:t>Stan końcowy, decyzja negatywna dla klienta.</w:t>
       </w:r>
+    </w:p>
+    <w:p>
+      <w:pPr>
+        <w:spacing w:after="240" w:line="240" w:lineRule="auto"/>
+        <w:rPr>
+          <w:rFonts w:ascii="Times New Roman" w:eastAsia="Times New Roman" w:hAnsi="Times New Roman" w:cs="Times New Roman"/>
+          <w:sz w:val="24"/>
+          <w:szCs w:val="24"/>
+          <w:lang w:val="pl-PL"/>
+        </w:rPr>
+      </w:pPr>
+    </w:p>
+    <w:p>
+      <w:pPr>
+        <w:spacing w:after="240" w:line="240" w:lineRule="auto"/>
+        <w:rPr>
+          <w:rFonts w:ascii="Times New Roman" w:eastAsia="Times New Roman" w:hAnsi="Times New Roman" w:cs="Times New Roman"/>
+          <w:sz w:val="24"/>
+          <w:szCs w:val="24"/>
+          <w:lang w:val="pl-PL"/>
+        </w:rPr>
+      </w:pPr>
+    </w:p>
+    <w:p>
+      <w:pPr>
+        <w:spacing w:after="240" w:line="240" w:lineRule="auto"/>
+        <w:rPr>
+          <w:rFonts w:ascii="Times New Roman" w:eastAsia="Times New Roman" w:hAnsi="Times New Roman" w:cs="Times New Roman"/>
+          <w:sz w:val="24"/>
+          <w:szCs w:val="24"/>
+          <w:lang w:val="pl-PL"/>
+        </w:rPr>
+      </w:pPr>
+    </w:p>
+    <w:p>
+      <w:pPr>
+        <w:spacing w:after="240" w:line="240" w:lineRule="auto"/>
+        <w:rPr>
+          <w:rFonts w:ascii="Times New Roman" w:eastAsia="Times New Roman" w:hAnsi="Times New Roman" w:cs="Times New Roman"/>
+          <w:sz w:val="24"/>
+          <w:szCs w:val="24"/>
+          <w:lang w:val="pl-PL"/>
+        </w:rPr>
+      </w:pPr>
+    </w:p>
+    <w:p>
+      <w:pPr>
+        <w:spacing w:after="240" w:line="240" w:lineRule="auto"/>
+        <w:rPr>
+          <w:rFonts w:ascii="Times New Roman" w:eastAsia="Times New Roman" w:hAnsi="Times New Roman" w:cs="Times New Roman"/>
+          <w:sz w:val="24"/>
+          <w:szCs w:val="24"/>
+          <w:lang w:val="pl-PL"/>
+        </w:rPr>
+      </w:pPr>
+    </w:p>
+    <w:p>
+      <w:pPr>
+        <w:spacing w:after="240" w:line="240" w:lineRule="auto"/>
+        <w:rPr>
+          <w:rFonts w:ascii="Times New Roman" w:eastAsia="Times New Roman" w:hAnsi="Times New Roman" w:cs="Times New Roman"/>
+          <w:sz w:val="24"/>
+          <w:szCs w:val="24"/>
+          <w:lang w:val="pl-PL"/>
+        </w:rPr>
+      </w:pPr>
+    </w:p>
+    <w:p>
+      <w:pPr>
+        <w:spacing w:line="240" w:lineRule="auto"/>
+        <w:rPr>
+          <w:rFonts w:eastAsia="Times New Roman"/>
+          <w:b/>
+          <w:bCs/>
+          <w:color w:val="000000"/>
+          <w:sz w:val="28"/>
+          <w:szCs w:val="28"/>
+          <w:lang w:val="pl-PL"/>
+        </w:rPr>
+      </w:pPr>
+      <w:r>
+        <w:rPr>
+          <w:rFonts w:eastAsia="Times New Roman"/>
+          <w:b/>
+          <w:bCs/>
+          <w:color w:val="000000"/>
+          <w:sz w:val="28"/>
+          <w:szCs w:val="28"/>
+          <w:lang w:val="pl-PL"/>
+        </w:rPr>
+        <w:lastRenderedPageBreak/>
+        <w:t>5.4. Propozycje interfejsu użytkownika</w:t>
+      </w:r>
+    </w:p>
+    <w:p>
+      <w:pPr>
+        <w:spacing w:line="240" w:lineRule="auto"/>
+        <w:rPr>
+          <w:rFonts w:ascii="Times New Roman" w:eastAsia="Times New Roman" w:hAnsi="Times New Roman" w:cs="Times New Roman"/>
+          <w:color w:val="000000"/>
+          <w:sz w:val="24"/>
+          <w:szCs w:val="24"/>
+          <w:lang w:val="pl-PL"/>
+        </w:rPr>
+      </w:pPr>
+    </w:p>
+    <w:p>
+      <w:pPr>
+        <w:spacing w:line="240" w:lineRule="auto"/>
+        <w:rPr>
+          <w:rFonts w:eastAsia="Times New Roman"/>
+          <w:b/>
+          <w:bCs/>
+          <w:color w:val="000000"/>
+          <w:sz w:val="24"/>
+          <w:szCs w:val="24"/>
+          <w:lang w:val="pl-PL"/>
+        </w:rPr>
+      </w:pPr>
+      <w:r>
+        <w:rPr>
+          <w:rFonts w:eastAsia="Times New Roman"/>
+          <w:b/>
+          <w:bCs/>
+          <w:color w:val="000000"/>
+          <w:sz w:val="24"/>
+          <w:szCs w:val="24"/>
+          <w:lang w:val="pl-PL"/>
+        </w:rPr>
+        <w:t>Strona główna</w:t>
+      </w:r>
+    </w:p>
+    <w:p>
+      <w:pPr>
+        <w:spacing w:line="240" w:lineRule="auto"/>
+        <w:rPr>
+          <w:rFonts w:ascii="Times New Roman" w:eastAsia="Times New Roman" w:hAnsi="Times New Roman" w:cs="Times New Roman"/>
+          <w:color w:val="000000"/>
+          <w:sz w:val="24"/>
+          <w:szCs w:val="24"/>
+          <w:lang w:val="pl-PL"/>
+        </w:rPr>
+      </w:pPr>
+    </w:p>
+    <w:p>
+      <w:pPr>
+        <w:spacing w:line="240" w:lineRule="auto"/>
+        <w:rPr>
+          <w:rFonts w:ascii="Times New Roman" w:eastAsia="Times New Roman" w:hAnsi="Times New Roman" w:cs="Times New Roman"/>
+          <w:color w:val="000000"/>
+          <w:sz w:val="24"/>
+          <w:szCs w:val="24"/>
+          <w:lang w:val="pl-PL"/>
+        </w:rPr>
+      </w:pPr>
+      <w:r>
+        <w:rPr>
+          <w:rFonts w:eastAsia="Times New Roman"/>
+          <w:b/>
+          <w:bCs/>
+          <w:noProof/>
+          <w:color w:val="000000"/>
+          <w:sz w:val="24"/>
+          <w:szCs w:val="24"/>
+          <w:bdr w:val="none" w:sz="0" w:space="0" w:color="auto" w:frame="1"/>
+          <w:lang w:val="pl-PL"/>
+        </w:rPr>
+        <w:drawing>
+          <wp:inline distT="0" distB="0" distL="0" distR="0" wp14:anchorId="08F9121B" wp14:editId="67FBC753">
+            <wp:extent cx="6835775" cy="8649335"/>
+            <wp:effectExtent l="0" t="0" r="0" b="0"/>
+            <wp:docPr id="39542113" name="Obraz 13"/>
+            <wp:cNvGraphicFramePr>
+              <a:graphicFrameLocks xmlns:a="http://schemas.openxmlformats.org/drawingml/2006/main" noChangeAspect="1"/>
+            </wp:cNvGraphicFramePr>
+            <a:graphic xmlns:a="http://schemas.openxmlformats.org/drawingml/2006/main">
+              <a:graphicData uri="http://schemas.openxmlformats.org/drawingml/2006/picture">
+                <pic:pic xmlns:pic="http://schemas.openxmlformats.org/drawingml/2006/picture">
+                  <pic:nvPicPr>
+                    <pic:cNvPr id="0" name="Picture 1"/>
+                    <pic:cNvPicPr>
+                      <a:picLocks noChangeAspect="1" noChangeArrowheads="1"/>
+                    </pic:cNvPicPr>
+                  </pic:nvPicPr>
+                  <pic:blipFill>
+                    <a:blip r:embed="rId13">
+                      <a:extLst>
+                        <a:ext uri="{28A0092B-C50C-407E-A947-70E740481C1C}">
+                          <a14:useLocalDpi xmlns:a14="http://schemas.microsoft.com/office/drawing/2010/main" val="0"/>
+                        </a:ext>
+                      </a:extLst>
+                    </a:blip>
+                    <a:srcRect/>
+                    <a:stretch>
+                      <a:fillRect/>
+                    </a:stretch>
+                  </pic:blipFill>
+                  <pic:spPr bwMode="auto">
+                    <a:xfrm>
+                      <a:off x="0" y="0"/>
+                      <a:ext cx="6835775" cy="8649335"/>
+                    </a:xfrm>
+                    <a:prstGeom prst="rect">
+                      <a:avLst/>
+                    </a:prstGeom>
+                    <a:noFill/>
+                    <a:ln>
+                      <a:noFill/>
+                    </a:ln>
+                  </pic:spPr>
+                </pic:pic>
+              </a:graphicData>
+            </a:graphic>
+          </wp:inline>
+        </w:drawing>
+      </w:r>
+    </w:p>
+    <w:p>
+      <w:pPr>
+        <w:spacing w:line="240" w:lineRule="auto"/>
+        <w:rPr>
+          <w:rFonts w:eastAsia="Times New Roman"/>
+          <w:b/>
+          <w:bCs/>
+          <w:color w:val="000000"/>
+          <w:sz w:val="24"/>
+          <w:szCs w:val="24"/>
+          <w:lang w:val="pl-PL"/>
+        </w:rPr>
+      </w:pPr>
+    </w:p>
+    <w:p>
+      <w:pPr>
+        <w:spacing w:line="240" w:lineRule="auto"/>
+        <w:rPr>
+          <w:rFonts w:eastAsia="Times New Roman"/>
+          <w:b/>
+          <w:bCs/>
+          <w:color w:val="000000"/>
+          <w:sz w:val="24"/>
+          <w:szCs w:val="24"/>
+          <w:lang w:val="pl-PL"/>
+        </w:rPr>
+      </w:pPr>
+    </w:p>
+    <w:p>
+      <w:pPr>
+        <w:spacing w:line="240" w:lineRule="auto"/>
+        <w:rPr>
+          <w:rFonts w:eastAsia="Times New Roman"/>
+          <w:b/>
+          <w:bCs/>
+          <w:color w:val="000000"/>
+          <w:sz w:val="24"/>
+          <w:szCs w:val="24"/>
+          <w:lang w:val="pl-PL"/>
+        </w:rPr>
+      </w:pPr>
+    </w:p>
+    <w:p>
+      <w:pPr>
+        <w:spacing w:line="240" w:lineRule="auto"/>
+        <w:rPr>
+          <w:rFonts w:eastAsia="Times New Roman"/>
+          <w:b/>
+          <w:bCs/>
+          <w:color w:val="000000"/>
+          <w:sz w:val="24"/>
+          <w:szCs w:val="24"/>
+          <w:lang w:val="pl-PL"/>
+        </w:rPr>
+      </w:pPr>
+    </w:p>
+    <w:p>
+      <w:pPr>
+        <w:spacing w:line="240" w:lineRule="auto"/>
+        <w:rPr>
+          <w:rFonts w:eastAsia="Times New Roman"/>
+          <w:b/>
+          <w:bCs/>
+          <w:color w:val="000000"/>
+          <w:sz w:val="24"/>
+          <w:szCs w:val="24"/>
+          <w:lang w:val="pl-PL"/>
+        </w:rPr>
+      </w:pPr>
+      <w:r>
+        <w:rPr>
+          <w:rFonts w:eastAsia="Times New Roman"/>
+          <w:b/>
+          <w:bCs/>
+          <w:color w:val="000000"/>
+          <w:sz w:val="24"/>
+          <w:szCs w:val="24"/>
+          <w:lang w:val="pl-PL"/>
+        </w:rPr>
+        <w:t>Rejestracja</w:t>
+      </w:r>
+    </w:p>
+    <w:p>
+      <w:pPr>
+        <w:spacing w:line="240" w:lineRule="auto"/>
+        <w:rPr>
+          <w:rFonts w:ascii="Times New Roman" w:eastAsia="Times New Roman" w:hAnsi="Times New Roman" w:cs="Times New Roman"/>
+          <w:color w:val="000000"/>
+          <w:sz w:val="24"/>
+          <w:szCs w:val="24"/>
+          <w:lang w:val="pl-PL"/>
+        </w:rPr>
+      </w:pPr>
+    </w:p>
+    <w:p>
+      <w:pPr>
+        <w:spacing w:line="240" w:lineRule="auto"/>
+        <w:rPr>
+          <w:rFonts w:ascii="Times New Roman" w:eastAsia="Times New Roman" w:hAnsi="Times New Roman" w:cs="Times New Roman"/>
+          <w:color w:val="000000"/>
+          <w:sz w:val="24"/>
+          <w:szCs w:val="24"/>
+          <w:lang w:val="pl-PL"/>
+        </w:rPr>
+      </w:pPr>
+      <w:r>
+        <w:rPr>
+          <w:rFonts w:eastAsia="Times New Roman"/>
+          <w:b/>
+          <w:bCs/>
+          <w:noProof/>
+          <w:color w:val="000000"/>
+          <w:sz w:val="24"/>
+          <w:szCs w:val="24"/>
+          <w:bdr w:val="none" w:sz="0" w:space="0" w:color="auto" w:frame="1"/>
+          <w:lang w:val="pl-PL"/>
+        </w:rPr>
+        <w:drawing>
+          <wp:inline distT="0" distB="0" distL="0" distR="0" wp14:anchorId="563859D8" wp14:editId="40955C79">
+            <wp:extent cx="6745605" cy="5224145"/>
+            <wp:effectExtent l="0" t="0" r="0" b="0"/>
+            <wp:docPr id="1911035203" name="Obraz 12"/>
+            <wp:cNvGraphicFramePr>
+              <a:graphicFrameLocks xmlns:a="http://schemas.openxmlformats.org/drawingml/2006/main" noChangeAspect="1"/>
+            </wp:cNvGraphicFramePr>
+            <a:graphic xmlns:a="http://schemas.openxmlformats.org/drawingml/2006/main">
+              <a:graphicData uri="http://schemas.openxmlformats.org/drawingml/2006/picture">
+                <pic:pic xmlns:pic="http://schemas.openxmlformats.org/drawingml/2006/picture">
+                  <pic:nvPicPr>
+                    <pic:cNvPr id="0" name="Picture 2"/>
+                    <pic:cNvPicPr>
+                      <a:picLocks noChangeAspect="1" noChangeArrowheads="1"/>
+                    </pic:cNvPicPr>
+                  </pic:nvPicPr>
+                  <pic:blipFill>
+                    <a:blip r:embed="rId14">
+                      <a:extLst>
+                        <a:ext uri="{28A0092B-C50C-407E-A947-70E740481C1C}">
+                          <a14:useLocalDpi xmlns:a14="http://schemas.microsoft.com/office/drawing/2010/main" val="0"/>
+                        </a:ext>
+                      </a:extLst>
+                    </a:blip>
+                    <a:srcRect/>
+                    <a:stretch>
+                      <a:fillRect/>
+                    </a:stretch>
+                  </pic:blipFill>
+                  <pic:spPr bwMode="auto">
+                    <a:xfrm>
+                      <a:off x="0" y="0"/>
+                      <a:ext cx="6745605" cy="5224145"/>
+                    </a:xfrm>
+                    <a:prstGeom prst="rect">
+                      <a:avLst/>
+                    </a:prstGeom>
+                    <a:noFill/>
+                    <a:ln>
+                      <a:noFill/>
+                    </a:ln>
+                  </pic:spPr>
+                </pic:pic>
+              </a:graphicData>
+            </a:graphic>
+          </wp:inline>
+        </w:drawing>
+      </w:r>
+    </w:p>
+    <w:p>
+      <w:pPr>
+        <w:spacing w:after="240" w:line="240" w:lineRule="auto"/>
+        <w:rPr>
+          <w:rFonts w:ascii="Times New Roman" w:eastAsia="Times New Roman" w:hAnsi="Times New Roman" w:cs="Times New Roman"/>
+          <w:color w:val="000000"/>
+          <w:sz w:val="24"/>
+          <w:szCs w:val="24"/>
+          <w:lang w:val="pl-PL"/>
+        </w:rPr>
+      </w:pPr>
+      <w:r>
+        <w:rPr>
+          <w:rFonts w:ascii="Times New Roman" w:eastAsia="Times New Roman" w:hAnsi="Times New Roman" w:cs="Times New Roman"/>
+          <w:color w:val="000000"/>
+          <w:sz w:val="24"/>
+          <w:szCs w:val="24"/>
+          <w:lang w:val="pl-PL"/>
+        </w:rPr>
+        <w:br/>
+      </w:r>
+      <w:r>
+        <w:rPr>
+          <w:rFonts w:ascii="Times New Roman" w:eastAsia="Times New Roman" w:hAnsi="Times New Roman" w:cs="Times New Roman"/>
+          <w:color w:val="000000"/>
+          <w:sz w:val="24"/>
+          <w:szCs w:val="24"/>
+          <w:lang w:val="pl-PL"/>
+        </w:rPr>
+        <w:br/>
+      </w:r>
+      <w:r>
+        <w:rPr>
+          <w:rFonts w:ascii="Times New Roman" w:eastAsia="Times New Roman" w:hAnsi="Times New Roman" w:cs="Times New Roman"/>
+          <w:color w:val="000000"/>
+          <w:sz w:val="24"/>
+          <w:szCs w:val="24"/>
+          <w:lang w:val="pl-PL"/>
+        </w:rPr>
+        <w:br/>
+      </w:r>
+      <w:r>
+        <w:rPr>
+          <w:rFonts w:ascii="Times New Roman" w:eastAsia="Times New Roman" w:hAnsi="Times New Roman" w:cs="Times New Roman"/>
+          <w:color w:val="000000"/>
+          <w:sz w:val="24"/>
+          <w:szCs w:val="24"/>
+          <w:lang w:val="pl-PL"/>
+        </w:rPr>
+        <w:br/>
+      </w:r>
+      <w:r>
+        <w:rPr>
+          <w:rFonts w:ascii="Times New Roman" w:eastAsia="Times New Roman" w:hAnsi="Times New Roman" w:cs="Times New Roman"/>
+          <w:color w:val="000000"/>
+          <w:sz w:val="24"/>
+          <w:szCs w:val="24"/>
+          <w:lang w:val="pl-PL"/>
+        </w:rPr>
+        <w:br/>
+      </w:r>
+      <w:r>
+        <w:rPr>
+          <w:rFonts w:ascii="Times New Roman" w:eastAsia="Times New Roman" w:hAnsi="Times New Roman" w:cs="Times New Roman"/>
+          <w:color w:val="000000"/>
+          <w:sz w:val="24"/>
+          <w:szCs w:val="24"/>
+          <w:lang w:val="pl-PL"/>
+        </w:rPr>
+        <w:br/>
+      </w:r>
+      <w:r>
+        <w:rPr>
+          <w:rFonts w:ascii="Times New Roman" w:eastAsia="Times New Roman" w:hAnsi="Times New Roman" w:cs="Times New Roman"/>
+          <w:color w:val="000000"/>
+          <w:sz w:val="24"/>
+          <w:szCs w:val="24"/>
+          <w:lang w:val="pl-PL"/>
+        </w:rPr>
+        <w:br/>
+      </w:r>
+      <w:r>
+        <w:rPr>
+          <w:rFonts w:ascii="Times New Roman" w:eastAsia="Times New Roman" w:hAnsi="Times New Roman" w:cs="Times New Roman"/>
+          <w:color w:val="000000"/>
+          <w:sz w:val="24"/>
+          <w:szCs w:val="24"/>
+          <w:lang w:val="pl-PL"/>
+        </w:rPr>
+        <w:br/>
+      </w:r>
+      <w:r>
+        <w:rPr>
+          <w:rFonts w:ascii="Times New Roman" w:eastAsia="Times New Roman" w:hAnsi="Times New Roman" w:cs="Times New Roman"/>
+          <w:color w:val="000000"/>
+          <w:sz w:val="24"/>
+          <w:szCs w:val="24"/>
+          <w:lang w:val="pl-PL"/>
+        </w:rPr>
+        <w:br/>
+      </w:r>
+      <w:r>
+        <w:rPr>
+          <w:rFonts w:ascii="Times New Roman" w:eastAsia="Times New Roman" w:hAnsi="Times New Roman" w:cs="Times New Roman"/>
+          <w:color w:val="000000"/>
+          <w:sz w:val="24"/>
+          <w:szCs w:val="24"/>
+          <w:lang w:val="pl-PL"/>
+        </w:rPr>
+        <w:br/>
+      </w:r>
+      <w:r>
+        <w:rPr>
+          <w:rFonts w:ascii="Times New Roman" w:eastAsia="Times New Roman" w:hAnsi="Times New Roman" w:cs="Times New Roman"/>
+          <w:color w:val="000000"/>
+          <w:sz w:val="24"/>
+          <w:szCs w:val="24"/>
+          <w:lang w:val="pl-PL"/>
+        </w:rPr>
+        <w:br/>
+      </w:r>
+      <w:r>
+        <w:rPr>
+          <w:rFonts w:ascii="Times New Roman" w:eastAsia="Times New Roman" w:hAnsi="Times New Roman" w:cs="Times New Roman"/>
+          <w:color w:val="000000"/>
+          <w:sz w:val="24"/>
+          <w:szCs w:val="24"/>
+          <w:lang w:val="pl-PL"/>
+        </w:rPr>
+        <w:br/>
+      </w:r>
+      <w:r>
+        <w:rPr>
+          <w:rFonts w:ascii="Times New Roman" w:eastAsia="Times New Roman" w:hAnsi="Times New Roman" w:cs="Times New Roman"/>
+          <w:color w:val="000000"/>
+          <w:sz w:val="24"/>
+          <w:szCs w:val="24"/>
+          <w:lang w:val="pl-PL"/>
+        </w:rPr>
+        <w:br/>
+      </w:r>
+      <w:r>
+        <w:rPr>
+          <w:rFonts w:ascii="Times New Roman" w:eastAsia="Times New Roman" w:hAnsi="Times New Roman" w:cs="Times New Roman"/>
+          <w:color w:val="000000"/>
+          <w:sz w:val="24"/>
+          <w:szCs w:val="24"/>
+          <w:lang w:val="pl-PL"/>
+        </w:rPr>
+        <w:br/>
+      </w:r>
+      <w:r>
+        <w:rPr>
+          <w:rFonts w:ascii="Times New Roman" w:eastAsia="Times New Roman" w:hAnsi="Times New Roman" w:cs="Times New Roman"/>
+          <w:color w:val="000000"/>
+          <w:sz w:val="24"/>
+          <w:szCs w:val="24"/>
+          <w:lang w:val="pl-PL"/>
+        </w:rPr>
+        <w:br/>
+      </w:r>
+      <w:r>
+        <w:rPr>
+          <w:rFonts w:ascii="Times New Roman" w:eastAsia="Times New Roman" w:hAnsi="Times New Roman" w:cs="Times New Roman"/>
+          <w:color w:val="000000"/>
+          <w:sz w:val="24"/>
+          <w:szCs w:val="24"/>
+          <w:lang w:val="pl-PL"/>
+        </w:rPr>
+        <w:br/>
+      </w:r>
+      <w:r>
+        <w:rPr>
+          <w:rFonts w:ascii="Times New Roman" w:eastAsia="Times New Roman" w:hAnsi="Times New Roman" w:cs="Times New Roman"/>
+          <w:color w:val="000000"/>
+          <w:sz w:val="24"/>
+          <w:szCs w:val="24"/>
+          <w:lang w:val="pl-PL"/>
+        </w:rPr>
+        <w:br/>
+      </w:r>
+      <w:r>
+        <w:rPr>
+          <w:rFonts w:ascii="Times New Roman" w:eastAsia="Times New Roman" w:hAnsi="Times New Roman" w:cs="Times New Roman"/>
+          <w:color w:val="000000"/>
+          <w:sz w:val="24"/>
+          <w:szCs w:val="24"/>
+          <w:lang w:val="pl-PL"/>
+        </w:rPr>
+        <w:br/>
+      </w:r>
+      <w:r>
+        <w:rPr>
+          <w:rFonts w:ascii="Times New Roman" w:eastAsia="Times New Roman" w:hAnsi="Times New Roman" w:cs="Times New Roman"/>
+          <w:color w:val="000000"/>
+          <w:sz w:val="24"/>
+          <w:szCs w:val="24"/>
+          <w:lang w:val="pl-PL"/>
+        </w:rPr>
+        <w:br/>
+      </w:r>
+      <w:r>
+        <w:rPr>
+          <w:rFonts w:ascii="Times New Roman" w:eastAsia="Times New Roman" w:hAnsi="Times New Roman" w:cs="Times New Roman"/>
+          <w:color w:val="000000"/>
+          <w:sz w:val="24"/>
+          <w:szCs w:val="24"/>
+          <w:lang w:val="pl-PL"/>
+        </w:rPr>
+        <w:br/>
+      </w:r>
+    </w:p>
+    <w:p>
+      <w:pPr>
+        <w:spacing w:line="240" w:lineRule="auto"/>
+        <w:rPr>
+          <w:rFonts w:eastAsia="Times New Roman"/>
+          <w:b/>
+          <w:bCs/>
+          <w:color w:val="000000"/>
+          <w:sz w:val="24"/>
+          <w:szCs w:val="24"/>
+          <w:lang w:val="pl-PL"/>
+        </w:rPr>
+      </w:pPr>
+    </w:p>
+    <w:p>
+      <w:pPr>
+        <w:spacing w:line="240" w:lineRule="auto"/>
+        <w:rPr>
+          <w:rFonts w:eastAsia="Times New Roman"/>
+          <w:b/>
+          <w:bCs/>
+          <w:color w:val="000000"/>
+          <w:sz w:val="24"/>
+          <w:szCs w:val="24"/>
+          <w:lang w:val="pl-PL"/>
+        </w:rPr>
+      </w:pPr>
+    </w:p>
+    <w:p>
+      <w:pPr>
+        <w:spacing w:line="240" w:lineRule="auto"/>
+        <w:rPr>
+          <w:rFonts w:eastAsia="Times New Roman"/>
+          <w:b/>
+          <w:bCs/>
+          <w:color w:val="000000"/>
+          <w:sz w:val="24"/>
+          <w:szCs w:val="24"/>
+          <w:lang w:val="pl-PL"/>
+        </w:rPr>
+      </w:pPr>
+    </w:p>
+    <w:p>
+      <w:pPr>
+        <w:spacing w:line="240" w:lineRule="auto"/>
+        <w:rPr>
+          <w:rFonts w:eastAsia="Times New Roman"/>
+          <w:b/>
+          <w:bCs/>
+          <w:color w:val="000000"/>
+          <w:sz w:val="24"/>
+          <w:szCs w:val="24"/>
+          <w:lang w:val="pl-PL"/>
+        </w:rPr>
+      </w:pPr>
+    </w:p>
+    <w:p>
+      <w:pPr>
+        <w:spacing w:line="240" w:lineRule="auto"/>
+        <w:rPr>
+          <w:rFonts w:eastAsia="Times New Roman"/>
+          <w:b/>
+          <w:bCs/>
+          <w:color w:val="000000"/>
+          <w:sz w:val="24"/>
+          <w:szCs w:val="24"/>
+          <w:lang w:val="pl-PL"/>
+        </w:rPr>
+      </w:pPr>
+      <w:r>
+        <w:rPr>
+          <w:rFonts w:eastAsia="Times New Roman"/>
+          <w:b/>
+          <w:bCs/>
+          <w:color w:val="000000"/>
+          <w:sz w:val="24"/>
+          <w:szCs w:val="24"/>
+          <w:lang w:val="pl-PL"/>
+        </w:rPr>
+        <w:t>Logowanie </w:t>
+      </w:r>
+    </w:p>
+    <w:p>
+      <w:pPr>
+        <w:spacing w:line="240" w:lineRule="auto"/>
+        <w:rPr>
+          <w:rFonts w:ascii="Times New Roman" w:eastAsia="Times New Roman" w:hAnsi="Times New Roman" w:cs="Times New Roman"/>
+          <w:color w:val="000000"/>
+          <w:sz w:val="24"/>
+          <w:szCs w:val="24"/>
+          <w:lang w:val="pl-PL"/>
+        </w:rPr>
+      </w:pPr>
+    </w:p>
+    <w:p>
+      <w:pPr>
+        <w:spacing w:line="240" w:lineRule="auto"/>
+        <w:rPr>
+          <w:rFonts w:ascii="Times New Roman" w:eastAsia="Times New Roman" w:hAnsi="Times New Roman" w:cs="Times New Roman"/>
+          <w:color w:val="000000"/>
+          <w:sz w:val="24"/>
+          <w:szCs w:val="24"/>
+          <w:lang w:val="pl-PL"/>
+        </w:rPr>
+      </w:pPr>
+      <w:r>
+        <w:rPr>
+          <w:rFonts w:eastAsia="Times New Roman"/>
+          <w:b/>
+          <w:bCs/>
+          <w:noProof/>
+          <w:color w:val="000000"/>
+          <w:sz w:val="24"/>
+          <w:szCs w:val="24"/>
+          <w:bdr w:val="none" w:sz="0" w:space="0" w:color="auto" w:frame="1"/>
+          <w:lang w:val="pl-PL"/>
+        </w:rPr>
+        <w:drawing>
+          <wp:inline distT="0" distB="0" distL="0" distR="0" wp14:anchorId="4ADB8A9C" wp14:editId="5A0D0CDB">
+            <wp:extent cx="6835775" cy="4399915"/>
+            <wp:effectExtent l="0" t="0" r="0" b="0"/>
+            <wp:docPr id="1452093348" name="Obraz 11"/>
+            <wp:cNvGraphicFramePr>
+              <a:graphicFrameLocks xmlns:a="http://schemas.openxmlformats.org/drawingml/2006/main" noChangeAspect="1"/>
+            </wp:cNvGraphicFramePr>
+            <a:graphic xmlns:a="http://schemas.openxmlformats.org/drawingml/2006/main">
+              <a:graphicData uri="http://schemas.openxmlformats.org/drawingml/2006/picture">
+                <pic:pic xmlns:pic="http://schemas.openxmlformats.org/drawingml/2006/picture">
+                  <pic:nvPicPr>
+                    <pic:cNvPr id="0" name="Picture 3"/>
+                    <pic:cNvPicPr>
+                      <a:picLocks noChangeAspect="1" noChangeArrowheads="1"/>
+                    </pic:cNvPicPr>
+                  </pic:nvPicPr>
+                  <pic:blipFill>
+                    <a:blip r:embed="rId15">
+                      <a:extLst>
+                        <a:ext uri="{28A0092B-C50C-407E-A947-70E740481C1C}">
+                          <a14:useLocalDpi xmlns:a14="http://schemas.microsoft.com/office/drawing/2010/main" val="0"/>
+                        </a:ext>
+                      </a:extLst>
+                    </a:blip>
+                    <a:srcRect/>
+                    <a:stretch>
+                      <a:fillRect/>
+                    </a:stretch>
+                  </pic:blipFill>
+                  <pic:spPr bwMode="auto">
+                    <a:xfrm>
+                      <a:off x="0" y="0"/>
+                      <a:ext cx="6835775" cy="4399915"/>
+                    </a:xfrm>
+                    <a:prstGeom prst="rect">
+                      <a:avLst/>
+                    </a:prstGeom>
+                    <a:noFill/>
+                    <a:ln>
+                      <a:noFill/>
+                    </a:ln>
+                  </pic:spPr>
+                </pic:pic>
+              </a:graphicData>
+            </a:graphic>
+          </wp:inline>
+        </w:drawing>
+      </w:r>
+    </w:p>
+    <w:p>
+      <w:pPr>
+        <w:spacing w:line="240" w:lineRule="auto"/>
+        <w:rPr>
+          <w:rFonts w:ascii="Times New Roman" w:eastAsia="Times New Roman" w:hAnsi="Times New Roman" w:cs="Times New Roman"/>
+          <w:color w:val="000000"/>
+          <w:sz w:val="24"/>
+          <w:szCs w:val="24"/>
+          <w:lang w:val="pl-PL"/>
+        </w:rPr>
+      </w:pPr>
+    </w:p>
+    <w:p>
+      <w:pPr>
+        <w:spacing w:line="240" w:lineRule="auto"/>
+        <w:rPr>
+          <w:rFonts w:eastAsia="Times New Roman"/>
+          <w:b/>
+          <w:bCs/>
+          <w:color w:val="000000"/>
+          <w:sz w:val="24"/>
+          <w:szCs w:val="24"/>
+          <w:lang w:val="pl-PL"/>
+        </w:rPr>
+      </w:pPr>
+      <w:r>
+        <w:rPr>
+          <w:rFonts w:eastAsia="Times New Roman"/>
+          <w:b/>
+          <w:bCs/>
+          <w:color w:val="000000"/>
+          <w:sz w:val="24"/>
+          <w:szCs w:val="24"/>
+          <w:lang w:val="pl-PL"/>
+        </w:rPr>
+        <w:t>Panel klienta</w:t>
+      </w:r>
+    </w:p>
+    <w:p>
+      <w:pPr>
+        <w:spacing w:line="240" w:lineRule="auto"/>
+        <w:rPr>
+          <w:rFonts w:ascii="Times New Roman" w:eastAsia="Times New Roman" w:hAnsi="Times New Roman" w:cs="Times New Roman"/>
+          <w:color w:val="000000"/>
+          <w:sz w:val="24"/>
+          <w:szCs w:val="24"/>
+          <w:lang w:val="pl-PL"/>
+        </w:rPr>
+      </w:pPr>
+    </w:p>
+    <w:p>
+      <w:pPr>
+        <w:spacing w:line="240" w:lineRule="auto"/>
+        <w:rPr>
+          <w:rFonts w:ascii="Times New Roman" w:eastAsia="Times New Roman" w:hAnsi="Times New Roman" w:cs="Times New Roman"/>
+          <w:color w:val="000000"/>
+          <w:sz w:val="24"/>
+          <w:szCs w:val="24"/>
+          <w:lang w:val="pl-PL"/>
+        </w:rPr>
+      </w:pPr>
+      <w:r>
+        <w:rPr>
+          <w:rFonts w:eastAsia="Times New Roman"/>
+          <w:b/>
+          <w:bCs/>
+          <w:noProof/>
+          <w:color w:val="000000"/>
+          <w:sz w:val="24"/>
+          <w:szCs w:val="24"/>
+          <w:bdr w:val="none" w:sz="0" w:space="0" w:color="auto" w:frame="1"/>
+          <w:lang w:val="pl-PL"/>
+        </w:rPr>
+        <w:lastRenderedPageBreak/>
+        <w:drawing>
+          <wp:inline distT="0" distB="0" distL="0" distR="0" wp14:anchorId="63616606" wp14:editId="5DA7AAAF">
+            <wp:extent cx="6835775" cy="4609465"/>
+            <wp:effectExtent l="0" t="0" r="0" b="635"/>
+            <wp:docPr id="1492418473" name="Obraz 10"/>
+            <wp:cNvGraphicFramePr>
+              <a:graphicFrameLocks xmlns:a="http://schemas.openxmlformats.org/drawingml/2006/main" noChangeAspect="1"/>
+            </wp:cNvGraphicFramePr>
+            <a:graphic xmlns:a="http://schemas.openxmlformats.org/drawingml/2006/main">
+              <a:graphicData uri="http://schemas.openxmlformats.org/drawingml/2006/picture">
+                <pic:pic xmlns:pic="http://schemas.openxmlformats.org/drawingml/2006/picture">
+                  <pic:nvPicPr>
+                    <pic:cNvPr id="0" name="Picture 4"/>
+                    <pic:cNvPicPr>
+                      <a:picLocks noChangeAspect="1" noChangeArrowheads="1"/>
+                    </pic:cNvPicPr>
+                  </pic:nvPicPr>
+                  <pic:blipFill>
+                    <a:blip r:embed="rId16">
+                      <a:extLst>
+                        <a:ext uri="{28A0092B-C50C-407E-A947-70E740481C1C}">
+                          <a14:useLocalDpi xmlns:a14="http://schemas.microsoft.com/office/drawing/2010/main" val="0"/>
+                        </a:ext>
+                      </a:extLst>
+                    </a:blip>
+                    <a:srcRect/>
+                    <a:stretch>
+                      <a:fillRect/>
+                    </a:stretch>
+                  </pic:blipFill>
+                  <pic:spPr bwMode="auto">
+                    <a:xfrm>
+                      <a:off x="0" y="0"/>
+                      <a:ext cx="6835775" cy="4609465"/>
+                    </a:xfrm>
+                    <a:prstGeom prst="rect">
+                      <a:avLst/>
+                    </a:prstGeom>
+                    <a:noFill/>
+                    <a:ln>
+                      <a:noFill/>
+                    </a:ln>
+                  </pic:spPr>
+                </pic:pic>
+              </a:graphicData>
+            </a:graphic>
+          </wp:inline>
+        </w:drawing>
+      </w:r>
+    </w:p>
+    <w:p>
+      <w:pPr>
+        <w:spacing w:line="240" w:lineRule="auto"/>
+        <w:rPr>
+          <w:rFonts w:ascii="Times New Roman" w:eastAsia="Times New Roman" w:hAnsi="Times New Roman" w:cs="Times New Roman"/>
+          <w:color w:val="000000"/>
+          <w:sz w:val="24"/>
+          <w:szCs w:val="24"/>
+          <w:lang w:val="pl-PL"/>
+        </w:rPr>
+      </w:pPr>
+    </w:p>
+    <w:p>
+      <w:pPr>
+        <w:spacing w:line="240" w:lineRule="auto"/>
+        <w:rPr>
+          <w:rFonts w:eastAsia="Times New Roman"/>
+          <w:b/>
+          <w:bCs/>
+          <w:color w:val="000000"/>
+          <w:sz w:val="24"/>
+          <w:szCs w:val="24"/>
+          <w:lang w:val="pl-PL"/>
+        </w:rPr>
+      </w:pPr>
+    </w:p>
+    <w:p>
+      <w:pPr>
+        <w:spacing w:line="240" w:lineRule="auto"/>
+        <w:rPr>
+          <w:rFonts w:eastAsia="Times New Roman"/>
+          <w:b/>
+          <w:bCs/>
+          <w:color w:val="000000"/>
+          <w:sz w:val="24"/>
+          <w:szCs w:val="24"/>
+          <w:lang w:val="pl-PL"/>
+        </w:rPr>
+      </w:pPr>
+      <w:r>
+        <w:rPr>
+          <w:rFonts w:eastAsia="Times New Roman"/>
+          <w:b/>
+          <w:bCs/>
+          <w:color w:val="000000"/>
+          <w:sz w:val="24"/>
+          <w:szCs w:val="24"/>
+          <w:lang w:val="pl-PL"/>
+        </w:rPr>
+        <w:t>Panel administratora</w:t>
+      </w:r>
+    </w:p>
+    <w:p>
+      <w:pPr>
+        <w:spacing w:line="240" w:lineRule="auto"/>
+        <w:rPr>
+          <w:rFonts w:ascii="Times New Roman" w:eastAsia="Times New Roman" w:hAnsi="Times New Roman" w:cs="Times New Roman"/>
+          <w:color w:val="000000"/>
+          <w:sz w:val="24"/>
+          <w:szCs w:val="24"/>
+          <w:lang w:val="pl-PL"/>
+        </w:rPr>
+      </w:pPr>
+    </w:p>
+    <w:p>
+      <w:pPr>
+        <w:spacing w:line="240" w:lineRule="auto"/>
+        <w:rPr>
+          <w:rFonts w:ascii="Times New Roman" w:eastAsia="Times New Roman" w:hAnsi="Times New Roman" w:cs="Times New Roman"/>
+          <w:color w:val="000000"/>
+          <w:sz w:val="24"/>
+          <w:szCs w:val="24"/>
+          <w:lang w:val="pl-PL"/>
+        </w:rPr>
+      </w:pPr>
+      <w:r>
+        <w:rPr>
+          <w:rFonts w:eastAsia="Times New Roman"/>
+          <w:b/>
+          <w:bCs/>
+          <w:noProof/>
+          <w:color w:val="000000"/>
+          <w:sz w:val="24"/>
+          <w:szCs w:val="24"/>
+          <w:bdr w:val="none" w:sz="0" w:space="0" w:color="auto" w:frame="1"/>
+          <w:lang w:val="pl-PL"/>
+        </w:rPr>
+        <w:drawing>
+          <wp:inline distT="0" distB="0" distL="0" distR="0" wp14:anchorId="2A93EED7" wp14:editId="78DC80E9">
+            <wp:extent cx="6835775" cy="4422140"/>
+            <wp:effectExtent l="0" t="0" r="0" b="0"/>
+            <wp:docPr id="832163481" name="Obraz 9"/>
+            <wp:cNvGraphicFramePr>
+              <a:graphicFrameLocks xmlns:a="http://schemas.openxmlformats.org/drawingml/2006/main" noChangeAspect="1"/>
+            </wp:cNvGraphicFramePr>
+            <a:graphic xmlns:a="http://schemas.openxmlformats.org/drawingml/2006/main">
+              <a:graphicData uri="http://schemas.openxmlformats.org/drawingml/2006/picture">
+                <pic:pic xmlns:pic="http://schemas.openxmlformats.org/drawingml/2006/picture">
+                  <pic:nvPicPr>
+                    <pic:cNvPr id="0" name="Picture 5"/>
+                    <pic:cNvPicPr>
+                      <a:picLocks noChangeAspect="1" noChangeArrowheads="1"/>
+                    </pic:cNvPicPr>
+                  </pic:nvPicPr>
+                  <pic:blipFill>
+                    <a:blip r:embed="rId17">
+                      <a:extLst>
+                        <a:ext uri="{28A0092B-C50C-407E-A947-70E740481C1C}">
+                          <a14:useLocalDpi xmlns:a14="http://schemas.microsoft.com/office/drawing/2010/main" val="0"/>
+                        </a:ext>
+                      </a:extLst>
+                    </a:blip>
+                    <a:srcRect/>
+                    <a:stretch>
+                      <a:fillRect/>
+                    </a:stretch>
+                  </pic:blipFill>
+                  <pic:spPr bwMode="auto">
+                    <a:xfrm>
+                      <a:off x="0" y="0"/>
+                      <a:ext cx="6835775" cy="4422140"/>
+                    </a:xfrm>
+                    <a:prstGeom prst="rect">
+                      <a:avLst/>
+                    </a:prstGeom>
+                    <a:noFill/>
+                    <a:ln>
+                      <a:noFill/>
+                    </a:ln>
+                  </pic:spPr>
+                </pic:pic>
+              </a:graphicData>
+            </a:graphic>
+          </wp:inline>
+        </w:drawing>
+      </w:r>
+    </w:p>
+    <w:p>
+      <w:pPr>
+        <w:spacing w:line="240" w:lineRule="auto"/>
+        <w:rPr>
+          <w:rFonts w:ascii="Times New Roman" w:eastAsia="Times New Roman" w:hAnsi="Times New Roman" w:cs="Times New Roman"/>
+          <w:color w:val="000000"/>
+          <w:sz w:val="24"/>
+          <w:szCs w:val="24"/>
+          <w:lang w:val="pl-PL"/>
+        </w:rPr>
+      </w:pPr>
+    </w:p>
+    <w:p>
+      <w:pPr>
+        <w:spacing w:line="240" w:lineRule="auto"/>
+        <w:rPr>
+          <w:rFonts w:eastAsia="Times New Roman"/>
+          <w:b/>
+          <w:bCs/>
+          <w:color w:val="000000"/>
+          <w:sz w:val="24"/>
+          <w:szCs w:val="24"/>
+          <w:lang w:val="pl-PL"/>
+        </w:rPr>
+      </w:pPr>
+      <w:r>
+        <w:rPr>
+          <w:rFonts w:eastAsia="Times New Roman"/>
+          <w:b/>
+          <w:bCs/>
+          <w:color w:val="000000"/>
+          <w:sz w:val="24"/>
+          <w:szCs w:val="24"/>
+          <w:lang w:val="pl-PL"/>
+        </w:rPr>
+        <w:lastRenderedPageBreak/>
+        <w:t>Panel weterynarza </w:t>
+      </w:r>
+    </w:p>
+    <w:p>
+      <w:pPr>
+        <w:spacing w:line="240" w:lineRule="auto"/>
+        <w:rPr>
+          <w:rFonts w:ascii="Times New Roman" w:eastAsia="Times New Roman" w:hAnsi="Times New Roman" w:cs="Times New Roman"/>
+          <w:color w:val="000000"/>
+          <w:sz w:val="24"/>
+          <w:szCs w:val="24"/>
+          <w:lang w:val="pl-PL"/>
+        </w:rPr>
+      </w:pPr>
+    </w:p>
+    <w:p>
+      <w:pPr>
+        <w:spacing w:line="240" w:lineRule="auto"/>
+        <w:rPr>
+          <w:rFonts w:ascii="Times New Roman" w:eastAsia="Times New Roman" w:hAnsi="Times New Roman" w:cs="Times New Roman"/>
+          <w:color w:val="000000"/>
+          <w:sz w:val="24"/>
+          <w:szCs w:val="24"/>
+          <w:lang w:val="pl-PL"/>
+        </w:rPr>
+      </w:pPr>
+      <w:r>
+        <w:rPr>
+          <w:rFonts w:eastAsia="Times New Roman"/>
+          <w:b/>
+          <w:bCs/>
+          <w:noProof/>
+          <w:color w:val="000000"/>
+          <w:sz w:val="24"/>
+          <w:szCs w:val="24"/>
+          <w:bdr w:val="none" w:sz="0" w:space="0" w:color="auto" w:frame="1"/>
+          <w:lang w:val="pl-PL"/>
+        </w:rPr>
+        <w:drawing>
+          <wp:inline distT="0" distB="0" distL="0" distR="0" wp14:anchorId="083E6ED9" wp14:editId="312B99BC">
+            <wp:extent cx="6835775" cy="4406900"/>
+            <wp:effectExtent l="0" t="0" r="0" b="0"/>
+            <wp:docPr id="879651765" name="Obraz 8"/>
+            <wp:cNvGraphicFramePr>
+              <a:graphicFrameLocks xmlns:a="http://schemas.openxmlformats.org/drawingml/2006/main" noChangeAspect="1"/>
+            </wp:cNvGraphicFramePr>
+            <a:graphic xmlns:a="http://schemas.openxmlformats.org/drawingml/2006/main">
+              <a:graphicData uri="http://schemas.openxmlformats.org/drawingml/2006/picture">
+                <pic:pic xmlns:pic="http://schemas.openxmlformats.org/drawingml/2006/picture">
+                  <pic:nvPicPr>
+                    <pic:cNvPr id="0" name="Picture 6"/>
+                    <pic:cNvPicPr>
+                      <a:picLocks noChangeAspect="1" noChangeArrowheads="1"/>
+                    </pic:cNvPicPr>
+                  </pic:nvPicPr>
+                  <pic:blipFill>
+                    <a:blip r:embed="rId18">
+                      <a:extLst>
+                        <a:ext uri="{28A0092B-C50C-407E-A947-70E740481C1C}">
+                          <a14:useLocalDpi xmlns:a14="http://schemas.microsoft.com/office/drawing/2010/main" val="0"/>
+                        </a:ext>
+                      </a:extLst>
+                    </a:blip>
+                    <a:srcRect/>
+                    <a:stretch>
+                      <a:fillRect/>
+                    </a:stretch>
+                  </pic:blipFill>
+                  <pic:spPr bwMode="auto">
+                    <a:xfrm>
+                      <a:off x="0" y="0"/>
+                      <a:ext cx="6835775" cy="4406900"/>
+                    </a:xfrm>
+                    <a:prstGeom prst="rect">
+                      <a:avLst/>
+                    </a:prstGeom>
+                    <a:noFill/>
+                    <a:ln>
+                      <a:noFill/>
+                    </a:ln>
+                  </pic:spPr>
+                </pic:pic>
+              </a:graphicData>
+            </a:graphic>
+          </wp:inline>
+        </w:drawing>
+      </w:r>
+    </w:p>
+    <w:p>
+      <w:pPr>
+        <w:spacing w:after="240" w:line="240" w:lineRule="auto"/>
+        <w:rPr>
+          <w:rFonts w:ascii="Times New Roman" w:eastAsia="Times New Roman" w:hAnsi="Times New Roman" w:cs="Times New Roman"/>
+          <w:color w:val="000000"/>
+          <w:sz w:val="24"/>
+          <w:szCs w:val="24"/>
+          <w:lang w:val="pl-PL"/>
+        </w:rPr>
+      </w:pPr>
+    </w:p>
+    <w:p>
+      <w:pPr>
+        <w:spacing w:line="240" w:lineRule="auto"/>
+        <w:rPr>
+          <w:rFonts w:eastAsia="Times New Roman"/>
+          <w:b/>
+          <w:bCs/>
+          <w:color w:val="000000"/>
+          <w:sz w:val="24"/>
+          <w:szCs w:val="24"/>
+          <w:lang w:val="pl-PL"/>
+        </w:rPr>
+      </w:pPr>
+    </w:p>
+    <w:p>
+      <w:pPr>
+        <w:spacing w:line="240" w:lineRule="auto"/>
+        <w:rPr>
+          <w:rFonts w:eastAsia="Times New Roman"/>
+          <w:b/>
+          <w:bCs/>
+          <w:color w:val="000000"/>
+          <w:sz w:val="24"/>
+          <w:szCs w:val="24"/>
+          <w:lang w:val="pl-PL"/>
+        </w:rPr>
+      </w:pPr>
+      <w:r>
+        <w:rPr>
+          <w:rFonts w:eastAsia="Times New Roman"/>
+          <w:b/>
+          <w:bCs/>
+          <w:color w:val="000000"/>
+          <w:sz w:val="24"/>
+          <w:szCs w:val="24"/>
+          <w:lang w:val="pl-PL"/>
+        </w:rPr>
+        <w:t>Panel pracownika</w:t>
+      </w:r>
+    </w:p>
+    <w:p>
+      <w:pPr>
+        <w:spacing w:line="240" w:lineRule="auto"/>
+        <w:rPr>
+          <w:rFonts w:ascii="Times New Roman" w:eastAsia="Times New Roman" w:hAnsi="Times New Roman" w:cs="Times New Roman"/>
+          <w:color w:val="000000"/>
+          <w:sz w:val="24"/>
+          <w:szCs w:val="24"/>
+          <w:lang w:val="pl-PL"/>
+        </w:rPr>
+      </w:pPr>
+    </w:p>
+    <w:p>
+      <w:pPr>
+        <w:spacing w:line="240" w:lineRule="auto"/>
+        <w:rPr>
+          <w:rFonts w:ascii="Times New Roman" w:eastAsia="Times New Roman" w:hAnsi="Times New Roman" w:cs="Times New Roman"/>
+          <w:color w:val="000000"/>
+          <w:sz w:val="24"/>
+          <w:szCs w:val="24"/>
+          <w:lang w:val="pl-PL"/>
+        </w:rPr>
+      </w:pPr>
+      <w:r>
+        <w:rPr>
+          <w:rFonts w:eastAsia="Times New Roman"/>
+          <w:b/>
+          <w:bCs/>
+          <w:noProof/>
+          <w:color w:val="000000"/>
+          <w:sz w:val="24"/>
+          <w:szCs w:val="24"/>
+          <w:bdr w:val="none" w:sz="0" w:space="0" w:color="auto" w:frame="1"/>
+          <w:lang w:val="pl-PL"/>
+        </w:rPr>
+        <w:lastRenderedPageBreak/>
+        <w:drawing>
+          <wp:inline distT="0" distB="0" distL="0" distR="0" wp14:anchorId="5E2F2BE9" wp14:editId="3B4D0D3F">
+            <wp:extent cx="6715760" cy="4399915"/>
+            <wp:effectExtent l="0" t="0" r="2540" b="0"/>
+            <wp:docPr id="203686245" name="Obraz 7"/>
+            <wp:cNvGraphicFramePr>
+              <a:graphicFrameLocks xmlns:a="http://schemas.openxmlformats.org/drawingml/2006/main" noChangeAspect="1"/>
+            </wp:cNvGraphicFramePr>
+            <a:graphic xmlns:a="http://schemas.openxmlformats.org/drawingml/2006/main">
+              <a:graphicData uri="http://schemas.openxmlformats.org/drawingml/2006/picture">
+                <pic:pic xmlns:pic="http://schemas.openxmlformats.org/drawingml/2006/picture">
+                  <pic:nvPicPr>
+                    <pic:cNvPr id="0" name="Picture 7"/>
+                    <pic:cNvPicPr>
+                      <a:picLocks noChangeAspect="1" noChangeArrowheads="1"/>
+                    </pic:cNvPicPr>
+                  </pic:nvPicPr>
+                  <pic:blipFill>
+                    <a:blip r:embed="rId19">
+                      <a:extLst>
+                        <a:ext uri="{28A0092B-C50C-407E-A947-70E740481C1C}">
+                          <a14:useLocalDpi xmlns:a14="http://schemas.microsoft.com/office/drawing/2010/main" val="0"/>
+                        </a:ext>
+                      </a:extLst>
+                    </a:blip>
+                    <a:srcRect/>
+                    <a:stretch>
+                      <a:fillRect/>
+                    </a:stretch>
+                  </pic:blipFill>
+                  <pic:spPr bwMode="auto">
+                    <a:xfrm>
+                      <a:off x="0" y="0"/>
+                      <a:ext cx="6715760" cy="4399915"/>
+                    </a:xfrm>
+                    <a:prstGeom prst="rect">
+                      <a:avLst/>
+                    </a:prstGeom>
+                    <a:noFill/>
+                    <a:ln>
+                      <a:noFill/>
+                    </a:ln>
+                  </pic:spPr>
+                </pic:pic>
+              </a:graphicData>
+            </a:graphic>
+          </wp:inline>
+        </w:drawing>
+      </w:r>
+    </w:p>
+    <w:p>
+      <w:pPr>
+        <w:spacing w:after="240" w:line="240" w:lineRule="auto"/>
+        <w:rPr>
+          <w:rFonts w:eastAsia="Times New Roman"/>
+          <w:b/>
+          <w:bCs/>
+          <w:color w:val="000000"/>
+          <w:sz w:val="24"/>
+          <w:szCs w:val="24"/>
+          <w:lang w:val="pl-PL"/>
+        </w:rPr>
+      </w:pPr>
+      <w:r>
+        <w:rPr>
+          <w:rFonts w:ascii="Times New Roman" w:eastAsia="Times New Roman" w:hAnsi="Times New Roman" w:cs="Times New Roman"/>
+          <w:color w:val="000000"/>
+          <w:sz w:val="24"/>
+          <w:szCs w:val="24"/>
+          <w:lang w:val="pl-PL"/>
+        </w:rPr>
+        <w:br/>
+      </w:r>
+    </w:p>
+    <w:p>
+      <w:pPr>
+        <w:spacing w:after="240" w:line="240" w:lineRule="auto"/>
+        <w:rPr>
+          <w:rFonts w:eastAsia="Times New Roman"/>
+          <w:b/>
+          <w:bCs/>
+          <w:color w:val="000000"/>
+          <w:sz w:val="24"/>
+          <w:szCs w:val="24"/>
+          <w:lang w:val="pl-PL"/>
+        </w:rPr>
+      </w:pPr>
+    </w:p>
+    <w:p>
+      <w:pPr>
+        <w:spacing w:after="240" w:line="240" w:lineRule="auto"/>
+        <w:rPr>
+          <w:rFonts w:eastAsia="Times New Roman"/>
+          <w:b/>
+          <w:bCs/>
+          <w:color w:val="000000"/>
+          <w:sz w:val="24"/>
+          <w:szCs w:val="24"/>
+          <w:lang w:val="pl-PL"/>
+        </w:rPr>
+      </w:pPr>
+    </w:p>
+    <w:p>
+      <w:pPr>
+        <w:spacing w:after="240" w:line="240" w:lineRule="auto"/>
+        <w:rPr>
+          <w:rFonts w:eastAsia="Times New Roman"/>
+          <w:b/>
+          <w:bCs/>
+          <w:color w:val="000000"/>
+          <w:sz w:val="24"/>
+          <w:szCs w:val="24"/>
+          <w:lang w:val="pl-PL"/>
+        </w:rPr>
+      </w:pPr>
+    </w:p>
+    <w:p>
+      <w:pPr>
+        <w:spacing w:after="240" w:line="240" w:lineRule="auto"/>
+        <w:rPr>
+          <w:rFonts w:eastAsia="Times New Roman"/>
+          <w:b/>
+          <w:bCs/>
+          <w:color w:val="000000"/>
+          <w:sz w:val="24"/>
+          <w:szCs w:val="24"/>
+          <w:lang w:val="pl-PL"/>
+        </w:rPr>
+      </w:pPr>
+    </w:p>
+    <w:p>
+      <w:pPr>
+        <w:spacing w:after="240" w:line="240" w:lineRule="auto"/>
+        <w:rPr>
+          <w:rFonts w:eastAsia="Times New Roman"/>
+          <w:b/>
+          <w:bCs/>
+          <w:color w:val="000000"/>
+          <w:sz w:val="24"/>
+          <w:szCs w:val="24"/>
+          <w:lang w:val="pl-PL"/>
+        </w:rPr>
+      </w:pPr>
+    </w:p>
+    <w:p>
+      <w:pPr>
+        <w:spacing w:after="240" w:line="240" w:lineRule="auto"/>
+        <w:rPr>
+          <w:rFonts w:eastAsia="Times New Roman"/>
+          <w:b/>
+          <w:bCs/>
+          <w:color w:val="000000"/>
+          <w:sz w:val="24"/>
+          <w:szCs w:val="24"/>
+          <w:lang w:val="pl-PL"/>
+        </w:rPr>
+      </w:pPr>
+    </w:p>
+    <w:p>
+      <w:pPr>
+        <w:spacing w:after="240" w:line="240" w:lineRule="auto"/>
+        <w:rPr>
+          <w:rFonts w:eastAsia="Times New Roman"/>
+          <w:b/>
+          <w:bCs/>
+          <w:color w:val="000000"/>
+          <w:sz w:val="24"/>
+          <w:szCs w:val="24"/>
+          <w:lang w:val="pl-PL"/>
+        </w:rPr>
+      </w:pPr>
+    </w:p>
+    <w:p>
+      <w:pPr>
+        <w:spacing w:after="240" w:line="240" w:lineRule="auto"/>
+        <w:rPr>
+          <w:rFonts w:eastAsia="Times New Roman"/>
+          <w:b/>
+          <w:bCs/>
+          <w:color w:val="000000"/>
+          <w:sz w:val="24"/>
+          <w:szCs w:val="24"/>
+          <w:lang w:val="pl-PL"/>
+        </w:rPr>
+      </w:pPr>
+    </w:p>
+    <w:p>
+      <w:pPr>
+        <w:spacing w:after="240" w:line="240" w:lineRule="auto"/>
+        <w:rPr>
+          <w:rFonts w:eastAsia="Times New Roman"/>
+          <w:b/>
+          <w:bCs/>
+          <w:color w:val="000000"/>
+          <w:sz w:val="24"/>
+          <w:szCs w:val="24"/>
+          <w:lang w:val="pl-PL"/>
+        </w:rPr>
+      </w:pPr>
+    </w:p>
+    <w:p>
+      <w:pPr>
+        <w:spacing w:after="240" w:line="240" w:lineRule="auto"/>
+        <w:rPr>
+          <w:rFonts w:eastAsia="Times New Roman"/>
+          <w:b/>
+          <w:bCs/>
+          <w:color w:val="000000"/>
+          <w:sz w:val="24"/>
+          <w:szCs w:val="24"/>
+          <w:lang w:val="pl-PL"/>
+        </w:rPr>
+      </w:pPr>
+    </w:p>
+    <w:p>
+      <w:pPr>
+        <w:spacing w:after="240" w:line="240" w:lineRule="auto"/>
+        <w:rPr>
+          <w:rFonts w:eastAsia="Times New Roman"/>
+          <w:b/>
+          <w:bCs/>
+          <w:color w:val="000000"/>
+          <w:sz w:val="24"/>
+          <w:szCs w:val="24"/>
+          <w:lang w:val="pl-PL"/>
+        </w:rPr>
+      </w:pPr>
+    </w:p>
+    <w:p>
+      <w:pPr>
+        <w:spacing w:after="240" w:line="240" w:lineRule="auto"/>
+        <w:rPr>
+          <w:rFonts w:eastAsia="Times New Roman"/>
+          <w:b/>
+          <w:bCs/>
+          <w:color w:val="000000"/>
+          <w:sz w:val="24"/>
+          <w:szCs w:val="24"/>
+          <w:lang w:val="pl-PL"/>
+        </w:rPr>
+      </w:pPr>
+    </w:p>
+    <w:p>
+      <w:pPr>
+        <w:spacing w:after="240" w:line="240" w:lineRule="auto"/>
+        <w:rPr>
+          <w:rFonts w:eastAsia="Times New Roman"/>
+          <w:b/>
+          <w:bCs/>
+          <w:color w:val="000000"/>
+          <w:sz w:val="24"/>
+          <w:szCs w:val="24"/>
+          <w:lang w:val="pl-PL"/>
+        </w:rPr>
+      </w:pPr>
+    </w:p>
+    <w:p>
+      <w:pPr>
+        <w:spacing w:after="240" w:line="240" w:lineRule="auto"/>
+        <w:rPr>
+          <w:rFonts w:eastAsia="Times New Roman"/>
+          <w:b/>
+          <w:bCs/>
+          <w:color w:val="000000"/>
+          <w:sz w:val="24"/>
+          <w:szCs w:val="24"/>
+          <w:lang w:val="pl-PL"/>
+        </w:rPr>
+      </w:pPr>
+    </w:p>
+    <w:p>
+      <w:pPr>
+        <w:spacing w:after="240" w:line="240" w:lineRule="auto"/>
+        <w:rPr>
+          <w:rFonts w:eastAsia="Times New Roman"/>
+          <w:b/>
+          <w:bCs/>
+          <w:color w:val="000000"/>
+          <w:sz w:val="24"/>
+          <w:szCs w:val="24"/>
+          <w:lang w:val="pl-PL"/>
+        </w:rPr>
+      </w:pPr>
+    </w:p>
+    <w:p>
+      <w:pPr>
+        <w:spacing w:after="240" w:line="240" w:lineRule="auto"/>
+        <w:rPr>
+          <w:rFonts w:ascii="Times New Roman" w:eastAsia="Times New Roman" w:hAnsi="Times New Roman" w:cs="Times New Roman"/>
+          <w:color w:val="000000"/>
+          <w:sz w:val="24"/>
+          <w:szCs w:val="24"/>
+          <w:lang w:val="pl-PL"/>
+        </w:rPr>
+      </w:pPr>
+      <w:r>
+        <w:rPr>
+          <w:rFonts w:eastAsia="Times New Roman"/>
+          <w:b/>
+          <w:bCs/>
+          <w:color w:val="000000"/>
+          <w:sz w:val="24"/>
+          <w:szCs w:val="24"/>
+          <w:lang w:val="pl-PL"/>
+        </w:rPr>
+        <w:lastRenderedPageBreak/>
+        <w:t>Panel analityka</w:t>
+      </w:r>
+    </w:p>
+    <w:p>
+      <w:pPr>
+        <w:spacing w:line="240" w:lineRule="auto"/>
+        <w:rPr>
+          <w:rFonts w:ascii="Times New Roman" w:eastAsia="Times New Roman" w:hAnsi="Times New Roman" w:cs="Times New Roman"/>
+          <w:color w:val="000000"/>
+          <w:sz w:val="24"/>
+          <w:szCs w:val="24"/>
+          <w:lang w:val="pl-PL"/>
+        </w:rPr>
+      </w:pPr>
+      <w:r>
+        <w:rPr>
+          <w:rFonts w:eastAsia="Times New Roman"/>
+          <w:b/>
+          <w:bCs/>
+          <w:noProof/>
+          <w:color w:val="000000"/>
+          <w:sz w:val="24"/>
+          <w:szCs w:val="24"/>
+          <w:bdr w:val="none" w:sz="0" w:space="0" w:color="auto" w:frame="1"/>
+          <w:lang w:val="pl-PL"/>
+        </w:rPr>
+        <w:drawing>
+          <wp:inline distT="0" distB="0" distL="0" distR="0" wp14:anchorId="52B46282" wp14:editId="6BC9AAE1">
+            <wp:extent cx="6828155" cy="6850380"/>
+            <wp:effectExtent l="0" t="0" r="4445" b="0"/>
+            <wp:docPr id="964631075" name="Obraz 6"/>
+            <wp:cNvGraphicFramePr>
+              <a:graphicFrameLocks xmlns:a="http://schemas.openxmlformats.org/drawingml/2006/main" noChangeAspect="1"/>
+            </wp:cNvGraphicFramePr>
+            <a:graphic xmlns:a="http://schemas.openxmlformats.org/drawingml/2006/main">
+              <a:graphicData uri="http://schemas.openxmlformats.org/drawingml/2006/picture">
+                <pic:pic xmlns:pic="http://schemas.openxmlformats.org/drawingml/2006/picture">
+                  <pic:nvPicPr>
+                    <pic:cNvPr id="0" name="Picture 8"/>
+                    <pic:cNvPicPr>
+                      <a:picLocks noChangeAspect="1" noChangeArrowheads="1"/>
+                    </pic:cNvPicPr>
+                  </pic:nvPicPr>
+                  <pic:blipFill>
+                    <a:blip r:embed="rId20">
+                      <a:extLst>
+                        <a:ext uri="{28A0092B-C50C-407E-A947-70E740481C1C}">
+                          <a14:useLocalDpi xmlns:a14="http://schemas.microsoft.com/office/drawing/2010/main" val="0"/>
+                        </a:ext>
+                      </a:extLst>
+                    </a:blip>
+                    <a:srcRect/>
+                    <a:stretch>
+                      <a:fillRect/>
+                    </a:stretch>
+                  </pic:blipFill>
+                  <pic:spPr bwMode="auto">
+                    <a:xfrm>
+                      <a:off x="0" y="0"/>
+                      <a:ext cx="6828155" cy="6850380"/>
+                    </a:xfrm>
+                    <a:prstGeom prst="rect">
+                      <a:avLst/>
+                    </a:prstGeom>
+                    <a:noFill/>
+                    <a:ln>
+                      <a:noFill/>
+                    </a:ln>
+                  </pic:spPr>
+                </pic:pic>
+              </a:graphicData>
+            </a:graphic>
+          </wp:inline>
+        </w:drawing>
+      </w:r>
+    </w:p>
+    <w:p>
+      <w:pPr>
+        <w:spacing w:after="240" w:line="240" w:lineRule="auto"/>
+        <w:rPr>
+          <w:rFonts w:ascii="Times New Roman" w:eastAsia="Times New Roman" w:hAnsi="Times New Roman" w:cs="Times New Roman"/>
+          <w:color w:val="000000"/>
+          <w:sz w:val="24"/>
+          <w:szCs w:val="24"/>
+          <w:lang w:val="pl-PL"/>
+        </w:rPr>
+      </w:pPr>
+      <w:r>
+        <w:rPr>
+          <w:rFonts w:ascii="Times New Roman" w:eastAsia="Times New Roman" w:hAnsi="Times New Roman" w:cs="Times New Roman"/>
+          <w:color w:val="000000"/>
+          <w:sz w:val="24"/>
+          <w:szCs w:val="24"/>
+          <w:lang w:val="pl-PL"/>
+        </w:rPr>
+        <w:br/>
+      </w:r>
+      <w:r>
+        <w:rPr>
+          <w:rFonts w:ascii="Times New Roman" w:eastAsia="Times New Roman" w:hAnsi="Times New Roman" w:cs="Times New Roman"/>
+          <w:color w:val="000000"/>
+          <w:sz w:val="24"/>
+          <w:szCs w:val="24"/>
+          <w:lang w:val="pl-PL"/>
+        </w:rPr>
+        <w:br/>
+      </w:r>
+      <w:r>
+        <w:rPr>
+          <w:rFonts w:ascii="Times New Roman" w:eastAsia="Times New Roman" w:hAnsi="Times New Roman" w:cs="Times New Roman"/>
+          <w:color w:val="000000"/>
+          <w:sz w:val="24"/>
+          <w:szCs w:val="24"/>
+          <w:lang w:val="pl-PL"/>
+        </w:rPr>
+        <w:br/>
+      </w:r>
+      <w:r>
+        <w:rPr>
+          <w:rFonts w:ascii="Times New Roman" w:eastAsia="Times New Roman" w:hAnsi="Times New Roman" w:cs="Times New Roman"/>
+          <w:color w:val="000000"/>
+          <w:sz w:val="24"/>
+          <w:szCs w:val="24"/>
+          <w:lang w:val="pl-PL"/>
+        </w:rPr>
+        <w:br/>
+      </w:r>
+      <w:r>
+        <w:rPr>
+          <w:rFonts w:ascii="Times New Roman" w:eastAsia="Times New Roman" w:hAnsi="Times New Roman" w:cs="Times New Roman"/>
+          <w:color w:val="000000"/>
+          <w:sz w:val="24"/>
+          <w:szCs w:val="24"/>
+          <w:lang w:val="pl-PL"/>
+        </w:rPr>
+        <w:br/>
+      </w:r>
+      <w:r>
+        <w:rPr>
+          <w:rFonts w:ascii="Times New Roman" w:eastAsia="Times New Roman" w:hAnsi="Times New Roman" w:cs="Times New Roman"/>
+          <w:color w:val="000000"/>
+          <w:sz w:val="24"/>
+          <w:szCs w:val="24"/>
+          <w:lang w:val="pl-PL"/>
+        </w:rPr>
+        <w:br/>
+      </w:r>
+      <w:r>
+        <w:rPr>
+          <w:rFonts w:ascii="Times New Roman" w:eastAsia="Times New Roman" w:hAnsi="Times New Roman" w:cs="Times New Roman"/>
+          <w:color w:val="000000"/>
+          <w:sz w:val="24"/>
+          <w:szCs w:val="24"/>
+          <w:lang w:val="pl-PL"/>
+        </w:rPr>
+        <w:br/>
+      </w:r>
+      <w:r>
+        <w:rPr>
+          <w:rFonts w:ascii="Times New Roman" w:eastAsia="Times New Roman" w:hAnsi="Times New Roman" w:cs="Times New Roman"/>
+          <w:color w:val="000000"/>
+          <w:sz w:val="24"/>
+          <w:szCs w:val="24"/>
+          <w:lang w:val="pl-PL"/>
+        </w:rPr>
+        <w:br/>
+      </w:r>
+      <w:r>
+        <w:rPr>
+          <w:rFonts w:ascii="Times New Roman" w:eastAsia="Times New Roman" w:hAnsi="Times New Roman" w:cs="Times New Roman"/>
+          <w:color w:val="000000"/>
+          <w:sz w:val="24"/>
+          <w:szCs w:val="24"/>
+          <w:lang w:val="pl-PL"/>
+        </w:rPr>
+        <w:br/>
+      </w:r>
+      <w:r>
+        <w:rPr>
+          <w:rFonts w:ascii="Times New Roman" w:eastAsia="Times New Roman" w:hAnsi="Times New Roman" w:cs="Times New Roman"/>
+          <w:color w:val="000000"/>
+          <w:sz w:val="24"/>
+          <w:szCs w:val="24"/>
+          <w:lang w:val="pl-PL"/>
+        </w:rPr>
+        <w:br/>
+      </w:r>
+      <w:r>
+        <w:rPr>
+          <w:rFonts w:ascii="Times New Roman" w:eastAsia="Times New Roman" w:hAnsi="Times New Roman" w:cs="Times New Roman"/>
+          <w:color w:val="000000"/>
+          <w:sz w:val="24"/>
+          <w:szCs w:val="24"/>
+          <w:lang w:val="pl-PL"/>
+        </w:rPr>
+        <w:br/>
+      </w:r>
+      <w:r>
+        <w:rPr>
+          <w:rFonts w:ascii="Times New Roman" w:eastAsia="Times New Roman" w:hAnsi="Times New Roman" w:cs="Times New Roman"/>
+          <w:color w:val="000000"/>
+          <w:sz w:val="24"/>
+          <w:szCs w:val="24"/>
+          <w:lang w:val="pl-PL"/>
+        </w:rPr>
+        <w:br/>
+      </w:r>
+    </w:p>
+    <w:p>
+      <w:pPr>
+        <w:spacing w:line="240" w:lineRule="auto"/>
+        <w:rPr>
+          <w:rFonts w:eastAsia="Times New Roman"/>
+          <w:b/>
+          <w:bCs/>
+          <w:color w:val="000000"/>
+          <w:sz w:val="24"/>
+          <w:szCs w:val="24"/>
+          <w:lang w:val="pl-PL"/>
+        </w:rPr>
+      </w:pPr>
+    </w:p>
+    <w:p>
+      <w:pPr>
+        <w:spacing w:line="240" w:lineRule="auto"/>
+        <w:rPr>
+          <w:rFonts w:eastAsia="Times New Roman"/>
+          <w:b/>
+          <w:bCs/>
+          <w:color w:val="000000"/>
+          <w:sz w:val="24"/>
+          <w:szCs w:val="24"/>
+          <w:lang w:val="pl-PL"/>
+        </w:rPr>
+      </w:pPr>
+    </w:p>
+    <w:p>
+      <w:pPr>
+        <w:spacing w:line="240" w:lineRule="auto"/>
+        <w:rPr>
+          <w:rFonts w:eastAsia="Times New Roman"/>
+          <w:b/>
+          <w:bCs/>
+          <w:color w:val="000000"/>
+          <w:sz w:val="24"/>
+          <w:szCs w:val="24"/>
+          <w:lang w:val="pl-PL"/>
+        </w:rPr>
+      </w:pPr>
+      <w:r>
+        <w:rPr>
+          <w:rFonts w:eastAsia="Times New Roman"/>
+          <w:b/>
+          <w:bCs/>
+          <w:color w:val="000000"/>
+          <w:sz w:val="24"/>
+          <w:szCs w:val="24"/>
+          <w:lang w:val="pl-PL"/>
+        </w:rPr>
+        <w:lastRenderedPageBreak/>
+        <w:t>Formularz wniosku o wypożyczenie chomika</w:t>
+      </w:r>
+    </w:p>
+    <w:p>
+      <w:pPr>
+        <w:spacing w:line="240" w:lineRule="auto"/>
+        <w:rPr>
+          <w:rFonts w:ascii="Times New Roman" w:eastAsia="Times New Roman" w:hAnsi="Times New Roman" w:cs="Times New Roman"/>
+          <w:color w:val="000000"/>
+          <w:sz w:val="24"/>
+          <w:szCs w:val="24"/>
+          <w:lang w:val="pl-PL"/>
+        </w:rPr>
+      </w:pPr>
+    </w:p>
+    <w:p>
+      <w:pPr>
+        <w:spacing w:line="240" w:lineRule="auto"/>
+        <w:rPr>
+          <w:rFonts w:ascii="Times New Roman" w:eastAsia="Times New Roman" w:hAnsi="Times New Roman" w:cs="Times New Roman"/>
+          <w:color w:val="000000"/>
+          <w:sz w:val="24"/>
+          <w:szCs w:val="24"/>
+          <w:lang w:val="pl-PL"/>
+        </w:rPr>
+      </w:pPr>
+      <w:r>
+        <w:rPr>
+          <w:rFonts w:eastAsia="Times New Roman"/>
+          <w:b/>
+          <w:bCs/>
+          <w:noProof/>
+          <w:color w:val="000000"/>
+          <w:sz w:val="24"/>
+          <w:szCs w:val="24"/>
+          <w:bdr w:val="none" w:sz="0" w:space="0" w:color="auto" w:frame="1"/>
+          <w:lang w:val="pl-PL"/>
+        </w:rPr>
+        <w:drawing>
+          <wp:inline distT="0" distB="0" distL="0" distR="0" wp14:anchorId="6D33FF66" wp14:editId="0CC20830">
+            <wp:extent cx="6835775" cy="5374005"/>
+            <wp:effectExtent l="0" t="0" r="0" b="0"/>
+            <wp:docPr id="1427650575" name="Obraz 5"/>
+            <wp:cNvGraphicFramePr>
+              <a:graphicFrameLocks xmlns:a="http://schemas.openxmlformats.org/drawingml/2006/main" noChangeAspect="1"/>
+            </wp:cNvGraphicFramePr>
+            <a:graphic xmlns:a="http://schemas.openxmlformats.org/drawingml/2006/main">
+              <a:graphicData uri="http://schemas.openxmlformats.org/drawingml/2006/picture">
+                <pic:pic xmlns:pic="http://schemas.openxmlformats.org/drawingml/2006/picture">
+                  <pic:nvPicPr>
+                    <pic:cNvPr id="0" name="Picture 9"/>
+                    <pic:cNvPicPr>
+                      <a:picLocks noChangeAspect="1" noChangeArrowheads="1"/>
+                    </pic:cNvPicPr>
+                  </pic:nvPicPr>
+                  <pic:blipFill>
+                    <a:blip r:embed="rId21">
+                      <a:extLst>
+                        <a:ext uri="{28A0092B-C50C-407E-A947-70E740481C1C}">
+                          <a14:useLocalDpi xmlns:a14="http://schemas.microsoft.com/office/drawing/2010/main" val="0"/>
+                        </a:ext>
+                      </a:extLst>
+                    </a:blip>
+                    <a:srcRect/>
+                    <a:stretch>
+                      <a:fillRect/>
+                    </a:stretch>
+                  </pic:blipFill>
+                  <pic:spPr bwMode="auto">
+                    <a:xfrm>
+                      <a:off x="0" y="0"/>
+                      <a:ext cx="6835775" cy="5374005"/>
+                    </a:xfrm>
+                    <a:prstGeom prst="rect">
+                      <a:avLst/>
+                    </a:prstGeom>
+                    <a:noFill/>
+                    <a:ln>
+                      <a:noFill/>
+                    </a:ln>
+                  </pic:spPr>
+                </pic:pic>
+              </a:graphicData>
+            </a:graphic>
+          </wp:inline>
+        </w:drawing>
+      </w:r>
+    </w:p>
+    <w:p>
+      <w:pPr>
+        <w:spacing w:after="240" w:line="240" w:lineRule="auto"/>
+        <w:rPr>
+          <w:rFonts w:ascii="Times New Roman" w:eastAsia="Times New Roman" w:hAnsi="Times New Roman" w:cs="Times New Roman"/>
+          <w:color w:val="000000"/>
+          <w:sz w:val="24"/>
+          <w:szCs w:val="24"/>
+          <w:lang w:val="pl-PL"/>
+        </w:rPr>
+      </w:pPr>
+      <w:r>
+        <w:rPr>
+          <w:rFonts w:ascii="Times New Roman" w:eastAsia="Times New Roman" w:hAnsi="Times New Roman" w:cs="Times New Roman"/>
+          <w:color w:val="000000"/>
+          <w:sz w:val="24"/>
+          <w:szCs w:val="24"/>
+          <w:lang w:val="pl-PL"/>
+        </w:rPr>
+        <w:br/>
+      </w:r>
+      <w:r>
+        <w:rPr>
+          <w:rFonts w:ascii="Times New Roman" w:eastAsia="Times New Roman" w:hAnsi="Times New Roman" w:cs="Times New Roman"/>
+          <w:color w:val="000000"/>
+          <w:sz w:val="24"/>
+          <w:szCs w:val="24"/>
+          <w:lang w:val="pl-PL"/>
+        </w:rPr>
+        <w:br/>
+      </w:r>
+      <w:r>
+        <w:rPr>
+          <w:rFonts w:ascii="Times New Roman" w:eastAsia="Times New Roman" w:hAnsi="Times New Roman" w:cs="Times New Roman"/>
+          <w:color w:val="000000"/>
+          <w:sz w:val="24"/>
+          <w:szCs w:val="24"/>
+          <w:lang w:val="pl-PL"/>
+        </w:rPr>
+        <w:br/>
+      </w:r>
+      <w:r>
+        <w:rPr>
+          <w:rFonts w:ascii="Times New Roman" w:eastAsia="Times New Roman" w:hAnsi="Times New Roman" w:cs="Times New Roman"/>
+          <w:color w:val="000000"/>
+          <w:sz w:val="24"/>
+          <w:szCs w:val="24"/>
+          <w:lang w:val="pl-PL"/>
+        </w:rPr>
+        <w:br/>
+      </w:r>
+      <w:r>
+        <w:rPr>
+          <w:rFonts w:ascii="Times New Roman" w:eastAsia="Times New Roman" w:hAnsi="Times New Roman" w:cs="Times New Roman"/>
+          <w:color w:val="000000"/>
+          <w:sz w:val="24"/>
+          <w:szCs w:val="24"/>
+          <w:lang w:val="pl-PL"/>
+        </w:rPr>
+        <w:br/>
+      </w:r>
+      <w:r>
+        <w:rPr>
+          <w:rFonts w:ascii="Times New Roman" w:eastAsia="Times New Roman" w:hAnsi="Times New Roman" w:cs="Times New Roman"/>
+          <w:color w:val="000000"/>
+          <w:sz w:val="24"/>
+          <w:szCs w:val="24"/>
+          <w:lang w:val="pl-PL"/>
+        </w:rPr>
+        <w:br/>
+      </w:r>
+      <w:r>
+        <w:rPr>
+          <w:rFonts w:ascii="Times New Roman" w:eastAsia="Times New Roman" w:hAnsi="Times New Roman" w:cs="Times New Roman"/>
+          <w:color w:val="000000"/>
+          <w:sz w:val="24"/>
+          <w:szCs w:val="24"/>
+          <w:lang w:val="pl-PL"/>
+        </w:rPr>
+        <w:br/>
+      </w:r>
+      <w:r>
+        <w:rPr>
+          <w:rFonts w:ascii="Times New Roman" w:eastAsia="Times New Roman" w:hAnsi="Times New Roman" w:cs="Times New Roman"/>
+          <w:color w:val="000000"/>
+          <w:sz w:val="24"/>
+          <w:szCs w:val="24"/>
+          <w:lang w:val="pl-PL"/>
+        </w:rPr>
+        <w:br/>
+      </w:r>
+      <w:r>
+        <w:rPr>
+          <w:rFonts w:ascii="Times New Roman" w:eastAsia="Times New Roman" w:hAnsi="Times New Roman" w:cs="Times New Roman"/>
+          <w:color w:val="000000"/>
+          <w:sz w:val="24"/>
+          <w:szCs w:val="24"/>
+          <w:lang w:val="pl-PL"/>
+        </w:rPr>
+        <w:br/>
+      </w:r>
+      <w:r>
+        <w:rPr>
+          <w:rFonts w:ascii="Times New Roman" w:eastAsia="Times New Roman" w:hAnsi="Times New Roman" w:cs="Times New Roman"/>
+          <w:color w:val="000000"/>
+          <w:sz w:val="24"/>
+          <w:szCs w:val="24"/>
+          <w:lang w:val="pl-PL"/>
+        </w:rPr>
+        <w:br/>
+      </w:r>
+      <w:r>
+        <w:rPr>
+          <w:rFonts w:ascii="Times New Roman" w:eastAsia="Times New Roman" w:hAnsi="Times New Roman" w:cs="Times New Roman"/>
+          <w:color w:val="000000"/>
+          <w:sz w:val="24"/>
+          <w:szCs w:val="24"/>
+          <w:lang w:val="pl-PL"/>
+        </w:rPr>
+        <w:br/>
+      </w:r>
+      <w:r>
+        <w:rPr>
+          <w:rFonts w:ascii="Times New Roman" w:eastAsia="Times New Roman" w:hAnsi="Times New Roman" w:cs="Times New Roman"/>
+          <w:color w:val="000000"/>
+          <w:sz w:val="24"/>
+          <w:szCs w:val="24"/>
+          <w:lang w:val="pl-PL"/>
+        </w:rPr>
+        <w:br/>
+      </w:r>
+      <w:r>
+        <w:rPr>
+          <w:rFonts w:ascii="Times New Roman" w:eastAsia="Times New Roman" w:hAnsi="Times New Roman" w:cs="Times New Roman"/>
+          <w:color w:val="000000"/>
+          <w:sz w:val="24"/>
+          <w:szCs w:val="24"/>
+          <w:lang w:val="pl-PL"/>
+        </w:rPr>
+        <w:br/>
+      </w:r>
+      <w:r>
+        <w:rPr>
+          <w:rFonts w:ascii="Times New Roman" w:eastAsia="Times New Roman" w:hAnsi="Times New Roman" w:cs="Times New Roman"/>
+          <w:color w:val="000000"/>
+          <w:sz w:val="24"/>
+          <w:szCs w:val="24"/>
+          <w:lang w:val="pl-PL"/>
+        </w:rPr>
+        <w:br/>
+      </w:r>
+      <w:r>
+        <w:rPr>
+          <w:rFonts w:ascii="Times New Roman" w:eastAsia="Times New Roman" w:hAnsi="Times New Roman" w:cs="Times New Roman"/>
+          <w:color w:val="000000"/>
+          <w:sz w:val="24"/>
+          <w:szCs w:val="24"/>
+          <w:lang w:val="pl-PL"/>
+        </w:rPr>
+        <w:br/>
+      </w:r>
+      <w:r>
+        <w:rPr>
+          <w:rFonts w:ascii="Times New Roman" w:eastAsia="Times New Roman" w:hAnsi="Times New Roman" w:cs="Times New Roman"/>
+          <w:color w:val="000000"/>
+          <w:sz w:val="24"/>
+          <w:szCs w:val="24"/>
+          <w:lang w:val="pl-PL"/>
+        </w:rPr>
+        <w:br/>
+      </w:r>
+      <w:r>
+        <w:rPr>
+          <w:rFonts w:ascii="Times New Roman" w:eastAsia="Times New Roman" w:hAnsi="Times New Roman" w:cs="Times New Roman"/>
+          <w:color w:val="000000"/>
+          <w:sz w:val="24"/>
+          <w:szCs w:val="24"/>
+          <w:lang w:val="pl-PL"/>
+        </w:rPr>
+        <w:br/>
+      </w:r>
+      <w:r>
+        <w:rPr>
+          <w:rFonts w:ascii="Times New Roman" w:eastAsia="Times New Roman" w:hAnsi="Times New Roman" w:cs="Times New Roman"/>
+          <w:color w:val="000000"/>
+          <w:sz w:val="24"/>
+          <w:szCs w:val="24"/>
+          <w:lang w:val="pl-PL"/>
+        </w:rPr>
+        <w:br/>
+      </w:r>
+    </w:p>
+    <w:p>
+      <w:pPr>
+        <w:spacing w:line="240" w:lineRule="auto"/>
+        <w:rPr>
+          <w:rFonts w:eastAsia="Times New Roman"/>
+          <w:b/>
+          <w:bCs/>
+          <w:color w:val="000000"/>
+          <w:sz w:val="24"/>
+          <w:szCs w:val="24"/>
+          <w:lang w:val="pl-PL"/>
+        </w:rPr>
+      </w:pPr>
+    </w:p>
+    <w:p>
+      <w:pPr>
+        <w:spacing w:line="240" w:lineRule="auto"/>
+        <w:rPr>
+          <w:rFonts w:eastAsia="Times New Roman"/>
+          <w:b/>
+          <w:bCs/>
+          <w:color w:val="000000"/>
+          <w:sz w:val="24"/>
+          <w:szCs w:val="24"/>
+          <w:lang w:val="pl-PL"/>
+        </w:rPr>
+      </w:pPr>
+    </w:p>
+    <w:p>
+      <w:pPr>
+        <w:spacing w:line="240" w:lineRule="auto"/>
+        <w:rPr>
+          <w:rFonts w:eastAsia="Times New Roman"/>
+          <w:b/>
+          <w:bCs/>
+          <w:color w:val="000000"/>
+          <w:sz w:val="24"/>
+          <w:szCs w:val="24"/>
+          <w:lang w:val="pl-PL"/>
+        </w:rPr>
+      </w:pPr>
+    </w:p>
+    <w:p>
+      <w:pPr>
+        <w:spacing w:line="240" w:lineRule="auto"/>
+        <w:rPr>
+          <w:rFonts w:eastAsia="Times New Roman"/>
+          <w:b/>
+          <w:bCs/>
+          <w:color w:val="000000"/>
+          <w:sz w:val="24"/>
+          <w:szCs w:val="24"/>
+          <w:lang w:val="pl-PL"/>
+        </w:rPr>
+      </w:pPr>
+    </w:p>
+    <w:p>
+      <w:pPr>
+        <w:spacing w:line="240" w:lineRule="auto"/>
+        <w:rPr>
+          <w:rFonts w:eastAsia="Times New Roman"/>
+          <w:b/>
+          <w:bCs/>
+          <w:color w:val="000000"/>
+          <w:sz w:val="24"/>
+          <w:szCs w:val="24"/>
+          <w:lang w:val="pl-PL"/>
+        </w:rPr>
+      </w:pPr>
+      <w:r>
+        <w:rPr>
+          <w:rFonts w:eastAsia="Times New Roman"/>
+          <w:b/>
+          <w:bCs/>
+          <w:color w:val="000000"/>
+          <w:sz w:val="24"/>
+          <w:szCs w:val="24"/>
+          <w:lang w:val="pl-PL"/>
+        </w:rPr>
+        <w:lastRenderedPageBreak/>
+        <w:t>Formularz wyznaczania grafików karmienia</w:t>
+      </w:r>
+    </w:p>
+    <w:p>
+      <w:pPr>
+        <w:spacing w:line="240" w:lineRule="auto"/>
+        <w:rPr>
+          <w:rFonts w:ascii="Times New Roman" w:eastAsia="Times New Roman" w:hAnsi="Times New Roman" w:cs="Times New Roman"/>
+          <w:color w:val="000000"/>
+          <w:sz w:val="24"/>
+          <w:szCs w:val="24"/>
+          <w:lang w:val="pl-PL"/>
+        </w:rPr>
+      </w:pPr>
+    </w:p>
+    <w:p>
+      <w:pPr>
+        <w:spacing w:line="240" w:lineRule="auto"/>
+        <w:rPr>
+          <w:rFonts w:ascii="Times New Roman" w:eastAsia="Times New Roman" w:hAnsi="Times New Roman" w:cs="Times New Roman"/>
+          <w:color w:val="000000"/>
+          <w:sz w:val="24"/>
+          <w:szCs w:val="24"/>
+          <w:lang w:val="pl-PL"/>
+        </w:rPr>
+      </w:pPr>
+      <w:r>
+        <w:rPr>
+          <w:rFonts w:eastAsia="Times New Roman"/>
+          <w:b/>
+          <w:bCs/>
+          <w:noProof/>
+          <w:color w:val="000000"/>
+          <w:sz w:val="24"/>
+          <w:szCs w:val="24"/>
+          <w:bdr w:val="none" w:sz="0" w:space="0" w:color="auto" w:frame="1"/>
+          <w:lang w:val="pl-PL"/>
+        </w:rPr>
+        <w:drawing>
+          <wp:inline distT="0" distB="0" distL="0" distR="0" wp14:anchorId="7ED9D4A7" wp14:editId="4D1D7C35">
+            <wp:extent cx="6842760" cy="4257040"/>
+            <wp:effectExtent l="0" t="0" r="2540" b="0"/>
+            <wp:docPr id="1810219888" name="Obraz 4"/>
+            <wp:cNvGraphicFramePr>
+              <a:graphicFrameLocks xmlns:a="http://schemas.openxmlformats.org/drawingml/2006/main" noChangeAspect="1"/>
+            </wp:cNvGraphicFramePr>
+            <a:graphic xmlns:a="http://schemas.openxmlformats.org/drawingml/2006/main">
+              <a:graphicData uri="http://schemas.openxmlformats.org/drawingml/2006/picture">
+                <pic:pic xmlns:pic="http://schemas.openxmlformats.org/drawingml/2006/picture">
+                  <pic:nvPicPr>
+                    <pic:cNvPr id="0" name="Picture 10"/>
+                    <pic:cNvPicPr>
+                      <a:picLocks noChangeAspect="1" noChangeArrowheads="1"/>
+                    </pic:cNvPicPr>
+                  </pic:nvPicPr>
+                  <pic:blipFill>
+                    <a:blip r:embed="rId22">
+                      <a:extLst>
+                        <a:ext uri="{28A0092B-C50C-407E-A947-70E740481C1C}">
+                          <a14:useLocalDpi xmlns:a14="http://schemas.microsoft.com/office/drawing/2010/main" val="0"/>
+                        </a:ext>
+                      </a:extLst>
+                    </a:blip>
+                    <a:srcRect/>
+                    <a:stretch>
+                      <a:fillRect/>
+                    </a:stretch>
+                  </pic:blipFill>
+                  <pic:spPr bwMode="auto">
+                    <a:xfrm>
+                      <a:off x="0" y="0"/>
+                      <a:ext cx="6842760" cy="4257040"/>
+                    </a:xfrm>
+                    <a:prstGeom prst="rect">
+                      <a:avLst/>
+                    </a:prstGeom>
+                    <a:noFill/>
+                    <a:ln>
+                      <a:noFill/>
+                    </a:ln>
+                  </pic:spPr>
+                </pic:pic>
+              </a:graphicData>
+            </a:graphic>
+          </wp:inline>
+        </w:drawing>
+      </w:r>
+    </w:p>
+    <w:p>
+      <w:pPr>
+        <w:spacing w:line="240" w:lineRule="auto"/>
+        <w:rPr>
+          <w:rFonts w:ascii="Times New Roman" w:eastAsia="Times New Roman" w:hAnsi="Times New Roman" w:cs="Times New Roman"/>
+          <w:color w:val="000000"/>
+          <w:sz w:val="24"/>
+          <w:szCs w:val="24"/>
+          <w:lang w:val="pl-PL"/>
+        </w:rPr>
+      </w:pPr>
+    </w:p>
+    <w:p>
+      <w:pPr>
+        <w:spacing w:line="240" w:lineRule="auto"/>
+        <w:rPr>
+          <w:rFonts w:eastAsia="Times New Roman"/>
+          <w:b/>
+          <w:bCs/>
+          <w:color w:val="000000"/>
+          <w:sz w:val="24"/>
+          <w:szCs w:val="24"/>
+          <w:lang w:val="pl-PL"/>
+        </w:rPr>
+      </w:pPr>
+      <w:r>
+        <w:rPr>
+          <w:rFonts w:eastAsia="Times New Roman"/>
+          <w:b/>
+          <w:bCs/>
+          <w:color w:val="000000"/>
+          <w:sz w:val="24"/>
+          <w:szCs w:val="24"/>
+          <w:lang w:val="pl-PL"/>
+        </w:rPr>
+        <w:t>Formularz rejestracji chomika</w:t>
+      </w:r>
+    </w:p>
+    <w:p>
+      <w:pPr>
+        <w:spacing w:line="240" w:lineRule="auto"/>
+        <w:rPr>
+          <w:rFonts w:ascii="Times New Roman" w:eastAsia="Times New Roman" w:hAnsi="Times New Roman" w:cs="Times New Roman"/>
+          <w:color w:val="000000"/>
+          <w:sz w:val="24"/>
+          <w:szCs w:val="24"/>
+          <w:lang w:val="pl-PL"/>
+        </w:rPr>
+      </w:pPr>
+    </w:p>
+    <w:p>
+      <w:pPr>
+        <w:spacing w:line="240" w:lineRule="auto"/>
+        <w:rPr>
+          <w:rFonts w:ascii="Times New Roman" w:eastAsia="Times New Roman" w:hAnsi="Times New Roman" w:cs="Times New Roman"/>
+          <w:color w:val="000000"/>
+          <w:sz w:val="24"/>
+          <w:szCs w:val="24"/>
+          <w:lang w:val="pl-PL"/>
+        </w:rPr>
+      </w:pPr>
+      <w:r>
+        <w:rPr>
+          <w:rFonts w:eastAsia="Times New Roman"/>
+          <w:b/>
+          <w:bCs/>
+          <w:noProof/>
+          <w:color w:val="000000"/>
+          <w:sz w:val="24"/>
+          <w:szCs w:val="24"/>
+          <w:bdr w:val="none" w:sz="0" w:space="0" w:color="auto" w:frame="1"/>
+          <w:lang w:val="pl-PL"/>
+        </w:rPr>
+        <w:drawing>
+          <wp:inline distT="0" distB="0" distL="0" distR="0" wp14:anchorId="05BFFA64" wp14:editId="1A4AD4D2">
+            <wp:extent cx="6842760" cy="4272280"/>
+            <wp:effectExtent l="0" t="0" r="2540" b="0"/>
+            <wp:docPr id="678702384" name="Obraz 3"/>
+            <wp:cNvGraphicFramePr>
+              <a:graphicFrameLocks xmlns:a="http://schemas.openxmlformats.org/drawingml/2006/main" noChangeAspect="1"/>
+            </wp:cNvGraphicFramePr>
+            <a:graphic xmlns:a="http://schemas.openxmlformats.org/drawingml/2006/main">
+              <a:graphicData uri="http://schemas.openxmlformats.org/drawingml/2006/picture">
+                <pic:pic xmlns:pic="http://schemas.openxmlformats.org/drawingml/2006/picture">
+                  <pic:nvPicPr>
+                    <pic:cNvPr id="0" name="Picture 11"/>
+                    <pic:cNvPicPr>
+                      <a:picLocks noChangeAspect="1" noChangeArrowheads="1"/>
+                    </pic:cNvPicPr>
+                  </pic:nvPicPr>
+                  <pic:blipFill>
+                    <a:blip r:embed="rId23">
+                      <a:extLst>
+                        <a:ext uri="{28A0092B-C50C-407E-A947-70E740481C1C}">
+                          <a14:useLocalDpi xmlns:a14="http://schemas.microsoft.com/office/drawing/2010/main" val="0"/>
+                        </a:ext>
+                      </a:extLst>
+                    </a:blip>
+                    <a:srcRect/>
+                    <a:stretch>
+                      <a:fillRect/>
+                    </a:stretch>
+                  </pic:blipFill>
+                  <pic:spPr bwMode="auto">
+                    <a:xfrm>
+                      <a:off x="0" y="0"/>
+                      <a:ext cx="6842760" cy="4272280"/>
+                    </a:xfrm>
+                    <a:prstGeom prst="rect">
+                      <a:avLst/>
+                    </a:prstGeom>
+                    <a:noFill/>
+                    <a:ln>
+                      <a:noFill/>
+                    </a:ln>
+                  </pic:spPr>
+                </pic:pic>
+              </a:graphicData>
+            </a:graphic>
+          </wp:inline>
+        </w:drawing>
+      </w:r>
+    </w:p>
+    <w:p>
+      <w:pPr>
+        <w:spacing w:after="240" w:line="240" w:lineRule="auto"/>
+        <w:rPr>
+          <w:rFonts w:ascii="Times New Roman" w:eastAsia="Times New Roman" w:hAnsi="Times New Roman" w:cs="Times New Roman"/>
+          <w:color w:val="000000"/>
+          <w:sz w:val="24"/>
+          <w:szCs w:val="24"/>
+          <w:lang w:val="pl-PL"/>
+        </w:rPr>
+      </w:pPr>
+      <w:r>
+        <w:rPr>
+          <w:rFonts w:ascii="Times New Roman" w:eastAsia="Times New Roman" w:hAnsi="Times New Roman" w:cs="Times New Roman"/>
+          <w:color w:val="000000"/>
+          <w:sz w:val="24"/>
+          <w:szCs w:val="24"/>
+          <w:lang w:val="pl-PL"/>
+        </w:rPr>
+        <w:br/>
+      </w:r>
+      <w:r>
+        <w:rPr>
+          <w:rFonts w:ascii="Times New Roman" w:eastAsia="Times New Roman" w:hAnsi="Times New Roman" w:cs="Times New Roman"/>
+          <w:color w:val="000000"/>
+          <w:sz w:val="24"/>
+          <w:szCs w:val="24"/>
+          <w:lang w:val="pl-PL"/>
+        </w:rPr>
+        <w:br/>
+      </w:r>
+    </w:p>
+    <w:p>
+      <w:pPr>
+        <w:spacing w:line="240" w:lineRule="auto"/>
+        <w:rPr>
+          <w:rFonts w:eastAsia="Times New Roman"/>
+          <w:b/>
+          <w:bCs/>
+          <w:color w:val="000000"/>
+          <w:sz w:val="24"/>
+          <w:szCs w:val="24"/>
+          <w:lang w:val="pl-PL"/>
+        </w:rPr>
+      </w:pPr>
+      <w:r>
+        <w:rPr>
+          <w:rFonts w:eastAsia="Times New Roman"/>
+          <w:b/>
+          <w:bCs/>
+          <w:color w:val="000000"/>
+          <w:sz w:val="24"/>
+          <w:szCs w:val="24"/>
+          <w:lang w:val="pl-PL"/>
+        </w:rPr>
+        <w:lastRenderedPageBreak/>
+        <w:t>Formularz zgłoszenia chomika na wystawę</w:t>
+      </w:r>
+    </w:p>
+    <w:p>
+      <w:pPr>
+        <w:spacing w:line="240" w:lineRule="auto"/>
+        <w:rPr>
+          <w:rFonts w:ascii="Times New Roman" w:eastAsia="Times New Roman" w:hAnsi="Times New Roman" w:cs="Times New Roman"/>
+          <w:color w:val="000000"/>
+          <w:sz w:val="24"/>
+          <w:szCs w:val="24"/>
+          <w:lang w:val="pl-PL"/>
+        </w:rPr>
+      </w:pPr>
+    </w:p>
+    <w:p>
+      <w:pPr>
+        <w:spacing w:line="240" w:lineRule="auto"/>
+        <w:rPr>
+          <w:rFonts w:ascii="Times New Roman" w:eastAsia="Times New Roman" w:hAnsi="Times New Roman" w:cs="Times New Roman"/>
+          <w:color w:val="000000"/>
+          <w:sz w:val="24"/>
+          <w:szCs w:val="24"/>
+          <w:lang w:val="pl-PL"/>
+        </w:rPr>
+      </w:pPr>
+      <w:r>
+        <w:rPr>
+          <w:rFonts w:eastAsia="Times New Roman"/>
+          <w:b/>
+          <w:bCs/>
+          <w:noProof/>
+          <w:color w:val="000000"/>
+          <w:sz w:val="24"/>
+          <w:szCs w:val="24"/>
+          <w:bdr w:val="none" w:sz="0" w:space="0" w:color="auto" w:frame="1"/>
+          <w:lang w:val="pl-PL"/>
+        </w:rPr>
+        <w:drawing>
+          <wp:inline distT="0" distB="0" distL="0" distR="0" wp14:anchorId="30F57B36" wp14:editId="23700F4A">
+            <wp:extent cx="6835775" cy="4257040"/>
+            <wp:effectExtent l="0" t="0" r="0" b="0"/>
+            <wp:docPr id="794383931" name="Obraz 2"/>
+            <wp:cNvGraphicFramePr>
+              <a:graphicFrameLocks xmlns:a="http://schemas.openxmlformats.org/drawingml/2006/main" noChangeAspect="1"/>
+            </wp:cNvGraphicFramePr>
+            <a:graphic xmlns:a="http://schemas.openxmlformats.org/drawingml/2006/main">
+              <a:graphicData uri="http://schemas.openxmlformats.org/drawingml/2006/picture">
+                <pic:pic xmlns:pic="http://schemas.openxmlformats.org/drawingml/2006/picture">
+                  <pic:nvPicPr>
+                    <pic:cNvPr id="0" name="Picture 12"/>
+                    <pic:cNvPicPr>
+                      <a:picLocks noChangeAspect="1" noChangeArrowheads="1"/>
+                    </pic:cNvPicPr>
+                  </pic:nvPicPr>
+                  <pic:blipFill>
+                    <a:blip r:embed="rId24">
+                      <a:extLst>
+                        <a:ext uri="{28A0092B-C50C-407E-A947-70E740481C1C}">
+                          <a14:useLocalDpi xmlns:a14="http://schemas.microsoft.com/office/drawing/2010/main" val="0"/>
+                        </a:ext>
+                      </a:extLst>
+                    </a:blip>
+                    <a:srcRect/>
+                    <a:stretch>
+                      <a:fillRect/>
+                    </a:stretch>
+                  </pic:blipFill>
+                  <pic:spPr bwMode="auto">
+                    <a:xfrm>
+                      <a:off x="0" y="0"/>
+                      <a:ext cx="6835775" cy="4257040"/>
+                    </a:xfrm>
+                    <a:prstGeom prst="rect">
+                      <a:avLst/>
+                    </a:prstGeom>
+                    <a:noFill/>
+                    <a:ln>
+                      <a:noFill/>
+                    </a:ln>
+                  </pic:spPr>
+                </pic:pic>
+              </a:graphicData>
+            </a:graphic>
+          </wp:inline>
+        </w:drawing>
+      </w:r>
+    </w:p>
+    <w:p>
+      <w:pPr>
+        <w:spacing w:line="240" w:lineRule="auto"/>
+        <w:rPr>
+          <w:rFonts w:ascii="Times New Roman" w:eastAsia="Times New Roman" w:hAnsi="Times New Roman" w:cs="Times New Roman"/>
+          <w:color w:val="000000"/>
+          <w:sz w:val="24"/>
+          <w:szCs w:val="24"/>
+          <w:lang w:val="pl-PL"/>
+        </w:rPr>
+      </w:pPr>
+    </w:p>
+    <w:p>
+      <w:pPr>
+        <w:spacing w:line="240" w:lineRule="auto"/>
+        <w:rPr>
+          <w:rFonts w:eastAsia="Times New Roman"/>
+          <w:b/>
+          <w:bCs/>
+          <w:color w:val="000000"/>
+          <w:sz w:val="24"/>
+          <w:szCs w:val="24"/>
+          <w:lang w:val="pl-PL"/>
+        </w:rPr>
+      </w:pPr>
+      <w:r>
+        <w:rPr>
+          <w:rFonts w:eastAsia="Times New Roman"/>
+          <w:b/>
+          <w:bCs/>
+          <w:color w:val="000000"/>
+          <w:sz w:val="24"/>
+          <w:szCs w:val="24"/>
+          <w:lang w:val="pl-PL"/>
+        </w:rPr>
+        <w:t>Formularz dodania protokołu leczenia</w:t>
+      </w:r>
+    </w:p>
+    <w:p>
+      <w:pPr>
+        <w:spacing w:line="240" w:lineRule="auto"/>
+        <w:rPr>
+          <w:rFonts w:ascii="Times New Roman" w:eastAsia="Times New Roman" w:hAnsi="Times New Roman" w:cs="Times New Roman"/>
+          <w:color w:val="000000"/>
+          <w:sz w:val="24"/>
+          <w:szCs w:val="24"/>
+          <w:lang w:val="pl-PL"/>
+        </w:rPr>
+      </w:pPr>
+    </w:p>
+    <w:p>
+      <w:pPr>
+        <w:spacing w:line="240" w:lineRule="auto"/>
+        <w:rPr>
+          <w:rFonts w:ascii="Times New Roman" w:eastAsia="Times New Roman" w:hAnsi="Times New Roman" w:cs="Times New Roman"/>
+          <w:color w:val="000000"/>
+          <w:sz w:val="24"/>
+          <w:szCs w:val="24"/>
+          <w:lang w:val="pl-PL"/>
+        </w:rPr>
+      </w:pPr>
+      <w:r>
+        <w:rPr>
+          <w:rFonts w:eastAsia="Times New Roman"/>
+          <w:b/>
+          <w:bCs/>
+          <w:noProof/>
+          <w:color w:val="000000"/>
+          <w:sz w:val="24"/>
+          <w:szCs w:val="24"/>
+          <w:bdr w:val="none" w:sz="0" w:space="0" w:color="auto" w:frame="1"/>
+          <w:lang w:val="pl-PL"/>
+        </w:rPr>
+        <w:drawing>
+          <wp:inline distT="0" distB="0" distL="0" distR="0" wp14:anchorId="548498E3" wp14:editId="6E2A7868">
+            <wp:extent cx="6835775" cy="4264660"/>
+            <wp:effectExtent l="0" t="0" r="0" b="2540"/>
+            <wp:docPr id="986285125" name="Obraz 1"/>
+            <wp:cNvGraphicFramePr>
+              <a:graphicFrameLocks xmlns:a="http://schemas.openxmlformats.org/drawingml/2006/main" noChangeAspect="1"/>
+            </wp:cNvGraphicFramePr>
+            <a:graphic xmlns:a="http://schemas.openxmlformats.org/drawingml/2006/main">
+              <a:graphicData uri="http://schemas.openxmlformats.org/drawingml/2006/picture">
+                <pic:pic xmlns:pic="http://schemas.openxmlformats.org/drawingml/2006/picture">
+                  <pic:nvPicPr>
+                    <pic:cNvPr id="0" name="Picture 13"/>
+                    <pic:cNvPicPr>
+                      <a:picLocks noChangeAspect="1" noChangeArrowheads="1"/>
+                    </pic:cNvPicPr>
+                  </pic:nvPicPr>
+                  <pic:blipFill>
+                    <a:blip r:embed="rId25">
+                      <a:extLst>
+                        <a:ext uri="{28A0092B-C50C-407E-A947-70E740481C1C}">
+                          <a14:useLocalDpi xmlns:a14="http://schemas.microsoft.com/office/drawing/2010/main" val="0"/>
+                        </a:ext>
+                      </a:extLst>
+                    </a:blip>
+                    <a:srcRect/>
+                    <a:stretch>
+                      <a:fillRect/>
+                    </a:stretch>
+                  </pic:blipFill>
+                  <pic:spPr bwMode="auto">
+                    <a:xfrm>
+                      <a:off x="0" y="0"/>
+                      <a:ext cx="6835775" cy="4264660"/>
+                    </a:xfrm>
+                    <a:prstGeom prst="rect">
+                      <a:avLst/>
+                    </a:prstGeom>
+                    <a:noFill/>
+                    <a:ln>
+                      <a:noFill/>
+                    </a:ln>
+                  </pic:spPr>
+                </pic:pic>
+              </a:graphicData>
+            </a:graphic>
+          </wp:inline>
+        </w:drawing>
+      </w:r>
+    </w:p>
+    <w:p>
+      <w:pPr>
+        <w:spacing w:after="240" w:line="240" w:lineRule="auto"/>
+        <w:rPr>
+          <w:rFonts w:ascii="Times New Roman" w:eastAsia="Times New Roman" w:hAnsi="Times New Roman" w:cs="Times New Roman"/>
+          <w:sz w:val="24"/>
+          <w:szCs w:val="24"/>
+          <w:lang w:val="pl-PL"/>
+        </w:rPr>
+      </w:pPr>
+    </w:p>
+    <w:p>
+      <w:pPr>
+        <w:spacing w:line="240" w:lineRule="auto"/>
+        <w:rPr>
+          <w:rFonts w:ascii="Times New Roman" w:eastAsia="Times New Roman" w:hAnsi="Times New Roman" w:cs="Times New Roman"/>
+          <w:sz w:val="24"/>
+          <w:szCs w:val="24"/>
+          <w:lang w:val="pl-PL"/>
+        </w:rPr>
+      </w:pPr>
     </w:p>
     <w:p>
       <w:pPr>

</xml_diff>

<commit_message>
5.3 - Dodanie opsiów do diagramu stanów chomika
</commit_message>
<xml_diff>
--- a/TK/TK.docx
+++ b/TK/TK.docx
@@ -4989,158 +4989,6 @@
     <w:p>
       <w:pPr>
         <w:spacing w:line="240" w:lineRule="auto"/>
-        <w:rPr>
-          <w:rFonts w:eastAsia="Times New Roman"/>
-          <w:color w:val="000000"/>
-          <w:lang w:val="pl-PL"/>
-        </w:rPr>
-      </w:pPr>
-    </w:p>
-    <w:p>
-      <w:pPr>
-        <w:spacing w:line="240" w:lineRule="auto"/>
-        <w:rPr>
-          <w:rFonts w:eastAsia="Times New Roman"/>
-          <w:color w:val="000000"/>
-          <w:lang w:val="pl-PL"/>
-        </w:rPr>
-      </w:pPr>
-    </w:p>
-    <w:p>
-      <w:pPr>
-        <w:spacing w:line="240" w:lineRule="auto"/>
-        <w:rPr>
-          <w:rFonts w:eastAsia="Times New Roman"/>
-          <w:color w:val="000000"/>
-          <w:lang w:val="pl-PL"/>
-        </w:rPr>
-      </w:pPr>
-    </w:p>
-    <w:p>
-      <w:pPr>
-        <w:spacing w:line="240" w:lineRule="auto"/>
-        <w:rPr>
-          <w:rFonts w:eastAsia="Times New Roman"/>
-          <w:color w:val="000000"/>
-          <w:lang w:val="pl-PL"/>
-        </w:rPr>
-      </w:pPr>
-    </w:p>
-    <w:p>
-      <w:pPr>
-        <w:spacing w:line="240" w:lineRule="auto"/>
-        <w:rPr>
-          <w:rFonts w:eastAsia="Times New Roman"/>
-          <w:color w:val="000000"/>
-          <w:lang w:val="pl-PL"/>
-        </w:rPr>
-      </w:pPr>
-    </w:p>
-    <w:p>
-      <w:pPr>
-        <w:spacing w:line="240" w:lineRule="auto"/>
-        <w:rPr>
-          <w:rFonts w:eastAsia="Times New Roman"/>
-          <w:color w:val="000000"/>
-          <w:lang w:val="pl-PL"/>
-        </w:rPr>
-      </w:pPr>
-    </w:p>
-    <w:p>
-      <w:pPr>
-        <w:spacing w:line="240" w:lineRule="auto"/>
-        <w:rPr>
-          <w:rFonts w:eastAsia="Times New Roman"/>
-          <w:color w:val="000000"/>
-          <w:lang w:val="pl-PL"/>
-        </w:rPr>
-      </w:pPr>
-    </w:p>
-    <w:p>
-      <w:pPr>
-        <w:spacing w:line="240" w:lineRule="auto"/>
-        <w:rPr>
-          <w:rFonts w:eastAsia="Times New Roman"/>
-          <w:color w:val="000000"/>
-          <w:lang w:val="pl-PL"/>
-        </w:rPr>
-      </w:pPr>
-    </w:p>
-    <w:p>
-      <w:pPr>
-        <w:spacing w:line="240" w:lineRule="auto"/>
-        <w:rPr>
-          <w:rFonts w:eastAsia="Times New Roman"/>
-          <w:color w:val="000000"/>
-          <w:lang w:val="pl-PL"/>
-        </w:rPr>
-      </w:pPr>
-    </w:p>
-    <w:p>
-      <w:pPr>
-        <w:spacing w:line="240" w:lineRule="auto"/>
-        <w:rPr>
-          <w:rFonts w:eastAsia="Times New Roman"/>
-          <w:color w:val="000000"/>
-          <w:lang w:val="pl-PL"/>
-        </w:rPr>
-      </w:pPr>
-    </w:p>
-    <w:p>
-      <w:pPr>
-        <w:spacing w:line="240" w:lineRule="auto"/>
-        <w:rPr>
-          <w:rFonts w:eastAsia="Times New Roman"/>
-          <w:color w:val="000000"/>
-          <w:lang w:val="pl-PL"/>
-        </w:rPr>
-      </w:pPr>
-    </w:p>
-    <w:p>
-      <w:pPr>
-        <w:spacing w:line="240" w:lineRule="auto"/>
-        <w:rPr>
-          <w:rFonts w:eastAsia="Times New Roman"/>
-          <w:color w:val="000000"/>
-          <w:lang w:val="pl-PL"/>
-        </w:rPr>
-      </w:pPr>
-    </w:p>
-    <w:p>
-      <w:pPr>
-        <w:spacing w:line="240" w:lineRule="auto"/>
-        <w:rPr>
-          <w:rFonts w:eastAsia="Times New Roman"/>
-          <w:color w:val="000000"/>
-          <w:lang w:val="pl-PL"/>
-        </w:rPr>
-      </w:pPr>
-    </w:p>
-    <w:p>
-      <w:pPr>
-        <w:spacing w:line="240" w:lineRule="auto"/>
-        <w:rPr>
-          <w:rFonts w:eastAsia="Times New Roman"/>
-          <w:color w:val="000000"/>
-          <w:lang w:val="pl-PL"/>
-        </w:rPr>
-      </w:pPr>
-    </w:p>
-    <w:p>
-      <w:pPr>
-        <w:spacing w:line="240" w:lineRule="auto"/>
-        <w:rPr>
-          <w:rFonts w:ascii="Times New Roman" w:eastAsia="Times New Roman" w:hAnsi="Times New Roman" w:cs="Times New Roman"/>
-          <w:color w:val="000000"/>
-          <w:sz w:val="24"/>
-          <w:szCs w:val="24"/>
-          <w:lang w:val="pl-PL"/>
-        </w:rPr>
-      </w:pPr>
-    </w:p>
-    <w:p>
-      <w:pPr>
-        <w:spacing w:line="240" w:lineRule="auto"/>
         <w:jc w:val="center"/>
         <w:rPr>
           <w:rFonts w:ascii="Times New Roman" w:eastAsia="Times New Roman" w:hAnsi="Times New Roman" w:cs="Times New Roman"/>
@@ -5158,6 +5006,532 @@
           <w:color w:val="000000"/>
           <w:lang w:val="pl-PL"/>
         </w:rPr>
+        <w:lastRenderedPageBreak/>
+        <w:t>Stany chomika</w:t>
+      </w:r>
+    </w:p>
+    <w:p>
+      <w:pPr>
+        <w:spacing w:line="240" w:lineRule="auto"/>
+        <w:jc w:val="center"/>
+        <w:rPr>
+          <w:rFonts w:ascii="Times New Roman" w:eastAsia="Times New Roman" w:hAnsi="Times New Roman" w:cs="Times New Roman"/>
+          <w:color w:val="000000"/>
+          <w:sz w:val="24"/>
+          <w:szCs w:val="24"/>
+          <w:lang w:val="pl-PL"/>
+        </w:rPr>
+      </w:pPr>
+      <w:r>
+        <w:rPr>
+          <w:rFonts w:eastAsia="Times New Roman"/>
+          <w:b/>
+          <w:bCs/>
+          <w:noProof/>
+          <w:color w:val="000000"/>
+          <w:bdr w:val="none" w:sz="0" w:space="0" w:color="auto" w:frame="1"/>
+          <w:lang w:val="pl-PL"/>
+        </w:rPr>
+        <w:drawing>
+          <wp:inline distT="0" distB="0" distL="0" distR="0" wp14:anchorId="175EE008" wp14:editId="6FB5EC9E">
+            <wp:extent cx="6176010" cy="4474845"/>
+            <wp:effectExtent l="0" t="0" r="0" b="0"/>
+            <wp:docPr id="105561546" name="Obraz 1"/>
+            <wp:cNvGraphicFramePr>
+              <a:graphicFrameLocks xmlns:a="http://schemas.openxmlformats.org/drawingml/2006/main" noChangeAspect="1"/>
+            </wp:cNvGraphicFramePr>
+            <a:graphic xmlns:a="http://schemas.openxmlformats.org/drawingml/2006/main">
+              <a:graphicData uri="http://schemas.openxmlformats.org/drawingml/2006/picture">
+                <pic:pic xmlns:pic="http://schemas.openxmlformats.org/drawingml/2006/picture">
+                  <pic:nvPicPr>
+                    <pic:cNvPr id="0" name="Picture 1"/>
+                    <pic:cNvPicPr>
+                      <a:picLocks noChangeAspect="1" noChangeArrowheads="1"/>
+                    </pic:cNvPicPr>
+                  </pic:nvPicPr>
+                  <pic:blipFill>
+                    <a:blip r:embed="rId11">
+                      <a:extLst>
+                        <a:ext uri="{28A0092B-C50C-407E-A947-70E740481C1C}">
+                          <a14:useLocalDpi xmlns:a14="http://schemas.microsoft.com/office/drawing/2010/main" val="0"/>
+                        </a:ext>
+                      </a:extLst>
+                    </a:blip>
+                    <a:srcRect/>
+                    <a:stretch>
+                      <a:fillRect/>
+                    </a:stretch>
+                  </pic:blipFill>
+                  <pic:spPr bwMode="auto">
+                    <a:xfrm>
+                      <a:off x="0" y="0"/>
+                      <a:ext cx="6176010" cy="4474845"/>
+                    </a:xfrm>
+                    <a:prstGeom prst="rect">
+                      <a:avLst/>
+                    </a:prstGeom>
+                    <a:noFill/>
+                    <a:ln>
+                      <a:noFill/>
+                    </a:ln>
+                  </pic:spPr>
+                </pic:pic>
+              </a:graphicData>
+            </a:graphic>
+          </wp:inline>
+        </w:drawing>
+      </w:r>
+    </w:p>
+    <w:p>
+      <w:pPr>
+        <w:spacing w:line="240" w:lineRule="auto"/>
+        <w:jc w:val="center"/>
+        <w:rPr>
+          <w:rFonts w:ascii="Times New Roman" w:eastAsia="Times New Roman" w:hAnsi="Times New Roman" w:cs="Times New Roman"/>
+          <w:color w:val="000000"/>
+          <w:sz w:val="24"/>
+          <w:szCs w:val="24"/>
+          <w:lang w:val="pl-PL"/>
+        </w:rPr>
+      </w:pPr>
+    </w:p>
+    <w:p>
+      <w:pPr>
+        <w:spacing w:line="240" w:lineRule="auto"/>
+        <w:rPr>
+          <w:rFonts w:ascii="Times New Roman" w:eastAsia="Times New Roman" w:hAnsi="Times New Roman" w:cs="Times New Roman"/>
+          <w:color w:val="000000"/>
+          <w:sz w:val="24"/>
+          <w:szCs w:val="24"/>
+          <w:lang w:val="pl-PL"/>
+        </w:rPr>
+      </w:pPr>
+      <w:r>
+        <w:rPr>
+          <w:rFonts w:eastAsia="Times New Roman"/>
+          <w:b/>
+          <w:bCs/>
+          <w:color w:val="000000"/>
+          <w:lang w:val="pl-PL"/>
+        </w:rPr>
+        <w:t xml:space="preserve">Dostępny: </w:t>
+      </w:r>
+      <w:r>
+        <w:rPr>
+          <w:rFonts w:eastAsia="Times New Roman"/>
+          <w:color w:val="000000"/>
+          <w:lang w:val="pl-PL"/>
+        </w:rPr>
+        <w:t>Chomik przebywa w menażerii, jest zdrowy i gotowy do wypożyczenia.</w:t>
+      </w:r>
+    </w:p>
+    <w:p>
+      <w:pPr>
+        <w:spacing w:line="240" w:lineRule="auto"/>
+        <w:rPr>
+          <w:rFonts w:ascii="Times New Roman" w:eastAsia="Times New Roman" w:hAnsi="Times New Roman" w:cs="Times New Roman"/>
+          <w:color w:val="000000"/>
+          <w:sz w:val="24"/>
+          <w:szCs w:val="24"/>
+          <w:lang w:val="pl-PL"/>
+        </w:rPr>
+      </w:pPr>
+      <w:r>
+        <w:rPr>
+          <w:rFonts w:eastAsia="Times New Roman"/>
+          <w:b/>
+          <w:bCs/>
+          <w:color w:val="000000"/>
+          <w:lang w:val="pl-PL"/>
+        </w:rPr>
+        <w:t xml:space="preserve">Zarezerwowany: </w:t>
+      </w:r>
+      <w:r>
+        <w:rPr>
+          <w:rFonts w:eastAsia="Times New Roman"/>
+          <w:color w:val="000000"/>
+          <w:lang w:val="pl-PL"/>
+        </w:rPr>
+        <w:t>Chomik został wybrany w formularzu leasingowym przez klienta, system tymczasowo blokuje możliwość wypożyczenia go przez innych.</w:t>
+      </w:r>
+    </w:p>
+    <w:p>
+      <w:pPr>
+        <w:spacing w:line="240" w:lineRule="auto"/>
+        <w:rPr>
+          <w:rFonts w:ascii="Times New Roman" w:eastAsia="Times New Roman" w:hAnsi="Times New Roman" w:cs="Times New Roman"/>
+          <w:color w:val="000000"/>
+          <w:sz w:val="24"/>
+          <w:szCs w:val="24"/>
+          <w:lang w:val="pl-PL"/>
+        </w:rPr>
+      </w:pPr>
+      <w:r>
+        <w:rPr>
+          <w:rFonts w:eastAsia="Times New Roman"/>
+          <w:b/>
+          <w:bCs/>
+          <w:color w:val="000000"/>
+          <w:lang w:val="pl-PL"/>
+        </w:rPr>
+        <w:t xml:space="preserve">Wypożyczony: </w:t>
+      </w:r>
+      <w:r>
+        <w:rPr>
+          <w:rFonts w:eastAsia="Times New Roman"/>
+          <w:color w:val="000000"/>
+          <w:lang w:val="pl-PL"/>
+        </w:rPr>
+        <w:t>Chomik znajduje się u klienta w ramach trwającej umowy leasingowej.</w:t>
+      </w:r>
+    </w:p>
+    <w:p>
+      <w:pPr>
+        <w:spacing w:line="240" w:lineRule="auto"/>
+        <w:rPr>
+          <w:rFonts w:eastAsia="Times New Roman"/>
+          <w:color w:val="000000"/>
+          <w:lang w:val="pl-PL"/>
+        </w:rPr>
+      </w:pPr>
+      <w:r>
+        <w:rPr>
+          <w:rFonts w:eastAsia="Times New Roman"/>
+          <w:b/>
+          <w:bCs/>
+          <w:color w:val="000000"/>
+          <w:lang w:val="pl-PL"/>
+        </w:rPr>
+        <w:t xml:space="preserve">Chory: </w:t>
+      </w:r>
+      <w:r>
+        <w:rPr>
+          <w:rFonts w:eastAsia="Times New Roman"/>
+          <w:color w:val="000000"/>
+          <w:lang w:val="pl-PL"/>
+        </w:rPr>
+        <w:t>Chomik został zdiagnozowany jako chory, weterynarz prowadzi leczenie. W tym stanie chomik jest wyłączony z możliwości leasingu.</w:t>
+      </w:r>
+    </w:p>
+    <w:p>
+      <w:pPr>
+        <w:spacing w:line="240" w:lineRule="auto"/>
+        <w:rPr>
+          <w:rFonts w:eastAsia="Times New Roman"/>
+          <w:color w:val="000000"/>
+          <w:lang w:val="pl-PL"/>
+        </w:rPr>
+      </w:pPr>
+    </w:p>
+    <w:p>
+      <w:pPr>
+        <w:spacing w:line="240" w:lineRule="auto"/>
+        <w:rPr>
+          <w:rFonts w:eastAsia="Times New Roman"/>
+          <w:color w:val="000000"/>
+          <w:lang w:val="pl-PL"/>
+        </w:rPr>
+      </w:pPr>
+    </w:p>
+    <w:p>
+      <w:pPr>
+        <w:spacing w:line="240" w:lineRule="auto"/>
+        <w:rPr>
+          <w:rFonts w:eastAsia="Times New Roman"/>
+          <w:color w:val="000000"/>
+          <w:lang w:val="pl-PL"/>
+        </w:rPr>
+      </w:pPr>
+    </w:p>
+    <w:p>
+      <w:pPr>
+        <w:spacing w:line="240" w:lineRule="auto"/>
+        <w:rPr>
+          <w:rFonts w:eastAsia="Times New Roman"/>
+          <w:color w:val="000000"/>
+          <w:lang w:val="pl-PL"/>
+        </w:rPr>
+      </w:pPr>
+    </w:p>
+    <w:p>
+      <w:pPr>
+        <w:spacing w:line="240" w:lineRule="auto"/>
+        <w:rPr>
+          <w:rFonts w:eastAsia="Times New Roman"/>
+          <w:color w:val="000000"/>
+          <w:lang w:val="pl-PL"/>
+        </w:rPr>
+      </w:pPr>
+    </w:p>
+    <w:p>
+      <w:pPr>
+        <w:spacing w:line="240" w:lineRule="auto"/>
+        <w:rPr>
+          <w:rFonts w:eastAsia="Times New Roman"/>
+          <w:color w:val="000000"/>
+          <w:lang w:val="pl-PL"/>
+        </w:rPr>
+      </w:pPr>
+    </w:p>
+    <w:p>
+      <w:pPr>
+        <w:spacing w:line="240" w:lineRule="auto"/>
+        <w:rPr>
+          <w:rFonts w:eastAsia="Times New Roman"/>
+          <w:color w:val="000000"/>
+          <w:lang w:val="pl-PL"/>
+        </w:rPr>
+      </w:pPr>
+    </w:p>
+    <w:p>
+      <w:pPr>
+        <w:spacing w:line="240" w:lineRule="auto"/>
+        <w:rPr>
+          <w:rFonts w:eastAsia="Times New Roman"/>
+          <w:color w:val="000000"/>
+          <w:lang w:val="pl-PL"/>
+        </w:rPr>
+      </w:pPr>
+    </w:p>
+    <w:p>
+      <w:pPr>
+        <w:spacing w:line="240" w:lineRule="auto"/>
+        <w:rPr>
+          <w:rFonts w:eastAsia="Times New Roman"/>
+          <w:color w:val="000000"/>
+          <w:lang w:val="pl-PL"/>
+        </w:rPr>
+      </w:pPr>
+    </w:p>
+    <w:p>
+      <w:pPr>
+        <w:spacing w:line="240" w:lineRule="auto"/>
+        <w:rPr>
+          <w:rFonts w:eastAsia="Times New Roman"/>
+          <w:color w:val="000000"/>
+          <w:lang w:val="pl-PL"/>
+        </w:rPr>
+      </w:pPr>
+    </w:p>
+    <w:p>
+      <w:pPr>
+        <w:spacing w:line="240" w:lineRule="auto"/>
+        <w:rPr>
+          <w:rFonts w:eastAsia="Times New Roman"/>
+          <w:color w:val="000000"/>
+          <w:lang w:val="pl-PL"/>
+        </w:rPr>
+      </w:pPr>
+    </w:p>
+    <w:p>
+      <w:pPr>
+        <w:spacing w:line="240" w:lineRule="auto"/>
+        <w:rPr>
+          <w:rFonts w:eastAsia="Times New Roman"/>
+          <w:color w:val="000000"/>
+          <w:lang w:val="pl-PL"/>
+        </w:rPr>
+      </w:pPr>
+    </w:p>
+    <w:p>
+      <w:pPr>
+        <w:spacing w:line="240" w:lineRule="auto"/>
+        <w:rPr>
+          <w:rFonts w:eastAsia="Times New Roman"/>
+          <w:color w:val="000000"/>
+          <w:lang w:val="pl-PL"/>
+        </w:rPr>
+      </w:pPr>
+    </w:p>
+    <w:p>
+      <w:pPr>
+        <w:spacing w:line="240" w:lineRule="auto"/>
+        <w:rPr>
+          <w:rFonts w:ascii="Times New Roman" w:eastAsia="Times New Roman" w:hAnsi="Times New Roman" w:cs="Times New Roman"/>
+          <w:color w:val="000000"/>
+          <w:sz w:val="24"/>
+          <w:szCs w:val="24"/>
+          <w:lang w:val="pl-PL"/>
+        </w:rPr>
+      </w:pPr>
+    </w:p>
+    <w:p>
+      <w:pPr>
+        <w:spacing w:line="240" w:lineRule="auto"/>
+        <w:jc w:val="center"/>
+        <w:rPr>
+          <w:rFonts w:eastAsia="Times New Roman"/>
+          <w:b/>
+          <w:bCs/>
+          <w:color w:val="000000"/>
+          <w:lang w:val="pl-PL"/>
+        </w:rPr>
+      </w:pPr>
+    </w:p>
+    <w:p>
+      <w:pPr>
+        <w:spacing w:line="240" w:lineRule="auto"/>
+        <w:jc w:val="center"/>
+        <w:rPr>
+          <w:rFonts w:eastAsia="Times New Roman"/>
+          <w:b/>
+          <w:bCs/>
+          <w:color w:val="000000"/>
+          <w:lang w:val="pl-PL"/>
+        </w:rPr>
+      </w:pPr>
+    </w:p>
+    <w:p>
+      <w:pPr>
+        <w:spacing w:line="240" w:lineRule="auto"/>
+        <w:jc w:val="center"/>
+        <w:rPr>
+          <w:rFonts w:eastAsia="Times New Roman"/>
+          <w:b/>
+          <w:bCs/>
+          <w:color w:val="000000"/>
+          <w:lang w:val="pl-PL"/>
+        </w:rPr>
+      </w:pPr>
+    </w:p>
+    <w:p>
+      <w:pPr>
+        <w:spacing w:line="240" w:lineRule="auto"/>
+        <w:jc w:val="center"/>
+        <w:rPr>
+          <w:rFonts w:eastAsia="Times New Roman"/>
+          <w:b/>
+          <w:bCs/>
+          <w:color w:val="000000"/>
+          <w:lang w:val="pl-PL"/>
+        </w:rPr>
+      </w:pPr>
+    </w:p>
+    <w:p>
+      <w:pPr>
+        <w:spacing w:line="240" w:lineRule="auto"/>
+        <w:jc w:val="center"/>
+        <w:rPr>
+          <w:rFonts w:eastAsia="Times New Roman"/>
+          <w:b/>
+          <w:bCs/>
+          <w:color w:val="000000"/>
+          <w:lang w:val="pl-PL"/>
+        </w:rPr>
+      </w:pPr>
+    </w:p>
+    <w:p>
+      <w:pPr>
+        <w:spacing w:line="240" w:lineRule="auto"/>
+        <w:jc w:val="center"/>
+        <w:rPr>
+          <w:rFonts w:eastAsia="Times New Roman"/>
+          <w:b/>
+          <w:bCs/>
+          <w:color w:val="000000"/>
+          <w:lang w:val="pl-PL"/>
+        </w:rPr>
+      </w:pPr>
+    </w:p>
+    <w:p>
+      <w:pPr>
+        <w:spacing w:line="240" w:lineRule="auto"/>
+        <w:jc w:val="center"/>
+        <w:rPr>
+          <w:rFonts w:eastAsia="Times New Roman"/>
+          <w:b/>
+          <w:bCs/>
+          <w:color w:val="000000"/>
+          <w:lang w:val="pl-PL"/>
+        </w:rPr>
+      </w:pPr>
+    </w:p>
+    <w:p>
+      <w:pPr>
+        <w:spacing w:line="240" w:lineRule="auto"/>
+        <w:jc w:val="center"/>
+        <w:rPr>
+          <w:rFonts w:eastAsia="Times New Roman"/>
+          <w:b/>
+          <w:bCs/>
+          <w:color w:val="000000"/>
+          <w:lang w:val="pl-PL"/>
+        </w:rPr>
+      </w:pPr>
+    </w:p>
+    <w:p>
+      <w:pPr>
+        <w:spacing w:line="240" w:lineRule="auto"/>
+        <w:jc w:val="center"/>
+        <w:rPr>
+          <w:rFonts w:eastAsia="Times New Roman"/>
+          <w:b/>
+          <w:bCs/>
+          <w:color w:val="000000"/>
+          <w:lang w:val="pl-PL"/>
+        </w:rPr>
+      </w:pPr>
+    </w:p>
+    <w:p>
+      <w:pPr>
+        <w:spacing w:line="240" w:lineRule="auto"/>
+        <w:jc w:val="center"/>
+        <w:rPr>
+          <w:rFonts w:eastAsia="Times New Roman"/>
+          <w:b/>
+          <w:bCs/>
+          <w:color w:val="000000"/>
+          <w:lang w:val="pl-PL"/>
+        </w:rPr>
+      </w:pPr>
+    </w:p>
+    <w:p>
+      <w:pPr>
+        <w:spacing w:line="240" w:lineRule="auto"/>
+        <w:jc w:val="center"/>
+        <w:rPr>
+          <w:rFonts w:eastAsia="Times New Roman"/>
+          <w:b/>
+          <w:bCs/>
+          <w:color w:val="000000"/>
+          <w:lang w:val="pl-PL"/>
+        </w:rPr>
+      </w:pPr>
+    </w:p>
+    <w:p>
+      <w:pPr>
+        <w:spacing w:line="240" w:lineRule="auto"/>
+        <w:jc w:val="center"/>
+        <w:rPr>
+          <w:rFonts w:eastAsia="Times New Roman"/>
+          <w:b/>
+          <w:bCs/>
+          <w:color w:val="000000"/>
+          <w:lang w:val="pl-PL"/>
+        </w:rPr>
+      </w:pPr>
+    </w:p>
+    <w:p>
+      <w:pPr>
+        <w:spacing w:line="240" w:lineRule="auto"/>
+        <w:jc w:val="center"/>
+        <w:rPr>
+          <w:rFonts w:ascii="Times New Roman" w:eastAsia="Times New Roman" w:hAnsi="Times New Roman" w:cs="Times New Roman"/>
+          <w:color w:val="000000"/>
+          <w:sz w:val="24"/>
+          <w:szCs w:val="24"/>
+          <w:lang w:val="pl-PL"/>
+        </w:rPr>
+      </w:pPr>
+      <w:r>
+        <w:rPr>
+          <w:rFonts w:eastAsia="Times New Roman"/>
+          <w:b/>
+          <w:bCs/>
+          <w:color w:val="000000"/>
+          <w:lang w:val="pl-PL"/>
+        </w:rPr>
+        <w:lastRenderedPageBreak/>
         <w:t>Stany wniosku leasingowego</w:t>
       </w:r>
     </w:p>
@@ -5201,7 +5575,7 @@
                     </pic:cNvPicPr>
                   </pic:nvPicPr>
                   <pic:blipFill>
-                    <a:blip r:embed="rId11">
+                    <a:blip r:embed="rId12">
                       <a:extLst>
                         <a:ext uri="{28A0092B-C50C-407E-A947-70E740481C1C}">
                           <a14:useLocalDpi xmlns:a14="http://schemas.microsoft.com/office/drawing/2010/main" val="0"/>
@@ -5440,6 +5814,201 @@
         <w:spacing w:line="240" w:lineRule="auto"/>
         <w:jc w:val="center"/>
         <w:rPr>
+          <w:rFonts w:eastAsia="Times New Roman"/>
+          <w:b/>
+          <w:bCs/>
+          <w:color w:val="000000"/>
+          <w:lang w:val="pl-PL"/>
+        </w:rPr>
+      </w:pPr>
+    </w:p>
+    <w:p>
+      <w:pPr>
+        <w:spacing w:line="240" w:lineRule="auto"/>
+        <w:jc w:val="center"/>
+        <w:rPr>
+          <w:rFonts w:eastAsia="Times New Roman"/>
+          <w:b/>
+          <w:bCs/>
+          <w:color w:val="000000"/>
+          <w:lang w:val="pl-PL"/>
+        </w:rPr>
+      </w:pPr>
+    </w:p>
+    <w:p>
+      <w:pPr>
+        <w:spacing w:line="240" w:lineRule="auto"/>
+        <w:jc w:val="center"/>
+        <w:rPr>
+          <w:rFonts w:eastAsia="Times New Roman"/>
+          <w:b/>
+          <w:bCs/>
+          <w:color w:val="000000"/>
+          <w:lang w:val="pl-PL"/>
+        </w:rPr>
+      </w:pPr>
+    </w:p>
+    <w:p>
+      <w:pPr>
+        <w:spacing w:line="240" w:lineRule="auto"/>
+        <w:jc w:val="center"/>
+        <w:rPr>
+          <w:rFonts w:eastAsia="Times New Roman"/>
+          <w:b/>
+          <w:bCs/>
+          <w:color w:val="000000"/>
+          <w:lang w:val="pl-PL"/>
+        </w:rPr>
+      </w:pPr>
+    </w:p>
+    <w:p>
+      <w:pPr>
+        <w:spacing w:line="240" w:lineRule="auto"/>
+        <w:jc w:val="center"/>
+        <w:rPr>
+          <w:rFonts w:eastAsia="Times New Roman"/>
+          <w:b/>
+          <w:bCs/>
+          <w:color w:val="000000"/>
+          <w:lang w:val="pl-PL"/>
+        </w:rPr>
+      </w:pPr>
+    </w:p>
+    <w:p>
+      <w:pPr>
+        <w:spacing w:line="240" w:lineRule="auto"/>
+        <w:jc w:val="center"/>
+        <w:rPr>
+          <w:rFonts w:eastAsia="Times New Roman"/>
+          <w:b/>
+          <w:bCs/>
+          <w:color w:val="000000"/>
+          <w:lang w:val="pl-PL"/>
+        </w:rPr>
+      </w:pPr>
+    </w:p>
+    <w:p>
+      <w:pPr>
+        <w:spacing w:line="240" w:lineRule="auto"/>
+        <w:jc w:val="center"/>
+        <w:rPr>
+          <w:rFonts w:eastAsia="Times New Roman"/>
+          <w:b/>
+          <w:bCs/>
+          <w:color w:val="000000"/>
+          <w:lang w:val="pl-PL"/>
+        </w:rPr>
+      </w:pPr>
+    </w:p>
+    <w:p>
+      <w:pPr>
+        <w:spacing w:line="240" w:lineRule="auto"/>
+        <w:jc w:val="center"/>
+        <w:rPr>
+          <w:rFonts w:eastAsia="Times New Roman"/>
+          <w:b/>
+          <w:bCs/>
+          <w:color w:val="000000"/>
+          <w:lang w:val="pl-PL"/>
+        </w:rPr>
+      </w:pPr>
+    </w:p>
+    <w:p>
+      <w:pPr>
+        <w:spacing w:line="240" w:lineRule="auto"/>
+        <w:jc w:val="center"/>
+        <w:rPr>
+          <w:rFonts w:eastAsia="Times New Roman"/>
+          <w:b/>
+          <w:bCs/>
+          <w:color w:val="000000"/>
+          <w:lang w:val="pl-PL"/>
+        </w:rPr>
+      </w:pPr>
+    </w:p>
+    <w:p>
+      <w:pPr>
+        <w:spacing w:line="240" w:lineRule="auto"/>
+        <w:jc w:val="center"/>
+        <w:rPr>
+          <w:rFonts w:eastAsia="Times New Roman"/>
+          <w:b/>
+          <w:bCs/>
+          <w:color w:val="000000"/>
+          <w:lang w:val="pl-PL"/>
+        </w:rPr>
+      </w:pPr>
+    </w:p>
+    <w:p>
+      <w:pPr>
+        <w:spacing w:line="240" w:lineRule="auto"/>
+        <w:jc w:val="center"/>
+        <w:rPr>
+          <w:rFonts w:eastAsia="Times New Roman"/>
+          <w:b/>
+          <w:bCs/>
+          <w:color w:val="000000"/>
+          <w:lang w:val="pl-PL"/>
+        </w:rPr>
+      </w:pPr>
+    </w:p>
+    <w:p>
+      <w:pPr>
+        <w:spacing w:line="240" w:lineRule="auto"/>
+        <w:jc w:val="center"/>
+        <w:rPr>
+          <w:rFonts w:eastAsia="Times New Roman"/>
+          <w:b/>
+          <w:bCs/>
+          <w:color w:val="000000"/>
+          <w:lang w:val="pl-PL"/>
+        </w:rPr>
+      </w:pPr>
+    </w:p>
+    <w:p>
+      <w:pPr>
+        <w:spacing w:line="240" w:lineRule="auto"/>
+        <w:jc w:val="center"/>
+        <w:rPr>
+          <w:rFonts w:eastAsia="Times New Roman"/>
+          <w:b/>
+          <w:bCs/>
+          <w:color w:val="000000"/>
+          <w:lang w:val="pl-PL"/>
+        </w:rPr>
+      </w:pPr>
+    </w:p>
+    <w:p>
+      <w:pPr>
+        <w:spacing w:line="240" w:lineRule="auto"/>
+        <w:jc w:val="center"/>
+        <w:rPr>
+          <w:rFonts w:eastAsia="Times New Roman"/>
+          <w:b/>
+          <w:bCs/>
+          <w:color w:val="000000"/>
+          <w:lang w:val="pl-PL"/>
+        </w:rPr>
+      </w:pPr>
+    </w:p>
+    <w:p>
+      <w:pPr>
+        <w:spacing w:line="240" w:lineRule="auto"/>
+        <w:jc w:val="center"/>
+        <w:rPr>
+          <w:rFonts w:eastAsia="Times New Roman"/>
+          <w:b/>
+          <w:bCs/>
+          <w:color w:val="000000"/>
+          <w:lang w:val="pl-PL"/>
+        </w:rPr>
+      </w:pPr>
+    </w:p>
+    <w:p>
+      <w:pPr>
+        <w:spacing w:line="240" w:lineRule="auto"/>
+        <w:jc w:val="center"/>
+        <w:rPr>
           <w:rFonts w:ascii="Times New Roman" w:eastAsia="Times New Roman" w:hAnsi="Times New Roman" w:cs="Times New Roman"/>
           <w:color w:val="000000"/>
           <w:sz w:val="24"/>
@@ -5499,7 +6068,7 @@
                     </pic:cNvPicPr>
                   </pic:nvPicPr>
                   <pic:blipFill>
-                    <a:blip r:embed="rId12">
+                    <a:blip r:embed="rId13">
                       <a:extLst>
                         <a:ext uri="{28A0092B-C50C-407E-A947-70E740481C1C}">
                           <a14:useLocalDpi xmlns:a14="http://schemas.microsoft.com/office/drawing/2010/main" val="0"/>
@@ -5917,7 +6486,7 @@
                     </pic:cNvPicPr>
                   </pic:nvPicPr>
                   <pic:blipFill>
-                    <a:blip r:embed="rId13">
+                    <a:blip r:embed="rId14">
                       <a:extLst>
                         <a:ext uri="{28A0092B-C50C-407E-A947-70E740481C1C}">
                           <a14:useLocalDpi xmlns:a14="http://schemas.microsoft.com/office/drawing/2010/main" val="0"/>
@@ -6084,7 +6653,7 @@
                     </pic:cNvPicPr>
                   </pic:nvPicPr>
                   <pic:blipFill>
-                    <a:blip r:embed="rId14">
+                    <a:blip r:embed="rId15">
                       <a:extLst>
                         <a:ext uri="{28A0092B-C50C-407E-A947-70E740481C1C}">
                           <a14:useLocalDpi xmlns:a14="http://schemas.microsoft.com/office/drawing/2010/main" val="0"/>
@@ -6463,7 +7032,7 @@
                     </pic:cNvPicPr>
                   </pic:nvPicPr>
                   <pic:blipFill>
-                    <a:blip r:embed="rId15">
+                    <a:blip r:embed="rId16">
                       <a:extLst>
                         <a:ext uri="{28A0092B-C50C-407E-A947-70E740481C1C}">
                           <a14:useLocalDpi xmlns:a14="http://schemas.microsoft.com/office/drawing/2010/main" val="0"/>
@@ -6587,7 +7156,7 @@
                     </pic:cNvPicPr>
                   </pic:nvPicPr>
                   <pic:blipFill>
-                    <a:blip r:embed="rId16">
+                    <a:blip r:embed="rId17">
                       <a:extLst>
                         <a:ext uri="{28A0092B-C50C-407E-A947-70E740481C1C}">
                           <a14:useLocalDpi xmlns:a14="http://schemas.microsoft.com/office/drawing/2010/main" val="0"/>
@@ -6724,7 +7293,7 @@
                     </pic:cNvPicPr>
                   </pic:nvPicPr>
                   <pic:blipFill>
-                    <a:blip r:embed="rId17">
+                    <a:blip r:embed="rId18">
                       <a:extLst>
                         <a:ext uri="{28A0092B-C50C-407E-A947-70E740481C1C}">
                           <a14:useLocalDpi xmlns:a14="http://schemas.microsoft.com/office/drawing/2010/main" val="0"/>
@@ -6848,7 +7417,7 @@
                     </pic:cNvPicPr>
                   </pic:nvPicPr>
                   <pic:blipFill>
-                    <a:blip r:embed="rId18">
+                    <a:blip r:embed="rId19">
                       <a:extLst>
                         <a:ext uri="{28A0092B-C50C-407E-A947-70E740481C1C}">
                           <a14:useLocalDpi xmlns:a14="http://schemas.microsoft.com/office/drawing/2010/main" val="0"/>
@@ -6986,7 +7555,7 @@
                     </pic:cNvPicPr>
                   </pic:nvPicPr>
                   <pic:blipFill>
-                    <a:blip r:embed="rId19">
+                    <a:blip r:embed="rId20">
                       <a:extLst>
                         <a:ext uri="{28A0092B-C50C-407E-A947-70E740481C1C}">
                           <a14:useLocalDpi xmlns:a14="http://schemas.microsoft.com/office/drawing/2010/main" val="0"/>
@@ -7318,7 +7887,7 @@
                     </pic:cNvPicPr>
                   </pic:nvPicPr>
                   <pic:blipFill>
-                    <a:blip r:embed="rId20">
+                    <a:blip r:embed="rId21">
                       <a:extLst>
                         <a:ext uri="{28A0092B-C50C-407E-A947-70E740481C1C}">
                           <a14:useLocalDpi xmlns:a14="http://schemas.microsoft.com/office/drawing/2010/main" val="0"/>
@@ -7590,7 +8159,7 @@
                     </pic:cNvPicPr>
                   </pic:nvPicPr>
                   <pic:blipFill>
-                    <a:blip r:embed="rId21">
+                    <a:blip r:embed="rId22">
                       <a:extLst>
                         <a:ext uri="{28A0092B-C50C-407E-A947-70E740481C1C}">
                           <a14:useLocalDpi xmlns:a14="http://schemas.microsoft.com/office/drawing/2010/main" val="0"/>
@@ -7950,7 +8519,7 @@
                     </pic:cNvPicPr>
                   </pic:nvPicPr>
                   <pic:blipFill>
-                    <a:blip r:embed="rId22">
+                    <a:blip r:embed="rId23">
                       <a:extLst>
                         <a:ext uri="{28A0092B-C50C-407E-A947-70E740481C1C}">
                           <a14:useLocalDpi xmlns:a14="http://schemas.microsoft.com/office/drawing/2010/main" val="0"/>
@@ -8073,7 +8642,7 @@
                     </pic:cNvPicPr>
                   </pic:nvPicPr>
                   <pic:blipFill>
-                    <a:blip r:embed="rId23">
+                    <a:blip r:embed="rId24">
                       <a:extLst>
                         <a:ext uri="{28A0092B-C50C-407E-A947-70E740481C1C}">
                           <a14:useLocalDpi xmlns:a14="http://schemas.microsoft.com/office/drawing/2010/main" val="0"/>
@@ -8217,7 +8786,7 @@
                     </pic:cNvPicPr>
                   </pic:nvPicPr>
                   <pic:blipFill>
-                    <a:blip r:embed="rId24">
+                    <a:blip r:embed="rId25">
                       <a:extLst>
                         <a:ext uri="{28A0092B-C50C-407E-A947-70E740481C1C}">
                           <a14:useLocalDpi xmlns:a14="http://schemas.microsoft.com/office/drawing/2010/main" val="0"/>
@@ -8340,7 +8909,7 @@
                     </pic:cNvPicPr>
                   </pic:nvPicPr>
                   <pic:blipFill>
-                    <a:blip r:embed="rId25">
+                    <a:blip r:embed="rId26">
                       <a:extLst>
                         <a:ext uri="{28A0092B-C50C-407E-A947-70E740481C1C}">
                           <a14:useLocalDpi xmlns:a14="http://schemas.microsoft.com/office/drawing/2010/main" val="0"/>

</xml_diff>

<commit_message>
Dodanie podpunktu 5 - proponowana architektóra systemu wraz z opisem
</commit_message>
<xml_diff>
--- a/TK/TK.docx
+++ b/TK/TK.docx
@@ -8456,32 +8456,8 @@
           <w:b/>
           <w:bCs/>
           <w:color w:val="000000"/>
-        </w:rPr>
-      </w:pPr>
-    </w:p>
-    <w:p>
-      <w:pPr>
-        <w:spacing w:before="240" w:after="240" w:line="240" w:lineRule="auto"/>
-        <w:rPr>
-          <w:rFonts w:eastAsia="Times New Roman"/>
-          <w:b/>
-          <w:bCs/>
-          <w:color w:val="000000"/>
           <w:sz w:val="28"/>
           <w:szCs w:val="28"/>
-          <w:lang w:val="pl-PL"/>
-        </w:rPr>
-      </w:pPr>
-    </w:p>
-    <w:p>
-      <w:pPr>
-        <w:spacing w:before="240" w:after="240" w:line="240" w:lineRule="auto"/>
-        <w:rPr>
-          <w:rFonts w:ascii="Times New Roman" w:eastAsia="Times New Roman" w:hAnsi="Times New Roman" w:cs="Times New Roman"/>
-          <w:color w:val="000000"/>
-          <w:sz w:val="24"/>
-          <w:szCs w:val="24"/>
-          <w:lang w:val="pl-PL"/>
         </w:rPr>
       </w:pPr>
       <w:r>
@@ -8492,6 +8468,421 @@
           <w:color w:val="000000"/>
           <w:sz w:val="28"/>
           <w:szCs w:val="28"/>
+        </w:rPr>
+        <w:lastRenderedPageBreak/>
+        <w:t>5.</w:t>
+      </w:r>
+      <w:r>
+        <w:rPr>
+          <w:color w:val="000000"/>
+          <w:sz w:val="20"/>
+          <w:szCs w:val="20"/>
+        </w:rPr>
+        <w:t xml:space="preserve"> </w:t>
+      </w:r>
+      <w:r>
+        <w:rPr>
+          <w:rFonts w:eastAsia="Times New Roman"/>
+          <w:b/>
+          <w:bCs/>
+          <w:color w:val="000000"/>
+          <w:sz w:val="28"/>
+          <w:szCs w:val="28"/>
+        </w:rPr>
+        <w:t>Proponowana architektura systemu w postaci diagramu pakietów/komponentów</w:t>
+      </w:r>
+    </w:p>
+    <w:p>
+      <w:pPr>
+        <w:spacing w:before="240" w:after="240" w:line="240" w:lineRule="auto"/>
+        <w:rPr>
+          <w:rFonts w:eastAsia="Times New Roman"/>
+          <w:b/>
+          <w:bCs/>
+          <w:color w:val="000000"/>
+        </w:rPr>
+      </w:pPr>
+      <w:r>
+        <w:rPr>
+          <w:rFonts w:eastAsia="Times New Roman"/>
+          <w:b/>
+          <w:bCs/>
+          <w:noProof/>
+          <w:color w:val="000000"/>
+        </w:rPr>
+        <w:lastRenderedPageBreak/>
+        <w:drawing>
+          <wp:inline distT="0" distB="0" distL="0" distR="0" wp14:anchorId="1118F36F" wp14:editId="3D0D4717">
+            <wp:extent cx="6014085" cy="9970770"/>
+            <wp:effectExtent l="0" t="0" r="5715" b="0"/>
+            <wp:docPr id="1409838404" name="Obraz 1"/>
+            <wp:cNvGraphicFramePr>
+              <a:graphicFrameLocks xmlns:a="http://schemas.openxmlformats.org/drawingml/2006/main" noChangeAspect="1"/>
+            </wp:cNvGraphicFramePr>
+            <a:graphic xmlns:a="http://schemas.openxmlformats.org/drawingml/2006/main">
+              <a:graphicData uri="http://schemas.openxmlformats.org/drawingml/2006/picture">
+                <pic:pic xmlns:pic="http://schemas.openxmlformats.org/drawingml/2006/picture">
+                  <pic:nvPicPr>
+                    <pic:cNvPr id="1409838404" name="Obraz 1409838404"/>
+                    <pic:cNvPicPr/>
+                  </pic:nvPicPr>
+                  <pic:blipFill>
+                    <a:blip r:embed="rId14">
+                      <a:extLst>
+                        <a:ext uri="{28A0092B-C50C-407E-A947-70E740481C1C}">
+                          <a14:useLocalDpi xmlns:a14="http://schemas.microsoft.com/office/drawing/2010/main" val="0"/>
+                        </a:ext>
+                      </a:extLst>
+                    </a:blip>
+                    <a:stretch>
+                      <a:fillRect/>
+                    </a:stretch>
+                  </pic:blipFill>
+                  <pic:spPr>
+                    <a:xfrm>
+                      <a:off x="0" y="0"/>
+                      <a:ext cx="6014085" cy="9970770"/>
+                    </a:xfrm>
+                    <a:prstGeom prst="rect">
+                      <a:avLst/>
+                    </a:prstGeom>
+                  </pic:spPr>
+                </pic:pic>
+              </a:graphicData>
+            </a:graphic>
+          </wp:inline>
+        </w:drawing>
+      </w:r>
+    </w:p>
+    <w:p>
+      <w:pPr>
+        <w:spacing w:after="160" w:line="259" w:lineRule="auto"/>
+      </w:pPr>
+      <w:r>
+        <w:lastRenderedPageBreak/>
+        <w:t>System „Menażeria Chomików” zaprojektowano w architekturze warstwowej klient-serwer. Komunikacja pomiędzy warstwą prezentacji a serwerem aplikacyjnym odbywa się poprzez interfejs REST API z wykorzystaniem protokołu HTTPS. W strukturze systemu wydzielono cztery główne warstwy oraz jedną integrację zewnętrzną:</w:t>
+      </w:r>
+    </w:p>
+    <w:p>
+      <w:pPr>
+        <w:numPr>
+          <w:ilvl w:val="0"/>
+          <w:numId w:val="62"/>
+        </w:numPr>
+        <w:spacing w:after="160" w:line="259" w:lineRule="auto"/>
+      </w:pPr>
+      <w:r>
+        <w:rPr>
+          <w:b/>
+          <w:bCs/>
+        </w:rPr>
+        <w:t>Warstwa prezentacji (</w:t>
+      </w:r>
+      <w:proofErr w:type="spellStart"/>
+      <w:r>
+        <w:rPr>
+          <w:b/>
+          <w:bCs/>
+        </w:rPr>
+        <w:t>Frontend</w:t>
+      </w:r>
+      <w:proofErr w:type="spellEnd"/>
+      <w:r>
+        <w:rPr>
+          <w:b/>
+          <w:bCs/>
+        </w:rPr>
+        <w:t>)</w:t>
+      </w:r>
+      <w:r>
+        <w:t xml:space="preserve"> – responsywna Aplikacja webowa uruchamiana w przeglądarce internetowej</w:t>
+      </w:r>
+      <w:r>
+        <w:t xml:space="preserve">. </w:t>
+      </w:r>
+      <w:r>
+        <w:t xml:space="preserve">Odpowiada za wyświetlanie interfejsu użytkownika i dynamiczne ładowanie widoków w zależności od uprawnień zalogowanej roli: </w:t>
+      </w:r>
+      <w:r>
+        <w:rPr>
+          <w:i/>
+          <w:iCs/>
+        </w:rPr>
+        <w:t>Panelu Klienta</w:t>
+      </w:r>
+      <w:r>
+        <w:t xml:space="preserve">, </w:t>
+      </w:r>
+      <w:r>
+        <w:rPr>
+          <w:i/>
+          <w:iCs/>
+        </w:rPr>
+        <w:t>Panelu Pracowników i Analityka</w:t>
+      </w:r>
+      <w:r>
+        <w:t xml:space="preserve">, </w:t>
+      </w:r>
+      <w:r>
+        <w:rPr>
+          <w:i/>
+          <w:iCs/>
+        </w:rPr>
+        <w:t>Panelu Weterynarza</w:t>
+      </w:r>
+      <w:r>
+        <w:t xml:space="preserve"> oraz </w:t>
+      </w:r>
+      <w:r>
+        <w:rPr>
+          <w:i/>
+          <w:iCs/>
+        </w:rPr>
+        <w:t>Panelu Administratora</w:t>
+      </w:r>
+      <w:r>
+        <w:t>.</w:t>
+      </w:r>
+    </w:p>
+    <w:p>
+      <w:pPr>
+        <w:numPr>
+          <w:ilvl w:val="0"/>
+          <w:numId w:val="62"/>
+        </w:numPr>
+        <w:spacing w:after="160" w:line="259" w:lineRule="auto"/>
+      </w:pPr>
+      <w:r>
+        <w:rPr>
+          <w:b/>
+          <w:bCs/>
+        </w:rPr>
+        <w:t>Warstwa logiki biznesowej (</w:t>
+      </w:r>
+      <w:proofErr w:type="spellStart"/>
+      <w:r>
+        <w:rPr>
+          <w:b/>
+          <w:bCs/>
+        </w:rPr>
+        <w:t>Backend</w:t>
+      </w:r>
+      <w:proofErr w:type="spellEnd"/>
+      <w:r>
+        <w:rPr>
+          <w:b/>
+          <w:bCs/>
+        </w:rPr>
+        <w:t>)</w:t>
+      </w:r>
+      <w:r>
+        <w:t xml:space="preserve"> – centralny serwer aplikacyjny, w którym żądania sieciowe są obsługiwane przez Kontroler REST i przekazywane do </w:t>
+      </w:r>
+      <w:proofErr w:type="spellStart"/>
+      <w:r>
+        <w:t>podpakietu</w:t>
+      </w:r>
+      <w:proofErr w:type="spellEnd"/>
+      <w:r>
+        <w:t xml:space="preserve"> Usługi biznesowe. Warstwa ta zawiera pięć funkcjonalnych modułów: </w:t>
+      </w:r>
+      <w:r>
+        <w:rPr>
+          <w:i/>
+          <w:iCs/>
+        </w:rPr>
+        <w:t>Autoryzacji i Ról</w:t>
+      </w:r>
+      <w:r>
+        <w:t xml:space="preserve">, </w:t>
+      </w:r>
+      <w:r>
+        <w:rPr>
+          <w:i/>
+          <w:iCs/>
+        </w:rPr>
+        <w:t>Leasingu i Reklamacji</w:t>
+      </w:r>
+      <w:r>
+        <w:t xml:space="preserve">, </w:t>
+      </w:r>
+      <w:r>
+        <w:rPr>
+          <w:i/>
+          <w:iCs/>
+        </w:rPr>
+        <w:t>Weterynaryjny i Zadań</w:t>
+      </w:r>
+      <w:r>
+        <w:t xml:space="preserve">, </w:t>
+      </w:r>
+      <w:r>
+        <w:rPr>
+          <w:i/>
+          <w:iCs/>
+        </w:rPr>
+        <w:t>Hodowli i Wystaw</w:t>
+      </w:r>
+      <w:r>
+        <w:t xml:space="preserve"> oraz </w:t>
+      </w:r>
+      <w:r>
+        <w:rPr>
+          <w:i/>
+          <w:iCs/>
+        </w:rPr>
+        <w:t>Analityczno-Raportowy</w:t>
+      </w:r>
+      <w:r>
+        <w:t>.</w:t>
+      </w:r>
+    </w:p>
+    <w:p>
+      <w:pPr>
+        <w:numPr>
+          <w:ilvl w:val="0"/>
+          <w:numId w:val="62"/>
+        </w:numPr>
+        <w:spacing w:after="160" w:line="259" w:lineRule="auto"/>
+      </w:pPr>
+      <w:r>
+        <w:rPr>
+          <w:b/>
+          <w:bCs/>
+        </w:rPr>
+        <w:t>Warstwa dostępu do danych (ORM)</w:t>
+      </w:r>
+      <w:r>
+        <w:t xml:space="preserve"> – moduł </w:t>
+      </w:r>
+      <w:proofErr w:type="spellStart"/>
+      <w:r>
+        <w:t>Repozytorium_Danych</w:t>
+      </w:r>
+      <w:proofErr w:type="spellEnd"/>
+      <w:r>
+        <w:t xml:space="preserve"> realizujący odwzorowanie obiektowo-relacyjne. Odpowiada za translację obiektów aplikacyjnych na operacje bazodanowe, izolując logikę biznesową od fizycznej struktury bazy danych.</w:t>
+      </w:r>
+    </w:p>
+    <w:p>
+      <w:pPr>
+        <w:numPr>
+          <w:ilvl w:val="0"/>
+          <w:numId w:val="62"/>
+        </w:numPr>
+        <w:spacing w:after="160" w:line="259" w:lineRule="auto"/>
+      </w:pPr>
+      <w:r>
+        <w:rPr>
+          <w:b/>
+          <w:bCs/>
+        </w:rPr>
+        <w:t>Warstwa danych</w:t>
+      </w:r>
+      <w:r>
+        <w:t xml:space="preserve"> – relacyjna baza danych </w:t>
+      </w:r>
+      <w:proofErr w:type="spellStart"/>
+      <w:r>
+        <w:t>MenażeriaBD</w:t>
+      </w:r>
+      <w:proofErr w:type="spellEnd"/>
+      <w:r>
+        <w:t>, stanowiąca centralne repozytorium informacji. Przechowuje dane dotyczące profili chomików, historii medycznej, umów leasingowych, harmonogramów operacyjnych oraz kont użytkowników.</w:t>
+      </w:r>
+    </w:p>
+    <w:p>
+      <w:pPr>
+        <w:jc w:val="both"/>
+      </w:pPr>
+      <w:r>
+        <w:rPr>
+          <w:b/>
+          <w:bCs/>
+        </w:rPr>
+        <w:t>Integracje zewnętrzne:</w:t>
+      </w:r>
+      <w:r>
+        <w:t xml:space="preserve"> Moduł Leasingu i Reklamacji komunikuje się z zewnętrzną Bramą powiadomień e-mail (protokół API). Integracja ta służy do automatycznej, asynchronicznej wysyłki komunikatów systemowych i powiadomień o statusie wniosków bezpośrednio do użytkowników.</w:t>
+      </w:r>
+      <w:r>
+        <w:t xml:space="preserve"> </w:t>
+      </w:r>
+      <w:r>
+        <w:t xml:space="preserve">Przedstawiony podział architektury zapewnia pełną modularność systemu, separację odpowiedzialności poszczególnych warstw oraz możliwość niezależnego rozwijania </w:t>
+      </w:r>
+      <w:proofErr w:type="spellStart"/>
+      <w:r>
+        <w:t>frontendu</w:t>
+      </w:r>
+      <w:proofErr w:type="spellEnd"/>
+      <w:r>
+        <w:t xml:space="preserve"> i </w:t>
+      </w:r>
+      <w:proofErr w:type="spellStart"/>
+      <w:r>
+        <w:t>backendu</w:t>
+      </w:r>
+      <w:proofErr w:type="spellEnd"/>
+      <w:r>
+        <w:t xml:space="preserve"> aplikacji.</w:t>
+      </w:r>
+    </w:p>
+    <w:p>
+      <w:pPr>
+        <w:spacing w:before="240" w:after="240" w:line="240" w:lineRule="auto"/>
+        <w:rPr>
+          <w:rFonts w:eastAsia="Times New Roman"/>
+          <w:b/>
+          <w:bCs/>
+          <w:color w:val="000000"/>
+        </w:rPr>
+      </w:pPr>
+    </w:p>
+    <w:p>
+      <w:pPr>
+        <w:spacing w:before="240" w:after="240" w:line="240" w:lineRule="auto"/>
+        <w:rPr>
+          <w:rFonts w:eastAsia="Times New Roman"/>
+          <w:b/>
+          <w:bCs/>
+          <w:color w:val="000000"/>
+        </w:rPr>
+      </w:pPr>
+    </w:p>
+    <w:p>
+      <w:pPr>
+        <w:spacing w:before="240" w:after="240" w:line="240" w:lineRule="auto"/>
+        <w:rPr>
+          <w:rFonts w:eastAsia="Times New Roman"/>
+          <w:b/>
+          <w:bCs/>
+          <w:color w:val="000000"/>
+          <w:sz w:val="28"/>
+          <w:szCs w:val="28"/>
+          <w:lang w:val="pl-PL"/>
+        </w:rPr>
+      </w:pPr>
+    </w:p>
+    <w:p>
+      <w:pPr>
+        <w:spacing w:before="240" w:after="240" w:line="240" w:lineRule="auto"/>
+        <w:rPr>
+          <w:rFonts w:ascii="Times New Roman" w:eastAsia="Times New Roman" w:hAnsi="Times New Roman" w:cs="Times New Roman"/>
+          <w:color w:val="000000"/>
+          <w:sz w:val="24"/>
+          <w:szCs w:val="24"/>
+          <w:lang w:val="pl-PL"/>
+        </w:rPr>
+      </w:pPr>
+      <w:r>
+        <w:rPr>
+          <w:rFonts w:eastAsia="Times New Roman"/>
+          <w:b/>
+          <w:bCs/>
+          <w:color w:val="000000"/>
+          <w:sz w:val="28"/>
+          <w:szCs w:val="28"/>
           <w:lang w:val="pl-PL"/>
         </w:rPr>
         <w:t>5.1 Diagram klas</w:t>
@@ -8547,6 +8938,7 @@
           <w:szCs w:val="24"/>
           <w:lang w:val="pl-PL"/>
         </w:rPr>
+        <w:lastRenderedPageBreak/>
         <w:drawing>
           <wp:inline distT="0" distB="0" distL="0" distR="0" wp14:anchorId="36C7CC77" wp14:editId="56299779">
             <wp:extent cx="6843395" cy="3075305"/>
@@ -8563,7 +8955,7 @@
                     <pic:cNvPicPr/>
                   </pic:nvPicPr>
                   <pic:blipFill>
-                    <a:blip r:embed="rId14" cstate="print">
+                    <a:blip r:embed="rId15" cstate="print">
                       <a:extLst>
                         <a:ext uri="{28A0092B-C50C-407E-A947-70E740481C1C}">
                           <a14:useLocalDpi xmlns:a14="http://schemas.microsoft.com/office/drawing/2010/main" val="0"/>
@@ -9706,6 +10098,7 @@
           <w:color w:val="000000"/>
           <w:lang w:val="pl-PL"/>
         </w:rPr>
+        <w:lastRenderedPageBreak/>
         <w:t>sprawdzHistorieChorob</w:t>
       </w:r>
       <w:proofErr w:type="spellEnd"/>
@@ -12861,7 +13254,6 @@
           <w:color w:val="000000"/>
           <w:lang w:val="pl-PL"/>
         </w:rPr>
-        <w:lastRenderedPageBreak/>
         <w:t>email: String</w:t>
       </w:r>
     </w:p>
@@ -13127,6 +13519,7 @@
           <w:color w:val="000000"/>
           <w:lang w:val="pl-PL"/>
         </w:rPr>
+        <w:lastRenderedPageBreak/>
         <w:t>utworzHarmonogramCzynnosci</w:t>
       </w:r>
       <w:proofErr w:type="spellEnd"/>
@@ -14421,6 +14814,7 @@
           <w:color w:val="000000"/>
           <w:lang w:val="pl-PL"/>
         </w:rPr>
+        <w:lastRenderedPageBreak/>
         <w:t>Stany chomika</w:t>
       </w:r>
     </w:p>
@@ -14477,7 +14871,7 @@
                     </pic:cNvPicPr>
                   </pic:nvPicPr>
                   <pic:blipFill>
-                    <a:blip r:embed="rId15">
+                    <a:blip r:embed="rId16">
                       <a:extLst>
                         <a:ext uri="{28A0092B-C50C-407E-A947-70E740481C1C}">
                           <a14:useLocalDpi xmlns:a14="http://schemas.microsoft.com/office/drawing/2010/main" val="0"/>
@@ -14878,6 +15272,7 @@
           <w:bdr w:val="none" w:sz="0" w:space="0" w:color="auto" w:frame="1"/>
           <w:lang w:val="pl-PL"/>
         </w:rPr>
+        <w:lastRenderedPageBreak/>
         <w:drawing>
           <wp:inline distT="0" distB="0" distL="0" distR="0" wp14:anchorId="2358A67B" wp14:editId="3E0B6927">
             <wp:extent cx="6084711" cy="5906003"/>
@@ -14896,7 +15291,7 @@
                     </pic:cNvPicPr>
                   </pic:nvPicPr>
                   <pic:blipFill>
-                    <a:blip r:embed="rId16">
+                    <a:blip r:embed="rId17">
                       <a:extLst>
                         <a:ext uri="{28A0092B-C50C-407E-A947-70E740481C1C}">
                           <a14:useLocalDpi xmlns:a14="http://schemas.microsoft.com/office/drawing/2010/main" val="0"/>
@@ -15334,6 +15729,7 @@
           <w:bdr w:val="none" w:sz="0" w:space="0" w:color="auto" w:frame="1"/>
           <w:lang w:val="pl-PL"/>
         </w:rPr>
+        <w:lastRenderedPageBreak/>
         <w:drawing>
           <wp:inline distT="0" distB="0" distL="0" distR="0" wp14:anchorId="1AF77E66" wp14:editId="6CED090F">
             <wp:extent cx="6355644" cy="6765413"/>
@@ -15352,7 +15748,7 @@
                     </pic:cNvPicPr>
                   </pic:nvPicPr>
                   <pic:blipFill>
-                    <a:blip r:embed="rId17">
+                    <a:blip r:embed="rId18">
                       <a:extLst>
                         <a:ext uri="{28A0092B-C50C-407E-A947-70E740481C1C}">
                           <a14:useLocalDpi xmlns:a14="http://schemas.microsoft.com/office/drawing/2010/main" val="0"/>
@@ -15643,83 +16039,83 @@
           <w:szCs w:val="28"/>
           <w:lang w:val="pl-PL"/>
         </w:rPr>
+        <w:t>5.4. Propozycje interfejsu użytkownika</w:t>
+      </w:r>
+    </w:p>
+    <w:p>
+      <w:pPr>
+        <w:spacing w:line="240" w:lineRule="auto"/>
+        <w:rPr>
+          <w:rFonts w:ascii="Times New Roman" w:eastAsia="Times New Roman" w:hAnsi="Times New Roman" w:cs="Times New Roman"/>
+          <w:color w:val="000000"/>
+          <w:sz w:val="24"/>
+          <w:szCs w:val="24"/>
+          <w:lang w:val="pl-PL"/>
+        </w:rPr>
+      </w:pPr>
+    </w:p>
+    <w:p>
+      <w:pPr>
+        <w:spacing w:line="240" w:lineRule="auto"/>
+        <w:rPr>
+          <w:rFonts w:eastAsia="Times New Roman"/>
+          <w:b/>
+          <w:bCs/>
+          <w:color w:val="000000"/>
+          <w:sz w:val="24"/>
+          <w:szCs w:val="24"/>
+          <w:lang w:val="pl-PL"/>
+        </w:rPr>
+      </w:pPr>
+      <w:r>
+        <w:rPr>
+          <w:rFonts w:eastAsia="Times New Roman"/>
+          <w:b/>
+          <w:bCs/>
+          <w:color w:val="000000"/>
+          <w:sz w:val="24"/>
+          <w:szCs w:val="24"/>
+          <w:lang w:val="pl-PL"/>
+        </w:rPr>
+        <w:t>Strona główna</w:t>
+      </w:r>
+    </w:p>
+    <w:p>
+      <w:pPr>
+        <w:spacing w:line="240" w:lineRule="auto"/>
+        <w:rPr>
+          <w:rFonts w:ascii="Times New Roman" w:eastAsia="Times New Roman" w:hAnsi="Times New Roman" w:cs="Times New Roman"/>
+          <w:color w:val="000000"/>
+          <w:sz w:val="24"/>
+          <w:szCs w:val="24"/>
+          <w:lang w:val="pl-PL"/>
+        </w:rPr>
+      </w:pPr>
+    </w:p>
+    <w:p>
+      <w:pPr>
+        <w:spacing w:line="240" w:lineRule="auto"/>
+        <w:rPr>
+          <w:rFonts w:ascii="Times New Roman" w:eastAsia="Times New Roman" w:hAnsi="Times New Roman" w:cs="Times New Roman"/>
+          <w:color w:val="000000"/>
+          <w:sz w:val="24"/>
+          <w:szCs w:val="24"/>
+          <w:lang w:val="pl-PL"/>
+        </w:rPr>
+      </w:pPr>
+      <w:r>
+        <w:rPr>
+          <w:rFonts w:eastAsia="Times New Roman"/>
+          <w:b/>
+          <w:bCs/>
+          <w:noProof/>
+          <w:color w:val="000000"/>
+          <w:sz w:val="24"/>
+          <w:szCs w:val="24"/>
+          <w:bdr w:val="none" w:sz="0" w:space="0" w:color="auto" w:frame="1"/>
+          <w:lang w:val="pl-PL"/>
+        </w:rPr>
         <w:lastRenderedPageBreak/>
-        <w:t>5.4. Propozycje interfejsu użytkownika</w:t>
-      </w:r>
-    </w:p>
-    <w:p>
-      <w:pPr>
-        <w:spacing w:line="240" w:lineRule="auto"/>
-        <w:rPr>
-          <w:rFonts w:ascii="Times New Roman" w:eastAsia="Times New Roman" w:hAnsi="Times New Roman" w:cs="Times New Roman"/>
-          <w:color w:val="000000"/>
-          <w:sz w:val="24"/>
-          <w:szCs w:val="24"/>
-          <w:lang w:val="pl-PL"/>
-        </w:rPr>
-      </w:pPr>
-    </w:p>
-    <w:p>
-      <w:pPr>
-        <w:spacing w:line="240" w:lineRule="auto"/>
-        <w:rPr>
-          <w:rFonts w:eastAsia="Times New Roman"/>
-          <w:b/>
-          <w:bCs/>
-          <w:color w:val="000000"/>
-          <w:sz w:val="24"/>
-          <w:szCs w:val="24"/>
-          <w:lang w:val="pl-PL"/>
-        </w:rPr>
-      </w:pPr>
-      <w:r>
-        <w:rPr>
-          <w:rFonts w:eastAsia="Times New Roman"/>
-          <w:b/>
-          <w:bCs/>
-          <w:color w:val="000000"/>
-          <w:sz w:val="24"/>
-          <w:szCs w:val="24"/>
-          <w:lang w:val="pl-PL"/>
-        </w:rPr>
-        <w:t>Strona główna</w:t>
-      </w:r>
-    </w:p>
-    <w:p>
-      <w:pPr>
-        <w:spacing w:line="240" w:lineRule="auto"/>
-        <w:rPr>
-          <w:rFonts w:ascii="Times New Roman" w:eastAsia="Times New Roman" w:hAnsi="Times New Roman" w:cs="Times New Roman"/>
-          <w:color w:val="000000"/>
-          <w:sz w:val="24"/>
-          <w:szCs w:val="24"/>
-          <w:lang w:val="pl-PL"/>
-        </w:rPr>
-      </w:pPr>
-    </w:p>
-    <w:p>
-      <w:pPr>
-        <w:spacing w:line="240" w:lineRule="auto"/>
-        <w:rPr>
-          <w:rFonts w:ascii="Times New Roman" w:eastAsia="Times New Roman" w:hAnsi="Times New Roman" w:cs="Times New Roman"/>
-          <w:color w:val="000000"/>
-          <w:sz w:val="24"/>
-          <w:szCs w:val="24"/>
-          <w:lang w:val="pl-PL"/>
-        </w:rPr>
-      </w:pPr>
-      <w:r>
-        <w:rPr>
-          <w:rFonts w:eastAsia="Times New Roman"/>
-          <w:b/>
-          <w:bCs/>
-          <w:noProof/>
-          <w:color w:val="000000"/>
-          <w:sz w:val="24"/>
-          <w:szCs w:val="24"/>
-          <w:bdr w:val="none" w:sz="0" w:space="0" w:color="auto" w:frame="1"/>
-          <w:lang w:val="pl-PL"/>
-        </w:rPr>
         <w:drawing>
           <wp:inline distT="0" distB="0" distL="0" distR="0" wp14:anchorId="08F9121B" wp14:editId="67FBC753">
             <wp:extent cx="6835775" cy="8649335"/>
@@ -15738,7 +16134,7 @@
                     </pic:cNvPicPr>
                   </pic:nvPicPr>
                   <pic:blipFill>
-                    <a:blip r:embed="rId18">
+                    <a:blip r:embed="rId19">
                       <a:extLst>
                         <a:ext uri="{28A0092B-C50C-407E-A947-70E740481C1C}">
                           <a14:useLocalDpi xmlns:a14="http://schemas.microsoft.com/office/drawing/2010/main" val="0"/>
@@ -15887,6 +16283,7 @@
           <w:bdr w:val="none" w:sz="0" w:space="0" w:color="auto" w:frame="1"/>
           <w:lang w:val="pl-PL"/>
         </w:rPr>
+        <w:lastRenderedPageBreak/>
         <w:drawing>
           <wp:inline distT="0" distB="0" distL="0" distR="0" wp14:anchorId="563859D8" wp14:editId="40955C79">
             <wp:extent cx="6745605" cy="5224145"/>
@@ -15905,7 +16302,7 @@
                     </pic:cNvPicPr>
                   </pic:nvPicPr>
                   <pic:blipFill>
-                    <a:blip r:embed="rId19">
+                    <a:blip r:embed="rId20">
                       <a:extLst>
                         <a:ext uri="{28A0092B-C50C-407E-A947-70E740481C1C}">
                           <a14:useLocalDpi xmlns:a14="http://schemas.microsoft.com/office/drawing/2010/main" val="0"/>
@@ -16284,7 +16681,7 @@
                     </pic:cNvPicPr>
                   </pic:nvPicPr>
                   <pic:blipFill>
-                    <a:blip r:embed="rId20">
+                    <a:blip r:embed="rId21">
                       <a:extLst>
                         <a:ext uri="{28A0092B-C50C-407E-A947-70E740481C1C}">
                           <a14:useLocalDpi xmlns:a14="http://schemas.microsoft.com/office/drawing/2010/main" val="0"/>
@@ -16389,7 +16786,6 @@
           <w:bdr w:val="none" w:sz="0" w:space="0" w:color="auto" w:frame="1"/>
           <w:lang w:val="pl-PL"/>
         </w:rPr>
-        <w:lastRenderedPageBreak/>
         <w:drawing>
           <wp:inline distT="0" distB="0" distL="0" distR="0" wp14:anchorId="63616606" wp14:editId="5DA7AAAF">
             <wp:extent cx="6835775" cy="4609465"/>
@@ -16408,7 +16804,7 @@
                     </pic:cNvPicPr>
                   </pic:nvPicPr>
                   <pic:blipFill>
-                    <a:blip r:embed="rId21">
+                    <a:blip r:embed="rId22">
                       <a:extLst>
                         <a:ext uri="{28A0092B-C50C-407E-A947-70E740481C1C}">
                           <a14:useLocalDpi xmlns:a14="http://schemas.microsoft.com/office/drawing/2010/main" val="0"/>
@@ -16545,7 +16941,7 @@
                     </pic:cNvPicPr>
                   </pic:nvPicPr>
                   <pic:blipFill>
-                    <a:blip r:embed="rId22">
+                    <a:blip r:embed="rId23">
                       <a:extLst>
                         <a:ext uri="{28A0092B-C50C-407E-A947-70E740481C1C}">
                           <a14:useLocalDpi xmlns:a14="http://schemas.microsoft.com/office/drawing/2010/main" val="0"/>
@@ -16612,7 +17008,6 @@
           <w:szCs w:val="24"/>
           <w:lang w:val="pl-PL"/>
         </w:rPr>
-        <w:lastRenderedPageBreak/>
         <w:t>Panel weterynarza </w:t>
       </w:r>
     </w:p>
@@ -16669,7 +17064,7 @@
                     </pic:cNvPicPr>
                   </pic:nvPicPr>
                   <pic:blipFill>
-                    <a:blip r:embed="rId23">
+                    <a:blip r:embed="rId24">
                       <a:extLst>
                         <a:ext uri="{28A0092B-C50C-407E-A947-70E740481C1C}">
                           <a14:useLocalDpi xmlns:a14="http://schemas.microsoft.com/office/drawing/2010/main" val="0"/>
@@ -16788,7 +17183,6 @@
           <w:bdr w:val="none" w:sz="0" w:space="0" w:color="auto" w:frame="1"/>
           <w:lang w:val="pl-PL"/>
         </w:rPr>
-        <w:lastRenderedPageBreak/>
         <w:drawing>
           <wp:inline distT="0" distB="0" distL="0" distR="0" wp14:anchorId="5E2F2BE9" wp14:editId="3B4D0D3F">
             <wp:extent cx="6715760" cy="4399915"/>
@@ -16807,7 +17201,7 @@
                     </pic:cNvPicPr>
                   </pic:nvPicPr>
                   <pic:blipFill>
-                    <a:blip r:embed="rId24">
+                    <a:blip r:embed="rId25">
                       <a:extLst>
                         <a:ext uri="{28A0092B-C50C-407E-A947-70E740481C1C}">
                           <a14:useLocalDpi xmlns:a14="http://schemas.microsoft.com/office/drawing/2010/main" val="0"/>
@@ -17094,7 +17488,6 @@
           <w:szCs w:val="24"/>
           <w:lang w:val="pl-PL"/>
         </w:rPr>
-        <w:lastRenderedPageBreak/>
         <w:t>Panel analityka</w:t>
       </w:r>
     </w:p>
@@ -17139,7 +17532,7 @@
                     </pic:cNvPicPr>
                   </pic:nvPicPr>
                   <pic:blipFill>
-                    <a:blip r:embed="rId25">
+                    <a:blip r:embed="rId26">
                       <a:extLst>
                         <a:ext uri="{28A0092B-C50C-407E-A947-70E740481C1C}">
                           <a14:useLocalDpi xmlns:a14="http://schemas.microsoft.com/office/drawing/2010/main" val="0"/>
@@ -17300,6 +17693,7 @@
           <w:szCs w:val="24"/>
           <w:lang w:val="pl-PL"/>
         </w:rPr>
+        <w:lastRenderedPageBreak/>
         <w:br/>
       </w:r>
     </w:p>
@@ -17354,7 +17748,6 @@
           <w:szCs w:val="24"/>
           <w:lang w:val="pl-PL"/>
         </w:rPr>
-        <w:lastRenderedPageBreak/>
         <w:t>Formularz wniosku o wypożyczenie chomika</w:t>
       </w:r>
     </w:p>
@@ -17411,7 +17804,7 @@
                     </pic:cNvPicPr>
                   </pic:nvPicPr>
                   <pic:blipFill>
-                    <a:blip r:embed="rId26">
+                    <a:blip r:embed="rId27">
                       <a:extLst>
                         <a:ext uri="{28A0092B-C50C-407E-A947-70E740481C1C}">
                           <a14:useLocalDpi xmlns:a14="http://schemas.microsoft.com/office/drawing/2010/main" val="0"/>
@@ -17714,7 +18107,6 @@
           <w:szCs w:val="24"/>
           <w:lang w:val="pl-PL"/>
         </w:rPr>
-        <w:lastRenderedPageBreak/>
         <w:t>Formularz wyznaczania grafików karmienia</w:t>
       </w:r>
     </w:p>
@@ -17771,7 +18163,7 @@
                     </pic:cNvPicPr>
                   </pic:nvPicPr>
                   <pic:blipFill>
-                    <a:blip r:embed="rId27">
+                    <a:blip r:embed="rId28">
                       <a:extLst>
                         <a:ext uri="{28A0092B-C50C-407E-A947-70E740481C1C}">
                           <a14:useLocalDpi xmlns:a14="http://schemas.microsoft.com/office/drawing/2010/main" val="0"/>
@@ -17876,6 +18268,7 @@
           <w:bdr w:val="none" w:sz="0" w:space="0" w:color="auto" w:frame="1"/>
           <w:lang w:val="pl-PL"/>
         </w:rPr>
+        <w:lastRenderedPageBreak/>
         <w:drawing>
           <wp:inline distT="0" distB="0" distL="0" distR="0" wp14:anchorId="05BFFA64" wp14:editId="1A4AD4D2">
             <wp:extent cx="6842760" cy="4272280"/>
@@ -17894,7 +18287,7 @@
                     </pic:cNvPicPr>
                   </pic:nvPicPr>
                   <pic:blipFill>
-                    <a:blip r:embed="rId28">
+                    <a:blip r:embed="rId29">
                       <a:extLst>
                         <a:ext uri="{28A0092B-C50C-407E-A947-70E740481C1C}">
                           <a14:useLocalDpi xmlns:a14="http://schemas.microsoft.com/office/drawing/2010/main" val="0"/>
@@ -17981,7 +18374,6 @@
           <w:szCs w:val="24"/>
           <w:lang w:val="pl-PL"/>
         </w:rPr>
-        <w:lastRenderedPageBreak/>
         <w:t>Formularz zgłoszenia chomika na wystawę</w:t>
       </w:r>
     </w:p>
@@ -18038,7 +18430,7 @@
                     </pic:cNvPicPr>
                   </pic:nvPicPr>
                   <pic:blipFill>
-                    <a:blip r:embed="rId29">
+                    <a:blip r:embed="rId30">
                       <a:extLst>
                         <a:ext uri="{28A0092B-C50C-407E-A947-70E740481C1C}">
                           <a14:useLocalDpi xmlns:a14="http://schemas.microsoft.com/office/drawing/2010/main" val="0"/>
@@ -18161,7 +18553,7 @@
                     </pic:cNvPicPr>
                   </pic:nvPicPr>
                   <pic:blipFill>
-                    <a:blip r:embed="rId30">
+                    <a:blip r:embed="rId31">
                       <a:extLst>
                         <a:ext uri="{28A0092B-C50C-407E-A947-70E740481C1C}">
                           <a14:useLocalDpi xmlns:a14="http://schemas.microsoft.com/office/drawing/2010/main" val="0"/>
@@ -18237,7 +18629,6 @@
           <w:szCs w:val="28"/>
           <w:lang w:val="pl-PL"/>
         </w:rPr>
-        <w:lastRenderedPageBreak/>
         <w:t>7</w:t>
       </w:r>
       <w:r>
@@ -18365,7 +18756,7 @@
                     <pic:cNvPicPr/>
                   </pic:nvPicPr>
                   <pic:blipFill>
-                    <a:blip r:embed="rId31">
+                    <a:blip r:embed="rId32">
                       <a:extLst>
                         <a:ext uri="{28A0092B-C50C-407E-A947-70E740481C1C}">
                           <a14:useLocalDpi xmlns:a14="http://schemas.microsoft.com/office/drawing/2010/main" val="0"/>
@@ -18484,6 +18875,7 @@
           <w:color w:val="000000"/>
           <w:lang w:val="pl-PL"/>
         </w:rPr>
+        <w:lastRenderedPageBreak/>
         <w:t>Frontend</w:t>
       </w:r>
       <w:proofErr w:type="spellEnd"/>
@@ -20186,7 +20578,6 @@
                 <w:color w:val="000000"/>
                 <w:lang w:val="pl-PL"/>
               </w:rPr>
-              <w:lastRenderedPageBreak/>
               <w:t>6</w:t>
             </w:r>
           </w:p>
@@ -21508,6 +21899,7 @@
           <w:color w:val="000000"/>
           <w:lang w:val="pl-PL"/>
         </w:rPr>
+        <w:lastRenderedPageBreak/>
         <w:t>Architekt systemu - projektuje strukturę systemu oraz model danych</w:t>
       </w:r>
     </w:p>
@@ -22270,7 +22662,6 @@
                 <w:color w:val="000000"/>
                 <w:lang w:val="pl-PL"/>
               </w:rPr>
-              <w:lastRenderedPageBreak/>
               <w:t>Utrata historii leczenia chomika </w:t>
             </w:r>
           </w:p>
@@ -23597,6 +23988,7 @@
                 <w:color w:val="000000"/>
                 <w:lang w:val="pl-PL"/>
               </w:rPr>
+              <w:lastRenderedPageBreak/>
               <w:t>Analiza wymagań i opracowanie dokumentacji</w:t>
             </w:r>
           </w:p>
@@ -24634,7 +25026,6 @@
           <w:color w:val="000000"/>
           <w:lang w:val="pl-PL"/>
         </w:rPr>
-        <w:lastRenderedPageBreak/>
         <w:t>Płatność za realizację projektu odbywa się w trzech transakcjach:</w:t>
       </w:r>
     </w:p>
@@ -29973,6 +30364,155 @@
     </w:lvl>
   </w:abstractNum>
   <w:abstractNum w:abstractNumId="37" w15:restartNumberingAfterBreak="0">
+    <w:nsid w:val="53231BA3"/>
+    <w:multiLevelType w:val="multilevel"/>
+    <w:tmpl w:val="F7A8ABC0"/>
+    <w:lvl w:ilvl="0">
+      <w:start w:val="1"/>
+      <w:numFmt w:val="bullet"/>
+      <w:lvlText w:val=""/>
+      <w:lvlJc w:val="left"/>
+      <w:pPr>
+        <w:tabs>
+          <w:tab w:val="num" w:pos="720"/>
+        </w:tabs>
+        <w:ind w:left="720" w:hanging="360"/>
+      </w:pPr>
+      <w:rPr>
+        <w:rFonts w:ascii="Symbol" w:hAnsi="Symbol" w:hint="default"/>
+        <w:sz w:val="20"/>
+      </w:rPr>
+    </w:lvl>
+    <w:lvl w:ilvl="1" w:tentative="1">
+      <w:start w:val="1"/>
+      <w:numFmt w:val="bullet"/>
+      <w:lvlText w:val="o"/>
+      <w:lvlJc w:val="left"/>
+      <w:pPr>
+        <w:tabs>
+          <w:tab w:val="num" w:pos="1440"/>
+        </w:tabs>
+        <w:ind w:left="1440" w:hanging="360"/>
+      </w:pPr>
+      <w:rPr>
+        <w:rFonts w:ascii="Courier New" w:hAnsi="Courier New" w:hint="default"/>
+        <w:sz w:val="20"/>
+      </w:rPr>
+    </w:lvl>
+    <w:lvl w:ilvl="2" w:tentative="1">
+      <w:start w:val="1"/>
+      <w:numFmt w:val="bullet"/>
+      <w:lvlText w:val=""/>
+      <w:lvlJc w:val="left"/>
+      <w:pPr>
+        <w:tabs>
+          <w:tab w:val="num" w:pos="2160"/>
+        </w:tabs>
+        <w:ind w:left="2160" w:hanging="360"/>
+      </w:pPr>
+      <w:rPr>
+        <w:rFonts w:ascii="Wingdings" w:hAnsi="Wingdings" w:hint="default"/>
+        <w:sz w:val="20"/>
+      </w:rPr>
+    </w:lvl>
+    <w:lvl w:ilvl="3" w:tentative="1">
+      <w:start w:val="1"/>
+      <w:numFmt w:val="bullet"/>
+      <w:lvlText w:val=""/>
+      <w:lvlJc w:val="left"/>
+      <w:pPr>
+        <w:tabs>
+          <w:tab w:val="num" w:pos="2880"/>
+        </w:tabs>
+        <w:ind w:left="2880" w:hanging="360"/>
+      </w:pPr>
+      <w:rPr>
+        <w:rFonts w:ascii="Wingdings" w:hAnsi="Wingdings" w:hint="default"/>
+        <w:sz w:val="20"/>
+      </w:rPr>
+    </w:lvl>
+    <w:lvl w:ilvl="4" w:tentative="1">
+      <w:start w:val="1"/>
+      <w:numFmt w:val="bullet"/>
+      <w:lvlText w:val=""/>
+      <w:lvlJc w:val="left"/>
+      <w:pPr>
+        <w:tabs>
+          <w:tab w:val="num" w:pos="3600"/>
+        </w:tabs>
+        <w:ind w:left="3600" w:hanging="360"/>
+      </w:pPr>
+      <w:rPr>
+        <w:rFonts w:ascii="Wingdings" w:hAnsi="Wingdings" w:hint="default"/>
+        <w:sz w:val="20"/>
+      </w:rPr>
+    </w:lvl>
+    <w:lvl w:ilvl="5" w:tentative="1">
+      <w:start w:val="1"/>
+      <w:numFmt w:val="bullet"/>
+      <w:lvlText w:val=""/>
+      <w:lvlJc w:val="left"/>
+      <w:pPr>
+        <w:tabs>
+          <w:tab w:val="num" w:pos="4320"/>
+        </w:tabs>
+        <w:ind w:left="4320" w:hanging="360"/>
+      </w:pPr>
+      <w:rPr>
+        <w:rFonts w:ascii="Wingdings" w:hAnsi="Wingdings" w:hint="default"/>
+        <w:sz w:val="20"/>
+      </w:rPr>
+    </w:lvl>
+    <w:lvl w:ilvl="6" w:tentative="1">
+      <w:start w:val="1"/>
+      <w:numFmt w:val="bullet"/>
+      <w:lvlText w:val=""/>
+      <w:lvlJc w:val="left"/>
+      <w:pPr>
+        <w:tabs>
+          <w:tab w:val="num" w:pos="5040"/>
+        </w:tabs>
+        <w:ind w:left="5040" w:hanging="360"/>
+      </w:pPr>
+      <w:rPr>
+        <w:rFonts w:ascii="Wingdings" w:hAnsi="Wingdings" w:hint="default"/>
+        <w:sz w:val="20"/>
+      </w:rPr>
+    </w:lvl>
+    <w:lvl w:ilvl="7" w:tentative="1">
+      <w:start w:val="1"/>
+      <w:numFmt w:val="bullet"/>
+      <w:lvlText w:val=""/>
+      <w:lvlJc w:val="left"/>
+      <w:pPr>
+        <w:tabs>
+          <w:tab w:val="num" w:pos="5760"/>
+        </w:tabs>
+        <w:ind w:left="5760" w:hanging="360"/>
+      </w:pPr>
+      <w:rPr>
+        <w:rFonts w:ascii="Wingdings" w:hAnsi="Wingdings" w:hint="default"/>
+        <w:sz w:val="20"/>
+      </w:rPr>
+    </w:lvl>
+    <w:lvl w:ilvl="8" w:tentative="1">
+      <w:start w:val="1"/>
+      <w:numFmt w:val="bullet"/>
+      <w:lvlText w:val=""/>
+      <w:lvlJc w:val="left"/>
+      <w:pPr>
+        <w:tabs>
+          <w:tab w:val="num" w:pos="6480"/>
+        </w:tabs>
+        <w:ind w:left="6480" w:hanging="360"/>
+      </w:pPr>
+      <w:rPr>
+        <w:rFonts w:ascii="Wingdings" w:hAnsi="Wingdings" w:hint="default"/>
+        <w:sz w:val="20"/>
+      </w:rPr>
+    </w:lvl>
+  </w:abstractNum>
+  <w:abstractNum w:abstractNumId="38" w15:restartNumberingAfterBreak="0">
     <w:nsid w:val="53342C6F"/>
     <w:multiLevelType w:val="multilevel"/>
     <w:tmpl w:val="9C7CACD4"/>
@@ -30121,7 +30661,7 @@
       </w:rPr>
     </w:lvl>
   </w:abstractNum>
-  <w:abstractNum w:abstractNumId="38" w15:restartNumberingAfterBreak="0">
+  <w:abstractNum w:abstractNumId="39" w15:restartNumberingAfterBreak="0">
     <w:nsid w:val="53C6298F"/>
     <w:multiLevelType w:val="multilevel"/>
     <w:tmpl w:val="05B420A6"/>
@@ -30270,7 +30810,7 @@
       </w:rPr>
     </w:lvl>
   </w:abstractNum>
-  <w:abstractNum w:abstractNumId="39" w15:restartNumberingAfterBreak="0">
+  <w:abstractNum w:abstractNumId="40" w15:restartNumberingAfterBreak="0">
     <w:nsid w:val="54202591"/>
     <w:multiLevelType w:val="multilevel"/>
     <w:tmpl w:val="B0BEFC38"/>
@@ -30419,7 +30959,7 @@
       </w:rPr>
     </w:lvl>
   </w:abstractNum>
-  <w:abstractNum w:abstractNumId="40" w15:restartNumberingAfterBreak="0">
+  <w:abstractNum w:abstractNumId="41" w15:restartNumberingAfterBreak="0">
     <w:nsid w:val="568572B6"/>
     <w:multiLevelType w:val="multilevel"/>
     <w:tmpl w:val="DFDA65F2"/>
@@ -30568,7 +31108,7 @@
       </w:rPr>
     </w:lvl>
   </w:abstractNum>
-  <w:abstractNum w:abstractNumId="41" w15:restartNumberingAfterBreak="0">
+  <w:abstractNum w:abstractNumId="42" w15:restartNumberingAfterBreak="0">
     <w:nsid w:val="56D904D5"/>
     <w:multiLevelType w:val="multilevel"/>
     <w:tmpl w:val="1FFC75AE"/>
@@ -30717,7 +31257,7 @@
       </w:rPr>
     </w:lvl>
   </w:abstractNum>
-  <w:abstractNum w:abstractNumId="42" w15:restartNumberingAfterBreak="0">
+  <w:abstractNum w:abstractNumId="43" w15:restartNumberingAfterBreak="0">
     <w:nsid w:val="5C5F60B4"/>
     <w:multiLevelType w:val="multilevel"/>
     <w:tmpl w:val="40E89706"/>
@@ -30866,7 +31406,7 @@
       </w:rPr>
     </w:lvl>
   </w:abstractNum>
-  <w:abstractNum w:abstractNumId="43" w15:restartNumberingAfterBreak="0">
+  <w:abstractNum w:abstractNumId="44" w15:restartNumberingAfterBreak="0">
     <w:nsid w:val="5C7F3EA5"/>
     <w:multiLevelType w:val="multilevel"/>
     <w:tmpl w:val="E292C06A"/>
@@ -30979,7 +31519,7 @@
       </w:rPr>
     </w:lvl>
   </w:abstractNum>
-  <w:abstractNum w:abstractNumId="44" w15:restartNumberingAfterBreak="0">
+  <w:abstractNum w:abstractNumId="45" w15:restartNumberingAfterBreak="0">
     <w:nsid w:val="5DC513C1"/>
     <w:multiLevelType w:val="multilevel"/>
     <w:tmpl w:val="F998E6C4"/>
@@ -31128,7 +31668,7 @@
       </w:rPr>
     </w:lvl>
   </w:abstractNum>
-  <w:abstractNum w:abstractNumId="45" w15:restartNumberingAfterBreak="0">
+  <w:abstractNum w:abstractNumId="46" w15:restartNumberingAfterBreak="0">
     <w:nsid w:val="5E576AB2"/>
     <w:multiLevelType w:val="multilevel"/>
     <w:tmpl w:val="E726620C"/>
@@ -31277,7 +31817,7 @@
       </w:rPr>
     </w:lvl>
   </w:abstractNum>
-  <w:abstractNum w:abstractNumId="46" w15:restartNumberingAfterBreak="0">
+  <w:abstractNum w:abstractNumId="47" w15:restartNumberingAfterBreak="0">
     <w:nsid w:val="5E57751C"/>
     <w:multiLevelType w:val="hybridMultilevel"/>
     <w:tmpl w:val="11A6555E"/>
@@ -31390,7 +31930,7 @@
       </w:rPr>
     </w:lvl>
   </w:abstractNum>
-  <w:abstractNum w:abstractNumId="47" w15:restartNumberingAfterBreak="0">
+  <w:abstractNum w:abstractNumId="48" w15:restartNumberingAfterBreak="0">
     <w:nsid w:val="60090E3A"/>
     <w:multiLevelType w:val="multilevel"/>
     <w:tmpl w:val="128613DC"/>
@@ -31539,7 +32079,7 @@
       </w:rPr>
     </w:lvl>
   </w:abstractNum>
-  <w:abstractNum w:abstractNumId="48" w15:restartNumberingAfterBreak="0">
+  <w:abstractNum w:abstractNumId="49" w15:restartNumberingAfterBreak="0">
     <w:nsid w:val="629959B9"/>
     <w:multiLevelType w:val="multilevel"/>
     <w:tmpl w:val="699604E4"/>
@@ -31652,7 +32192,7 @@
       </w:pPr>
     </w:lvl>
   </w:abstractNum>
-  <w:abstractNum w:abstractNumId="49" w15:restartNumberingAfterBreak="0">
+  <w:abstractNum w:abstractNumId="50" w15:restartNumberingAfterBreak="0">
     <w:nsid w:val="6FA72DBC"/>
     <w:multiLevelType w:val="multilevel"/>
     <w:tmpl w:val="7326F9B6"/>
@@ -31801,7 +32341,7 @@
       </w:rPr>
     </w:lvl>
   </w:abstractNum>
-  <w:abstractNum w:abstractNumId="50" w15:restartNumberingAfterBreak="0">
+  <w:abstractNum w:abstractNumId="51" w15:restartNumberingAfterBreak="0">
     <w:nsid w:val="70571A84"/>
     <w:multiLevelType w:val="multilevel"/>
     <w:tmpl w:val="F1D07890"/>
@@ -31950,7 +32490,7 @@
       </w:rPr>
     </w:lvl>
   </w:abstractNum>
-  <w:abstractNum w:abstractNumId="51" w15:restartNumberingAfterBreak="0">
+  <w:abstractNum w:abstractNumId="52" w15:restartNumberingAfterBreak="0">
     <w:nsid w:val="72DD477B"/>
     <w:multiLevelType w:val="multilevel"/>
     <w:tmpl w:val="1C92742C"/>
@@ -32099,7 +32639,7 @@
       </w:rPr>
     </w:lvl>
   </w:abstractNum>
-  <w:abstractNum w:abstractNumId="52" w15:restartNumberingAfterBreak="0">
+  <w:abstractNum w:abstractNumId="53" w15:restartNumberingAfterBreak="0">
     <w:nsid w:val="72DE07B6"/>
     <w:multiLevelType w:val="multilevel"/>
     <w:tmpl w:val="F3A24FD6"/>
@@ -32248,7 +32788,7 @@
       </w:rPr>
     </w:lvl>
   </w:abstractNum>
-  <w:abstractNum w:abstractNumId="53" w15:restartNumberingAfterBreak="0">
+  <w:abstractNum w:abstractNumId="54" w15:restartNumberingAfterBreak="0">
     <w:nsid w:val="73956577"/>
     <w:multiLevelType w:val="multilevel"/>
     <w:tmpl w:val="82DCB43A"/>
@@ -32397,7 +32937,7 @@
       </w:rPr>
     </w:lvl>
   </w:abstractNum>
-  <w:abstractNum w:abstractNumId="54" w15:restartNumberingAfterBreak="0">
+  <w:abstractNum w:abstractNumId="55" w15:restartNumberingAfterBreak="0">
     <w:nsid w:val="73DB72A2"/>
     <w:multiLevelType w:val="multilevel"/>
     <w:tmpl w:val="1B24B312"/>
@@ -32546,7 +33086,7 @@
       </w:rPr>
     </w:lvl>
   </w:abstractNum>
-  <w:abstractNum w:abstractNumId="55" w15:restartNumberingAfterBreak="0">
+  <w:abstractNum w:abstractNumId="56" w15:restartNumberingAfterBreak="0">
     <w:nsid w:val="753F45FB"/>
     <w:multiLevelType w:val="multilevel"/>
     <w:tmpl w:val="C60AF980"/>
@@ -32695,7 +33235,7 @@
       </w:rPr>
     </w:lvl>
   </w:abstractNum>
-  <w:abstractNum w:abstractNumId="56" w15:restartNumberingAfterBreak="0">
+  <w:abstractNum w:abstractNumId="57" w15:restartNumberingAfterBreak="0">
     <w:nsid w:val="775849C8"/>
     <w:multiLevelType w:val="multilevel"/>
     <w:tmpl w:val="608E9DDE"/>
@@ -32844,7 +33384,7 @@
       </w:rPr>
     </w:lvl>
   </w:abstractNum>
-  <w:abstractNum w:abstractNumId="57" w15:restartNumberingAfterBreak="0">
+  <w:abstractNum w:abstractNumId="58" w15:restartNumberingAfterBreak="0">
     <w:nsid w:val="7B0B3AFC"/>
     <w:multiLevelType w:val="multilevel"/>
     <w:tmpl w:val="16D06C28"/>
@@ -32957,7 +33497,7 @@
       </w:pPr>
     </w:lvl>
   </w:abstractNum>
-  <w:abstractNum w:abstractNumId="58" w15:restartNumberingAfterBreak="0">
+  <w:abstractNum w:abstractNumId="59" w15:restartNumberingAfterBreak="0">
     <w:nsid w:val="7F7619E6"/>
     <w:multiLevelType w:val="multilevel"/>
     <w:tmpl w:val="8F2854C8"/>
@@ -33106,7 +33646,7 @@
       </w:rPr>
     </w:lvl>
   </w:abstractNum>
-  <w:abstractNum w:abstractNumId="59" w15:restartNumberingAfterBreak="0">
+  <w:abstractNum w:abstractNumId="60" w15:restartNumberingAfterBreak="0">
     <w:nsid w:val="7F941253"/>
     <w:multiLevelType w:val="multilevel"/>
     <w:tmpl w:val="7BCA9774"/>
@@ -33255,7 +33795,7 @@
       </w:rPr>
     </w:lvl>
   </w:abstractNum>
-  <w:abstractNum w:abstractNumId="60" w15:restartNumberingAfterBreak="0">
+  <w:abstractNum w:abstractNumId="61" w15:restartNumberingAfterBreak="0">
     <w:nsid w:val="7FB7744B"/>
     <w:multiLevelType w:val="multilevel"/>
     <w:tmpl w:val="5E7C15AE"/>
@@ -33369,19 +33909,19 @@
     </w:lvl>
   </w:abstractNum>
   <w:num w:numId="1" w16cid:durableId="993529380">
-    <w:abstractNumId w:val="43"/>
+    <w:abstractNumId w:val="44"/>
   </w:num>
   <w:num w:numId="2" w16cid:durableId="1957254034">
-    <w:abstractNumId w:val="45"/>
+    <w:abstractNumId w:val="46"/>
   </w:num>
   <w:num w:numId="3" w16cid:durableId="734547526">
-    <w:abstractNumId w:val="40"/>
+    <w:abstractNumId w:val="41"/>
   </w:num>
   <w:num w:numId="4" w16cid:durableId="146020699">
     <w:abstractNumId w:val="12"/>
   </w:num>
   <w:num w:numId="5" w16cid:durableId="174611146">
-    <w:abstractNumId w:val="52"/>
+    <w:abstractNumId w:val="53"/>
   </w:num>
   <w:num w:numId="6" w16cid:durableId="1825274068">
     <w:abstractNumId w:val="29"/>
@@ -33390,10 +33930,10 @@
     <w:abstractNumId w:val="18"/>
   </w:num>
   <w:num w:numId="8" w16cid:durableId="677578760">
-    <w:abstractNumId w:val="54"/>
+    <w:abstractNumId w:val="55"/>
   </w:num>
   <w:num w:numId="9" w16cid:durableId="1490436316">
-    <w:abstractNumId w:val="37"/>
+    <w:abstractNumId w:val="38"/>
   </w:num>
   <w:num w:numId="10" w16cid:durableId="1596278286">
     <w:abstractNumId w:val="2"/>
@@ -33402,16 +33942,16 @@
     <w:abstractNumId w:val="33"/>
   </w:num>
   <w:num w:numId="12" w16cid:durableId="1315451412">
-    <w:abstractNumId w:val="57"/>
+    <w:abstractNumId w:val="58"/>
   </w:num>
   <w:num w:numId="13" w16cid:durableId="1206674393">
-    <w:abstractNumId w:val="44"/>
+    <w:abstractNumId w:val="45"/>
   </w:num>
   <w:num w:numId="14" w16cid:durableId="1993563347">
-    <w:abstractNumId w:val="41"/>
+    <w:abstractNumId w:val="42"/>
   </w:num>
   <w:num w:numId="15" w16cid:durableId="1708023114">
-    <w:abstractNumId w:val="38"/>
+    <w:abstractNumId w:val="39"/>
   </w:num>
   <w:num w:numId="16" w16cid:durableId="2000814645">
     <w:abstractNumId w:val="23"/>
@@ -33420,22 +33960,22 @@
     <w:abstractNumId w:val="35"/>
   </w:num>
   <w:num w:numId="18" w16cid:durableId="483277252">
-    <w:abstractNumId w:val="42"/>
+    <w:abstractNumId w:val="43"/>
   </w:num>
   <w:num w:numId="19" w16cid:durableId="1155998351">
     <w:abstractNumId w:val="34"/>
   </w:num>
   <w:num w:numId="20" w16cid:durableId="893152542">
-    <w:abstractNumId w:val="55"/>
+    <w:abstractNumId w:val="56"/>
   </w:num>
   <w:num w:numId="21" w16cid:durableId="1173758258">
-    <w:abstractNumId w:val="39"/>
+    <w:abstractNumId w:val="40"/>
   </w:num>
   <w:num w:numId="22" w16cid:durableId="226694624">
     <w:abstractNumId w:val="17"/>
   </w:num>
   <w:num w:numId="23" w16cid:durableId="1568296332">
-    <w:abstractNumId w:val="53"/>
+    <w:abstractNumId w:val="54"/>
   </w:num>
   <w:num w:numId="24" w16cid:durableId="917445654">
     <w:abstractNumId w:val="19"/>
@@ -33447,7 +33987,7 @@
     <w:abstractNumId w:val="36"/>
   </w:num>
   <w:num w:numId="27" w16cid:durableId="210922851">
-    <w:abstractNumId w:val="60"/>
+    <w:abstractNumId w:val="61"/>
   </w:num>
   <w:num w:numId="28" w16cid:durableId="268314316">
     <w:abstractNumId w:val="27"/>
@@ -33468,7 +34008,7 @@
     <w:abstractNumId w:val="3"/>
   </w:num>
   <w:num w:numId="34" w16cid:durableId="1596399909">
-    <w:abstractNumId w:val="56"/>
+    <w:abstractNumId w:val="57"/>
   </w:num>
   <w:num w:numId="35" w16cid:durableId="1632318390">
     <w:abstractNumId w:val="20"/>
@@ -33480,10 +34020,10 @@
     <w:abstractNumId w:val="15"/>
   </w:num>
   <w:num w:numId="38" w16cid:durableId="971446756">
-    <w:abstractNumId w:val="49"/>
+    <w:abstractNumId w:val="50"/>
   </w:num>
   <w:num w:numId="39" w16cid:durableId="636761215">
-    <w:abstractNumId w:val="51"/>
+    <w:abstractNumId w:val="52"/>
   </w:num>
   <w:num w:numId="40" w16cid:durableId="1719088955">
     <w:abstractNumId w:val="25"/>
@@ -33498,13 +34038,13 @@
     <w:abstractNumId w:val="5"/>
   </w:num>
   <w:num w:numId="44" w16cid:durableId="1911576984">
-    <w:abstractNumId w:val="59"/>
+    <w:abstractNumId w:val="60"/>
   </w:num>
   <w:num w:numId="45" w16cid:durableId="801077412">
-    <w:abstractNumId w:val="47"/>
+    <w:abstractNumId w:val="48"/>
   </w:num>
   <w:num w:numId="46" w16cid:durableId="44184346">
-    <w:abstractNumId w:val="58"/>
+    <w:abstractNumId w:val="59"/>
   </w:num>
   <w:num w:numId="47" w16cid:durableId="1469740704">
     <w:abstractNumId w:val="16"/>
@@ -33516,7 +34056,7 @@
     <w:abstractNumId w:val="28"/>
   </w:num>
   <w:num w:numId="50" w16cid:durableId="1396855454">
-    <w:abstractNumId w:val="50"/>
+    <w:abstractNumId w:val="51"/>
   </w:num>
   <w:num w:numId="51" w16cid:durableId="1186484752">
     <w:abstractNumId w:val="22"/>
@@ -33531,7 +34071,7 @@
     <w:abstractNumId w:val="31"/>
   </w:num>
   <w:num w:numId="55" w16cid:durableId="1318847828">
-    <w:abstractNumId w:val="48"/>
+    <w:abstractNumId w:val="49"/>
   </w:num>
   <w:num w:numId="56" w16cid:durableId="468671156">
     <w:abstractNumId w:val="32"/>
@@ -33543,13 +34083,16 @@
     <w:abstractNumId w:val="1"/>
   </w:num>
   <w:num w:numId="59" w16cid:durableId="1639342352">
-    <w:abstractNumId w:val="46"/>
+    <w:abstractNumId w:val="47"/>
   </w:num>
   <w:num w:numId="60" w16cid:durableId="869954194">
     <w:abstractNumId w:val="4"/>
   </w:num>
   <w:num w:numId="61" w16cid:durableId="1860193001">
     <w:abstractNumId w:val="7"/>
+  </w:num>
+  <w:num w:numId="62" w16cid:durableId="698821672">
+    <w:abstractNumId w:val="37"/>
   </w:num>
   <w:numIdMacAtCleanup w:val="51"/>
 </w:numbering>
@@ -34070,7 +34613,6 @@
   <w:style w:type="character" w:default="1" w:styleId="Domylnaczcionkaakapitu">
     <w:name w:val="Default Paragraph Font"/>
     <w:uiPriority w:val="1"/>
-    <w:semiHidden/>
     <w:unhideWhenUsed/>
   </w:style>
   <w:style w:type="table" w:default="1" w:styleId="Standardowy">

</xml_diff>

<commit_message>
Dodanie podpunktu 6.1- oszacowanie wielkości bazy danych
</commit_message>
<xml_diff>
--- a/TK/TK.docx
+++ b/TK/TK.docx
@@ -18600,9 +18600,349 @@
       <w:pPr>
         <w:spacing w:line="240" w:lineRule="auto"/>
         <w:rPr>
-          <w:rFonts w:ascii="Times New Roman" w:eastAsia="Times New Roman" w:hAnsi="Times New Roman" w:cs="Times New Roman"/>
-          <w:sz w:val="24"/>
-          <w:szCs w:val="24"/>
+          <w:rFonts w:eastAsia="Times New Roman"/>
+          <w:b/>
+          <w:bCs/>
+          <w:sz w:val="28"/>
+          <w:szCs w:val="28"/>
+        </w:rPr>
+      </w:pPr>
+      <w:r>
+        <w:rPr>
+          <w:rFonts w:eastAsia="Times New Roman"/>
+          <w:b/>
+          <w:bCs/>
+          <w:sz w:val="28"/>
+          <w:szCs w:val="28"/>
+          <w:lang w:val="pl-PL"/>
+        </w:rPr>
+        <w:t>6.1.</w:t>
+      </w:r>
+      <w:r>
+        <w:rPr>
+          <w:rFonts w:eastAsia="Times New Roman"/>
+          <w:b/>
+          <w:bCs/>
+          <w:sz w:val="28"/>
+          <w:szCs w:val="28"/>
+          <w:lang w:val="pl-PL"/>
+        </w:rPr>
+        <w:t xml:space="preserve"> </w:t>
+      </w:r>
+      <w:r>
+        <w:rPr>
+          <w:rFonts w:eastAsia="Times New Roman"/>
+          <w:b/>
+          <w:bCs/>
+          <w:sz w:val="28"/>
+          <w:szCs w:val="28"/>
+        </w:rPr>
+        <w:t>Oszacowanie wielkości bazy danych</w:t>
+      </w:r>
+    </w:p>
+    <w:p>
+      <w:pPr>
+        <w:spacing w:line="240" w:lineRule="auto"/>
+        <w:rPr>
+          <w:rFonts w:eastAsia="Times New Roman"/>
+          <w:b/>
+          <w:bCs/>
+          <w:sz w:val="28"/>
+          <w:szCs w:val="28"/>
+        </w:rPr>
+      </w:pPr>
+    </w:p>
+    <w:p>
+      <w:pPr>
+        <w:spacing w:after="160" w:line="259" w:lineRule="auto"/>
+      </w:pPr>
+      <w:r>
+        <w:t>Określamy</w:t>
+      </w:r>
+      <w:r>
+        <w:t xml:space="preserve">, ile realnie miejsca na dysku serwera będzie potrzebować nasza aplikacja dla menażerii pana Zbigniewa. </w:t>
+      </w:r>
+      <w:r>
+        <w:t xml:space="preserve">Działamy na </w:t>
+      </w:r>
+      <w:r>
+        <w:t>perspektywie 2 lat od wdrożenia systemu i upewni</w:t>
+      </w:r>
+      <w:r>
+        <w:t>eniu</w:t>
+      </w:r>
+      <w:r>
+        <w:t xml:space="preserve"> się, że baza nie zapcha hostingu. </w:t>
+      </w:r>
+    </w:p>
+    <w:p>
+      <w:pPr>
+        <w:spacing w:after="160" w:line="259" w:lineRule="auto"/>
+      </w:pPr>
+      <w:r>
+        <w:t>Do obliczeń przyjęliśmy następujące założenia wolumenowe:</w:t>
+      </w:r>
+    </w:p>
+    <w:p>
+      <w:pPr>
+        <w:numPr>
+          <w:ilvl w:val="0"/>
+          <w:numId w:val="63"/>
+        </w:numPr>
+        <w:spacing w:after="160" w:line="259" w:lineRule="auto"/>
+      </w:pPr>
+      <w:r>
+        <w:rPr>
+          <w:b/>
+          <w:bCs/>
+        </w:rPr>
+        <w:t>Użytkownicy i zwierzaki:</w:t>
+      </w:r>
+      <w:r>
+        <w:t xml:space="preserve"> W systemie znajdzie się około 5000 kont klientów oraz 50 profili dla pracowników (w tym administrator , weterynarze i analityk ). Stała populacja chomików to 1000 osobników , które mieszkają w 250 klatkach. </w:t>
+      </w:r>
+    </w:p>
+    <w:p>
+      <w:pPr>
+        <w:numPr>
+          <w:ilvl w:val="0"/>
+          <w:numId w:val="63"/>
+        </w:numPr>
+        <w:spacing w:after="160" w:line="259" w:lineRule="auto"/>
+      </w:pPr>
+      <w:r>
+        <w:rPr>
+          <w:b/>
+          <w:bCs/>
+        </w:rPr>
+        <w:t>Aktywność i operacje:</w:t>
+      </w:r>
+      <w:r>
+        <w:t xml:space="preserve"> Przez 2 lata klienci złożą około 30 000 wniosków leasingowych. Około 1500 z nich może skończyć się reklamacją (np. ze względu na zły stan zdrowia chomika). Weterynarz wygeneruje też około 3000 protokołów leczenia i 500 kart rozmnażania. </w:t>
+      </w:r>
+    </w:p>
+    <w:p>
+      <w:pPr>
+        <w:numPr>
+          <w:ilvl w:val="0"/>
+          <w:numId w:val="63"/>
+        </w:numPr>
+        <w:spacing w:after="160" w:line="259" w:lineRule="auto"/>
+      </w:pPr>
+      <w:r>
+        <w:rPr>
+          <w:b/>
+          <w:bCs/>
+        </w:rPr>
+        <w:t>Logi pielęgnacyjne:</w:t>
+      </w:r>
+      <w:r>
+        <w:t xml:space="preserve"> Tutaj ruch jest największy. Codzienne odznaczanie karmienia i sprzątania klatek przez obsługę (data, godzina, osoba) wygeneruje ponad 180 000 rekordów w ciągu 2 lat. </w:t>
+      </w:r>
+    </w:p>
+    <w:p>
+      <w:pPr>
+        <w:spacing w:after="160" w:line="259" w:lineRule="auto"/>
+        <w:ind w:left="360"/>
+      </w:pPr>
+      <w:r>
+        <w:t xml:space="preserve">Rozmiar wpisów na dysku </w:t>
+      </w:r>
+      <w:r>
+        <w:t xml:space="preserve">jest </w:t>
+      </w:r>
+      <w:r>
+        <w:t>zależ</w:t>
+      </w:r>
+      <w:r>
+        <w:t>ny</w:t>
+      </w:r>
+      <w:r>
+        <w:t xml:space="preserve"> od tego, co przechowują:</w:t>
+      </w:r>
+    </w:p>
+    <w:p>
+      <w:pPr>
+        <w:numPr>
+          <w:ilvl w:val="0"/>
+          <w:numId w:val="63"/>
+        </w:numPr>
+        <w:spacing w:after="160" w:line="259" w:lineRule="auto"/>
+      </w:pPr>
+      <w:r>
+        <w:rPr>
+          <w:b/>
+          <w:bCs/>
+        </w:rPr>
+        <w:t>Małe rekordy (poniżej 0,1 KB):</w:t>
+      </w:r>
+      <w:r>
+        <w:t xml:space="preserve"> Logi operacyjne i statusy klatek. Są lekkie, ale przez codzienne klikanie ta tabela urośnie najszybciej. </w:t>
+      </w:r>
+    </w:p>
+    <w:p>
+      <w:pPr>
+        <w:numPr>
+          <w:ilvl w:val="0"/>
+          <w:numId w:val="63"/>
+        </w:numPr>
+        <w:spacing w:after="160" w:line="259" w:lineRule="auto"/>
+      </w:pPr>
+      <w:r>
+        <w:rPr>
+          <w:b/>
+          <w:bCs/>
+        </w:rPr>
+        <w:t>Średnie rekordy (do 0,3 KB):</w:t>
+      </w:r>
+      <w:r>
+        <w:t xml:space="preserve"> Cechy chomików (rasa, płeć, waga, maść) , historia wystaw , konta użytkowników oraz podstawowe dane wniosków. </w:t>
+      </w:r>
+    </w:p>
+    <w:p>
+      <w:pPr>
+        <w:numPr>
+          <w:ilvl w:val="0"/>
+          <w:numId w:val="63"/>
+        </w:numPr>
+        <w:spacing w:after="160" w:line="259" w:lineRule="auto"/>
+      </w:pPr>
+      <w:r>
+        <w:rPr>
+          <w:b/>
+          <w:bCs/>
+        </w:rPr>
+        <w:t>Duże rekordy (powyżej 0,5 KB):</w:t>
+      </w:r>
+      <w:r>
+        <w:t xml:space="preserve"> Pola tekstowe wpisywane ręcznie, czyli opisy diagnoz lekarskich oraz uzasadnienia reklamacji. </w:t>
+      </w:r>
+    </w:p>
+    <w:p>
+      <w:pPr>
+        <w:spacing w:after="160" w:line="259" w:lineRule="auto"/>
+        <w:ind w:left="360"/>
+      </w:pPr>
+      <w:r>
+        <w:rPr>
+          <w:b/>
+          <w:bCs/>
+        </w:rPr>
+        <w:t>Podsumowanie i wynik końcowy:</w:t>
+      </w:r>
+    </w:p>
+    <w:p>
+      <w:pPr>
+        <w:numPr>
+          <w:ilvl w:val="0"/>
+          <w:numId w:val="63"/>
+        </w:numPr>
+        <w:spacing w:after="160" w:line="259" w:lineRule="auto"/>
+      </w:pPr>
+      <w:r>
+        <w:rPr>
+          <w:b/>
+          <w:bCs/>
+        </w:rPr>
+        <w:lastRenderedPageBreak/>
+        <w:t>Baza danych (czysty tekst SQL):</w:t>
+      </w:r>
+      <w:r>
+        <w:t xml:space="preserve"> Same tabele tekstowe zajmą około 23 MB. Żeby wyszukiwanie historii chorób czy filtrowanie nie </w:t>
+      </w:r>
+      <w:r>
+        <w:t>zawieszało</w:t>
+      </w:r>
+      <w:r>
+        <w:t xml:space="preserve"> strony, dodajemy indeksy, co podniesie wagę bazy do około 46 MB. </w:t>
+      </w:r>
+    </w:p>
+    <w:p>
+      <w:pPr>
+        <w:numPr>
+          <w:ilvl w:val="0"/>
+          <w:numId w:val="63"/>
+        </w:numPr>
+        <w:spacing w:after="160" w:line="259" w:lineRule="auto"/>
+      </w:pPr>
+      <w:r>
+        <w:rPr>
+          <w:b/>
+          <w:bCs/>
+        </w:rPr>
+        <w:t>Pliki cyfrowe (PDF):</w:t>
+      </w:r>
+      <w:r>
+        <w:t xml:space="preserve"> </w:t>
+      </w:r>
+      <w:r>
+        <w:t xml:space="preserve">Rzecz, która głownie zabierze nam </w:t>
+      </w:r>
+      <w:r>
+        <w:t xml:space="preserve">pamięci. System musi fizycznie przechowywać wygenerowane umowy leasingowe dla klientów oraz raporty finansowe dla pana Zbigniewa. Przy wadze około 200 KB na dokument, na same pliki potrzebujemy ok. 6,4 GB. </w:t>
+      </w:r>
+    </w:p>
+    <w:p>
+      <w:pPr>
+        <w:spacing w:after="160" w:line="259" w:lineRule="auto"/>
+        <w:ind w:left="360"/>
+      </w:pPr>
+      <w:r>
+        <w:t xml:space="preserve">Łącznie baza danych, indeksy i pliki PDF po 2 latach stabilnej pracy dla jednego sklepu zajmą około </w:t>
+      </w:r>
+      <w:r>
+        <w:rPr>
+          <w:b/>
+          <w:bCs/>
+        </w:rPr>
+        <w:t>6,5 GB</w:t>
+      </w:r>
+      <w:r>
+        <w:t>.</w:t>
+      </w:r>
+    </w:p>
+    <w:p>
+      <w:pPr>
+        <w:spacing w:after="160" w:line="259" w:lineRule="auto"/>
+      </w:pPr>
+      <w:r>
+        <w:rPr>
+          <w:b/>
+          <w:bCs/>
+        </w:rPr>
+        <w:t>Rekomendacja infrastrukturalna:</w:t>
+      </w:r>
+    </w:p>
+    <w:p>
+      <w:pPr>
+        <w:spacing w:after="160" w:line="259" w:lineRule="auto"/>
+      </w:pPr>
+      <w:r>
+        <w:t>Jako bezpieczną opcję do sprawozdania proponujemy wybór hostingu oferującego minimum 10 GB przestrzeni dyskowej. Taka pojemność w zupełności wystarczy na zaliczenie projektu, pomieści wszystkie umowy w PDF-ach i zapewni bezpieczny zapas pamięci na przyszłość.</w:t>
+      </w:r>
+    </w:p>
+    <w:p>
+      <w:pPr>
+        <w:spacing w:line="240" w:lineRule="auto"/>
+        <w:rPr>
+          <w:rFonts w:eastAsia="Times New Roman"/>
+          <w:b/>
+          <w:bCs/>
+          <w:sz w:val="28"/>
+          <w:szCs w:val="28"/>
+        </w:rPr>
+      </w:pPr>
+    </w:p>
+    <w:p>
+      <w:pPr>
+        <w:spacing w:line="240" w:lineRule="auto"/>
+        <w:rPr>
+          <w:rFonts w:eastAsia="Times New Roman"/>
+          <w:b/>
+          <w:bCs/>
+          <w:color w:val="000000"/>
+          <w:sz w:val="28"/>
+          <w:szCs w:val="28"/>
           <w:lang w:val="pl-PL"/>
         </w:rPr>
       </w:pPr>
@@ -18875,7 +19215,6 @@
           <w:color w:val="000000"/>
           <w:lang w:val="pl-PL"/>
         </w:rPr>
-        <w:lastRenderedPageBreak/>
         <w:t>Frontend</w:t>
       </w:r>
       <w:proofErr w:type="spellEnd"/>
@@ -21899,7 +22238,6 @@
           <w:color w:val="000000"/>
           <w:lang w:val="pl-PL"/>
         </w:rPr>
-        <w:lastRenderedPageBreak/>
         <w:t>Architekt systemu - projektuje strukturę systemu oraz model danych</w:t>
       </w:r>
     </w:p>
@@ -23988,7 +24326,6 @@
                 <w:color w:val="000000"/>
                 <w:lang w:val="pl-PL"/>
               </w:rPr>
-              <w:lastRenderedPageBreak/>
               <w:t>Analiza wymagań i opracowanie dokumentacji</w:t>
             </w:r>
           </w:p>
@@ -24535,6 +24872,7 @@
                 <w:color w:val="000000"/>
                 <w:lang w:val="pl-PL"/>
               </w:rPr>
+              <w:lastRenderedPageBreak/>
               <w:t>Moduł raportowania i analityki</w:t>
             </w:r>
           </w:p>
@@ -26412,6 +26750,155 @@
     </w:lvl>
   </w:abstractNum>
   <w:abstractNum w:abstractNumId="9" w15:restartNumberingAfterBreak="0">
+    <w:nsid w:val="198B156E"/>
+    <w:multiLevelType w:val="multilevel"/>
+    <w:tmpl w:val="9B1AB160"/>
+    <w:lvl w:ilvl="0">
+      <w:start w:val="1"/>
+      <w:numFmt w:val="bullet"/>
+      <w:lvlText w:val=""/>
+      <w:lvlJc w:val="left"/>
+      <w:pPr>
+        <w:tabs>
+          <w:tab w:val="num" w:pos="720"/>
+        </w:tabs>
+        <w:ind w:left="720" w:hanging="360"/>
+      </w:pPr>
+      <w:rPr>
+        <w:rFonts w:ascii="Symbol" w:hAnsi="Symbol" w:hint="default"/>
+        <w:sz w:val="20"/>
+      </w:rPr>
+    </w:lvl>
+    <w:lvl w:ilvl="1" w:tentative="1">
+      <w:start w:val="1"/>
+      <w:numFmt w:val="bullet"/>
+      <w:lvlText w:val="o"/>
+      <w:lvlJc w:val="left"/>
+      <w:pPr>
+        <w:tabs>
+          <w:tab w:val="num" w:pos="1440"/>
+        </w:tabs>
+        <w:ind w:left="1440" w:hanging="360"/>
+      </w:pPr>
+      <w:rPr>
+        <w:rFonts w:ascii="Courier New" w:hAnsi="Courier New" w:hint="default"/>
+        <w:sz w:val="20"/>
+      </w:rPr>
+    </w:lvl>
+    <w:lvl w:ilvl="2" w:tentative="1">
+      <w:start w:val="1"/>
+      <w:numFmt w:val="bullet"/>
+      <w:lvlText w:val=""/>
+      <w:lvlJc w:val="left"/>
+      <w:pPr>
+        <w:tabs>
+          <w:tab w:val="num" w:pos="2160"/>
+        </w:tabs>
+        <w:ind w:left="2160" w:hanging="360"/>
+      </w:pPr>
+      <w:rPr>
+        <w:rFonts w:ascii="Wingdings" w:hAnsi="Wingdings" w:hint="default"/>
+        <w:sz w:val="20"/>
+      </w:rPr>
+    </w:lvl>
+    <w:lvl w:ilvl="3" w:tentative="1">
+      <w:start w:val="1"/>
+      <w:numFmt w:val="bullet"/>
+      <w:lvlText w:val=""/>
+      <w:lvlJc w:val="left"/>
+      <w:pPr>
+        <w:tabs>
+          <w:tab w:val="num" w:pos="2880"/>
+        </w:tabs>
+        <w:ind w:left="2880" w:hanging="360"/>
+      </w:pPr>
+      <w:rPr>
+        <w:rFonts w:ascii="Wingdings" w:hAnsi="Wingdings" w:hint="default"/>
+        <w:sz w:val="20"/>
+      </w:rPr>
+    </w:lvl>
+    <w:lvl w:ilvl="4" w:tentative="1">
+      <w:start w:val="1"/>
+      <w:numFmt w:val="bullet"/>
+      <w:lvlText w:val=""/>
+      <w:lvlJc w:val="left"/>
+      <w:pPr>
+        <w:tabs>
+          <w:tab w:val="num" w:pos="3600"/>
+        </w:tabs>
+        <w:ind w:left="3600" w:hanging="360"/>
+      </w:pPr>
+      <w:rPr>
+        <w:rFonts w:ascii="Wingdings" w:hAnsi="Wingdings" w:hint="default"/>
+        <w:sz w:val="20"/>
+      </w:rPr>
+    </w:lvl>
+    <w:lvl w:ilvl="5" w:tentative="1">
+      <w:start w:val="1"/>
+      <w:numFmt w:val="bullet"/>
+      <w:lvlText w:val=""/>
+      <w:lvlJc w:val="left"/>
+      <w:pPr>
+        <w:tabs>
+          <w:tab w:val="num" w:pos="4320"/>
+        </w:tabs>
+        <w:ind w:left="4320" w:hanging="360"/>
+      </w:pPr>
+      <w:rPr>
+        <w:rFonts w:ascii="Wingdings" w:hAnsi="Wingdings" w:hint="default"/>
+        <w:sz w:val="20"/>
+      </w:rPr>
+    </w:lvl>
+    <w:lvl w:ilvl="6" w:tentative="1">
+      <w:start w:val="1"/>
+      <w:numFmt w:val="bullet"/>
+      <w:lvlText w:val=""/>
+      <w:lvlJc w:val="left"/>
+      <w:pPr>
+        <w:tabs>
+          <w:tab w:val="num" w:pos="5040"/>
+        </w:tabs>
+        <w:ind w:left="5040" w:hanging="360"/>
+      </w:pPr>
+      <w:rPr>
+        <w:rFonts w:ascii="Wingdings" w:hAnsi="Wingdings" w:hint="default"/>
+        <w:sz w:val="20"/>
+      </w:rPr>
+    </w:lvl>
+    <w:lvl w:ilvl="7" w:tentative="1">
+      <w:start w:val="1"/>
+      <w:numFmt w:val="bullet"/>
+      <w:lvlText w:val=""/>
+      <w:lvlJc w:val="left"/>
+      <w:pPr>
+        <w:tabs>
+          <w:tab w:val="num" w:pos="5760"/>
+        </w:tabs>
+        <w:ind w:left="5760" w:hanging="360"/>
+      </w:pPr>
+      <w:rPr>
+        <w:rFonts w:ascii="Wingdings" w:hAnsi="Wingdings" w:hint="default"/>
+        <w:sz w:val="20"/>
+      </w:rPr>
+    </w:lvl>
+    <w:lvl w:ilvl="8" w:tentative="1">
+      <w:start w:val="1"/>
+      <w:numFmt w:val="bullet"/>
+      <w:lvlText w:val=""/>
+      <w:lvlJc w:val="left"/>
+      <w:pPr>
+        <w:tabs>
+          <w:tab w:val="num" w:pos="6480"/>
+        </w:tabs>
+        <w:ind w:left="6480" w:hanging="360"/>
+      </w:pPr>
+      <w:rPr>
+        <w:rFonts w:ascii="Wingdings" w:hAnsi="Wingdings" w:hint="default"/>
+        <w:sz w:val="20"/>
+      </w:rPr>
+    </w:lvl>
+  </w:abstractNum>
+  <w:abstractNum w:abstractNumId="10" w15:restartNumberingAfterBreak="0">
     <w:nsid w:val="1B8C7D7E"/>
     <w:multiLevelType w:val="multilevel"/>
     <w:tmpl w:val="2CB20E0A"/>
@@ -26560,7 +27047,7 @@
       </w:rPr>
     </w:lvl>
   </w:abstractNum>
-  <w:abstractNum w:abstractNumId="10" w15:restartNumberingAfterBreak="0">
+  <w:abstractNum w:abstractNumId="11" w15:restartNumberingAfterBreak="0">
     <w:nsid w:val="1BDC795E"/>
     <w:multiLevelType w:val="multilevel"/>
     <w:tmpl w:val="D87A7138"/>
@@ -26709,7 +27196,7 @@
       </w:rPr>
     </w:lvl>
   </w:abstractNum>
-  <w:abstractNum w:abstractNumId="11" w15:restartNumberingAfterBreak="0">
+  <w:abstractNum w:abstractNumId="12" w15:restartNumberingAfterBreak="0">
     <w:nsid w:val="1C051B26"/>
     <w:multiLevelType w:val="multilevel"/>
     <w:tmpl w:val="634E3E70"/>
@@ -26858,7 +27345,7 @@
       </w:rPr>
     </w:lvl>
   </w:abstractNum>
-  <w:abstractNum w:abstractNumId="12" w15:restartNumberingAfterBreak="0">
+  <w:abstractNum w:abstractNumId="13" w15:restartNumberingAfterBreak="0">
     <w:nsid w:val="1E527A44"/>
     <w:multiLevelType w:val="multilevel"/>
     <w:tmpl w:val="ABD83246"/>
@@ -27007,7 +27494,7 @@
       </w:rPr>
     </w:lvl>
   </w:abstractNum>
-  <w:abstractNum w:abstractNumId="13" w15:restartNumberingAfterBreak="0">
+  <w:abstractNum w:abstractNumId="14" w15:restartNumberingAfterBreak="0">
     <w:nsid w:val="200F2195"/>
     <w:multiLevelType w:val="multilevel"/>
     <w:tmpl w:val="72EE9A20"/>
@@ -27152,7 +27639,7 @@
       </w:rPr>
     </w:lvl>
   </w:abstractNum>
-  <w:abstractNum w:abstractNumId="14" w15:restartNumberingAfterBreak="0">
+  <w:abstractNum w:abstractNumId="15" w15:restartNumberingAfterBreak="0">
     <w:nsid w:val="20F20DCE"/>
     <w:multiLevelType w:val="multilevel"/>
     <w:tmpl w:val="73CCF802"/>
@@ -27301,7 +27788,7 @@
       </w:rPr>
     </w:lvl>
   </w:abstractNum>
-  <w:abstractNum w:abstractNumId="15" w15:restartNumberingAfterBreak="0">
+  <w:abstractNum w:abstractNumId="16" w15:restartNumberingAfterBreak="0">
     <w:nsid w:val="2466232B"/>
     <w:multiLevelType w:val="multilevel"/>
     <w:tmpl w:val="A3081284"/>
@@ -27450,7 +27937,7 @@
       </w:rPr>
     </w:lvl>
   </w:abstractNum>
-  <w:abstractNum w:abstractNumId="16" w15:restartNumberingAfterBreak="0">
+  <w:abstractNum w:abstractNumId="17" w15:restartNumberingAfterBreak="0">
     <w:nsid w:val="276E5999"/>
     <w:multiLevelType w:val="multilevel"/>
     <w:tmpl w:val="FEC2DDF6"/>
@@ -27599,7 +28086,7 @@
       </w:rPr>
     </w:lvl>
   </w:abstractNum>
-  <w:abstractNum w:abstractNumId="17" w15:restartNumberingAfterBreak="0">
+  <w:abstractNum w:abstractNumId="18" w15:restartNumberingAfterBreak="0">
     <w:nsid w:val="280C0961"/>
     <w:multiLevelType w:val="multilevel"/>
     <w:tmpl w:val="17B00F10"/>
@@ -27712,7 +28199,7 @@
       </w:pPr>
     </w:lvl>
   </w:abstractNum>
-  <w:abstractNum w:abstractNumId="18" w15:restartNumberingAfterBreak="0">
+  <w:abstractNum w:abstractNumId="19" w15:restartNumberingAfterBreak="0">
     <w:nsid w:val="287D79F9"/>
     <w:multiLevelType w:val="multilevel"/>
     <w:tmpl w:val="427619BA"/>
@@ -27861,7 +28348,7 @@
       </w:rPr>
     </w:lvl>
   </w:abstractNum>
-  <w:abstractNum w:abstractNumId="19" w15:restartNumberingAfterBreak="0">
+  <w:abstractNum w:abstractNumId="20" w15:restartNumberingAfterBreak="0">
     <w:nsid w:val="2EB76ABD"/>
     <w:multiLevelType w:val="multilevel"/>
     <w:tmpl w:val="546ACF68"/>
@@ -28010,7 +28497,7 @@
       </w:rPr>
     </w:lvl>
   </w:abstractNum>
-  <w:abstractNum w:abstractNumId="20" w15:restartNumberingAfterBreak="0">
+  <w:abstractNum w:abstractNumId="21" w15:restartNumberingAfterBreak="0">
     <w:nsid w:val="30CA6A67"/>
     <w:multiLevelType w:val="multilevel"/>
     <w:tmpl w:val="5E78A4EE"/>
@@ -28159,7 +28646,7 @@
       </w:rPr>
     </w:lvl>
   </w:abstractNum>
-  <w:abstractNum w:abstractNumId="21" w15:restartNumberingAfterBreak="0">
+  <w:abstractNum w:abstractNumId="22" w15:restartNumberingAfterBreak="0">
     <w:nsid w:val="329711FB"/>
     <w:multiLevelType w:val="multilevel"/>
     <w:tmpl w:val="E76807F2"/>
@@ -28272,7 +28759,7 @@
       </w:pPr>
     </w:lvl>
   </w:abstractNum>
-  <w:abstractNum w:abstractNumId="22" w15:restartNumberingAfterBreak="0">
+  <w:abstractNum w:abstractNumId="23" w15:restartNumberingAfterBreak="0">
     <w:nsid w:val="33435D4B"/>
     <w:multiLevelType w:val="multilevel"/>
     <w:tmpl w:val="B9A6B0FE"/>
@@ -28421,7 +28908,7 @@
       </w:rPr>
     </w:lvl>
   </w:abstractNum>
-  <w:abstractNum w:abstractNumId="23" w15:restartNumberingAfterBreak="0">
+  <w:abstractNum w:abstractNumId="24" w15:restartNumberingAfterBreak="0">
     <w:nsid w:val="37AE53EC"/>
     <w:multiLevelType w:val="multilevel"/>
     <w:tmpl w:val="95229CF6"/>
@@ -28570,7 +29057,7 @@
       </w:rPr>
     </w:lvl>
   </w:abstractNum>
-  <w:abstractNum w:abstractNumId="24" w15:restartNumberingAfterBreak="0">
+  <w:abstractNum w:abstractNumId="25" w15:restartNumberingAfterBreak="0">
     <w:nsid w:val="37F854D7"/>
     <w:multiLevelType w:val="multilevel"/>
     <w:tmpl w:val="F30A8C14"/>
@@ -28719,7 +29206,7 @@
       </w:rPr>
     </w:lvl>
   </w:abstractNum>
-  <w:abstractNum w:abstractNumId="25" w15:restartNumberingAfterBreak="0">
+  <w:abstractNum w:abstractNumId="26" w15:restartNumberingAfterBreak="0">
     <w:nsid w:val="380A257C"/>
     <w:multiLevelType w:val="multilevel"/>
     <w:tmpl w:val="A4606374"/>
@@ -28868,7 +29355,7 @@
       </w:rPr>
     </w:lvl>
   </w:abstractNum>
-  <w:abstractNum w:abstractNumId="26" w15:restartNumberingAfterBreak="0">
+  <w:abstractNum w:abstractNumId="27" w15:restartNumberingAfterBreak="0">
     <w:nsid w:val="39E130FE"/>
     <w:multiLevelType w:val="multilevel"/>
     <w:tmpl w:val="99F28842"/>
@@ -28981,7 +29468,7 @@
       </w:pPr>
     </w:lvl>
   </w:abstractNum>
-  <w:abstractNum w:abstractNumId="27" w15:restartNumberingAfterBreak="0">
+  <w:abstractNum w:abstractNumId="28" w15:restartNumberingAfterBreak="0">
     <w:nsid w:val="403E3A8B"/>
     <w:multiLevelType w:val="multilevel"/>
     <w:tmpl w:val="2B8E5ACE"/>
@@ -29130,7 +29617,7 @@
       </w:rPr>
     </w:lvl>
   </w:abstractNum>
-  <w:abstractNum w:abstractNumId="28" w15:restartNumberingAfterBreak="0">
+  <w:abstractNum w:abstractNumId="29" w15:restartNumberingAfterBreak="0">
     <w:nsid w:val="43490DDF"/>
     <w:multiLevelType w:val="multilevel"/>
     <w:tmpl w:val="91BE96B0"/>
@@ -29279,7 +29766,7 @@
       </w:rPr>
     </w:lvl>
   </w:abstractNum>
-  <w:abstractNum w:abstractNumId="29" w15:restartNumberingAfterBreak="0">
+  <w:abstractNum w:abstractNumId="30" w15:restartNumberingAfterBreak="0">
     <w:nsid w:val="44280337"/>
     <w:multiLevelType w:val="multilevel"/>
     <w:tmpl w:val="2D323A4C"/>
@@ -29428,7 +29915,7 @@
       </w:rPr>
     </w:lvl>
   </w:abstractNum>
-  <w:abstractNum w:abstractNumId="30" w15:restartNumberingAfterBreak="0">
+  <w:abstractNum w:abstractNumId="31" w15:restartNumberingAfterBreak="0">
     <w:nsid w:val="49BD2CCB"/>
     <w:multiLevelType w:val="multilevel"/>
     <w:tmpl w:val="36C0C4A0"/>
@@ -29577,7 +30064,7 @@
       </w:rPr>
     </w:lvl>
   </w:abstractNum>
-  <w:abstractNum w:abstractNumId="31" w15:restartNumberingAfterBreak="0">
+  <w:abstractNum w:abstractNumId="32" w15:restartNumberingAfterBreak="0">
     <w:nsid w:val="4A987B69"/>
     <w:multiLevelType w:val="multilevel"/>
     <w:tmpl w:val="699604E4"/>
@@ -29690,7 +30177,7 @@
       </w:pPr>
     </w:lvl>
   </w:abstractNum>
-  <w:abstractNum w:abstractNumId="32" w15:restartNumberingAfterBreak="0">
+  <w:abstractNum w:abstractNumId="33" w15:restartNumberingAfterBreak="0">
     <w:nsid w:val="4D032C06"/>
     <w:multiLevelType w:val="multilevel"/>
     <w:tmpl w:val="52446D64"/>
@@ -29803,7 +30290,7 @@
       </w:pPr>
     </w:lvl>
   </w:abstractNum>
-  <w:abstractNum w:abstractNumId="33" w15:restartNumberingAfterBreak="0">
+  <w:abstractNum w:abstractNumId="34" w15:restartNumberingAfterBreak="0">
     <w:nsid w:val="4F330D6A"/>
     <w:multiLevelType w:val="multilevel"/>
     <w:tmpl w:val="A82E583C"/>
@@ -29952,7 +30439,7 @@
       </w:rPr>
     </w:lvl>
   </w:abstractNum>
-  <w:abstractNum w:abstractNumId="34" w15:restartNumberingAfterBreak="0">
+  <w:abstractNum w:abstractNumId="35" w15:restartNumberingAfterBreak="0">
     <w:nsid w:val="51836275"/>
     <w:multiLevelType w:val="multilevel"/>
     <w:tmpl w:val="FDB83DC8"/>
@@ -30101,7 +30588,7 @@
       </w:rPr>
     </w:lvl>
   </w:abstractNum>
-  <w:abstractNum w:abstractNumId="35" w15:restartNumberingAfterBreak="0">
+  <w:abstractNum w:abstractNumId="36" w15:restartNumberingAfterBreak="0">
     <w:nsid w:val="51AE47C0"/>
     <w:multiLevelType w:val="multilevel"/>
     <w:tmpl w:val="A54E0E9A"/>
@@ -30214,7 +30701,7 @@
       </w:pPr>
     </w:lvl>
   </w:abstractNum>
-  <w:abstractNum w:abstractNumId="36" w15:restartNumberingAfterBreak="0">
+  <w:abstractNum w:abstractNumId="37" w15:restartNumberingAfterBreak="0">
     <w:nsid w:val="52FF45EB"/>
     <w:multiLevelType w:val="multilevel"/>
     <w:tmpl w:val="00FC421C"/>
@@ -30363,7 +30850,7 @@
       </w:rPr>
     </w:lvl>
   </w:abstractNum>
-  <w:abstractNum w:abstractNumId="37" w15:restartNumberingAfterBreak="0">
+  <w:abstractNum w:abstractNumId="38" w15:restartNumberingAfterBreak="0">
     <w:nsid w:val="53231BA3"/>
     <w:multiLevelType w:val="multilevel"/>
     <w:tmpl w:val="F7A8ABC0"/>
@@ -30512,7 +30999,7 @@
       </w:rPr>
     </w:lvl>
   </w:abstractNum>
-  <w:abstractNum w:abstractNumId="38" w15:restartNumberingAfterBreak="0">
+  <w:abstractNum w:abstractNumId="39" w15:restartNumberingAfterBreak="0">
     <w:nsid w:val="53342C6F"/>
     <w:multiLevelType w:val="multilevel"/>
     <w:tmpl w:val="9C7CACD4"/>
@@ -30661,7 +31148,7 @@
       </w:rPr>
     </w:lvl>
   </w:abstractNum>
-  <w:abstractNum w:abstractNumId="39" w15:restartNumberingAfterBreak="0">
+  <w:abstractNum w:abstractNumId="40" w15:restartNumberingAfterBreak="0">
     <w:nsid w:val="53C6298F"/>
     <w:multiLevelType w:val="multilevel"/>
     <w:tmpl w:val="05B420A6"/>
@@ -30810,7 +31297,7 @@
       </w:rPr>
     </w:lvl>
   </w:abstractNum>
-  <w:abstractNum w:abstractNumId="40" w15:restartNumberingAfterBreak="0">
+  <w:abstractNum w:abstractNumId="41" w15:restartNumberingAfterBreak="0">
     <w:nsid w:val="54202591"/>
     <w:multiLevelType w:val="multilevel"/>
     <w:tmpl w:val="B0BEFC38"/>
@@ -30959,7 +31446,7 @@
       </w:rPr>
     </w:lvl>
   </w:abstractNum>
-  <w:abstractNum w:abstractNumId="41" w15:restartNumberingAfterBreak="0">
+  <w:abstractNum w:abstractNumId="42" w15:restartNumberingAfterBreak="0">
     <w:nsid w:val="568572B6"/>
     <w:multiLevelType w:val="multilevel"/>
     <w:tmpl w:val="DFDA65F2"/>
@@ -31108,7 +31595,7 @@
       </w:rPr>
     </w:lvl>
   </w:abstractNum>
-  <w:abstractNum w:abstractNumId="42" w15:restartNumberingAfterBreak="0">
+  <w:abstractNum w:abstractNumId="43" w15:restartNumberingAfterBreak="0">
     <w:nsid w:val="56D904D5"/>
     <w:multiLevelType w:val="multilevel"/>
     <w:tmpl w:val="1FFC75AE"/>
@@ -31257,7 +31744,7 @@
       </w:rPr>
     </w:lvl>
   </w:abstractNum>
-  <w:abstractNum w:abstractNumId="43" w15:restartNumberingAfterBreak="0">
+  <w:abstractNum w:abstractNumId="44" w15:restartNumberingAfterBreak="0">
     <w:nsid w:val="5C5F60B4"/>
     <w:multiLevelType w:val="multilevel"/>
     <w:tmpl w:val="40E89706"/>
@@ -31406,7 +31893,7 @@
       </w:rPr>
     </w:lvl>
   </w:abstractNum>
-  <w:abstractNum w:abstractNumId="44" w15:restartNumberingAfterBreak="0">
+  <w:abstractNum w:abstractNumId="45" w15:restartNumberingAfterBreak="0">
     <w:nsid w:val="5C7F3EA5"/>
     <w:multiLevelType w:val="multilevel"/>
     <w:tmpl w:val="E292C06A"/>
@@ -31519,7 +32006,7 @@
       </w:rPr>
     </w:lvl>
   </w:abstractNum>
-  <w:abstractNum w:abstractNumId="45" w15:restartNumberingAfterBreak="0">
+  <w:abstractNum w:abstractNumId="46" w15:restartNumberingAfterBreak="0">
     <w:nsid w:val="5DC513C1"/>
     <w:multiLevelType w:val="multilevel"/>
     <w:tmpl w:val="F998E6C4"/>
@@ -31668,7 +32155,7 @@
       </w:rPr>
     </w:lvl>
   </w:abstractNum>
-  <w:abstractNum w:abstractNumId="46" w15:restartNumberingAfterBreak="0">
+  <w:abstractNum w:abstractNumId="47" w15:restartNumberingAfterBreak="0">
     <w:nsid w:val="5E576AB2"/>
     <w:multiLevelType w:val="multilevel"/>
     <w:tmpl w:val="E726620C"/>
@@ -31817,7 +32304,7 @@
       </w:rPr>
     </w:lvl>
   </w:abstractNum>
-  <w:abstractNum w:abstractNumId="47" w15:restartNumberingAfterBreak="0">
+  <w:abstractNum w:abstractNumId="48" w15:restartNumberingAfterBreak="0">
     <w:nsid w:val="5E57751C"/>
     <w:multiLevelType w:val="hybridMultilevel"/>
     <w:tmpl w:val="11A6555E"/>
@@ -31930,7 +32417,7 @@
       </w:rPr>
     </w:lvl>
   </w:abstractNum>
-  <w:abstractNum w:abstractNumId="48" w15:restartNumberingAfterBreak="0">
+  <w:abstractNum w:abstractNumId="49" w15:restartNumberingAfterBreak="0">
     <w:nsid w:val="60090E3A"/>
     <w:multiLevelType w:val="multilevel"/>
     <w:tmpl w:val="128613DC"/>
@@ -32079,7 +32566,7 @@
       </w:rPr>
     </w:lvl>
   </w:abstractNum>
-  <w:abstractNum w:abstractNumId="49" w15:restartNumberingAfterBreak="0">
+  <w:abstractNum w:abstractNumId="50" w15:restartNumberingAfterBreak="0">
     <w:nsid w:val="629959B9"/>
     <w:multiLevelType w:val="multilevel"/>
     <w:tmpl w:val="699604E4"/>
@@ -32192,7 +32679,7 @@
       </w:pPr>
     </w:lvl>
   </w:abstractNum>
-  <w:abstractNum w:abstractNumId="50" w15:restartNumberingAfterBreak="0">
+  <w:abstractNum w:abstractNumId="51" w15:restartNumberingAfterBreak="0">
     <w:nsid w:val="6FA72DBC"/>
     <w:multiLevelType w:val="multilevel"/>
     <w:tmpl w:val="7326F9B6"/>
@@ -32341,7 +32828,7 @@
       </w:rPr>
     </w:lvl>
   </w:abstractNum>
-  <w:abstractNum w:abstractNumId="51" w15:restartNumberingAfterBreak="0">
+  <w:abstractNum w:abstractNumId="52" w15:restartNumberingAfterBreak="0">
     <w:nsid w:val="70571A84"/>
     <w:multiLevelType w:val="multilevel"/>
     <w:tmpl w:val="F1D07890"/>
@@ -32490,7 +32977,7 @@
       </w:rPr>
     </w:lvl>
   </w:abstractNum>
-  <w:abstractNum w:abstractNumId="52" w15:restartNumberingAfterBreak="0">
+  <w:abstractNum w:abstractNumId="53" w15:restartNumberingAfterBreak="0">
     <w:nsid w:val="72DD477B"/>
     <w:multiLevelType w:val="multilevel"/>
     <w:tmpl w:val="1C92742C"/>
@@ -32639,7 +33126,7 @@
       </w:rPr>
     </w:lvl>
   </w:abstractNum>
-  <w:abstractNum w:abstractNumId="53" w15:restartNumberingAfterBreak="0">
+  <w:abstractNum w:abstractNumId="54" w15:restartNumberingAfterBreak="0">
     <w:nsid w:val="72DE07B6"/>
     <w:multiLevelType w:val="multilevel"/>
     <w:tmpl w:val="F3A24FD6"/>
@@ -32788,7 +33275,7 @@
       </w:rPr>
     </w:lvl>
   </w:abstractNum>
-  <w:abstractNum w:abstractNumId="54" w15:restartNumberingAfterBreak="0">
+  <w:abstractNum w:abstractNumId="55" w15:restartNumberingAfterBreak="0">
     <w:nsid w:val="73956577"/>
     <w:multiLevelType w:val="multilevel"/>
     <w:tmpl w:val="82DCB43A"/>
@@ -32937,7 +33424,7 @@
       </w:rPr>
     </w:lvl>
   </w:abstractNum>
-  <w:abstractNum w:abstractNumId="55" w15:restartNumberingAfterBreak="0">
+  <w:abstractNum w:abstractNumId="56" w15:restartNumberingAfterBreak="0">
     <w:nsid w:val="73DB72A2"/>
     <w:multiLevelType w:val="multilevel"/>
     <w:tmpl w:val="1B24B312"/>
@@ -33086,7 +33573,7 @@
       </w:rPr>
     </w:lvl>
   </w:abstractNum>
-  <w:abstractNum w:abstractNumId="56" w15:restartNumberingAfterBreak="0">
+  <w:abstractNum w:abstractNumId="57" w15:restartNumberingAfterBreak="0">
     <w:nsid w:val="753F45FB"/>
     <w:multiLevelType w:val="multilevel"/>
     <w:tmpl w:val="C60AF980"/>
@@ -33235,7 +33722,7 @@
       </w:rPr>
     </w:lvl>
   </w:abstractNum>
-  <w:abstractNum w:abstractNumId="57" w15:restartNumberingAfterBreak="0">
+  <w:abstractNum w:abstractNumId="58" w15:restartNumberingAfterBreak="0">
     <w:nsid w:val="775849C8"/>
     <w:multiLevelType w:val="multilevel"/>
     <w:tmpl w:val="608E9DDE"/>
@@ -33384,7 +33871,7 @@
       </w:rPr>
     </w:lvl>
   </w:abstractNum>
-  <w:abstractNum w:abstractNumId="58" w15:restartNumberingAfterBreak="0">
+  <w:abstractNum w:abstractNumId="59" w15:restartNumberingAfterBreak="0">
     <w:nsid w:val="7B0B3AFC"/>
     <w:multiLevelType w:val="multilevel"/>
     <w:tmpl w:val="16D06C28"/>
@@ -33497,7 +33984,7 @@
       </w:pPr>
     </w:lvl>
   </w:abstractNum>
-  <w:abstractNum w:abstractNumId="59" w15:restartNumberingAfterBreak="0">
+  <w:abstractNum w:abstractNumId="60" w15:restartNumberingAfterBreak="0">
     <w:nsid w:val="7F7619E6"/>
     <w:multiLevelType w:val="multilevel"/>
     <w:tmpl w:val="8F2854C8"/>
@@ -33646,7 +34133,7 @@
       </w:rPr>
     </w:lvl>
   </w:abstractNum>
-  <w:abstractNum w:abstractNumId="60" w15:restartNumberingAfterBreak="0">
+  <w:abstractNum w:abstractNumId="61" w15:restartNumberingAfterBreak="0">
     <w:nsid w:val="7F941253"/>
     <w:multiLevelType w:val="multilevel"/>
     <w:tmpl w:val="7BCA9774"/>
@@ -33795,7 +34282,7 @@
       </w:rPr>
     </w:lvl>
   </w:abstractNum>
-  <w:abstractNum w:abstractNumId="61" w15:restartNumberingAfterBreak="0">
+  <w:abstractNum w:abstractNumId="62" w15:restartNumberingAfterBreak="0">
     <w:nsid w:val="7FB7744B"/>
     <w:multiLevelType w:val="multilevel"/>
     <w:tmpl w:val="5E7C15AE"/>
@@ -33909,97 +34396,97 @@
     </w:lvl>
   </w:abstractNum>
   <w:num w:numId="1" w16cid:durableId="993529380">
-    <w:abstractNumId w:val="44"/>
+    <w:abstractNumId w:val="45"/>
   </w:num>
   <w:num w:numId="2" w16cid:durableId="1957254034">
-    <w:abstractNumId w:val="46"/>
+    <w:abstractNumId w:val="47"/>
   </w:num>
   <w:num w:numId="3" w16cid:durableId="734547526">
-    <w:abstractNumId w:val="41"/>
+    <w:abstractNumId w:val="42"/>
   </w:num>
   <w:num w:numId="4" w16cid:durableId="146020699">
-    <w:abstractNumId w:val="12"/>
+    <w:abstractNumId w:val="13"/>
   </w:num>
   <w:num w:numId="5" w16cid:durableId="174611146">
-    <w:abstractNumId w:val="53"/>
+    <w:abstractNumId w:val="54"/>
   </w:num>
   <w:num w:numId="6" w16cid:durableId="1825274068">
-    <w:abstractNumId w:val="29"/>
+    <w:abstractNumId w:val="30"/>
   </w:num>
   <w:num w:numId="7" w16cid:durableId="454258387">
-    <w:abstractNumId w:val="18"/>
+    <w:abstractNumId w:val="19"/>
   </w:num>
   <w:num w:numId="8" w16cid:durableId="677578760">
-    <w:abstractNumId w:val="55"/>
+    <w:abstractNumId w:val="56"/>
   </w:num>
   <w:num w:numId="9" w16cid:durableId="1490436316">
-    <w:abstractNumId w:val="38"/>
+    <w:abstractNumId w:val="39"/>
   </w:num>
   <w:num w:numId="10" w16cid:durableId="1596278286">
     <w:abstractNumId w:val="2"/>
   </w:num>
   <w:num w:numId="11" w16cid:durableId="697394649">
-    <w:abstractNumId w:val="33"/>
+    <w:abstractNumId w:val="34"/>
   </w:num>
   <w:num w:numId="12" w16cid:durableId="1315451412">
-    <w:abstractNumId w:val="58"/>
+    <w:abstractNumId w:val="59"/>
   </w:num>
   <w:num w:numId="13" w16cid:durableId="1206674393">
-    <w:abstractNumId w:val="45"/>
+    <w:abstractNumId w:val="46"/>
   </w:num>
   <w:num w:numId="14" w16cid:durableId="1993563347">
-    <w:abstractNumId w:val="42"/>
+    <w:abstractNumId w:val="43"/>
   </w:num>
   <w:num w:numId="15" w16cid:durableId="1708023114">
-    <w:abstractNumId w:val="39"/>
+    <w:abstractNumId w:val="40"/>
   </w:num>
   <w:num w:numId="16" w16cid:durableId="2000814645">
-    <w:abstractNumId w:val="23"/>
+    <w:abstractNumId w:val="24"/>
   </w:num>
   <w:num w:numId="17" w16cid:durableId="1125781783">
+    <w:abstractNumId w:val="36"/>
+  </w:num>
+  <w:num w:numId="18" w16cid:durableId="483277252">
+    <w:abstractNumId w:val="44"/>
+  </w:num>
+  <w:num w:numId="19" w16cid:durableId="1155998351">
     <w:abstractNumId w:val="35"/>
   </w:num>
-  <w:num w:numId="18" w16cid:durableId="483277252">
-    <w:abstractNumId w:val="43"/>
-  </w:num>
-  <w:num w:numId="19" w16cid:durableId="1155998351">
-    <w:abstractNumId w:val="34"/>
-  </w:num>
   <w:num w:numId="20" w16cid:durableId="893152542">
-    <w:abstractNumId w:val="56"/>
+    <w:abstractNumId w:val="57"/>
   </w:num>
   <w:num w:numId="21" w16cid:durableId="1173758258">
-    <w:abstractNumId w:val="40"/>
+    <w:abstractNumId w:val="41"/>
   </w:num>
   <w:num w:numId="22" w16cid:durableId="226694624">
-    <w:abstractNumId w:val="17"/>
+    <w:abstractNumId w:val="18"/>
   </w:num>
   <w:num w:numId="23" w16cid:durableId="1568296332">
-    <w:abstractNumId w:val="54"/>
+    <w:abstractNumId w:val="55"/>
   </w:num>
   <w:num w:numId="24" w16cid:durableId="917445654">
-    <w:abstractNumId w:val="19"/>
+    <w:abstractNumId w:val="20"/>
   </w:num>
   <w:num w:numId="25" w16cid:durableId="1860779320">
-    <w:abstractNumId w:val="9"/>
+    <w:abstractNumId w:val="10"/>
   </w:num>
   <w:num w:numId="26" w16cid:durableId="1226989757">
-    <w:abstractNumId w:val="36"/>
+    <w:abstractNumId w:val="37"/>
   </w:num>
   <w:num w:numId="27" w16cid:durableId="210922851">
-    <w:abstractNumId w:val="61"/>
+    <w:abstractNumId w:val="62"/>
   </w:num>
   <w:num w:numId="28" w16cid:durableId="268314316">
-    <w:abstractNumId w:val="27"/>
+    <w:abstractNumId w:val="28"/>
   </w:num>
   <w:num w:numId="29" w16cid:durableId="1349060385">
-    <w:abstractNumId w:val="13"/>
+    <w:abstractNumId w:val="14"/>
   </w:num>
   <w:num w:numId="30" w16cid:durableId="826170573">
-    <w:abstractNumId w:val="24"/>
+    <w:abstractNumId w:val="25"/>
   </w:num>
   <w:num w:numId="31" w16cid:durableId="1927034502">
-    <w:abstractNumId w:val="30"/>
+    <w:abstractNumId w:val="31"/>
   </w:num>
   <w:num w:numId="32" w16cid:durableId="1505709090">
     <w:abstractNumId w:val="0"/>
@@ -34008,28 +34495,28 @@
     <w:abstractNumId w:val="3"/>
   </w:num>
   <w:num w:numId="34" w16cid:durableId="1596399909">
-    <w:abstractNumId w:val="57"/>
+    <w:abstractNumId w:val="58"/>
   </w:num>
   <w:num w:numId="35" w16cid:durableId="1632318390">
-    <w:abstractNumId w:val="20"/>
+    <w:abstractNumId w:val="21"/>
   </w:num>
   <w:num w:numId="36" w16cid:durableId="141701253">
     <w:abstractNumId w:val="6"/>
   </w:num>
   <w:num w:numId="37" w16cid:durableId="1211768749">
-    <w:abstractNumId w:val="15"/>
+    <w:abstractNumId w:val="16"/>
   </w:num>
   <w:num w:numId="38" w16cid:durableId="971446756">
-    <w:abstractNumId w:val="50"/>
+    <w:abstractNumId w:val="51"/>
   </w:num>
   <w:num w:numId="39" w16cid:durableId="636761215">
-    <w:abstractNumId w:val="52"/>
+    <w:abstractNumId w:val="53"/>
   </w:num>
   <w:num w:numId="40" w16cid:durableId="1719088955">
-    <w:abstractNumId w:val="25"/>
+    <w:abstractNumId w:val="26"/>
   </w:num>
   <w:num w:numId="41" w16cid:durableId="16083882">
-    <w:abstractNumId w:val="14"/>
+    <w:abstractNumId w:val="15"/>
   </w:num>
   <w:num w:numId="42" w16cid:durableId="207837763">
     <w:abstractNumId w:val="8"/>
@@ -34038,52 +34525,52 @@
     <w:abstractNumId w:val="5"/>
   </w:num>
   <w:num w:numId="44" w16cid:durableId="1911576984">
+    <w:abstractNumId w:val="61"/>
+  </w:num>
+  <w:num w:numId="45" w16cid:durableId="801077412">
+    <w:abstractNumId w:val="49"/>
+  </w:num>
+  <w:num w:numId="46" w16cid:durableId="44184346">
     <w:abstractNumId w:val="60"/>
   </w:num>
-  <w:num w:numId="45" w16cid:durableId="801077412">
-    <w:abstractNumId w:val="48"/>
-  </w:num>
-  <w:num w:numId="46" w16cid:durableId="44184346">
-    <w:abstractNumId w:val="59"/>
-  </w:num>
   <w:num w:numId="47" w16cid:durableId="1469740704">
-    <w:abstractNumId w:val="16"/>
+    <w:abstractNumId w:val="17"/>
   </w:num>
   <w:num w:numId="48" w16cid:durableId="1758600098">
-    <w:abstractNumId w:val="11"/>
+    <w:abstractNumId w:val="12"/>
   </w:num>
   <w:num w:numId="49" w16cid:durableId="937903788">
-    <w:abstractNumId w:val="28"/>
+    <w:abstractNumId w:val="29"/>
   </w:num>
   <w:num w:numId="50" w16cid:durableId="1396855454">
-    <w:abstractNumId w:val="51"/>
+    <w:abstractNumId w:val="52"/>
   </w:num>
   <w:num w:numId="51" w16cid:durableId="1186484752">
+    <w:abstractNumId w:val="23"/>
+  </w:num>
+  <w:num w:numId="52" w16cid:durableId="1805393135">
+    <w:abstractNumId w:val="27"/>
+  </w:num>
+  <w:num w:numId="53" w16cid:durableId="574703136">
     <w:abstractNumId w:val="22"/>
   </w:num>
-  <w:num w:numId="52" w16cid:durableId="1805393135">
-    <w:abstractNumId w:val="26"/>
-  </w:num>
-  <w:num w:numId="53" w16cid:durableId="574703136">
-    <w:abstractNumId w:val="21"/>
-  </w:num>
   <w:num w:numId="54" w16cid:durableId="1802726209">
-    <w:abstractNumId w:val="31"/>
+    <w:abstractNumId w:val="32"/>
   </w:num>
   <w:num w:numId="55" w16cid:durableId="1318847828">
-    <w:abstractNumId w:val="49"/>
+    <w:abstractNumId w:val="50"/>
   </w:num>
   <w:num w:numId="56" w16cid:durableId="468671156">
-    <w:abstractNumId w:val="32"/>
+    <w:abstractNumId w:val="33"/>
   </w:num>
   <w:num w:numId="57" w16cid:durableId="2051147794">
-    <w:abstractNumId w:val="10"/>
+    <w:abstractNumId w:val="11"/>
   </w:num>
   <w:num w:numId="58" w16cid:durableId="389965855">
     <w:abstractNumId w:val="1"/>
   </w:num>
   <w:num w:numId="59" w16cid:durableId="1639342352">
-    <w:abstractNumId w:val="47"/>
+    <w:abstractNumId w:val="48"/>
   </w:num>
   <w:num w:numId="60" w16cid:durableId="869954194">
     <w:abstractNumId w:val="4"/>
@@ -34092,7 +34579,10 @@
     <w:abstractNumId w:val="7"/>
   </w:num>
   <w:num w:numId="62" w16cid:durableId="698821672">
-    <w:abstractNumId w:val="37"/>
+    <w:abstractNumId w:val="38"/>
+  </w:num>
+  <w:num w:numId="63" w16cid:durableId="1686399775">
+    <w:abstractNumId w:val="9"/>
   </w:num>
   <w:numIdMacAtCleanup w:val="51"/>
 </w:numbering>

</xml_diff>

<commit_message>
Dodanie podpunktu 6.2 - Propozycja wymaganych czasów odpowiedzi
</commit_message>
<xml_diff>
--- a/TK/TK.docx
+++ b/TK/TK.docx
@@ -18932,58 +18932,172 @@
           <w:szCs w:val="28"/>
         </w:rPr>
       </w:pPr>
-    </w:p>
-    <w:p>
-      <w:pPr>
-        <w:spacing w:line="240" w:lineRule="auto"/>
-        <w:rPr>
-          <w:rFonts w:eastAsia="Times New Roman"/>
-          <w:b/>
-          <w:bCs/>
-          <w:color w:val="000000"/>
+      <w:r>
+        <w:rPr>
+          <w:rFonts w:eastAsia="Times New Roman"/>
+          <w:b/>
+          <w:bCs/>
           <w:sz w:val="28"/>
           <w:szCs w:val="28"/>
-          <w:lang w:val="pl-PL"/>
-        </w:rPr>
-      </w:pPr>
-    </w:p>
-    <w:p>
-      <w:pPr>
-        <w:spacing w:line="240" w:lineRule="auto"/>
-        <w:rPr>
-          <w:rFonts w:eastAsia="Times New Roman"/>
-          <w:b/>
-          <w:bCs/>
-          <w:color w:val="000000"/>
+        </w:rPr>
+        <w:t>6.2.</w:t>
+      </w:r>
+      <w:r>
+        <w:rPr>
+          <w:color w:val="000000"/>
+          <w:sz w:val="20"/>
+          <w:szCs w:val="20"/>
+        </w:rPr>
+        <w:t xml:space="preserve"> </w:t>
+      </w:r>
+      <w:r>
+        <w:rPr>
+          <w:rFonts w:eastAsia="Times New Roman"/>
+          <w:b/>
+          <w:bCs/>
           <w:sz w:val="28"/>
           <w:szCs w:val="28"/>
         </w:rPr>
-      </w:pPr>
-      <w:r>
-        <w:rPr>
-          <w:rFonts w:eastAsia="Times New Roman"/>
-          <w:b/>
-          <w:bCs/>
-          <w:color w:val="000000"/>
+        <w:t>Propozycja wymaganych czasów odpowiedzi</w:t>
+      </w:r>
+    </w:p>
+    <w:p>
+      <w:pPr>
+        <w:spacing w:line="240" w:lineRule="auto"/>
+        <w:rPr>
+          <w:rFonts w:eastAsia="Times New Roman"/>
+          <w:b/>
+          <w:bCs/>
           <w:sz w:val="28"/>
           <w:szCs w:val="28"/>
-          <w:lang w:val="pl-PL"/>
-        </w:rPr>
-        <w:t>7</w:t>
-      </w:r>
-      <w:r>
-        <w:rPr>
-          <w:rFonts w:eastAsia="Times New Roman"/>
-          <w:b/>
-          <w:bCs/>
-          <w:color w:val="000000"/>
+        </w:rPr>
+      </w:pPr>
+    </w:p>
+    <w:p>
+      <w:r>
+        <w:t xml:space="preserve">Żeby system działał płynnie i nie denerwował użytkowników, aplikacja musi spełniać </w:t>
+      </w:r>
+      <w:r>
+        <w:t>działać sprawnie</w:t>
+      </w:r>
+      <w:r>
+        <w:t>. Poniżej przedstawiono propozycje maksymalnych czasów reakcji dla kluczowych operacji:</w:t>
+      </w:r>
+    </w:p>
+    <w:p/>
+    <w:p>
+      <w:pPr>
+        <w:pStyle w:val="Akapitzlist"/>
+        <w:numPr>
+          <w:ilvl w:val="0"/>
+          <w:numId w:val="64"/>
+        </w:numPr>
+      </w:pPr>
+      <w:r>
+        <w:rPr>
+          <w:b/>
+          <w:bCs/>
+        </w:rPr>
+        <w:t>Operacje krytyczne (Zapis/Edycja):</w:t>
+      </w:r>
+      <w:r>
+        <w:t xml:space="preserve"> Akcje takie jak złożenie wniosku o leasing , rejestracja nowego konta czy anulowanie rezerwacji muszą wykonywać się natychmiastowo. Maksymalny czas odpowiedzi serwera to poniżej 2 sekund, żeby użytkownik od razu widział zmianę statusu na ekranie.</w:t>
+      </w:r>
+    </w:p>
+    <w:p/>
+    <w:p>
+      <w:pPr>
+        <w:pStyle w:val="Akapitzlist"/>
+        <w:numPr>
+          <w:ilvl w:val="0"/>
+          <w:numId w:val="64"/>
+        </w:numPr>
+      </w:pPr>
+      <w:r>
+        <w:rPr>
+          <w:b/>
+          <w:bCs/>
+        </w:rPr>
+        <w:t>Odczyt danych i filtrowanie:</w:t>
+      </w:r>
+      <w:r>
+        <w:t xml:space="preserve"> Przeglądanie listy chomików, filtrowanie ich po cechach oraz sprawdzanie historii chorób przez klienta lub weterynarza powinno ładować się bez zacięć. Dzięki indeksom w bazie danych, czas ten ma wynosić poniżej 1,5 sekundy.</w:t>
+      </w:r>
+    </w:p>
+    <w:p>
+      <w:pPr>
+        <w:rPr>
+          <w:b/>
+          <w:bCs/>
+        </w:rPr>
+      </w:pPr>
+    </w:p>
+    <w:p>
+      <w:pPr>
+        <w:pStyle w:val="Akapitzlist"/>
+        <w:numPr>
+          <w:ilvl w:val="0"/>
+          <w:numId w:val="64"/>
+        </w:numPr>
+      </w:pPr>
+      <w:r>
+        <w:rPr>
+          <w:b/>
+          <w:bCs/>
+        </w:rPr>
+        <w:t>Generowanie dokumentów i raportów:</w:t>
+      </w:r>
+      <w:r>
+        <w:t xml:space="preserve"> </w:t>
+      </w:r>
+      <w:r>
+        <w:t>Generowanie</w:t>
+      </w:r>
+      <w:r>
+        <w:t xml:space="preserve"> umowy leasingowej w PDF oraz przeliczanie statystyk finansowych przez analityka to operacje najbardziej wymagające procesowo. Czas ten powinien wynosić poniżej 5 sekund.</w:t>
+      </w:r>
+    </w:p>
+    <w:p/>
+    <w:p>
+      <w:pPr>
+        <w:pStyle w:val="Akapitzlist"/>
+        <w:numPr>
+          <w:ilvl w:val="0"/>
+          <w:numId w:val="64"/>
+        </w:numPr>
+      </w:pPr>
+      <w:r>
+        <w:rPr>
+          <w:b/>
+          <w:bCs/>
+        </w:rPr>
+        <w:t>Nawigacja:</w:t>
+      </w:r>
+      <w:r>
+        <w:t xml:space="preserve"> Zwykłe klikanie po menu, logowanie do panelu czy odświeżenie przez weterynarza dziennego grafiku karmienia i sprzątania klatek powinno dziać się </w:t>
+      </w:r>
+      <w:r>
+        <w:t>bardzo szybko</w:t>
+      </w:r>
+      <w:r>
+        <w:t>. Oczekiwany czas reakcji systemu to poniżej 1 sekundy.</w:t>
+      </w:r>
+    </w:p>
+    <w:p>
+      <w:pPr>
+        <w:spacing w:line="240" w:lineRule="auto"/>
+        <w:rPr>
+          <w:rFonts w:eastAsia="Times New Roman"/>
+          <w:b/>
+          <w:bCs/>
           <w:sz w:val="28"/>
           <w:szCs w:val="28"/>
-          <w:lang w:val="pl-PL"/>
-        </w:rPr>
-        <w:t xml:space="preserve">. </w:t>
-      </w:r>
-      <w:r>
+        </w:rPr>
+      </w:pPr>
+    </w:p>
+    <w:p>
+      <w:pPr>
+        <w:spacing w:line="240" w:lineRule="auto"/>
         <w:rPr>
           <w:rFonts w:eastAsia="Times New Roman"/>
           <w:b/>
@@ -18991,6 +19105,54 @@
           <w:color w:val="000000"/>
           <w:sz w:val="28"/>
           <w:szCs w:val="28"/>
+          <w:lang w:val="pl-PL"/>
+        </w:rPr>
+      </w:pPr>
+    </w:p>
+    <w:p>
+      <w:pPr>
+        <w:spacing w:line="240" w:lineRule="auto"/>
+        <w:rPr>
+          <w:rFonts w:eastAsia="Times New Roman"/>
+          <w:b/>
+          <w:bCs/>
+          <w:color w:val="000000"/>
+          <w:sz w:val="28"/>
+          <w:szCs w:val="28"/>
+        </w:rPr>
+      </w:pPr>
+      <w:r>
+        <w:rPr>
+          <w:rFonts w:eastAsia="Times New Roman"/>
+          <w:b/>
+          <w:bCs/>
+          <w:color w:val="000000"/>
+          <w:sz w:val="28"/>
+          <w:szCs w:val="28"/>
+          <w:lang w:val="pl-PL"/>
+        </w:rPr>
+        <w:t>7</w:t>
+      </w:r>
+      <w:r>
+        <w:rPr>
+          <w:rFonts w:eastAsia="Times New Roman"/>
+          <w:b/>
+          <w:bCs/>
+          <w:color w:val="000000"/>
+          <w:sz w:val="28"/>
+          <w:szCs w:val="28"/>
+          <w:lang w:val="pl-PL"/>
+        </w:rPr>
+        <w:t xml:space="preserve">. </w:t>
+      </w:r>
+      <w:r>
+        <w:rPr>
+          <w:rFonts w:eastAsia="Times New Roman"/>
+          <w:b/>
+          <w:bCs/>
+          <w:color w:val="000000"/>
+          <w:sz w:val="28"/>
+          <w:szCs w:val="28"/>
         </w:rPr>
         <w:t>Propozycja technologii informatycznych, które mogą zostać wykorzystane do realizacji systemu (sprzęt, oprogramowanie) - diagram wdrożenia</w:t>
       </w:r>
@@ -19080,6 +19242,7 @@
           <w:szCs w:val="24"/>
           <w:lang w:val="pl-PL"/>
         </w:rPr>
+        <w:lastRenderedPageBreak/>
         <w:drawing>
           <wp:inline distT="0" distB="0" distL="0" distR="0" wp14:anchorId="52BD2AAB" wp14:editId="2F284C12">
             <wp:extent cx="6843395" cy="3315335"/>
@@ -21321,6 +21484,7 @@
                 <w:color w:val="000000"/>
                 <w:lang w:val="pl-PL"/>
               </w:rPr>
+              <w:lastRenderedPageBreak/>
               <w:t>8</w:t>
             </w:r>
           </w:p>
@@ -23192,7 +23356,16 @@
                 <w:color w:val="000000"/>
                 <w:lang w:val="pl-PL"/>
               </w:rPr>
-              <w:t>Nieprawidłowe przypisanie pracownika do harmonogramu karmienia lub sprzątania</w:t>
+              <w:t xml:space="preserve">Nieprawidłowe przypisanie pracownika do harmonogramu </w:t>
+            </w:r>
+            <w:r>
+              <w:rPr>
+                <w:rFonts w:eastAsia="Times New Roman"/>
+                <w:color w:val="000000"/>
+                <w:lang w:val="pl-PL"/>
+              </w:rPr>
+              <w:lastRenderedPageBreak/>
+              <w:t>karmienia lub sprzątania</w:t>
             </w:r>
           </w:p>
         </w:tc>
@@ -23230,6 +23403,7 @@
                 <w:color w:val="000000"/>
                 <w:lang w:val="pl-PL"/>
               </w:rPr>
+              <w:lastRenderedPageBreak/>
               <w:t>Średnie</w:t>
             </w:r>
           </w:p>
@@ -24872,7 +25046,6 @@
                 <w:color w:val="000000"/>
                 <w:lang w:val="pl-PL"/>
               </w:rPr>
-              <w:lastRenderedPageBreak/>
               <w:t>Moduł raportowania i analityki</w:t>
             </w:r>
           </w:p>
@@ -25489,7 +25662,16 @@
           <w:color w:val="000000"/>
           <w:lang w:val="pl-PL"/>
         </w:rPr>
-        <w:t>Odbiór systemu następuje po zakończeniu testów akceptacyjnych oraz potwierdzeniu poprawnego działania wszystkich funkcjonalności opisanych w specyfikacji projektu. W szczególności sprawdzana jest poprawność procesu rejestracji i logowania, poprawność obsługi procesu leasingu chomika, poprawność działania modułu weterynaryjnego, poprawność generowania raportów, poprawność działania mechanizmów bezpieczeństwa. Warunkiem odbioru jest brak błędów krytycznych uniemożliwiających korzystanie z systemu.  </w:t>
+        <w:t xml:space="preserve">Odbiór systemu następuje po zakończeniu testów akceptacyjnych oraz potwierdzeniu poprawnego działania wszystkich funkcjonalności opisanych w specyfikacji projektu. W szczególności sprawdzana jest poprawność </w:t>
+      </w:r>
+      <w:r>
+        <w:rPr>
+          <w:rFonts w:eastAsia="Times New Roman"/>
+          <w:color w:val="000000"/>
+          <w:lang w:val="pl-PL"/>
+        </w:rPr>
+        <w:lastRenderedPageBreak/>
+        <w:t>procesu rejestracji i logowania, poprawność obsługi procesu leasingu chomika, poprawność działania modułu weterynaryjnego, poprawność generowania raportów, poprawność działania mechanizmów bezpieczeństwa. Warunkiem odbioru jest brak błędów krytycznych uniemożliwiających korzystanie z systemu.  </w:t>
       </w:r>
     </w:p>
     <w:sectPr>
@@ -33985,6 +34167,119 @@
     </w:lvl>
   </w:abstractNum>
   <w:abstractNum w:abstractNumId="60" w15:restartNumberingAfterBreak="0">
+    <w:nsid w:val="7BE83EC8"/>
+    <w:multiLevelType w:val="hybridMultilevel"/>
+    <w:tmpl w:val="80C80CEC"/>
+    <w:lvl w:ilvl="0" w:tplc="04150001">
+      <w:start w:val="1"/>
+      <w:numFmt w:val="bullet"/>
+      <w:lvlText w:val=""/>
+      <w:lvlJc w:val="left"/>
+      <w:pPr>
+        <w:ind w:left="720" w:hanging="360"/>
+      </w:pPr>
+      <w:rPr>
+        <w:rFonts w:ascii="Symbol" w:hAnsi="Symbol" w:hint="default"/>
+      </w:rPr>
+    </w:lvl>
+    <w:lvl w:ilvl="1" w:tplc="04150003" w:tentative="1">
+      <w:start w:val="1"/>
+      <w:numFmt w:val="bullet"/>
+      <w:lvlText w:val="o"/>
+      <w:lvlJc w:val="left"/>
+      <w:pPr>
+        <w:ind w:left="1440" w:hanging="360"/>
+      </w:pPr>
+      <w:rPr>
+        <w:rFonts w:ascii="Courier New" w:hAnsi="Courier New" w:cs="Courier New" w:hint="default"/>
+      </w:rPr>
+    </w:lvl>
+    <w:lvl w:ilvl="2" w:tplc="04150005" w:tentative="1">
+      <w:start w:val="1"/>
+      <w:numFmt w:val="bullet"/>
+      <w:lvlText w:val=""/>
+      <w:lvlJc w:val="left"/>
+      <w:pPr>
+        <w:ind w:left="2160" w:hanging="360"/>
+      </w:pPr>
+      <w:rPr>
+        <w:rFonts w:ascii="Wingdings" w:hAnsi="Wingdings" w:hint="default"/>
+      </w:rPr>
+    </w:lvl>
+    <w:lvl w:ilvl="3" w:tplc="04150001" w:tentative="1">
+      <w:start w:val="1"/>
+      <w:numFmt w:val="bullet"/>
+      <w:lvlText w:val=""/>
+      <w:lvlJc w:val="left"/>
+      <w:pPr>
+        <w:ind w:left="2880" w:hanging="360"/>
+      </w:pPr>
+      <w:rPr>
+        <w:rFonts w:ascii="Symbol" w:hAnsi="Symbol" w:hint="default"/>
+      </w:rPr>
+    </w:lvl>
+    <w:lvl w:ilvl="4" w:tplc="04150003" w:tentative="1">
+      <w:start w:val="1"/>
+      <w:numFmt w:val="bullet"/>
+      <w:lvlText w:val="o"/>
+      <w:lvlJc w:val="left"/>
+      <w:pPr>
+        <w:ind w:left="3600" w:hanging="360"/>
+      </w:pPr>
+      <w:rPr>
+        <w:rFonts w:ascii="Courier New" w:hAnsi="Courier New" w:cs="Courier New" w:hint="default"/>
+      </w:rPr>
+    </w:lvl>
+    <w:lvl w:ilvl="5" w:tplc="04150005" w:tentative="1">
+      <w:start w:val="1"/>
+      <w:numFmt w:val="bullet"/>
+      <w:lvlText w:val=""/>
+      <w:lvlJc w:val="left"/>
+      <w:pPr>
+        <w:ind w:left="4320" w:hanging="360"/>
+      </w:pPr>
+      <w:rPr>
+        <w:rFonts w:ascii="Wingdings" w:hAnsi="Wingdings" w:hint="default"/>
+      </w:rPr>
+    </w:lvl>
+    <w:lvl w:ilvl="6" w:tplc="04150001" w:tentative="1">
+      <w:start w:val="1"/>
+      <w:numFmt w:val="bullet"/>
+      <w:lvlText w:val=""/>
+      <w:lvlJc w:val="left"/>
+      <w:pPr>
+        <w:ind w:left="5040" w:hanging="360"/>
+      </w:pPr>
+      <w:rPr>
+        <w:rFonts w:ascii="Symbol" w:hAnsi="Symbol" w:hint="default"/>
+      </w:rPr>
+    </w:lvl>
+    <w:lvl w:ilvl="7" w:tplc="04150003" w:tentative="1">
+      <w:start w:val="1"/>
+      <w:numFmt w:val="bullet"/>
+      <w:lvlText w:val="o"/>
+      <w:lvlJc w:val="left"/>
+      <w:pPr>
+        <w:ind w:left="5760" w:hanging="360"/>
+      </w:pPr>
+      <w:rPr>
+        <w:rFonts w:ascii="Courier New" w:hAnsi="Courier New" w:cs="Courier New" w:hint="default"/>
+      </w:rPr>
+    </w:lvl>
+    <w:lvl w:ilvl="8" w:tplc="04150005" w:tentative="1">
+      <w:start w:val="1"/>
+      <w:numFmt w:val="bullet"/>
+      <w:lvlText w:val=""/>
+      <w:lvlJc w:val="left"/>
+      <w:pPr>
+        <w:ind w:left="6480" w:hanging="360"/>
+      </w:pPr>
+      <w:rPr>
+        <w:rFonts w:ascii="Wingdings" w:hAnsi="Wingdings" w:hint="default"/>
+      </w:rPr>
+    </w:lvl>
+  </w:abstractNum>
+  <w:abstractNum w:abstractNumId="61" w15:restartNumberingAfterBreak="0">
     <w:nsid w:val="7F7619E6"/>
     <w:multiLevelType w:val="multilevel"/>
     <w:tmpl w:val="8F2854C8"/>
@@ -34133,7 +34428,7 @@
       </w:rPr>
     </w:lvl>
   </w:abstractNum>
-  <w:abstractNum w:abstractNumId="61" w15:restartNumberingAfterBreak="0">
+  <w:abstractNum w:abstractNumId="62" w15:restartNumberingAfterBreak="0">
     <w:nsid w:val="7F941253"/>
     <w:multiLevelType w:val="multilevel"/>
     <w:tmpl w:val="7BCA9774"/>
@@ -34282,7 +34577,7 @@
       </w:rPr>
     </w:lvl>
   </w:abstractNum>
-  <w:abstractNum w:abstractNumId="62" w15:restartNumberingAfterBreak="0">
+  <w:abstractNum w:abstractNumId="63" w15:restartNumberingAfterBreak="0">
     <w:nsid w:val="7FB7744B"/>
     <w:multiLevelType w:val="multilevel"/>
     <w:tmpl w:val="5E7C15AE"/>
@@ -34474,7 +34769,7 @@
     <w:abstractNumId w:val="37"/>
   </w:num>
   <w:num w:numId="27" w16cid:durableId="210922851">
-    <w:abstractNumId w:val="62"/>
+    <w:abstractNumId w:val="63"/>
   </w:num>
   <w:num w:numId="28" w16cid:durableId="268314316">
     <w:abstractNumId w:val="28"/>
@@ -34525,13 +34820,13 @@
     <w:abstractNumId w:val="5"/>
   </w:num>
   <w:num w:numId="44" w16cid:durableId="1911576984">
-    <w:abstractNumId w:val="61"/>
+    <w:abstractNumId w:val="62"/>
   </w:num>
   <w:num w:numId="45" w16cid:durableId="801077412">
     <w:abstractNumId w:val="49"/>
   </w:num>
   <w:num w:numId="46" w16cid:durableId="44184346">
-    <w:abstractNumId w:val="60"/>
+    <w:abstractNumId w:val="61"/>
   </w:num>
   <w:num w:numId="47" w16cid:durableId="1469740704">
     <w:abstractNumId w:val="17"/>
@@ -34583,6 +34878,9 @@
   </w:num>
   <w:num w:numId="63" w16cid:durableId="1686399775">
     <w:abstractNumId w:val="9"/>
+  </w:num>
+  <w:num w:numId="64" w16cid:durableId="1498350678">
+    <w:abstractNumId w:val="60"/>
   </w:num>
   <w:numIdMacAtCleanup w:val="51"/>
 </w:numbering>

</xml_diff>

<commit_message>
Dodanie podpunktu 6.3 - Oszacowanie liczby i typów potrzebnych stanowisk pracy
</commit_message>
<xml_diff>
--- a/TK/TK.docx
+++ b/TK/TK.docx
@@ -19094,58 +19094,170 @@
           <w:szCs w:val="28"/>
         </w:rPr>
       </w:pPr>
-    </w:p>
-    <w:p>
-      <w:pPr>
-        <w:spacing w:line="240" w:lineRule="auto"/>
-        <w:rPr>
-          <w:rFonts w:eastAsia="Times New Roman"/>
-          <w:b/>
-          <w:bCs/>
-          <w:color w:val="000000"/>
+      <w:r>
+        <w:rPr>
+          <w:rFonts w:eastAsia="Times New Roman"/>
+          <w:b/>
+          <w:bCs/>
           <w:sz w:val="28"/>
           <w:szCs w:val="28"/>
-          <w:lang w:val="pl-PL"/>
-        </w:rPr>
-      </w:pPr>
-    </w:p>
-    <w:p>
-      <w:pPr>
-        <w:spacing w:line="240" w:lineRule="auto"/>
-        <w:rPr>
-          <w:rFonts w:eastAsia="Times New Roman"/>
-          <w:b/>
-          <w:bCs/>
-          <w:color w:val="000000"/>
+        </w:rPr>
+        <w:t xml:space="preserve">6.3. </w:t>
+      </w:r>
+      <w:r>
+        <w:rPr>
+          <w:rFonts w:eastAsia="Times New Roman"/>
+          <w:b/>
+          <w:bCs/>
           <w:sz w:val="28"/>
           <w:szCs w:val="28"/>
         </w:rPr>
-      </w:pPr>
-      <w:r>
-        <w:rPr>
-          <w:rFonts w:eastAsia="Times New Roman"/>
-          <w:b/>
-          <w:bCs/>
-          <w:color w:val="000000"/>
+        <w:t>Oszacowanie liczby i typów potrzebnych stanowisk pracy</w:t>
+      </w:r>
+    </w:p>
+    <w:p>
+      <w:pPr>
+        <w:spacing w:line="240" w:lineRule="auto"/>
+        <w:rPr>
+          <w:rFonts w:eastAsia="Times New Roman"/>
+          <w:b/>
+          <w:bCs/>
           <w:sz w:val="28"/>
           <w:szCs w:val="28"/>
-          <w:lang w:val="pl-PL"/>
-        </w:rPr>
-        <w:t>7</w:t>
-      </w:r>
-      <w:r>
-        <w:rPr>
-          <w:rFonts w:eastAsia="Times New Roman"/>
-          <w:b/>
-          <w:bCs/>
-          <w:color w:val="000000"/>
+        </w:rPr>
+      </w:pPr>
+    </w:p>
+    <w:p>
+      <w:r>
+        <w:t>Praca z aplikacją będzie wyglądać zupełnie inaczej dla osób zajmujących się obsługą, a inaczej dla klientów systemu. Z tego powodu rodzaj stanowiska komputerowego oraz typ używanego sprzętu zależą bezpośrednio od pełnionej w menażerii funkcji:</w:t>
+      </w:r>
+    </w:p>
+    <w:p/>
+    <w:p>
+      <w:pPr>
+        <w:pStyle w:val="Akapitzlist"/>
+        <w:numPr>
+          <w:ilvl w:val="0"/>
+          <w:numId w:val="65"/>
+        </w:numPr>
+      </w:pPr>
+      <w:r>
+        <w:rPr>
+          <w:b/>
+          <w:bCs/>
+        </w:rPr>
+        <w:t>Stanowisko Pracownika:</w:t>
+      </w:r>
+      <w:r>
+        <w:t xml:space="preserve"> Przeznaczone do szybkiego od</w:t>
+      </w:r>
+      <w:r>
+        <w:t>znaczania</w:t>
+      </w:r>
+      <w:r>
+        <w:t xml:space="preserve"> wykonanego karmienia i sprzątania bezpośrednio przy zwierzętach. Wystarczy podstawowy, tani tablet lub smartfon z dostępem do lokalnej sieci Wi-Fi w menażerii, żeby pracownik mógł na bieżąco aktualizować statusy zadań w biegu.</w:t>
+      </w:r>
+    </w:p>
+    <w:p/>
+    <w:p>
+      <w:pPr>
+        <w:pStyle w:val="Akapitzlist"/>
+        <w:numPr>
+          <w:ilvl w:val="0"/>
+          <w:numId w:val="65"/>
+        </w:numPr>
+      </w:pPr>
+      <w:r>
+        <w:rPr>
+          <w:b/>
+          <w:bCs/>
+        </w:rPr>
+        <w:t>Stanowisko Weterynarza:</w:t>
+      </w:r>
+      <w:r>
+        <w:t xml:space="preserve"> To główne miejsce zarządzania zdrowiem i planowaniem grafików. Wymaga standardowego komputera stacjonarnego PC lub laptopa w gabinecie weterynaryjnym. Przydatna jest konfiguracja z dużym monitorem, gdzie na jednym ekranie weterynarz układa harmonogramy, a w osobnym oknie ma otwartą szczegółową historię chorób i protokoły leczenia chomików.</w:t>
+      </w:r>
+    </w:p>
+    <w:p/>
+    <w:p>
+      <w:pPr>
+        <w:pStyle w:val="Akapitzlist"/>
+        <w:numPr>
+          <w:ilvl w:val="0"/>
+          <w:numId w:val="65"/>
+        </w:numPr>
+      </w:pPr>
+      <w:r>
+        <w:rPr>
+          <w:b/>
+          <w:bCs/>
+        </w:rPr>
+        <w:lastRenderedPageBreak/>
+        <w:t>Urządzenia mobilne (Klient):</w:t>
+      </w:r>
+      <w:r>
+        <w:t xml:space="preserve"> Zakładamy podejście gdzie klient korzysta w pełni z własnego sprzętu </w:t>
+      </w:r>
+      <w:r>
+        <w:t xml:space="preserve">(np. </w:t>
+      </w:r>
+      <w:r>
+        <w:t>tablet, domowy komputer). Do przeglądania chomików i składania wniosków leasingowych online wystarczy im dowoln</w:t>
+      </w:r>
+      <w:r>
+        <w:t xml:space="preserve">e urządzenie </w:t>
+      </w:r>
+      <w:r>
+        <w:t>z dostępem do Internetu, na którym otworzą stronę w przeglądarce.</w:t>
+      </w:r>
+    </w:p>
+    <w:p/>
+    <w:p>
+      <w:pPr>
+        <w:pStyle w:val="Akapitzlist"/>
+        <w:numPr>
+          <w:ilvl w:val="0"/>
+          <w:numId w:val="65"/>
+        </w:numPr>
+      </w:pPr>
+      <w:r>
+        <w:rPr>
+          <w:b/>
+          <w:bCs/>
+        </w:rPr>
+        <w:t>Stanowisko Właściciela i Analityka (Pan Zbigniew / Pracownik Analityczny):</w:t>
+      </w:r>
+      <w:r>
+        <w:t xml:space="preserve"> Do analizy statystyk, generowania raportów finansowych oraz sprawdzania historii wystaw. Tutaj w zupełności wystarczy zwykły biurowy laptop lub komputer osobisty z nowoczesną przeglądarką internetową</w:t>
+      </w:r>
+      <w:r>
+        <w:t xml:space="preserve"> w ilości dwóch sztuk</w:t>
+      </w:r>
+      <w:r>
+        <w:t xml:space="preserve">, która bez problemu udźwignie </w:t>
+      </w:r>
+      <w:r>
+        <w:t>generowanie</w:t>
+      </w:r>
+      <w:r>
+        <w:t xml:space="preserve"> wykresów i tabel zestawieniowych.</w:t>
+      </w:r>
+    </w:p>
+    <w:p>
+      <w:pPr>
+        <w:spacing w:line="240" w:lineRule="auto"/>
+        <w:rPr>
+          <w:rFonts w:eastAsia="Times New Roman"/>
+          <w:b/>
+          <w:bCs/>
           <w:sz w:val="28"/>
           <w:szCs w:val="28"/>
-          <w:lang w:val="pl-PL"/>
-        </w:rPr>
-        <w:t xml:space="preserve">. </w:t>
-      </w:r>
-      <w:r>
+        </w:rPr>
+      </w:pPr>
+    </w:p>
+    <w:p>
+      <w:pPr>
+        <w:spacing w:line="240" w:lineRule="auto"/>
         <w:rPr>
           <w:rFonts w:eastAsia="Times New Roman"/>
           <w:b/>
@@ -19153,6 +19265,54 @@
           <w:color w:val="000000"/>
           <w:sz w:val="28"/>
           <w:szCs w:val="28"/>
+          <w:lang w:val="pl-PL"/>
+        </w:rPr>
+      </w:pPr>
+    </w:p>
+    <w:p>
+      <w:pPr>
+        <w:spacing w:line="240" w:lineRule="auto"/>
+        <w:rPr>
+          <w:rFonts w:eastAsia="Times New Roman"/>
+          <w:b/>
+          <w:bCs/>
+          <w:color w:val="000000"/>
+          <w:sz w:val="28"/>
+          <w:szCs w:val="28"/>
+        </w:rPr>
+      </w:pPr>
+      <w:r>
+        <w:rPr>
+          <w:rFonts w:eastAsia="Times New Roman"/>
+          <w:b/>
+          <w:bCs/>
+          <w:color w:val="000000"/>
+          <w:sz w:val="28"/>
+          <w:szCs w:val="28"/>
+          <w:lang w:val="pl-PL"/>
+        </w:rPr>
+        <w:t>7</w:t>
+      </w:r>
+      <w:r>
+        <w:rPr>
+          <w:rFonts w:eastAsia="Times New Roman"/>
+          <w:b/>
+          <w:bCs/>
+          <w:color w:val="000000"/>
+          <w:sz w:val="28"/>
+          <w:szCs w:val="28"/>
+          <w:lang w:val="pl-PL"/>
+        </w:rPr>
+        <w:t xml:space="preserve">. </w:t>
+      </w:r>
+      <w:r>
+        <w:rPr>
+          <w:rFonts w:eastAsia="Times New Roman"/>
+          <w:b/>
+          <w:bCs/>
+          <w:color w:val="000000"/>
+          <w:sz w:val="28"/>
+          <w:szCs w:val="28"/>
         </w:rPr>
         <w:t>Propozycja technologii informatycznych, które mogą zostać wykorzystane do realizacji systemu (sprzęt, oprogramowanie) - diagram wdrożenia</w:t>
       </w:r>
@@ -19242,7 +19402,6 @@
           <w:szCs w:val="24"/>
           <w:lang w:val="pl-PL"/>
         </w:rPr>
-        <w:lastRenderedPageBreak/>
         <w:drawing>
           <wp:inline distT="0" distB="0" distL="0" distR="0" wp14:anchorId="52BD2AAB" wp14:editId="2F284C12">
             <wp:extent cx="6843395" cy="3315335"/>
@@ -20256,6 +20415,7 @@
                 <w:color w:val="000000"/>
                 <w:lang w:val="pl-PL"/>
               </w:rPr>
+              <w:lastRenderedPageBreak/>
               <w:t>2</w:t>
             </w:r>
           </w:p>
@@ -21484,7 +21644,6 @@
                 <w:color w:val="000000"/>
                 <w:lang w:val="pl-PL"/>
               </w:rPr>
-              <w:lastRenderedPageBreak/>
               <w:t>8</w:t>
             </w:r>
           </w:p>
@@ -22771,6 +22930,7 @@
                 <w:color w:val="000000"/>
                 <w:lang w:val="pl-PL"/>
               </w:rPr>
+              <w:lastRenderedPageBreak/>
               <w:t>Zagrożenie</w:t>
             </w:r>
           </w:p>
@@ -23356,16 +23516,7 @@
                 <w:color w:val="000000"/>
                 <w:lang w:val="pl-PL"/>
               </w:rPr>
-              <w:t xml:space="preserve">Nieprawidłowe przypisanie pracownika do harmonogramu </w:t>
-            </w:r>
-            <w:r>
-              <w:rPr>
-                <w:rFonts w:eastAsia="Times New Roman"/>
-                <w:color w:val="000000"/>
-                <w:lang w:val="pl-PL"/>
-              </w:rPr>
-              <w:lastRenderedPageBreak/>
-              <w:t>karmienia lub sprzątania</w:t>
+              <w:t>Nieprawidłowe przypisanie pracownika do harmonogramu karmienia lub sprzątania</w:t>
             </w:r>
           </w:p>
         </w:tc>
@@ -23403,7 +23554,6 @@
                 <w:color w:val="000000"/>
                 <w:lang w:val="pl-PL"/>
               </w:rPr>
-              <w:lastRenderedPageBreak/>
               <w:t>Średnie</w:t>
             </w:r>
           </w:p>
@@ -25202,6 +25352,7 @@
                 <w:color w:val="000000"/>
                 <w:lang w:val="pl-PL"/>
               </w:rPr>
+              <w:lastRenderedPageBreak/>
               <w:t>Wdrożenie systemu</w:t>
             </w:r>
           </w:p>
@@ -25662,16 +25813,7 @@
           <w:color w:val="000000"/>
           <w:lang w:val="pl-PL"/>
         </w:rPr>
-        <w:t xml:space="preserve">Odbiór systemu następuje po zakończeniu testów akceptacyjnych oraz potwierdzeniu poprawnego działania wszystkich funkcjonalności opisanych w specyfikacji projektu. W szczególności sprawdzana jest poprawność </w:t>
-      </w:r>
-      <w:r>
-        <w:rPr>
-          <w:rFonts w:eastAsia="Times New Roman"/>
-          <w:color w:val="000000"/>
-          <w:lang w:val="pl-PL"/>
-        </w:rPr>
-        <w:lastRenderedPageBreak/>
-        <w:t>procesu rejestracji i logowania, poprawność obsługi procesu leasingu chomika, poprawność działania modułu weterynaryjnego, poprawność generowania raportów, poprawność działania mechanizmów bezpieczeństwa. Warunkiem odbioru jest brak błędów krytycznych uniemożliwiających korzystanie z systemu.  </w:t>
+        <w:t>Odbiór systemu następuje po zakończeniu testów akceptacyjnych oraz potwierdzeniu poprawnego działania wszystkich funkcjonalności opisanych w specyfikacji projektu. W szczególności sprawdzana jest poprawność procesu rejestracji i logowania, poprawność obsługi procesu leasingu chomika, poprawność działania modułu weterynaryjnego, poprawność generowania raportów, poprawność działania mechanizmów bezpieczeństwa. Warunkiem odbioru jest brak błędów krytycznych uniemożliwiających korzystanie z systemu.  </w:t>
       </w:r>
     </w:p>
     <w:sectPr>
@@ -26694,6 +26836,119 @@
     </w:lvl>
   </w:abstractNum>
   <w:abstractNum w:abstractNumId="7" w15:restartNumberingAfterBreak="0">
+    <w:nsid w:val="0DBC0B20"/>
+    <w:multiLevelType w:val="hybridMultilevel"/>
+    <w:tmpl w:val="DED87FDC"/>
+    <w:lvl w:ilvl="0" w:tplc="04150001">
+      <w:start w:val="1"/>
+      <w:numFmt w:val="bullet"/>
+      <w:lvlText w:val=""/>
+      <w:lvlJc w:val="left"/>
+      <w:pPr>
+        <w:ind w:left="720" w:hanging="360"/>
+      </w:pPr>
+      <w:rPr>
+        <w:rFonts w:ascii="Symbol" w:hAnsi="Symbol" w:hint="default"/>
+      </w:rPr>
+    </w:lvl>
+    <w:lvl w:ilvl="1" w:tplc="04150003" w:tentative="1">
+      <w:start w:val="1"/>
+      <w:numFmt w:val="bullet"/>
+      <w:lvlText w:val="o"/>
+      <w:lvlJc w:val="left"/>
+      <w:pPr>
+        <w:ind w:left="1440" w:hanging="360"/>
+      </w:pPr>
+      <w:rPr>
+        <w:rFonts w:ascii="Courier New" w:hAnsi="Courier New" w:cs="Courier New" w:hint="default"/>
+      </w:rPr>
+    </w:lvl>
+    <w:lvl w:ilvl="2" w:tplc="04150005" w:tentative="1">
+      <w:start w:val="1"/>
+      <w:numFmt w:val="bullet"/>
+      <w:lvlText w:val=""/>
+      <w:lvlJc w:val="left"/>
+      <w:pPr>
+        <w:ind w:left="2160" w:hanging="360"/>
+      </w:pPr>
+      <w:rPr>
+        <w:rFonts w:ascii="Wingdings" w:hAnsi="Wingdings" w:hint="default"/>
+      </w:rPr>
+    </w:lvl>
+    <w:lvl w:ilvl="3" w:tplc="04150001" w:tentative="1">
+      <w:start w:val="1"/>
+      <w:numFmt w:val="bullet"/>
+      <w:lvlText w:val=""/>
+      <w:lvlJc w:val="left"/>
+      <w:pPr>
+        <w:ind w:left="2880" w:hanging="360"/>
+      </w:pPr>
+      <w:rPr>
+        <w:rFonts w:ascii="Symbol" w:hAnsi="Symbol" w:hint="default"/>
+      </w:rPr>
+    </w:lvl>
+    <w:lvl w:ilvl="4" w:tplc="04150003" w:tentative="1">
+      <w:start w:val="1"/>
+      <w:numFmt w:val="bullet"/>
+      <w:lvlText w:val="o"/>
+      <w:lvlJc w:val="left"/>
+      <w:pPr>
+        <w:ind w:left="3600" w:hanging="360"/>
+      </w:pPr>
+      <w:rPr>
+        <w:rFonts w:ascii="Courier New" w:hAnsi="Courier New" w:cs="Courier New" w:hint="default"/>
+      </w:rPr>
+    </w:lvl>
+    <w:lvl w:ilvl="5" w:tplc="04150005" w:tentative="1">
+      <w:start w:val="1"/>
+      <w:numFmt w:val="bullet"/>
+      <w:lvlText w:val=""/>
+      <w:lvlJc w:val="left"/>
+      <w:pPr>
+        <w:ind w:left="4320" w:hanging="360"/>
+      </w:pPr>
+      <w:rPr>
+        <w:rFonts w:ascii="Wingdings" w:hAnsi="Wingdings" w:hint="default"/>
+      </w:rPr>
+    </w:lvl>
+    <w:lvl w:ilvl="6" w:tplc="04150001" w:tentative="1">
+      <w:start w:val="1"/>
+      <w:numFmt w:val="bullet"/>
+      <w:lvlText w:val=""/>
+      <w:lvlJc w:val="left"/>
+      <w:pPr>
+        <w:ind w:left="5040" w:hanging="360"/>
+      </w:pPr>
+      <w:rPr>
+        <w:rFonts w:ascii="Symbol" w:hAnsi="Symbol" w:hint="default"/>
+      </w:rPr>
+    </w:lvl>
+    <w:lvl w:ilvl="7" w:tplc="04150003" w:tentative="1">
+      <w:start w:val="1"/>
+      <w:numFmt w:val="bullet"/>
+      <w:lvlText w:val="o"/>
+      <w:lvlJc w:val="left"/>
+      <w:pPr>
+        <w:ind w:left="5760" w:hanging="360"/>
+      </w:pPr>
+      <w:rPr>
+        <w:rFonts w:ascii="Courier New" w:hAnsi="Courier New" w:cs="Courier New" w:hint="default"/>
+      </w:rPr>
+    </w:lvl>
+    <w:lvl w:ilvl="8" w:tplc="04150005" w:tentative="1">
+      <w:start w:val="1"/>
+      <w:numFmt w:val="bullet"/>
+      <w:lvlText w:val=""/>
+      <w:lvlJc w:val="left"/>
+      <w:pPr>
+        <w:ind w:left="6480" w:hanging="360"/>
+      </w:pPr>
+      <w:rPr>
+        <w:rFonts w:ascii="Wingdings" w:hAnsi="Wingdings" w:hint="default"/>
+      </w:rPr>
+    </w:lvl>
+  </w:abstractNum>
+  <w:abstractNum w:abstractNumId="8" w15:restartNumberingAfterBreak="0">
     <w:nsid w:val="183018AE"/>
     <w:multiLevelType w:val="hybridMultilevel"/>
     <w:tmpl w:val="23863BB4"/>
@@ -26782,7 +27037,7 @@
       </w:pPr>
     </w:lvl>
   </w:abstractNum>
-  <w:abstractNum w:abstractNumId="8" w15:restartNumberingAfterBreak="0">
+  <w:abstractNum w:abstractNumId="9" w15:restartNumberingAfterBreak="0">
     <w:nsid w:val="185A7018"/>
     <w:multiLevelType w:val="multilevel"/>
     <w:tmpl w:val="4574E79E"/>
@@ -26931,7 +27186,7 @@
       </w:rPr>
     </w:lvl>
   </w:abstractNum>
-  <w:abstractNum w:abstractNumId="9" w15:restartNumberingAfterBreak="0">
+  <w:abstractNum w:abstractNumId="10" w15:restartNumberingAfterBreak="0">
     <w:nsid w:val="198B156E"/>
     <w:multiLevelType w:val="multilevel"/>
     <w:tmpl w:val="9B1AB160"/>
@@ -27080,7 +27335,7 @@
       </w:rPr>
     </w:lvl>
   </w:abstractNum>
-  <w:abstractNum w:abstractNumId="10" w15:restartNumberingAfterBreak="0">
+  <w:abstractNum w:abstractNumId="11" w15:restartNumberingAfterBreak="0">
     <w:nsid w:val="1B8C7D7E"/>
     <w:multiLevelType w:val="multilevel"/>
     <w:tmpl w:val="2CB20E0A"/>
@@ -27229,7 +27484,7 @@
       </w:rPr>
     </w:lvl>
   </w:abstractNum>
-  <w:abstractNum w:abstractNumId="11" w15:restartNumberingAfterBreak="0">
+  <w:abstractNum w:abstractNumId="12" w15:restartNumberingAfterBreak="0">
     <w:nsid w:val="1BDC795E"/>
     <w:multiLevelType w:val="multilevel"/>
     <w:tmpl w:val="D87A7138"/>
@@ -27378,7 +27633,7 @@
       </w:rPr>
     </w:lvl>
   </w:abstractNum>
-  <w:abstractNum w:abstractNumId="12" w15:restartNumberingAfterBreak="0">
+  <w:abstractNum w:abstractNumId="13" w15:restartNumberingAfterBreak="0">
     <w:nsid w:val="1C051B26"/>
     <w:multiLevelType w:val="multilevel"/>
     <w:tmpl w:val="634E3E70"/>
@@ -27527,7 +27782,7 @@
       </w:rPr>
     </w:lvl>
   </w:abstractNum>
-  <w:abstractNum w:abstractNumId="13" w15:restartNumberingAfterBreak="0">
+  <w:abstractNum w:abstractNumId="14" w15:restartNumberingAfterBreak="0">
     <w:nsid w:val="1E527A44"/>
     <w:multiLevelType w:val="multilevel"/>
     <w:tmpl w:val="ABD83246"/>
@@ -27676,7 +27931,7 @@
       </w:rPr>
     </w:lvl>
   </w:abstractNum>
-  <w:abstractNum w:abstractNumId="14" w15:restartNumberingAfterBreak="0">
+  <w:abstractNum w:abstractNumId="15" w15:restartNumberingAfterBreak="0">
     <w:nsid w:val="200F2195"/>
     <w:multiLevelType w:val="multilevel"/>
     <w:tmpl w:val="72EE9A20"/>
@@ -27821,7 +28076,7 @@
       </w:rPr>
     </w:lvl>
   </w:abstractNum>
-  <w:abstractNum w:abstractNumId="15" w15:restartNumberingAfterBreak="0">
+  <w:abstractNum w:abstractNumId="16" w15:restartNumberingAfterBreak="0">
     <w:nsid w:val="20F20DCE"/>
     <w:multiLevelType w:val="multilevel"/>
     <w:tmpl w:val="73CCF802"/>
@@ -27970,7 +28225,7 @@
       </w:rPr>
     </w:lvl>
   </w:abstractNum>
-  <w:abstractNum w:abstractNumId="16" w15:restartNumberingAfterBreak="0">
+  <w:abstractNum w:abstractNumId="17" w15:restartNumberingAfterBreak="0">
     <w:nsid w:val="2466232B"/>
     <w:multiLevelType w:val="multilevel"/>
     <w:tmpl w:val="A3081284"/>
@@ -28119,7 +28374,7 @@
       </w:rPr>
     </w:lvl>
   </w:abstractNum>
-  <w:abstractNum w:abstractNumId="17" w15:restartNumberingAfterBreak="0">
+  <w:abstractNum w:abstractNumId="18" w15:restartNumberingAfterBreak="0">
     <w:nsid w:val="276E5999"/>
     <w:multiLevelType w:val="multilevel"/>
     <w:tmpl w:val="FEC2DDF6"/>
@@ -28268,7 +28523,7 @@
       </w:rPr>
     </w:lvl>
   </w:abstractNum>
-  <w:abstractNum w:abstractNumId="18" w15:restartNumberingAfterBreak="0">
+  <w:abstractNum w:abstractNumId="19" w15:restartNumberingAfterBreak="0">
     <w:nsid w:val="280C0961"/>
     <w:multiLevelType w:val="multilevel"/>
     <w:tmpl w:val="17B00F10"/>
@@ -28381,7 +28636,7 @@
       </w:pPr>
     </w:lvl>
   </w:abstractNum>
-  <w:abstractNum w:abstractNumId="19" w15:restartNumberingAfterBreak="0">
+  <w:abstractNum w:abstractNumId="20" w15:restartNumberingAfterBreak="0">
     <w:nsid w:val="287D79F9"/>
     <w:multiLevelType w:val="multilevel"/>
     <w:tmpl w:val="427619BA"/>
@@ -28530,7 +28785,7 @@
       </w:rPr>
     </w:lvl>
   </w:abstractNum>
-  <w:abstractNum w:abstractNumId="20" w15:restartNumberingAfterBreak="0">
+  <w:abstractNum w:abstractNumId="21" w15:restartNumberingAfterBreak="0">
     <w:nsid w:val="2EB76ABD"/>
     <w:multiLevelType w:val="multilevel"/>
     <w:tmpl w:val="546ACF68"/>
@@ -28679,7 +28934,7 @@
       </w:rPr>
     </w:lvl>
   </w:abstractNum>
-  <w:abstractNum w:abstractNumId="21" w15:restartNumberingAfterBreak="0">
+  <w:abstractNum w:abstractNumId="22" w15:restartNumberingAfterBreak="0">
     <w:nsid w:val="30CA6A67"/>
     <w:multiLevelType w:val="multilevel"/>
     <w:tmpl w:val="5E78A4EE"/>
@@ -28828,7 +29083,7 @@
       </w:rPr>
     </w:lvl>
   </w:abstractNum>
-  <w:abstractNum w:abstractNumId="22" w15:restartNumberingAfterBreak="0">
+  <w:abstractNum w:abstractNumId="23" w15:restartNumberingAfterBreak="0">
     <w:nsid w:val="329711FB"/>
     <w:multiLevelType w:val="multilevel"/>
     <w:tmpl w:val="E76807F2"/>
@@ -28941,7 +29196,7 @@
       </w:pPr>
     </w:lvl>
   </w:abstractNum>
-  <w:abstractNum w:abstractNumId="23" w15:restartNumberingAfterBreak="0">
+  <w:abstractNum w:abstractNumId="24" w15:restartNumberingAfterBreak="0">
     <w:nsid w:val="33435D4B"/>
     <w:multiLevelType w:val="multilevel"/>
     <w:tmpl w:val="B9A6B0FE"/>
@@ -29090,7 +29345,7 @@
       </w:rPr>
     </w:lvl>
   </w:abstractNum>
-  <w:abstractNum w:abstractNumId="24" w15:restartNumberingAfterBreak="0">
+  <w:abstractNum w:abstractNumId="25" w15:restartNumberingAfterBreak="0">
     <w:nsid w:val="37AE53EC"/>
     <w:multiLevelType w:val="multilevel"/>
     <w:tmpl w:val="95229CF6"/>
@@ -29239,7 +29494,7 @@
       </w:rPr>
     </w:lvl>
   </w:abstractNum>
-  <w:abstractNum w:abstractNumId="25" w15:restartNumberingAfterBreak="0">
+  <w:abstractNum w:abstractNumId="26" w15:restartNumberingAfterBreak="0">
     <w:nsid w:val="37F854D7"/>
     <w:multiLevelType w:val="multilevel"/>
     <w:tmpl w:val="F30A8C14"/>
@@ -29388,7 +29643,7 @@
       </w:rPr>
     </w:lvl>
   </w:abstractNum>
-  <w:abstractNum w:abstractNumId="26" w15:restartNumberingAfterBreak="0">
+  <w:abstractNum w:abstractNumId="27" w15:restartNumberingAfterBreak="0">
     <w:nsid w:val="380A257C"/>
     <w:multiLevelType w:val="multilevel"/>
     <w:tmpl w:val="A4606374"/>
@@ -29537,7 +29792,7 @@
       </w:rPr>
     </w:lvl>
   </w:abstractNum>
-  <w:abstractNum w:abstractNumId="27" w15:restartNumberingAfterBreak="0">
+  <w:abstractNum w:abstractNumId="28" w15:restartNumberingAfterBreak="0">
     <w:nsid w:val="39E130FE"/>
     <w:multiLevelType w:val="multilevel"/>
     <w:tmpl w:val="99F28842"/>
@@ -29650,7 +29905,7 @@
       </w:pPr>
     </w:lvl>
   </w:abstractNum>
-  <w:abstractNum w:abstractNumId="28" w15:restartNumberingAfterBreak="0">
+  <w:abstractNum w:abstractNumId="29" w15:restartNumberingAfterBreak="0">
     <w:nsid w:val="403E3A8B"/>
     <w:multiLevelType w:val="multilevel"/>
     <w:tmpl w:val="2B8E5ACE"/>
@@ -29799,7 +30054,7 @@
       </w:rPr>
     </w:lvl>
   </w:abstractNum>
-  <w:abstractNum w:abstractNumId="29" w15:restartNumberingAfterBreak="0">
+  <w:abstractNum w:abstractNumId="30" w15:restartNumberingAfterBreak="0">
     <w:nsid w:val="43490DDF"/>
     <w:multiLevelType w:val="multilevel"/>
     <w:tmpl w:val="91BE96B0"/>
@@ -29948,7 +30203,7 @@
       </w:rPr>
     </w:lvl>
   </w:abstractNum>
-  <w:abstractNum w:abstractNumId="30" w15:restartNumberingAfterBreak="0">
+  <w:abstractNum w:abstractNumId="31" w15:restartNumberingAfterBreak="0">
     <w:nsid w:val="44280337"/>
     <w:multiLevelType w:val="multilevel"/>
     <w:tmpl w:val="2D323A4C"/>
@@ -30097,7 +30352,7 @@
       </w:rPr>
     </w:lvl>
   </w:abstractNum>
-  <w:abstractNum w:abstractNumId="31" w15:restartNumberingAfterBreak="0">
+  <w:abstractNum w:abstractNumId="32" w15:restartNumberingAfterBreak="0">
     <w:nsid w:val="49BD2CCB"/>
     <w:multiLevelType w:val="multilevel"/>
     <w:tmpl w:val="36C0C4A0"/>
@@ -30246,7 +30501,7 @@
       </w:rPr>
     </w:lvl>
   </w:abstractNum>
-  <w:abstractNum w:abstractNumId="32" w15:restartNumberingAfterBreak="0">
+  <w:abstractNum w:abstractNumId="33" w15:restartNumberingAfterBreak="0">
     <w:nsid w:val="4A987B69"/>
     <w:multiLevelType w:val="multilevel"/>
     <w:tmpl w:val="699604E4"/>
@@ -30359,7 +30614,7 @@
       </w:pPr>
     </w:lvl>
   </w:abstractNum>
-  <w:abstractNum w:abstractNumId="33" w15:restartNumberingAfterBreak="0">
+  <w:abstractNum w:abstractNumId="34" w15:restartNumberingAfterBreak="0">
     <w:nsid w:val="4D032C06"/>
     <w:multiLevelType w:val="multilevel"/>
     <w:tmpl w:val="52446D64"/>
@@ -30472,7 +30727,7 @@
       </w:pPr>
     </w:lvl>
   </w:abstractNum>
-  <w:abstractNum w:abstractNumId="34" w15:restartNumberingAfterBreak="0">
+  <w:abstractNum w:abstractNumId="35" w15:restartNumberingAfterBreak="0">
     <w:nsid w:val="4F330D6A"/>
     <w:multiLevelType w:val="multilevel"/>
     <w:tmpl w:val="A82E583C"/>
@@ -30621,7 +30876,7 @@
       </w:rPr>
     </w:lvl>
   </w:abstractNum>
-  <w:abstractNum w:abstractNumId="35" w15:restartNumberingAfterBreak="0">
+  <w:abstractNum w:abstractNumId="36" w15:restartNumberingAfterBreak="0">
     <w:nsid w:val="51836275"/>
     <w:multiLevelType w:val="multilevel"/>
     <w:tmpl w:val="FDB83DC8"/>
@@ -30770,7 +31025,7 @@
       </w:rPr>
     </w:lvl>
   </w:abstractNum>
-  <w:abstractNum w:abstractNumId="36" w15:restartNumberingAfterBreak="0">
+  <w:abstractNum w:abstractNumId="37" w15:restartNumberingAfterBreak="0">
     <w:nsid w:val="51AE47C0"/>
     <w:multiLevelType w:val="multilevel"/>
     <w:tmpl w:val="A54E0E9A"/>
@@ -30883,7 +31138,7 @@
       </w:pPr>
     </w:lvl>
   </w:abstractNum>
-  <w:abstractNum w:abstractNumId="37" w15:restartNumberingAfterBreak="0">
+  <w:abstractNum w:abstractNumId="38" w15:restartNumberingAfterBreak="0">
     <w:nsid w:val="52FF45EB"/>
     <w:multiLevelType w:val="multilevel"/>
     <w:tmpl w:val="00FC421C"/>
@@ -31032,7 +31287,7 @@
       </w:rPr>
     </w:lvl>
   </w:abstractNum>
-  <w:abstractNum w:abstractNumId="38" w15:restartNumberingAfterBreak="0">
+  <w:abstractNum w:abstractNumId="39" w15:restartNumberingAfterBreak="0">
     <w:nsid w:val="53231BA3"/>
     <w:multiLevelType w:val="multilevel"/>
     <w:tmpl w:val="F7A8ABC0"/>
@@ -31181,7 +31436,7 @@
       </w:rPr>
     </w:lvl>
   </w:abstractNum>
-  <w:abstractNum w:abstractNumId="39" w15:restartNumberingAfterBreak="0">
+  <w:abstractNum w:abstractNumId="40" w15:restartNumberingAfterBreak="0">
     <w:nsid w:val="53342C6F"/>
     <w:multiLevelType w:val="multilevel"/>
     <w:tmpl w:val="9C7CACD4"/>
@@ -31330,7 +31585,7 @@
       </w:rPr>
     </w:lvl>
   </w:abstractNum>
-  <w:abstractNum w:abstractNumId="40" w15:restartNumberingAfterBreak="0">
+  <w:abstractNum w:abstractNumId="41" w15:restartNumberingAfterBreak="0">
     <w:nsid w:val="53C6298F"/>
     <w:multiLevelType w:val="multilevel"/>
     <w:tmpl w:val="05B420A6"/>
@@ -31479,7 +31734,7 @@
       </w:rPr>
     </w:lvl>
   </w:abstractNum>
-  <w:abstractNum w:abstractNumId="41" w15:restartNumberingAfterBreak="0">
+  <w:abstractNum w:abstractNumId="42" w15:restartNumberingAfterBreak="0">
     <w:nsid w:val="54202591"/>
     <w:multiLevelType w:val="multilevel"/>
     <w:tmpl w:val="B0BEFC38"/>
@@ -31628,7 +31883,7 @@
       </w:rPr>
     </w:lvl>
   </w:abstractNum>
-  <w:abstractNum w:abstractNumId="42" w15:restartNumberingAfterBreak="0">
+  <w:abstractNum w:abstractNumId="43" w15:restartNumberingAfterBreak="0">
     <w:nsid w:val="568572B6"/>
     <w:multiLevelType w:val="multilevel"/>
     <w:tmpl w:val="DFDA65F2"/>
@@ -31777,7 +32032,7 @@
       </w:rPr>
     </w:lvl>
   </w:abstractNum>
-  <w:abstractNum w:abstractNumId="43" w15:restartNumberingAfterBreak="0">
+  <w:abstractNum w:abstractNumId="44" w15:restartNumberingAfterBreak="0">
     <w:nsid w:val="56D904D5"/>
     <w:multiLevelType w:val="multilevel"/>
     <w:tmpl w:val="1FFC75AE"/>
@@ -31926,7 +32181,7 @@
       </w:rPr>
     </w:lvl>
   </w:abstractNum>
-  <w:abstractNum w:abstractNumId="44" w15:restartNumberingAfterBreak="0">
+  <w:abstractNum w:abstractNumId="45" w15:restartNumberingAfterBreak="0">
     <w:nsid w:val="5C5F60B4"/>
     <w:multiLevelType w:val="multilevel"/>
     <w:tmpl w:val="40E89706"/>
@@ -32075,7 +32330,7 @@
       </w:rPr>
     </w:lvl>
   </w:abstractNum>
-  <w:abstractNum w:abstractNumId="45" w15:restartNumberingAfterBreak="0">
+  <w:abstractNum w:abstractNumId="46" w15:restartNumberingAfterBreak="0">
     <w:nsid w:val="5C7F3EA5"/>
     <w:multiLevelType w:val="multilevel"/>
     <w:tmpl w:val="E292C06A"/>
@@ -32188,7 +32443,7 @@
       </w:rPr>
     </w:lvl>
   </w:abstractNum>
-  <w:abstractNum w:abstractNumId="46" w15:restartNumberingAfterBreak="0">
+  <w:abstractNum w:abstractNumId="47" w15:restartNumberingAfterBreak="0">
     <w:nsid w:val="5DC513C1"/>
     <w:multiLevelType w:val="multilevel"/>
     <w:tmpl w:val="F998E6C4"/>
@@ -32337,7 +32592,7 @@
       </w:rPr>
     </w:lvl>
   </w:abstractNum>
-  <w:abstractNum w:abstractNumId="47" w15:restartNumberingAfterBreak="0">
+  <w:abstractNum w:abstractNumId="48" w15:restartNumberingAfterBreak="0">
     <w:nsid w:val="5E576AB2"/>
     <w:multiLevelType w:val="multilevel"/>
     <w:tmpl w:val="E726620C"/>
@@ -32486,7 +32741,7 @@
       </w:rPr>
     </w:lvl>
   </w:abstractNum>
-  <w:abstractNum w:abstractNumId="48" w15:restartNumberingAfterBreak="0">
+  <w:abstractNum w:abstractNumId="49" w15:restartNumberingAfterBreak="0">
     <w:nsid w:val="5E57751C"/>
     <w:multiLevelType w:val="hybridMultilevel"/>
     <w:tmpl w:val="11A6555E"/>
@@ -32599,7 +32854,7 @@
       </w:rPr>
     </w:lvl>
   </w:abstractNum>
-  <w:abstractNum w:abstractNumId="49" w15:restartNumberingAfterBreak="0">
+  <w:abstractNum w:abstractNumId="50" w15:restartNumberingAfterBreak="0">
     <w:nsid w:val="60090E3A"/>
     <w:multiLevelType w:val="multilevel"/>
     <w:tmpl w:val="128613DC"/>
@@ -32748,7 +33003,7 @@
       </w:rPr>
     </w:lvl>
   </w:abstractNum>
-  <w:abstractNum w:abstractNumId="50" w15:restartNumberingAfterBreak="0">
+  <w:abstractNum w:abstractNumId="51" w15:restartNumberingAfterBreak="0">
     <w:nsid w:val="629959B9"/>
     <w:multiLevelType w:val="multilevel"/>
     <w:tmpl w:val="699604E4"/>
@@ -32861,7 +33116,7 @@
       </w:pPr>
     </w:lvl>
   </w:abstractNum>
-  <w:abstractNum w:abstractNumId="51" w15:restartNumberingAfterBreak="0">
+  <w:abstractNum w:abstractNumId="52" w15:restartNumberingAfterBreak="0">
     <w:nsid w:val="6FA72DBC"/>
     <w:multiLevelType w:val="multilevel"/>
     <w:tmpl w:val="7326F9B6"/>
@@ -33010,7 +33265,7 @@
       </w:rPr>
     </w:lvl>
   </w:abstractNum>
-  <w:abstractNum w:abstractNumId="52" w15:restartNumberingAfterBreak="0">
+  <w:abstractNum w:abstractNumId="53" w15:restartNumberingAfterBreak="0">
     <w:nsid w:val="70571A84"/>
     <w:multiLevelType w:val="multilevel"/>
     <w:tmpl w:val="F1D07890"/>
@@ -33159,7 +33414,7 @@
       </w:rPr>
     </w:lvl>
   </w:abstractNum>
-  <w:abstractNum w:abstractNumId="53" w15:restartNumberingAfterBreak="0">
+  <w:abstractNum w:abstractNumId="54" w15:restartNumberingAfterBreak="0">
     <w:nsid w:val="72DD477B"/>
     <w:multiLevelType w:val="multilevel"/>
     <w:tmpl w:val="1C92742C"/>
@@ -33308,7 +33563,7 @@
       </w:rPr>
     </w:lvl>
   </w:abstractNum>
-  <w:abstractNum w:abstractNumId="54" w15:restartNumberingAfterBreak="0">
+  <w:abstractNum w:abstractNumId="55" w15:restartNumberingAfterBreak="0">
     <w:nsid w:val="72DE07B6"/>
     <w:multiLevelType w:val="multilevel"/>
     <w:tmpl w:val="F3A24FD6"/>
@@ -33457,7 +33712,7 @@
       </w:rPr>
     </w:lvl>
   </w:abstractNum>
-  <w:abstractNum w:abstractNumId="55" w15:restartNumberingAfterBreak="0">
+  <w:abstractNum w:abstractNumId="56" w15:restartNumberingAfterBreak="0">
     <w:nsid w:val="73956577"/>
     <w:multiLevelType w:val="multilevel"/>
     <w:tmpl w:val="82DCB43A"/>
@@ -33606,7 +33861,7 @@
       </w:rPr>
     </w:lvl>
   </w:abstractNum>
-  <w:abstractNum w:abstractNumId="56" w15:restartNumberingAfterBreak="0">
+  <w:abstractNum w:abstractNumId="57" w15:restartNumberingAfterBreak="0">
     <w:nsid w:val="73DB72A2"/>
     <w:multiLevelType w:val="multilevel"/>
     <w:tmpl w:val="1B24B312"/>
@@ -33755,7 +34010,7 @@
       </w:rPr>
     </w:lvl>
   </w:abstractNum>
-  <w:abstractNum w:abstractNumId="57" w15:restartNumberingAfterBreak="0">
+  <w:abstractNum w:abstractNumId="58" w15:restartNumberingAfterBreak="0">
     <w:nsid w:val="753F45FB"/>
     <w:multiLevelType w:val="multilevel"/>
     <w:tmpl w:val="C60AF980"/>
@@ -33904,7 +34159,7 @@
       </w:rPr>
     </w:lvl>
   </w:abstractNum>
-  <w:abstractNum w:abstractNumId="58" w15:restartNumberingAfterBreak="0">
+  <w:abstractNum w:abstractNumId="59" w15:restartNumberingAfterBreak="0">
     <w:nsid w:val="775849C8"/>
     <w:multiLevelType w:val="multilevel"/>
     <w:tmpl w:val="608E9DDE"/>
@@ -34053,7 +34308,7 @@
       </w:rPr>
     </w:lvl>
   </w:abstractNum>
-  <w:abstractNum w:abstractNumId="59" w15:restartNumberingAfterBreak="0">
+  <w:abstractNum w:abstractNumId="60" w15:restartNumberingAfterBreak="0">
     <w:nsid w:val="7B0B3AFC"/>
     <w:multiLevelType w:val="multilevel"/>
     <w:tmpl w:val="16D06C28"/>
@@ -34166,7 +34421,7 @@
       </w:pPr>
     </w:lvl>
   </w:abstractNum>
-  <w:abstractNum w:abstractNumId="60" w15:restartNumberingAfterBreak="0">
+  <w:abstractNum w:abstractNumId="61" w15:restartNumberingAfterBreak="0">
     <w:nsid w:val="7BE83EC8"/>
     <w:multiLevelType w:val="hybridMultilevel"/>
     <w:tmpl w:val="80C80CEC"/>
@@ -34279,7 +34534,7 @@
       </w:rPr>
     </w:lvl>
   </w:abstractNum>
-  <w:abstractNum w:abstractNumId="61" w15:restartNumberingAfterBreak="0">
+  <w:abstractNum w:abstractNumId="62" w15:restartNumberingAfterBreak="0">
     <w:nsid w:val="7F7619E6"/>
     <w:multiLevelType w:val="multilevel"/>
     <w:tmpl w:val="8F2854C8"/>
@@ -34428,7 +34683,7 @@
       </w:rPr>
     </w:lvl>
   </w:abstractNum>
-  <w:abstractNum w:abstractNumId="62" w15:restartNumberingAfterBreak="0">
+  <w:abstractNum w:abstractNumId="63" w15:restartNumberingAfterBreak="0">
     <w:nsid w:val="7F941253"/>
     <w:multiLevelType w:val="multilevel"/>
     <w:tmpl w:val="7BCA9774"/>
@@ -34577,7 +34832,7 @@
       </w:rPr>
     </w:lvl>
   </w:abstractNum>
-  <w:abstractNum w:abstractNumId="63" w15:restartNumberingAfterBreak="0">
+  <w:abstractNum w:abstractNumId="64" w15:restartNumberingAfterBreak="0">
     <w:nsid w:val="7FB7744B"/>
     <w:multiLevelType w:val="multilevel"/>
     <w:tmpl w:val="5E7C15AE"/>
@@ -34691,97 +34946,97 @@
     </w:lvl>
   </w:abstractNum>
   <w:num w:numId="1" w16cid:durableId="993529380">
-    <w:abstractNumId w:val="45"/>
+    <w:abstractNumId w:val="46"/>
   </w:num>
   <w:num w:numId="2" w16cid:durableId="1957254034">
-    <w:abstractNumId w:val="47"/>
+    <w:abstractNumId w:val="48"/>
   </w:num>
   <w:num w:numId="3" w16cid:durableId="734547526">
-    <w:abstractNumId w:val="42"/>
+    <w:abstractNumId w:val="43"/>
   </w:num>
   <w:num w:numId="4" w16cid:durableId="146020699">
-    <w:abstractNumId w:val="13"/>
+    <w:abstractNumId w:val="14"/>
   </w:num>
   <w:num w:numId="5" w16cid:durableId="174611146">
-    <w:abstractNumId w:val="54"/>
+    <w:abstractNumId w:val="55"/>
   </w:num>
   <w:num w:numId="6" w16cid:durableId="1825274068">
-    <w:abstractNumId w:val="30"/>
+    <w:abstractNumId w:val="31"/>
   </w:num>
   <w:num w:numId="7" w16cid:durableId="454258387">
-    <w:abstractNumId w:val="19"/>
+    <w:abstractNumId w:val="20"/>
   </w:num>
   <w:num w:numId="8" w16cid:durableId="677578760">
-    <w:abstractNumId w:val="56"/>
+    <w:abstractNumId w:val="57"/>
   </w:num>
   <w:num w:numId="9" w16cid:durableId="1490436316">
-    <w:abstractNumId w:val="39"/>
+    <w:abstractNumId w:val="40"/>
   </w:num>
   <w:num w:numId="10" w16cid:durableId="1596278286">
     <w:abstractNumId w:val="2"/>
   </w:num>
   <w:num w:numId="11" w16cid:durableId="697394649">
-    <w:abstractNumId w:val="34"/>
+    <w:abstractNumId w:val="35"/>
   </w:num>
   <w:num w:numId="12" w16cid:durableId="1315451412">
-    <w:abstractNumId w:val="59"/>
+    <w:abstractNumId w:val="60"/>
   </w:num>
   <w:num w:numId="13" w16cid:durableId="1206674393">
-    <w:abstractNumId w:val="46"/>
+    <w:abstractNumId w:val="47"/>
   </w:num>
   <w:num w:numId="14" w16cid:durableId="1993563347">
-    <w:abstractNumId w:val="43"/>
+    <w:abstractNumId w:val="44"/>
   </w:num>
   <w:num w:numId="15" w16cid:durableId="1708023114">
-    <w:abstractNumId w:val="40"/>
+    <w:abstractNumId w:val="41"/>
   </w:num>
   <w:num w:numId="16" w16cid:durableId="2000814645">
-    <w:abstractNumId w:val="24"/>
+    <w:abstractNumId w:val="25"/>
   </w:num>
   <w:num w:numId="17" w16cid:durableId="1125781783">
+    <w:abstractNumId w:val="37"/>
+  </w:num>
+  <w:num w:numId="18" w16cid:durableId="483277252">
+    <w:abstractNumId w:val="45"/>
+  </w:num>
+  <w:num w:numId="19" w16cid:durableId="1155998351">
     <w:abstractNumId w:val="36"/>
   </w:num>
-  <w:num w:numId="18" w16cid:durableId="483277252">
-    <w:abstractNumId w:val="44"/>
-  </w:num>
-  <w:num w:numId="19" w16cid:durableId="1155998351">
-    <w:abstractNumId w:val="35"/>
-  </w:num>
   <w:num w:numId="20" w16cid:durableId="893152542">
-    <w:abstractNumId w:val="57"/>
+    <w:abstractNumId w:val="58"/>
   </w:num>
   <w:num w:numId="21" w16cid:durableId="1173758258">
-    <w:abstractNumId w:val="41"/>
+    <w:abstractNumId w:val="42"/>
   </w:num>
   <w:num w:numId="22" w16cid:durableId="226694624">
-    <w:abstractNumId w:val="18"/>
+    <w:abstractNumId w:val="19"/>
   </w:num>
   <w:num w:numId="23" w16cid:durableId="1568296332">
-    <w:abstractNumId w:val="55"/>
+    <w:abstractNumId w:val="56"/>
   </w:num>
   <w:num w:numId="24" w16cid:durableId="917445654">
-    <w:abstractNumId w:val="20"/>
+    <w:abstractNumId w:val="21"/>
   </w:num>
   <w:num w:numId="25" w16cid:durableId="1860779320">
-    <w:abstractNumId w:val="10"/>
+    <w:abstractNumId w:val="11"/>
   </w:num>
   <w:num w:numId="26" w16cid:durableId="1226989757">
-    <w:abstractNumId w:val="37"/>
+    <w:abstractNumId w:val="38"/>
   </w:num>
   <w:num w:numId="27" w16cid:durableId="210922851">
-    <w:abstractNumId w:val="63"/>
+    <w:abstractNumId w:val="64"/>
   </w:num>
   <w:num w:numId="28" w16cid:durableId="268314316">
-    <w:abstractNumId w:val="28"/>
+    <w:abstractNumId w:val="29"/>
   </w:num>
   <w:num w:numId="29" w16cid:durableId="1349060385">
-    <w:abstractNumId w:val="14"/>
+    <w:abstractNumId w:val="15"/>
   </w:num>
   <w:num w:numId="30" w16cid:durableId="826170573">
-    <w:abstractNumId w:val="25"/>
+    <w:abstractNumId w:val="26"/>
   </w:num>
   <w:num w:numId="31" w16cid:durableId="1927034502">
-    <w:abstractNumId w:val="31"/>
+    <w:abstractNumId w:val="32"/>
   </w:num>
   <w:num w:numId="32" w16cid:durableId="1505709090">
     <w:abstractNumId w:val="0"/>
@@ -34790,97 +35045,100 @@
     <w:abstractNumId w:val="3"/>
   </w:num>
   <w:num w:numId="34" w16cid:durableId="1596399909">
-    <w:abstractNumId w:val="58"/>
+    <w:abstractNumId w:val="59"/>
   </w:num>
   <w:num w:numId="35" w16cid:durableId="1632318390">
-    <w:abstractNumId w:val="21"/>
+    <w:abstractNumId w:val="22"/>
   </w:num>
   <w:num w:numId="36" w16cid:durableId="141701253">
     <w:abstractNumId w:val="6"/>
   </w:num>
   <w:num w:numId="37" w16cid:durableId="1211768749">
+    <w:abstractNumId w:val="17"/>
+  </w:num>
+  <w:num w:numId="38" w16cid:durableId="971446756">
+    <w:abstractNumId w:val="52"/>
+  </w:num>
+  <w:num w:numId="39" w16cid:durableId="636761215">
+    <w:abstractNumId w:val="54"/>
+  </w:num>
+  <w:num w:numId="40" w16cid:durableId="1719088955">
+    <w:abstractNumId w:val="27"/>
+  </w:num>
+  <w:num w:numId="41" w16cid:durableId="16083882">
     <w:abstractNumId w:val="16"/>
   </w:num>
-  <w:num w:numId="38" w16cid:durableId="971446756">
-    <w:abstractNumId w:val="51"/>
-  </w:num>
-  <w:num w:numId="39" w16cid:durableId="636761215">
-    <w:abstractNumId w:val="53"/>
-  </w:num>
-  <w:num w:numId="40" w16cid:durableId="1719088955">
-    <w:abstractNumId w:val="26"/>
-  </w:num>
-  <w:num w:numId="41" w16cid:durableId="16083882">
-    <w:abstractNumId w:val="15"/>
-  </w:num>
   <w:num w:numId="42" w16cid:durableId="207837763">
-    <w:abstractNumId w:val="8"/>
+    <w:abstractNumId w:val="9"/>
   </w:num>
   <w:num w:numId="43" w16cid:durableId="717583654">
     <w:abstractNumId w:val="5"/>
   </w:num>
   <w:num w:numId="44" w16cid:durableId="1911576984">
+    <w:abstractNumId w:val="63"/>
+  </w:num>
+  <w:num w:numId="45" w16cid:durableId="801077412">
+    <w:abstractNumId w:val="50"/>
+  </w:num>
+  <w:num w:numId="46" w16cid:durableId="44184346">
     <w:abstractNumId w:val="62"/>
   </w:num>
-  <w:num w:numId="45" w16cid:durableId="801077412">
-    <w:abstractNumId w:val="49"/>
-  </w:num>
-  <w:num w:numId="46" w16cid:durableId="44184346">
-    <w:abstractNumId w:val="61"/>
-  </w:num>
   <w:num w:numId="47" w16cid:durableId="1469740704">
-    <w:abstractNumId w:val="17"/>
+    <w:abstractNumId w:val="18"/>
   </w:num>
   <w:num w:numId="48" w16cid:durableId="1758600098">
-    <w:abstractNumId w:val="12"/>
+    <w:abstractNumId w:val="13"/>
   </w:num>
   <w:num w:numId="49" w16cid:durableId="937903788">
-    <w:abstractNumId w:val="29"/>
+    <w:abstractNumId w:val="30"/>
   </w:num>
   <w:num w:numId="50" w16cid:durableId="1396855454">
-    <w:abstractNumId w:val="52"/>
+    <w:abstractNumId w:val="53"/>
   </w:num>
   <w:num w:numId="51" w16cid:durableId="1186484752">
+    <w:abstractNumId w:val="24"/>
+  </w:num>
+  <w:num w:numId="52" w16cid:durableId="1805393135">
+    <w:abstractNumId w:val="28"/>
+  </w:num>
+  <w:num w:numId="53" w16cid:durableId="574703136">
     <w:abstractNumId w:val="23"/>
   </w:num>
-  <w:num w:numId="52" w16cid:durableId="1805393135">
-    <w:abstractNumId w:val="27"/>
-  </w:num>
-  <w:num w:numId="53" w16cid:durableId="574703136">
-    <w:abstractNumId w:val="22"/>
-  </w:num>
   <w:num w:numId="54" w16cid:durableId="1802726209">
-    <w:abstractNumId w:val="32"/>
+    <w:abstractNumId w:val="33"/>
   </w:num>
   <w:num w:numId="55" w16cid:durableId="1318847828">
-    <w:abstractNumId w:val="50"/>
+    <w:abstractNumId w:val="51"/>
   </w:num>
   <w:num w:numId="56" w16cid:durableId="468671156">
-    <w:abstractNumId w:val="33"/>
+    <w:abstractNumId w:val="34"/>
   </w:num>
   <w:num w:numId="57" w16cid:durableId="2051147794">
-    <w:abstractNumId w:val="11"/>
+    <w:abstractNumId w:val="12"/>
   </w:num>
   <w:num w:numId="58" w16cid:durableId="389965855">
     <w:abstractNumId w:val="1"/>
   </w:num>
   <w:num w:numId="59" w16cid:durableId="1639342352">
-    <w:abstractNumId w:val="48"/>
+    <w:abstractNumId w:val="49"/>
   </w:num>
   <w:num w:numId="60" w16cid:durableId="869954194">
     <w:abstractNumId w:val="4"/>
   </w:num>
   <w:num w:numId="61" w16cid:durableId="1860193001">
-    <w:abstractNumId w:val="7"/>
+    <w:abstractNumId w:val="8"/>
   </w:num>
   <w:num w:numId="62" w16cid:durableId="698821672">
-    <w:abstractNumId w:val="38"/>
+    <w:abstractNumId w:val="39"/>
   </w:num>
   <w:num w:numId="63" w16cid:durableId="1686399775">
-    <w:abstractNumId w:val="9"/>
+    <w:abstractNumId w:val="10"/>
   </w:num>
   <w:num w:numId="64" w16cid:durableId="1498350678">
-    <w:abstractNumId w:val="60"/>
+    <w:abstractNumId w:val="61"/>
+  </w:num>
+  <w:num w:numId="65" w16cid:durableId="415714015">
+    <w:abstractNumId w:val="7"/>
   </w:num>
   <w:numIdMacAtCleanup w:val="51"/>
 </w:numbering>

</xml_diff>